<commit_message>
Restructure le document Z101 en présentation de projet
Ajoute une fiche synthèse, les objectifs, les rôles par période,
l'échéancier de démarrage, les ressources et coûts, les risques,
les indicateurs de suivi et la décision demandée.

Co-Authored-By: Claude Opus 5.5 <noreply@anthropic.com>
Claude-Session: https://claude.ai/code/session_01GMdriyBYj6aFRdtmm4tFaT
</commit_message>
<xml_diff>
--- a/documents/z101/Projet-Z101.docx
+++ b/documents/z101/Projet-Z101.docx
@@ -16,7 +16,7 @@
           <w:sz w:val="18"/>
           <w:szCs w:val="18"/>
         </w:rPr>
-        <w:t xml:space="preserve">PROPOSITION À LA TABLE DES DIRECTIONS · OCTOBRE 2026</w:t>
+        <w:t xml:space="preserve">PRÉSENTATION DE PROJET · TABLE DES DIRECTIONS · OCTOBRE 2026</w:t>
       </w:r>
     </w:p>
     <w:p>
@@ -29,10 +29,10 @@
           <w:b/>
           <w:bCs/>
           <w:color w:val="1D3557"/>
-          <w:sz w:val="52"/>
-          <w:szCs w:val="52"/>
-        </w:rPr>
-        <w:t xml:space="preserve">Projet PPS Z101</w:t>
+          <w:sz w:val="50"/>
+          <w:szCs w:val="50"/>
+        </w:rPr>
+        <w:t xml:space="preserve">PPS Z101 : un deuxième sous-groupe</w:t>
       </w:r>
     </w:p>
     <w:p>
@@ -43,15 +43,15 @@
         <w:rPr>
           <w:rFonts w:ascii="Calibri" w:cs="Calibri" w:eastAsia="Calibri" w:hAnsi="Calibri"/>
           <w:color w:val="1D3557"/>
-          <w:sz w:val="28"/>
-          <w:szCs w:val="28"/>
-        </w:rPr>
-        <w:t xml:space="preserve">Accueillir les 9 élèves en attente grâce à une formule en deux sous-groupes</w:t>
+          <w:sz w:val="26"/>
+          <w:szCs w:val="26"/>
+        </w:rPr>
+        <w:t xml:space="preserve">Accueillir les 9 élèves en attente sans embauche, grâce à une formule d'ateliers autonomes</w:t>
       </w:r>
     </w:p>
     <w:p>
       <w:pPr>
-        <w:spacing w:after="240"/>
+        <w:spacing w:after="220"/>
       </w:pPr>
       <w:r>
         <w:rPr>
@@ -62,7 +62,7 @@
           <w:sz w:val="19"/>
           <w:szCs w:val="19"/>
         </w:rPr>
-        <w:t xml:space="preserve">Préparé par la conseillère pédagogique, secteur PPS, CFGA</w:t>
+        <w:t xml:space="preserve">Présenté par la conseillère pédagogique, secteur PPS, CFGA</w:t>
       </w:r>
     </w:p>
     <w:tbl>
@@ -293,24 +293,38 @@
     </w:tbl>
     <w:p>
       <w:pPr>
-        <w:spacing w:after="220"/>
+        <w:spacing w:after="200"/>
       </w:pPr>
+    </w:p>
+    <w:p>
+      <w:pPr>
+        <w:pStyle w:val="Heading2"/>
+        <w:keepNext/>
+        <w:spacing w:after="80" w:before="200"/>
+      </w:pPr>
+      <w:r>
+        <w:rPr>
+          <w:rFonts w:ascii="Calibri" w:cs="Calibri" w:eastAsia="Calibri" w:hAnsi="Calibri"/>
+        </w:rPr>
+        <w:t xml:space="preserve">Fiche synthèse</w:t>
+      </w:r>
     </w:p>
     <w:tbl>
       <w:tblPr>
         <w:tblW w:type="dxa" w:w="9360"/>
         <w:tblBorders>
-          <w:top w:val="single" w:color="auto" w:sz="4"/>
-          <w:left w:val="single" w:color="auto" w:sz="4"/>
-          <w:bottom w:val="single" w:color="auto" w:sz="4"/>
-          <w:right w:val="single" w:color="auto" w:sz="4"/>
-          <w:insideH w:val="single" w:color="auto" w:sz="4"/>
-          <w:insideV w:val="single" w:color="auto" w:sz="4"/>
+          <w:top w:val="single" w:color="CFD4DC" w:sz="4"/>
+          <w:left w:val="single" w:color="CFD4DC" w:sz="4"/>
+          <w:bottom w:val="single" w:color="CFD4DC" w:sz="4"/>
+          <w:right w:val="single" w:color="CFD4DC" w:sz="4"/>
+          <w:insideH w:val="single" w:color="CFD4DC" w:sz="4"/>
+          <w:insideV w:val="single" w:color="CFD4DC" w:sz="4"/>
         </w:tblBorders>
         <w:tblLayout w:type="fixed"/>
       </w:tblPr>
       <w:tblGrid>
-        <w:gridCol w:w="9360"/>
+        <w:gridCol w:w="2400"/>
+        <w:gridCol w:w="6960"/>
       </w:tblGrid>
       <w:tr>
         <w:trPr>
@@ -318,124 +332,396 @@
         </w:trPr>
         <w:tc>
           <w:tcPr>
-            <w:tcW w:type="dxa" w:w="9360"/>
-            <w:tcBorders>
-              <w:top w:val="none" w:color="FFFFFF" w:sz="0"/>
-              <w:left w:val="single" w:color="1D3557" w:sz="36"/>
-              <w:bottom w:val="none" w:color="FFFFFF" w:sz="0"/>
-              <w:right w:val="none" w:color="FFFFFF" w:sz="0"/>
-            </w:tcBorders>
+            <w:tcW w:type="dxa" w:w="2400"/>
             <w:shd w:fill="E8F0FB" w:color="auto" w:val="clear"/>
             <w:tcMar>
-              <w:top w:type="dxa" w:w="160"/>
-              <w:left w:type="dxa" w:w="260"/>
-              <w:bottom w:type="dxa" w:w="120"/>
-              <w:right w:type="dxa" w:w="260"/>
-            </w:tcMar>
-          </w:tcPr>
-          <w:p>
-            <w:pPr>
-              <w:spacing w:after="80"/>
-            </w:pPr>
-            <w:r>
-              <w:rPr>
-                <w:rFonts w:ascii="Calibri" w:cs="Calibri" w:eastAsia="Calibri" w:hAnsi="Calibri"/>
-                <w:b/>
-                <w:bCs/>
-                <w:color w:val="1D3557"/>
-                <w:sz w:val="24"/>
-                <w:szCs w:val="24"/>
-              </w:rPr>
-              <w:t xml:space="preserve">En bref</w:t>
-            </w:r>
-          </w:p>
-          <w:p>
-            <w:pPr>
-              <w:spacing w:after="120" w:line="288"/>
-            </w:pPr>
-            <w:r>
-              <w:rPr>
-                <w:rFonts w:ascii="Calibri" w:cs="Calibri" w:eastAsia="Calibri" w:hAnsi="Calibri"/>
-              </w:rPr>
-              <w:t xml:space="preserve">Le groupe Z101 est complet avec </w:t>
-            </w:r>
-            <w:r>
-              <w:rPr>
-                <w:rFonts w:ascii="Calibri" w:cs="Calibri" w:eastAsia="Calibri" w:hAnsi="Calibri"/>
-                <w:b/>
-                <w:bCs/>
-              </w:rPr>
-              <w:t xml:space="preserve">15 élèves</w:t>
-            </w:r>
-            <w:r>
-              <w:rPr>
-                <w:rFonts w:ascii="Calibri" w:cs="Calibri" w:eastAsia="Calibri" w:hAnsi="Calibri"/>
-              </w:rPr>
-              <w:t xml:space="preserve">, et </w:t>
-            </w:r>
-            <w:r>
-              <w:rPr>
-                <w:rFonts w:ascii="Calibri" w:cs="Calibri" w:eastAsia="Calibri" w:hAnsi="Calibri"/>
-                <w:b/>
-                <w:bCs/>
-              </w:rPr>
-              <w:t xml:space="preserve">9 autres élèves attendent</w:t>
-            </w:r>
-            <w:r>
-              <w:rPr>
-                <w:rFonts w:ascii="Calibri" w:cs="Calibri" w:eastAsia="Calibri" w:hAnsi="Calibri"/>
-              </w:rPr>
-              <w:t xml:space="preserve"> une place. Plusieurs nous sont référés par des enseignantes de la FBC parce que leur profil correspond à PPS.</w:t>
-            </w:r>
-          </w:p>
-          <w:p>
-            <w:pPr>
-              <w:spacing w:after="120" w:line="288"/>
-            </w:pPr>
-            <w:r>
-              <w:rPr>
-                <w:rFonts w:ascii="Calibri" w:cs="Calibri" w:eastAsia="Calibri" w:hAnsi="Calibri"/>
-              </w:rPr>
-              <w:t xml:space="preserve">Nous proposons d'accueillir ces 9 élèves </w:t>
-            </w:r>
-            <w:r>
-              <w:rPr>
-                <w:rFonts w:ascii="Calibri" w:cs="Calibri" w:eastAsia="Calibri" w:hAnsi="Calibri"/>
-                <w:b/>
-                <w:bCs/>
-              </w:rPr>
-              <w:t xml:space="preserve">sans embauche et sans période vide à l'horaire</w:t>
-            </w:r>
-            <w:r>
-              <w:rPr>
-                <w:rFonts w:ascii="Calibri" w:cs="Calibri" w:eastAsia="Calibri" w:hAnsi="Calibri"/>
-              </w:rPr>
-              <w:t xml:space="preserve">. Les 24 élèves seraient répartis en deux sous-groupes qui alternent entre l'enseignement direct avec l'enseignante et des ateliers autonomes très structurés.</w:t>
-            </w:r>
-          </w:p>
-          <w:p>
-            <w:pPr>
-              <w:spacing w:after="60"/>
-            </w:pPr>
-            <w:r>
-              <w:rPr>
-                <w:rFonts w:ascii="Calibri" w:cs="Calibri" w:eastAsia="Calibri" w:hAnsi="Calibri"/>
-              </w:rPr>
-              <w:t xml:space="preserve">La TES accompagne d'abord les élèves vers l'autonomie. Une fois cette autonomie acquise, </w:t>
-            </w:r>
-            <w:r>
-              <w:rPr>
-                <w:rFonts w:ascii="Calibri" w:cs="Calibri" w:eastAsia="Calibri" w:hAnsi="Calibri"/>
-                <w:b/>
-                <w:bCs/>
-              </w:rPr>
-              <w:t xml:space="preserve">l'enseignante anime des ateliers en sous-groupes de besoins et la TES anime des ateliers ciblés en petits groupes.</w:t>
-            </w:r>
-            <w:r>
-              <w:rPr>
-                <w:rFonts w:ascii="Calibri" w:cs="Calibri" w:eastAsia="Calibri" w:hAnsi="Calibri"/>
-              </w:rPr>
-              <w:t xml:space="preserve"> La TES a déjà donné son accord.</w:t>
+              <w:top w:type="dxa" w:w="100"/>
+              <w:left w:type="dxa" w:w="140"/>
+              <w:bottom w:type="dxa" w:w="100"/>
+              <w:right w:type="dxa" w:w="140"/>
+            </w:tcMar>
+            <w:vAlign w:val="top"/>
+          </w:tcPr>
+          <w:p>
+            <w:pPr>
+              <w:spacing w:after="40" w:line="264"/>
+            </w:pPr>
+            <w:r>
+              <w:rPr>
+                <w:rFonts w:ascii="Calibri" w:cs="Calibri" w:eastAsia="Calibri" w:hAnsi="Calibri"/>
+                <w:b/>
+                <w:bCs/>
+              </w:rPr>
+              <w:t xml:space="preserve">Problème</w:t>
+            </w:r>
+          </w:p>
+        </w:tc>
+        <w:tc>
+          <w:tcPr>
+            <w:tcW w:type="dxa" w:w="6960"/>
+            <w:tcMar>
+              <w:top w:type="dxa" w:w="100"/>
+              <w:left w:type="dxa" w:w="140"/>
+              <w:bottom w:type="dxa" w:w="100"/>
+              <w:right w:type="dxa" w:w="140"/>
+            </w:tcMar>
+            <w:vAlign w:val="top"/>
+          </w:tcPr>
+          <w:p>
+            <w:pPr>
+              <w:spacing w:after="40" w:line="264"/>
+            </w:pPr>
+            <w:r>
+              <w:rPr>
+                <w:rFonts w:ascii="Calibri" w:cs="Calibri" w:eastAsia="Calibri" w:hAnsi="Calibri"/>
+              </w:rPr>
+              <w:t xml:space="preserve">Le groupe Z101 est complet (15 élèves) et 9 élèves référés attendent une place. Sans solution, ils restent à la porte au moment où ils sont prêts à s'engager.</w:t>
+            </w:r>
+          </w:p>
+        </w:tc>
+      </w:tr>
+      <w:tr>
+        <w:trPr>
+          <w:cantSplit/>
+        </w:trPr>
+        <w:tc>
+          <w:tcPr>
+            <w:tcW w:type="dxa" w:w="2400"/>
+            <w:shd w:fill="E8F0FB" w:color="auto" w:val="clear"/>
+            <w:tcMar>
+              <w:top w:type="dxa" w:w="100"/>
+              <w:left w:type="dxa" w:w="140"/>
+              <w:bottom w:type="dxa" w:w="100"/>
+              <w:right w:type="dxa" w:w="140"/>
+            </w:tcMar>
+            <w:vAlign w:val="top"/>
+          </w:tcPr>
+          <w:p>
+            <w:pPr>
+              <w:spacing w:after="40" w:line="264"/>
+            </w:pPr>
+            <w:r>
+              <w:rPr>
+                <w:rFonts w:ascii="Calibri" w:cs="Calibri" w:eastAsia="Calibri" w:hAnsi="Calibri"/>
+                <w:b/>
+                <w:bCs/>
+              </w:rPr>
+              <w:t xml:space="preserve">Solution</w:t>
+            </w:r>
+          </w:p>
+        </w:tc>
+        <w:tc>
+          <w:tcPr>
+            <w:tcW w:type="dxa" w:w="6960"/>
+            <w:tcMar>
+              <w:top w:type="dxa" w:w="100"/>
+              <w:left w:type="dxa" w:w="140"/>
+              <w:bottom w:type="dxa" w:w="100"/>
+              <w:right w:type="dxa" w:w="140"/>
+            </w:tcMar>
+            <w:vAlign w:val="top"/>
+          </w:tcPr>
+          <w:p>
+            <w:pPr>
+              <w:spacing w:after="40" w:line="264"/>
+            </w:pPr>
+            <w:r>
+              <w:rPr>
+                <w:rFonts w:ascii="Calibri" w:cs="Calibri" w:eastAsia="Calibri" w:hAnsi="Calibri"/>
+              </w:rPr>
+              <w:t xml:space="preserve">Accueillir les 24 élèves en </w:t>
+            </w:r>
+            <w:r>
+              <w:rPr>
+                <w:rFonts w:ascii="Calibri" w:cs="Calibri" w:eastAsia="Calibri" w:hAnsi="Calibri"/>
+                <w:b/>
+                <w:bCs/>
+              </w:rPr>
+              <w:t xml:space="preserve">deux sous-groupes de 12</w:t>
+            </w:r>
+            <w:r>
+              <w:rPr>
+                <w:rFonts w:ascii="Calibri" w:cs="Calibri" w:eastAsia="Calibri" w:hAnsi="Calibri"/>
+              </w:rPr>
+              <w:t xml:space="preserve"> qui alternent entre l'enseignement direct et des ateliers autonomes structurés.</w:t>
+            </w:r>
+          </w:p>
+        </w:tc>
+      </w:tr>
+      <w:tr>
+        <w:trPr>
+          <w:cantSplit/>
+        </w:trPr>
+        <w:tc>
+          <w:tcPr>
+            <w:tcW w:type="dxa" w:w="2400"/>
+            <w:shd w:fill="E8F0FB" w:color="auto" w:val="clear"/>
+            <w:tcMar>
+              <w:top w:type="dxa" w:w="100"/>
+              <w:left w:type="dxa" w:w="140"/>
+              <w:bottom w:type="dxa" w:w="100"/>
+              <w:right w:type="dxa" w:w="140"/>
+            </w:tcMar>
+            <w:vAlign w:val="top"/>
+          </w:tcPr>
+          <w:p>
+            <w:pPr>
+              <w:spacing w:after="40" w:line="264"/>
+            </w:pPr>
+            <w:r>
+              <w:rPr>
+                <w:rFonts w:ascii="Calibri" w:cs="Calibri" w:eastAsia="Calibri" w:hAnsi="Calibri"/>
+                <w:b/>
+                <w:bCs/>
+              </w:rPr>
+              <w:t xml:space="preserve">Clientèle</w:t>
+            </w:r>
+          </w:p>
+        </w:tc>
+        <w:tc>
+          <w:tcPr>
+            <w:tcW w:type="dxa" w:w="6960"/>
+            <w:tcMar>
+              <w:top w:type="dxa" w:w="100"/>
+              <w:left w:type="dxa" w:w="140"/>
+              <w:bottom w:type="dxa" w:w="100"/>
+              <w:right w:type="dxa" w:w="140"/>
+            </w:tcMar>
+            <w:vAlign w:val="top"/>
+          </w:tcPr>
+          <w:p>
+            <w:pPr>
+              <w:spacing w:after="40" w:line="264"/>
+            </w:pPr>
+            <w:r>
+              <w:rPr>
+                <w:rFonts w:ascii="Calibri" w:cs="Calibri" w:eastAsia="Calibri" w:hAnsi="Calibri"/>
+              </w:rPr>
+              <w:t xml:space="preserve">Élèves adultes du programme Participation sociale (PPS), dont plusieurs référés par des enseignantes de la FBC.</w:t>
+            </w:r>
+          </w:p>
+        </w:tc>
+      </w:tr>
+      <w:tr>
+        <w:trPr>
+          <w:cantSplit/>
+        </w:trPr>
+        <w:tc>
+          <w:tcPr>
+            <w:tcW w:type="dxa" w:w="2400"/>
+            <w:shd w:fill="E8F0FB" w:color="auto" w:val="clear"/>
+            <w:tcMar>
+              <w:top w:type="dxa" w:w="100"/>
+              <w:left w:type="dxa" w:w="140"/>
+              <w:bottom w:type="dxa" w:w="100"/>
+              <w:right w:type="dxa" w:w="140"/>
+            </w:tcMar>
+            <w:vAlign w:val="top"/>
+          </w:tcPr>
+          <w:p>
+            <w:pPr>
+              <w:spacing w:after="40" w:line="264"/>
+            </w:pPr>
+            <w:r>
+              <w:rPr>
+                <w:rFonts w:ascii="Calibri" w:cs="Calibri" w:eastAsia="Calibri" w:hAnsi="Calibri"/>
+                <w:b/>
+                <w:bCs/>
+              </w:rPr>
+              <w:t xml:space="preserve">Équipe</w:t>
+            </w:r>
+          </w:p>
+        </w:tc>
+        <w:tc>
+          <w:tcPr>
+            <w:tcW w:type="dxa" w:w="6960"/>
+            <w:tcMar>
+              <w:top w:type="dxa" w:w="100"/>
+              <w:left w:type="dxa" w:w="140"/>
+              <w:bottom w:type="dxa" w:w="100"/>
+              <w:right w:type="dxa" w:w="140"/>
+            </w:tcMar>
+            <w:vAlign w:val="top"/>
+          </w:tcPr>
+          <w:p>
+            <w:pPr>
+              <w:spacing w:after="40" w:line="264"/>
+            </w:pPr>
+            <w:r>
+              <w:rPr>
+                <w:rFonts w:ascii="Calibri" w:cs="Calibri" w:eastAsia="Calibri" w:hAnsi="Calibri"/>
+              </w:rPr>
+              <w:t xml:space="preserve">Enseignante du Z101, TES préventive, orthopédagogue et conseillère pédagogique. Tous déjà en poste.</w:t>
+            </w:r>
+          </w:p>
+        </w:tc>
+      </w:tr>
+      <w:tr>
+        <w:trPr>
+          <w:cantSplit/>
+        </w:trPr>
+        <w:tc>
+          <w:tcPr>
+            <w:tcW w:type="dxa" w:w="2400"/>
+            <w:shd w:fill="E8F0FB" w:color="auto" w:val="clear"/>
+            <w:tcMar>
+              <w:top w:type="dxa" w:w="100"/>
+              <w:left w:type="dxa" w:w="140"/>
+              <w:bottom w:type="dxa" w:w="100"/>
+              <w:right w:type="dxa" w:w="140"/>
+            </w:tcMar>
+            <w:vAlign w:val="top"/>
+          </w:tcPr>
+          <w:p>
+            <w:pPr>
+              <w:spacing w:after="40" w:line="264"/>
+            </w:pPr>
+            <w:r>
+              <w:rPr>
+                <w:rFonts w:ascii="Calibri" w:cs="Calibri" w:eastAsia="Calibri" w:hAnsi="Calibri"/>
+                <w:b/>
+                <w:bCs/>
+              </w:rPr>
+              <w:t xml:space="preserve">Coût</w:t>
+            </w:r>
+          </w:p>
+        </w:tc>
+        <w:tc>
+          <w:tcPr>
+            <w:tcW w:type="dxa" w:w="6960"/>
+            <w:tcMar>
+              <w:top w:type="dxa" w:w="100"/>
+              <w:left w:type="dxa" w:w="140"/>
+              <w:bottom w:type="dxa" w:w="100"/>
+              <w:right w:type="dxa" w:w="140"/>
+            </w:tcMar>
+            <w:vAlign w:val="top"/>
+          </w:tcPr>
+          <w:p>
+            <w:pPr>
+              <w:spacing w:after="40" w:line="264"/>
+            </w:pPr>
+            <w:r>
+              <w:rPr>
+                <w:rFonts w:ascii="Calibri" w:cs="Calibri" w:eastAsia="Calibri" w:hAnsi="Calibri"/>
+                <w:b/>
+                <w:bCs/>
+              </w:rPr>
+              <w:t xml:space="preserve">Aucune embauche.</w:t>
+            </w:r>
+            <w:r>
+              <w:rPr>
+                <w:rFonts w:ascii="Calibri" w:cs="Calibri" w:eastAsia="Calibri" w:hAnsi="Calibri"/>
+              </w:rPr>
+              <w:t xml:space="preserve"> Matériel : fiches plastifiées et chariots TEACCH partagés avec l'alpha-pré et la DAP.</w:t>
+            </w:r>
+          </w:p>
+        </w:tc>
+      </w:tr>
+      <w:tr>
+        <w:trPr>
+          <w:cantSplit/>
+        </w:trPr>
+        <w:tc>
+          <w:tcPr>
+            <w:tcW w:type="dxa" w:w="2400"/>
+            <w:shd w:fill="E8F0FB" w:color="auto" w:val="clear"/>
+            <w:tcMar>
+              <w:top w:type="dxa" w:w="100"/>
+              <w:left w:type="dxa" w:w="140"/>
+              <w:bottom w:type="dxa" w:w="100"/>
+              <w:right w:type="dxa" w:w="140"/>
+            </w:tcMar>
+            <w:vAlign w:val="top"/>
+          </w:tcPr>
+          <w:p>
+            <w:pPr>
+              <w:spacing w:after="40" w:line="264"/>
+            </w:pPr>
+            <w:r>
+              <w:rPr>
+                <w:rFonts w:ascii="Calibri" w:cs="Calibri" w:eastAsia="Calibri" w:hAnsi="Calibri"/>
+                <w:b/>
+                <w:bCs/>
+              </w:rPr>
+              <w:t xml:space="preserve">Durée</w:t>
+            </w:r>
+          </w:p>
+        </w:tc>
+        <w:tc>
+          <w:tcPr>
+            <w:tcW w:type="dxa" w:w="6960"/>
+            <w:tcMar>
+              <w:top w:type="dxa" w:w="100"/>
+              <w:left w:type="dxa" w:w="140"/>
+              <w:bottom w:type="dxa" w:w="100"/>
+              <w:right w:type="dxa" w:w="140"/>
+            </w:tcMar>
+            <w:vAlign w:val="top"/>
+          </w:tcPr>
+          <w:p>
+            <w:pPr>
+              <w:spacing w:after="40" w:line="264"/>
+            </w:pPr>
+            <w:r>
+              <w:rPr>
+                <w:rFonts w:ascii="Calibri" w:cs="Calibri" w:eastAsia="Calibri" w:hAnsi="Calibri"/>
+              </w:rPr>
+              <w:t xml:space="preserve">Projet pilote à partir de l'acceptation, en trois périodes, avec un premier bilan à la fin de la période d'ancrage.</w:t>
+            </w:r>
+          </w:p>
+        </w:tc>
+      </w:tr>
+      <w:tr>
+        <w:trPr>
+          <w:cantSplit/>
+        </w:trPr>
+        <w:tc>
+          <w:tcPr>
+            <w:tcW w:type="dxa" w:w="2400"/>
+            <w:shd w:fill="E8F0FB" w:color="auto" w:val="clear"/>
+            <w:tcMar>
+              <w:top w:type="dxa" w:w="100"/>
+              <w:left w:type="dxa" w:w="140"/>
+              <w:bottom w:type="dxa" w:w="100"/>
+              <w:right w:type="dxa" w:w="140"/>
+            </w:tcMar>
+            <w:vAlign w:val="top"/>
+          </w:tcPr>
+          <w:p>
+            <w:pPr>
+              <w:spacing w:after="40" w:line="264"/>
+            </w:pPr>
+            <w:r>
+              <w:rPr>
+                <w:rFonts w:ascii="Calibri" w:cs="Calibri" w:eastAsia="Calibri" w:hAnsi="Calibri"/>
+                <w:b/>
+                <w:bCs/>
+              </w:rPr>
+              <w:t xml:space="preserve">Décision demandée</w:t>
+            </w:r>
+          </w:p>
+        </w:tc>
+        <w:tc>
+          <w:tcPr>
+            <w:tcW w:type="dxa" w:w="6960"/>
+            <w:tcMar>
+              <w:top w:type="dxa" w:w="100"/>
+              <w:left w:type="dxa" w:w="140"/>
+              <w:bottom w:type="dxa" w:w="100"/>
+              <w:right w:type="dxa" w:w="140"/>
+            </w:tcMar>
+            <w:vAlign w:val="top"/>
+          </w:tcPr>
+          <w:p>
+            <w:pPr>
+              <w:spacing w:after="40" w:line="264"/>
+            </w:pPr>
+            <w:r>
+              <w:rPr>
+                <w:rFonts w:ascii="Calibri" w:cs="Calibri" w:eastAsia="Calibri" w:hAnsi="Calibri"/>
+              </w:rPr>
+              <w:t xml:space="preserve">Rouvrir les inscriptions au Z101 et autoriser la formule en deux sous-groupes à titre de projet pilote.</w:t>
             </w:r>
           </w:p>
         </w:tc>
@@ -454,20 +740,7 @@
         <w:rPr>
           <w:rFonts w:ascii="Calibri" w:cs="Calibri" w:eastAsia="Calibri" w:hAnsi="Calibri"/>
         </w:rPr>
-        <w:t xml:space="preserve">1. La situation et les enjeux</w:t>
-      </w:r>
-    </w:p>
-    <w:p>
-      <w:pPr>
-        <w:pStyle w:val="Heading2"/>
-        <w:keepNext/>
-        <w:spacing w:after="80" w:before="200"/>
-      </w:pPr>
-      <w:r>
-        <w:rPr>
-          <w:rFonts w:ascii="Calibri" w:cs="Calibri" w:eastAsia="Calibri" w:hAnsi="Calibri"/>
-        </w:rPr>
-        <w:t xml:space="preserve">Ce qui se passe actuellement</w:t>
+        <w:t xml:space="preserve">1. Contexte et problématique</w:t>
       </w:r>
     </w:p>
     <w:p>
@@ -527,7 +800,7 @@
         <w:rPr>
           <w:rFonts w:ascii="Calibri" w:cs="Calibri" w:eastAsia="Calibri" w:hAnsi="Calibri"/>
         </w:rPr>
-        <w:t xml:space="preserve">, dont plusieurs référés par des enseignantes de la FBC.</w:t>
+        <w:t xml:space="preserve">. Plusieurs sont référés par des enseignantes de la FBC parce que leur profil correspond à PPS et que le Z101 serait pour eux un levier d'engagement et de motivation.</w:t>
       </w:r>
     </w:p>
     <w:p>
@@ -543,7 +816,7 @@
         <w:rPr>
           <w:rFonts w:ascii="Calibri" w:cs="Calibri" w:eastAsia="Calibri" w:hAnsi="Calibri"/>
         </w:rPr>
-        <w:t xml:space="preserve">La cohorte actuelle est </w:t>
+        <w:t xml:space="preserve">Les élèves du Z101 </w:t>
       </w:r>
       <w:r>
         <w:rPr>
@@ -551,13 +824,29 @@
           <w:b/>
           <w:bCs/>
         </w:rPr>
-        <w:t xml:space="preserve">très participative et engagée</w:t>
-      </w:r>
-      <w:r>
-        <w:rPr>
-          <w:rFonts w:ascii="Calibri" w:cs="Calibri" w:eastAsia="Calibri" w:hAnsi="Calibri"/>
-        </w:rPr>
-        <w:t xml:space="preserve">. C'est une base solide pour introduire des ateliers autonomes.</w:t>
+        <w:t xml:space="preserve">poursuivent ensuite en années 2 et 3 en PPS</w:t>
+      </w:r>
+      <w:r>
+        <w:rPr>
+          <w:rFonts w:ascii="Calibri" w:cs="Calibri" w:eastAsia="Calibri" w:hAnsi="Calibri"/>
+        </w:rPr>
+        <w:t xml:space="preserve"> au centre.</w:t>
+      </w:r>
+    </w:p>
+    <w:p>
+      <w:pPr>
+        <w:pStyle w:val="ListParagraph"/>
+        <w:numPr>
+          <w:ilvl w:val="0"/>
+          <w:numId w:val="2"/>
+        </w:numPr>
+        <w:spacing w:after="80" w:line="276"/>
+      </w:pPr>
+      <w:r>
+        <w:rPr>
+          <w:rFonts w:ascii="Calibri" w:cs="Calibri" w:eastAsia="Calibri" w:hAnsi="Calibri"/>
+        </w:rPr>
+        <w:t xml:space="preserve">La direction souhaite éviter les périodes vides à l'horaire des élèves et ne pas embaucher de ressource supplémentaire. La formule proposée respecte ces deux conditions.</w:t>
       </w:r>
     </w:p>
     <w:p>
@@ -570,7 +859,7 @@
         <w:rPr>
           <w:rFonts w:ascii="Calibri" w:cs="Calibri" w:eastAsia="Calibri" w:hAnsi="Calibri"/>
         </w:rPr>
-        <w:t xml:space="preserve">Pourquoi c'est important</w:t>
+        <w:t xml:space="preserve">Les enjeux</w:t>
       </w:r>
     </w:p>
     <w:tbl>
@@ -756,21 +1045,7 @@
               <w:rPr>
                 <w:rFonts w:ascii="Calibri" w:cs="Calibri" w:eastAsia="Calibri" w:hAnsi="Calibri"/>
               </w:rPr>
-              <w:t xml:space="preserve">Les élèves du Z101 poursuivent en </w:t>
-            </w:r>
-            <w:r>
-              <w:rPr>
-                <w:rFonts w:ascii="Calibri" w:cs="Calibri" w:eastAsia="Calibri" w:hAnsi="Calibri"/>
-                <w:b/>
-                <w:bCs/>
-              </w:rPr>
-              <w:t xml:space="preserve">années 2 et 3 en PPS</w:t>
-            </w:r>
-            <w:r>
-              <w:rPr>
-                <w:rFonts w:ascii="Calibri" w:cs="Calibri" w:eastAsia="Calibri" w:hAnsi="Calibri"/>
-              </w:rPr>
-              <w:t xml:space="preserve">. Chaque élève accueilli aujourd'hui, c'est un parcours de trois ans au centre.</w:t>
+              <w:t xml:space="preserve">Chaque élève accueilli en Z101 représente un parcours possible de trois ans en PPS au centre.</w:t>
             </w:r>
           </w:p>
         </w:tc>
@@ -801,7 +1076,7 @@
                 <w:b/>
                 <w:bCs/>
               </w:rPr>
-              <w:t xml:space="preserve">Engagement</w:t>
+              <w:t xml:space="preserve">Équité</w:t>
             </w:r>
           </w:p>
         </w:tc>
@@ -824,7 +1099,7 @@
               <w:rPr>
                 <w:rFonts w:ascii="Calibri" w:cs="Calibri" w:eastAsia="Calibri" w:hAnsi="Calibri"/>
               </w:rPr>
-              <w:t xml:space="preserve">Les enseignantes de la FBC voient le Z101 comme un levier de motivation pour ces élèves. C'est pour cette raison qu'elles nous les réfèrent.</w:t>
+              <w:t xml:space="preserve">Ces élèves ont un profil qui correspond à PPS. Leur offrir une place, c'est leur offrir le service qui leur convient.</w:t>
             </w:r>
           </w:p>
         </w:tc>
@@ -878,7 +1153,7 @@
               <w:rPr>
                 <w:rFonts w:ascii="Calibri" w:cs="Calibri" w:eastAsia="Calibri" w:hAnsi="Calibri"/>
               </w:rPr>
-              <w:t xml:space="preserve">La formule peut devenir un modèle pour d'autres services du centre (section 7).</w:t>
+              <w:t xml:space="preserve">La formule peut devenir un modèle pour d'autres services du centre (section 10).</w:t>
             </w:r>
           </w:p>
         </w:tc>
@@ -897,7 +1172,7 @@
         <w:rPr>
           <w:rFonts w:ascii="Calibri" w:cs="Calibri" w:eastAsia="Calibri" w:hAnsi="Calibri"/>
         </w:rPr>
-        <w:t xml:space="preserve">2. La formule proposée</w:t>
+        <w:t xml:space="preserve">2. Objectifs du projet</w:t>
       </w:r>
     </w:p>
     <w:p>
@@ -907,36 +1182,16 @@
       <w:r>
         <w:rPr>
           <w:rFonts w:ascii="Calibri" w:cs="Calibri" w:eastAsia="Calibri" w:hAnsi="Calibri"/>
-        </w:rPr>
-        <w:t xml:space="preserve">Les 24 élèves forment </w:t>
-      </w:r>
-      <w:r>
-        <w:rPr>
-          <w:rFonts w:ascii="Calibri" w:cs="Calibri" w:eastAsia="Calibri" w:hAnsi="Calibri"/>
           <w:b/>
           <w:bCs/>
         </w:rPr>
-        <w:t xml:space="preserve">deux sous-groupes de 12 (A et B)</w:t>
-      </w:r>
-      <w:r>
-        <w:rPr>
-          <w:rFonts w:ascii="Calibri" w:cs="Calibri" w:eastAsia="Calibri" w:hAnsi="Calibri"/>
-        </w:rPr>
-        <w:t xml:space="preserve">. Pendant que l'un reçoit l'enseignement direct du Z101 avec l'enseignante, l'autre travaille en </w:t>
-      </w:r>
-      <w:r>
-        <w:rPr>
-          <w:rFonts w:ascii="Calibri" w:cs="Calibri" w:eastAsia="Calibri" w:hAnsi="Calibri"/>
-          <w:b/>
-          <w:bCs/>
-        </w:rPr>
-        <w:t xml:space="preserve">ateliers autonomes</w:t>
-      </w:r>
-      <w:r>
-        <w:rPr>
-          <w:rFonts w:ascii="Calibri" w:cs="Calibri" w:eastAsia="Calibri" w:hAnsi="Calibri"/>
-        </w:rPr>
-        <w:t xml:space="preserve">. Les sous-groupes changent de place à mi-parcours. Chaque élève est donc toujours en apprentissage encadré, sans période vide.</w:t>
+        <w:t xml:space="preserve">Objectif général :</w:t>
+      </w:r>
+      <w:r>
+        <w:rPr>
+          <w:rFonts w:ascii="Calibri" w:cs="Calibri" w:eastAsia="Calibri" w:hAnsi="Calibri"/>
+        </w:rPr>
+        <w:t xml:space="preserve"> accueillir les 9 élèves en attente au Z101 et développer l'autonomie de tous les élèves du groupe, sans embauche ni période vide.</w:t>
       </w:r>
     </w:p>
     <w:p>
@@ -949,7 +1204,119 @@
         <w:rPr>
           <w:rFonts w:ascii="Calibri" w:cs="Calibri" w:eastAsia="Calibri" w:hAnsi="Calibri"/>
         </w:rPr>
-        <w:t xml:space="preserve">Le menu du matin (périodes 1 et 2)</w:t>
+        <w:t xml:space="preserve">Objectifs spécifiques</w:t>
+      </w:r>
+    </w:p>
+    <w:p>
+      <w:pPr>
+        <w:pStyle w:val="ListParagraph"/>
+        <w:numPr>
+          <w:ilvl w:val="0"/>
+          <w:numId w:val="3"/>
+        </w:numPr>
+        <w:spacing w:after="80" w:line="276"/>
+      </w:pPr>
+      <w:r>
+        <w:rPr>
+          <w:rFonts w:ascii="Calibri" w:cs="Calibri" w:eastAsia="Calibri" w:hAnsi="Calibri"/>
+          <w:b/>
+          <w:bCs/>
+        </w:rPr>
+        <w:t xml:space="preserve">Retenir</w:t>
+      </w:r>
+      <w:r>
+        <w:rPr>
+          <w:rFonts w:ascii="Calibri" w:cs="Calibri" w:eastAsia="Calibri" w:hAnsi="Calibri"/>
+        </w:rPr>
+        <w:t xml:space="preserve"> les 24 élèves pendant le projet pilote, dans un environnement sécurisant.</w:t>
+      </w:r>
+    </w:p>
+    <w:p>
+      <w:pPr>
+        <w:pStyle w:val="ListParagraph"/>
+        <w:numPr>
+          <w:ilvl w:val="0"/>
+          <w:numId w:val="3"/>
+        </w:numPr>
+        <w:spacing w:after="80" w:line="276"/>
+      </w:pPr>
+      <w:r>
+        <w:rPr>
+          <w:rFonts w:ascii="Calibri" w:cs="Calibri" w:eastAsia="Calibri" w:hAnsi="Calibri"/>
+          <w:b/>
+          <w:bCs/>
+        </w:rPr>
+        <w:t xml:space="preserve">Développer l'autonomie</w:t>
+      </w:r>
+      <w:r>
+        <w:rPr>
+          <w:rFonts w:ascii="Calibri" w:cs="Calibri" w:eastAsia="Calibri" w:hAnsi="Calibri"/>
+        </w:rPr>
+        <w:t xml:space="preserve"> des élèves en atelier, au point où les adultes peuvent enseigner de façon ciblée (période 3).</w:t>
+      </w:r>
+    </w:p>
+    <w:p>
+      <w:pPr>
+        <w:pStyle w:val="ListParagraph"/>
+        <w:numPr>
+          <w:ilvl w:val="0"/>
+          <w:numId w:val="3"/>
+        </w:numPr>
+        <w:spacing w:after="80" w:line="276"/>
+      </w:pPr>
+      <w:r>
+        <w:rPr>
+          <w:rFonts w:ascii="Calibri" w:cs="Calibri" w:eastAsia="Calibri" w:hAnsi="Calibri"/>
+          <w:b/>
+          <w:bCs/>
+        </w:rPr>
+        <w:t xml:space="preserve">Soutenir l'engagement</w:t>
+      </w:r>
+      <w:r>
+        <w:rPr>
+          <w:rFonts w:ascii="Calibri" w:cs="Calibri" w:eastAsia="Calibri" w:hAnsi="Calibri"/>
+        </w:rPr>
+        <w:t xml:space="preserve"> en nourrissant les quatre besoins : compétence, autonomie, sens et appartenance.</w:t>
+      </w:r>
+    </w:p>
+    <w:p>
+      <w:pPr>
+        <w:pStyle w:val="ListParagraph"/>
+        <w:numPr>
+          <w:ilvl w:val="0"/>
+          <w:numId w:val="3"/>
+        </w:numPr>
+        <w:spacing w:after="80" w:line="276"/>
+      </w:pPr>
+      <w:r>
+        <w:rPr>
+          <w:rFonts w:ascii="Calibri" w:cs="Calibri" w:eastAsia="Calibri" w:hAnsi="Calibri"/>
+          <w:b/>
+          <w:bCs/>
+        </w:rPr>
+        <w:t xml:space="preserve">Documenter la formule</w:t>
+      </w:r>
+      <w:r>
+        <w:rPr>
+          <w:rFonts w:ascii="Calibri" w:cs="Calibri" w:eastAsia="Calibri" w:hAnsi="Calibri"/>
+        </w:rPr>
+        <w:t xml:space="preserve"> pour évaluer si elle peut s'appliquer ailleurs au centre.</w:t>
+      </w:r>
+    </w:p>
+    <w:p>
+      <w:pPr>
+        <w:pStyle w:val="Heading1"/>
+        <w:keepNext/>
+        <w:pBdr>
+          <w:bottom w:val="single" w:color="2F7A2A" w:sz="6" w:space="4"/>
+        </w:pBdr>
+        <w:spacing w:after="140" w:before="360"/>
+      </w:pPr>
+      <w:r>
+        <w:rPr>
+          <w:rFonts w:ascii="Calibri" w:cs="Calibri" w:eastAsia="Calibri" w:hAnsi="Calibri"/>
+        </w:rPr>
+        <w:t xml:space="preserve">3. Description de la formule</w:t>
       </w:r>
     </w:p>
     <w:p>
@@ -960,7 +1327,221 @@
         <w:rPr>
           <w:rFonts w:ascii="Calibri" w:cs="Calibri" w:eastAsia="Calibri" w:hAnsi="Calibri"/>
         </w:rPr>
-        <w:t xml:space="preserve">Voici comment se déroule une matinée type, et ce que font l'enseignante et la TES à chaque moment.</w:t>
+        <w:t xml:space="preserve">Les 24 élèves forment </w:t>
+      </w:r>
+      <w:r>
+        <w:rPr>
+          <w:rFonts w:ascii="Calibri" w:cs="Calibri" w:eastAsia="Calibri" w:hAnsi="Calibri"/>
+          <w:b/>
+          <w:bCs/>
+        </w:rPr>
+        <w:t xml:space="preserve">deux sous-groupes de 12 (A et B)</w:t>
+      </w:r>
+      <w:r>
+        <w:rPr>
+          <w:rFonts w:ascii="Calibri" w:cs="Calibri" w:eastAsia="Calibri" w:hAnsi="Calibri"/>
+        </w:rPr>
+        <w:t xml:space="preserve">, composés d'élèves de profils variés. Pendant que l'un reçoit l'enseignement direct du Z101 avec l'enseignante, l'autre travaille en </w:t>
+      </w:r>
+      <w:r>
+        <w:rPr>
+          <w:rFonts w:ascii="Calibri" w:cs="Calibri" w:eastAsia="Calibri" w:hAnsi="Calibri"/>
+          <w:b/>
+          <w:bCs/>
+        </w:rPr>
+        <w:t xml:space="preserve">ateliers autonomes</w:t>
+      </w:r>
+      <w:r>
+        <w:rPr>
+          <w:rFonts w:ascii="Calibri" w:cs="Calibri" w:eastAsia="Calibri" w:hAnsi="Calibri"/>
+        </w:rPr>
+        <w:t xml:space="preserve">. Les sous-groupes changent de place à mi-matinée. Chaque élève est donc toujours en apprentissage encadré.</w:t>
+      </w:r>
+    </w:p>
+    <w:p>
+      <w:pPr>
+        <w:pStyle w:val="Heading2"/>
+        <w:keepNext/>
+        <w:spacing w:after="80" w:before="200"/>
+      </w:pPr>
+      <w:r>
+        <w:rPr>
+          <w:rFonts w:ascii="Calibri" w:cs="Calibri" w:eastAsia="Calibri" w:hAnsi="Calibri"/>
+        </w:rPr>
+        <w:t xml:space="preserve">Les outils qui rendent les élèves autonomes</w:t>
+      </w:r>
+    </w:p>
+    <w:p>
+      <w:pPr>
+        <w:pStyle w:val="ListParagraph"/>
+        <w:numPr>
+          <w:ilvl w:val="0"/>
+          <w:numId w:val="2"/>
+        </w:numPr>
+        <w:spacing w:after="80" w:line="276"/>
+      </w:pPr>
+      <w:r>
+        <w:rPr>
+          <w:rFonts w:ascii="Calibri" w:cs="Calibri" w:eastAsia="Calibri" w:hAnsi="Calibri"/>
+          <w:b/>
+          <w:bCs/>
+        </w:rPr>
+        <w:t xml:space="preserve">Fiches de tâches autonomes :</w:t>
+      </w:r>
+      <w:r>
+        <w:rPr>
+          <w:rFonts w:ascii="Calibri" w:cs="Calibri" w:eastAsia="Calibri" w:hAnsi="Calibri"/>
+        </w:rPr>
+        <w:t xml:space="preserve"> une tâche par fiche, de 1 à 5 étapes illustrées, et des critères de réussite pour s'auto-évaluer.</w:t>
+      </w:r>
+    </w:p>
+    <w:p>
+      <w:pPr>
+        <w:pStyle w:val="ListParagraph"/>
+        <w:numPr>
+          <w:ilvl w:val="0"/>
+          <w:numId w:val="2"/>
+        </w:numPr>
+        <w:spacing w:after="80" w:line="276"/>
+      </w:pPr>
+      <w:r>
+        <w:rPr>
+          <w:rFonts w:ascii="Calibri" w:cs="Calibri" w:eastAsia="Calibri" w:hAnsi="Calibri"/>
+          <w:b/>
+          <w:bCs/>
+        </w:rPr>
+        <w:t xml:space="preserve">Leader tournant :</w:t>
+      </w:r>
+      <w:r>
+        <w:rPr>
+          <w:rFonts w:ascii="Calibri" w:cs="Calibri" w:eastAsia="Calibri" w:hAnsi="Calibri"/>
+        </w:rPr>
+        <w:t xml:space="preserve"> à chaque atelier, un élève lit la fiche, distribue les rôles et gère le temps. Le rôle tourne pour que chacun l'exerce.</w:t>
+      </w:r>
+    </w:p>
+    <w:p>
+      <w:pPr>
+        <w:pStyle w:val="ListParagraph"/>
+        <w:numPr>
+          <w:ilvl w:val="0"/>
+          <w:numId w:val="2"/>
+        </w:numPr>
+        <w:spacing w:after="80" w:line="276"/>
+      </w:pPr>
+      <w:r>
+        <w:rPr>
+          <w:rFonts w:ascii="Calibri" w:cs="Calibri" w:eastAsia="Calibri" w:hAnsi="Calibri"/>
+          <w:b/>
+          <w:bCs/>
+        </w:rPr>
+        <w:t xml:space="preserve">Registre d'autonomie :</w:t>
+      </w:r>
+      <w:r>
+        <w:rPr>
+          <w:rFonts w:ascii="Calibri" w:cs="Calibri" w:eastAsia="Calibri" w:hAnsi="Calibri"/>
+        </w:rPr>
+        <w:t xml:space="preserve"> chaque élève y inscrit sa tâche en début de matinée, le leader valide les étapes et l'enseignante fait la validation finale.</w:t>
+      </w:r>
+    </w:p>
+    <w:p>
+      <w:pPr>
+        <w:pStyle w:val="ListParagraph"/>
+        <w:numPr>
+          <w:ilvl w:val="0"/>
+          <w:numId w:val="2"/>
+        </w:numPr>
+        <w:spacing w:after="80" w:line="276"/>
+      </w:pPr>
+      <w:r>
+        <w:rPr>
+          <w:rFonts w:ascii="Calibri" w:cs="Calibri" w:eastAsia="Calibri" w:hAnsi="Calibri"/>
+          <w:b/>
+          <w:bCs/>
+        </w:rPr>
+        <w:t xml:space="preserve">Règle « 3 avant l'enseignante » :</w:t>
+      </w:r>
+      <w:r>
+        <w:rPr>
+          <w:rFonts w:ascii="Calibri" w:cs="Calibri" w:eastAsia="Calibri" w:hAnsi="Calibri"/>
+        </w:rPr>
+        <w:t xml:space="preserve"> relire la fiche, demander à un coéquipier, essayer une autre solution.</w:t>
+      </w:r>
+    </w:p>
+    <w:p>
+      <w:pPr>
+        <w:pStyle w:val="ListParagraph"/>
+        <w:numPr>
+          <w:ilvl w:val="0"/>
+          <w:numId w:val="2"/>
+        </w:numPr>
+        <w:spacing w:after="80" w:line="276"/>
+      </w:pPr>
+      <w:r>
+        <w:rPr>
+          <w:rFonts w:ascii="Calibri" w:cs="Calibri" w:eastAsia="Calibri" w:hAnsi="Calibri"/>
+          <w:b/>
+          <w:bCs/>
+        </w:rPr>
+        <w:t xml:space="preserve">Plateaux et chariots TEACCH :</w:t>
+      </w:r>
+      <w:r>
+        <w:rPr>
+          <w:rFonts w:ascii="Calibri" w:cs="Calibri" w:eastAsia="Calibri" w:hAnsi="Calibri"/>
+        </w:rPr>
+        <w:t xml:space="preserve"> ateliers en cuisine et au grenier, postes de travail visuels et structurés.</w:t>
+      </w:r>
+    </w:p>
+    <w:p>
+      <w:pPr>
+        <w:pStyle w:val="ListParagraph"/>
+        <w:numPr>
+          <w:ilvl w:val="0"/>
+          <w:numId w:val="2"/>
+        </w:numPr>
+        <w:spacing w:after="80" w:line="276"/>
+      </w:pPr>
+      <w:r>
+        <w:rPr>
+          <w:rFonts w:ascii="Calibri" w:cs="Calibri" w:eastAsia="Calibri" w:hAnsi="Calibri"/>
+          <w:b/>
+          <w:bCs/>
+        </w:rPr>
+        <w:t xml:space="preserve">Tableau de programmation :</w:t>
+      </w:r>
+      <w:r>
+        <w:rPr>
+          <w:rFonts w:ascii="Calibri" w:cs="Calibri" w:eastAsia="Calibri" w:hAnsi="Calibri"/>
+        </w:rPr>
+        <w:t xml:space="preserve"> chaque bloc de la matinée est planifié et affiché. Aucune période n'est laissée vide.</w:t>
+      </w:r>
+    </w:p>
+    <w:p>
+      <w:pPr>
+        <w:pStyle w:val="Heading1"/>
+        <w:keepNext/>
+        <w:pBdr>
+          <w:bottom w:val="single" w:color="2F7A2A" w:sz="6" w:space="4"/>
+        </w:pBdr>
+        <w:spacing w:after="140" w:before="360"/>
+      </w:pPr>
+      <w:r>
+        <w:rPr>
+          <w:rFonts w:ascii="Calibri" w:cs="Calibri" w:eastAsia="Calibri" w:hAnsi="Calibri"/>
+        </w:rPr>
+        <w:t xml:space="preserve">4. Le menu du matin</w:t>
+      </w:r>
+    </w:p>
+    <w:p>
+      <w:pPr>
+        <w:pStyle w:val="Heading2"/>
+        <w:keepNext/>
+        <w:spacing w:after="80" w:before="200"/>
+      </w:pPr>
+      <w:r>
+        <w:rPr>
+          <w:rFonts w:ascii="Calibri" w:cs="Calibri" w:eastAsia="Calibri" w:hAnsi="Calibri"/>
+        </w:rPr>
+        <w:t xml:space="preserve">Périodes 1 et 2 : installer et consolider l'autonomie</w:t>
       </w:r>
     </w:p>
     <w:tbl>
@@ -1755,7 +2336,7 @@
           <w:sz w:val="18"/>
           <w:szCs w:val="18"/>
         </w:rPr>
-        <w:t xml:space="preserve">Les heures sont indicatives et seront ajustées à l'horaire réel du groupe.</w:t>
+        <w:t xml:space="preserve">Heures indicatives, à ajuster à l'horaire réel du groupe.</w:t>
       </w:r>
     </w:p>
     <w:p>
@@ -1768,7 +2349,7 @@
         <w:rPr>
           <w:rFonts w:ascii="Calibri" w:cs="Calibri" w:eastAsia="Calibri" w:hAnsi="Calibri"/>
         </w:rPr>
-        <w:t xml:space="preserve">Le menu du matin en période 3, quand l'autonomie est acquise</w:t>
+        <w:t xml:space="preserve">Période 3 : quand l'autonomie est acquise</w:t>
       </w:r>
     </w:p>
     <w:p>
@@ -1779,7 +2360,7 @@
         <w:rPr>
           <w:rFonts w:ascii="Calibri" w:cs="Calibri" w:eastAsia="Calibri" w:hAnsi="Calibri"/>
         </w:rPr>
-        <w:t xml:space="preserve">Quand les élèves fonctionnent seuls en atelier et que la gestion de classe le permet, les adultes ne sont plus nécessaires pour accompagner les ateliers. Ils peuvent alors enseigner de façon ciblée.</w:t>
+        <w:t xml:space="preserve">Quand les élèves fonctionnent seuls en atelier et que la gestion de classe le permet, les adultes n'ont plus besoin d'accompagner les ateliers. Ils enseignent alors de façon ciblée.</w:t>
       </w:r>
     </w:p>
     <w:tbl>
@@ -2292,142 +2873,751 @@
     </w:tbl>
     <w:p>
       <w:pPr>
-        <w:spacing w:after="120"/>
+        <w:pStyle w:val="Heading1"/>
+        <w:keepNext/>
+        <w:pBdr>
+          <w:bottom w:val="single" w:color="2F7A2A" w:sz="6" w:space="4"/>
+        </w:pBdr>
+        <w:spacing w:after="140" w:before="360"/>
+      </w:pPr>
+      <w:r>
+        <w:rPr>
+          <w:rFonts w:ascii="Calibri" w:cs="Calibri" w:eastAsia="Calibri" w:hAnsi="Calibri"/>
+        </w:rPr>
+        <w:t xml:space="preserve">5. Rôles et responsabilités</w:t>
+      </w:r>
+    </w:p>
+    <w:tbl>
+      <w:tblPr>
+        <w:tblW w:type="dxa" w:w="9360"/>
+        <w:tblBorders>
+          <w:top w:val="single" w:color="CFD4DC" w:sz="4"/>
+          <w:left w:val="single" w:color="CFD4DC" w:sz="4"/>
+          <w:bottom w:val="single" w:color="CFD4DC" w:sz="4"/>
+          <w:right w:val="single" w:color="CFD4DC" w:sz="4"/>
+          <w:insideH w:val="single" w:color="CFD4DC" w:sz="4"/>
+          <w:insideV w:val="single" w:color="CFD4DC" w:sz="4"/>
+        </w:tblBorders>
+        <w:tblLayout w:type="fixed"/>
+      </w:tblPr>
+      <w:tblGrid>
+        <w:gridCol w:w="2100"/>
+        <w:gridCol w:w="3630"/>
+        <w:gridCol w:w="3630"/>
+      </w:tblGrid>
+      <w:tr>
+        <w:trPr>
+          <w:tblHeader/>
+        </w:trPr>
+        <w:tc>
+          <w:tcPr>
+            <w:tcW w:type="dxa" w:w="2100"/>
+            <w:shd w:fill="1D3557" w:color="auto" w:val="clear"/>
+            <w:tcMar>
+              <w:top w:type="dxa" w:w="100"/>
+              <w:left w:type="dxa" w:w="140"/>
+              <w:bottom w:type="dxa" w:w="100"/>
+              <w:right w:type="dxa" w:w="140"/>
+            </w:tcMar>
+            <w:vAlign w:val="top"/>
+          </w:tcPr>
+          <w:p>
+            <w:pPr>
+              <w:spacing w:after="0"/>
+            </w:pPr>
+            <w:r>
+              <w:rPr>
+                <w:rFonts w:ascii="Calibri" w:cs="Calibri" w:eastAsia="Calibri" w:hAnsi="Calibri"/>
+                <w:b/>
+                <w:bCs/>
+                <w:color w:val="FFFFFF"/>
+                <w:sz w:val="20"/>
+                <w:szCs w:val="20"/>
+              </w:rPr>
+              <w:t xml:space="preserve">Personne</w:t>
+            </w:r>
+          </w:p>
+        </w:tc>
+        <w:tc>
+          <w:tcPr>
+            <w:tcW w:type="dxa" w:w="3630"/>
+            <w:shd w:fill="1D3557" w:color="auto" w:val="clear"/>
+            <w:tcMar>
+              <w:top w:type="dxa" w:w="100"/>
+              <w:left w:type="dxa" w:w="140"/>
+              <w:bottom w:type="dxa" w:w="100"/>
+              <w:right w:type="dxa" w:w="140"/>
+            </w:tcMar>
+            <w:vAlign w:val="top"/>
+          </w:tcPr>
+          <w:p>
+            <w:pPr>
+              <w:spacing w:after="0"/>
+            </w:pPr>
+            <w:r>
+              <w:rPr>
+                <w:rFonts w:ascii="Calibri" w:cs="Calibri" w:eastAsia="Calibri" w:hAnsi="Calibri"/>
+                <w:b/>
+                <w:bCs/>
+                <w:color w:val="FFFFFF"/>
+                <w:sz w:val="20"/>
+                <w:szCs w:val="20"/>
+              </w:rPr>
+              <w:t xml:space="preserve">Périodes 1 et 2</w:t>
+            </w:r>
+          </w:p>
+        </w:tc>
+        <w:tc>
+          <w:tcPr>
+            <w:tcW w:type="dxa" w:w="3630"/>
+            <w:shd w:fill="1D3557" w:color="auto" w:val="clear"/>
+            <w:tcMar>
+              <w:top w:type="dxa" w:w="100"/>
+              <w:left w:type="dxa" w:w="140"/>
+              <w:bottom w:type="dxa" w:w="100"/>
+              <w:right w:type="dxa" w:w="140"/>
+            </w:tcMar>
+            <w:vAlign w:val="top"/>
+          </w:tcPr>
+          <w:p>
+            <w:pPr>
+              <w:spacing w:after="0"/>
+            </w:pPr>
+            <w:r>
+              <w:rPr>
+                <w:rFonts w:ascii="Calibri" w:cs="Calibri" w:eastAsia="Calibri" w:hAnsi="Calibri"/>
+                <w:b/>
+                <w:bCs/>
+                <w:color w:val="FFFFFF"/>
+                <w:sz w:val="20"/>
+                <w:szCs w:val="20"/>
+              </w:rPr>
+              <w:t xml:space="preserve">Période 3</w:t>
+            </w:r>
+          </w:p>
+        </w:tc>
+      </w:tr>
+      <w:tr>
+        <w:trPr>
+          <w:cantSplit/>
+        </w:trPr>
+        <w:tc>
+          <w:tcPr>
+            <w:tcW w:type="dxa" w:w="2100"/>
+            <w:shd w:fill="EAF4E4" w:color="auto" w:val="clear"/>
+            <w:tcMar>
+              <w:top w:type="dxa" w:w="100"/>
+              <w:left w:type="dxa" w:w="140"/>
+              <w:bottom w:type="dxa" w:w="100"/>
+              <w:right w:type="dxa" w:w="140"/>
+            </w:tcMar>
+            <w:vAlign w:val="top"/>
+          </w:tcPr>
+          <w:p>
+            <w:pPr>
+              <w:spacing w:after="40" w:line="264"/>
+            </w:pPr>
+            <w:r>
+              <w:rPr>
+                <w:rFonts w:ascii="Calibri" w:cs="Calibri" w:eastAsia="Calibri" w:hAnsi="Calibri"/>
+                <w:b/>
+                <w:bCs/>
+              </w:rPr>
+              <w:t xml:space="preserve">Enseignante</w:t>
+            </w:r>
+          </w:p>
+          <w:p>
+            <w:pPr>
+              <w:spacing w:after="40" w:line="264"/>
+            </w:pPr>
+            <w:r>
+              <w:rPr>
+                <w:rFonts w:ascii="Calibri" w:cs="Calibri" w:eastAsia="Calibri" w:hAnsi="Calibri"/>
+              </w:rPr>
+              <w:t xml:space="preserve">Pilote pédagogique</w:t>
+            </w:r>
+          </w:p>
+        </w:tc>
+        <w:tc>
+          <w:tcPr>
+            <w:tcW w:type="dxa" w:w="3630"/>
+            <w:tcMar>
+              <w:top w:type="dxa" w:w="100"/>
+              <w:left w:type="dxa" w:w="140"/>
+              <w:bottom w:type="dxa" w:w="100"/>
+              <w:right w:type="dxa" w:w="140"/>
+            </w:tcMar>
+            <w:vAlign w:val="top"/>
+          </w:tcPr>
+          <w:p>
+            <w:pPr>
+              <w:spacing w:after="40" w:line="264"/>
+            </w:pPr>
+            <w:r>
+              <w:rPr>
+                <w:rFonts w:ascii="Calibri" w:cs="Calibri" w:eastAsia="Calibri" w:hAnsi="Calibri"/>
+              </w:rPr>
+              <w:t xml:space="preserve">Enseigne le Z101 à chaque sous-groupe. Planifie, évalue et valide le registre. Présente les outils d'autonomie.</w:t>
+            </w:r>
+          </w:p>
+        </w:tc>
+        <w:tc>
+          <w:tcPr>
+            <w:tcW w:type="dxa" w:w="3630"/>
+            <w:tcMar>
+              <w:top w:type="dxa" w:w="100"/>
+              <w:left w:type="dxa" w:w="140"/>
+              <w:bottom w:type="dxa" w:w="100"/>
+              <w:right w:type="dxa" w:w="140"/>
+            </w:tcMar>
+            <w:vAlign w:val="top"/>
+          </w:tcPr>
+          <w:p>
+            <w:pPr>
+              <w:spacing w:after="40" w:line="264"/>
+            </w:pPr>
+            <w:r>
+              <w:rPr>
+                <w:rFonts w:ascii="Calibri" w:cs="Calibri" w:eastAsia="Calibri" w:hAnsi="Calibri"/>
+              </w:rPr>
+              <w:t xml:space="preserve">Enseigne le Z101 et </w:t>
+            </w:r>
+            <w:r>
+              <w:rPr>
+                <w:rFonts w:ascii="Calibri" w:cs="Calibri" w:eastAsia="Calibri" w:hAnsi="Calibri"/>
+                <w:b/>
+                <w:bCs/>
+              </w:rPr>
+              <w:t xml:space="preserve">anime des ateliers en sous-groupes de besoins</w:t>
+            </w:r>
+            <w:r>
+              <w:rPr>
+                <w:rFonts w:ascii="Calibri" w:cs="Calibri" w:eastAsia="Calibri" w:hAnsi="Calibri"/>
+              </w:rPr>
+              <w:t xml:space="preserve"> pendant que les autres travaillent en autonomie.</w:t>
+            </w:r>
+          </w:p>
+        </w:tc>
+      </w:tr>
+      <w:tr>
+        <w:trPr>
+          <w:cantSplit/>
+        </w:trPr>
+        <w:tc>
+          <w:tcPr>
+            <w:tcW w:type="dxa" w:w="2100"/>
+            <w:shd w:fill="EAF4E4" w:color="auto" w:val="clear"/>
+            <w:tcMar>
+              <w:top w:type="dxa" w:w="100"/>
+              <w:left w:type="dxa" w:w="140"/>
+              <w:bottom w:type="dxa" w:w="100"/>
+              <w:right w:type="dxa" w:w="140"/>
+            </w:tcMar>
+            <w:vAlign w:val="top"/>
+          </w:tcPr>
+          <w:p>
+            <w:pPr>
+              <w:spacing w:after="40" w:line="264"/>
+            </w:pPr>
+            <w:r>
+              <w:rPr>
+                <w:rFonts w:ascii="Calibri" w:cs="Calibri" w:eastAsia="Calibri" w:hAnsi="Calibri"/>
+                <w:b/>
+                <w:bCs/>
+              </w:rPr>
+              <w:t xml:space="preserve">TES préventive</w:t>
+            </w:r>
+          </w:p>
+          <w:p>
+            <w:pPr>
+              <w:spacing w:after="40" w:line="264"/>
+            </w:pPr>
+            <w:r>
+              <w:rPr>
+                <w:rFonts w:ascii="Calibri" w:cs="Calibri" w:eastAsia="Calibri" w:hAnsi="Calibri"/>
+              </w:rPr>
+              <w:t xml:space="preserve">Transition vers l'autonomie</w:t>
+            </w:r>
+          </w:p>
+        </w:tc>
+        <w:tc>
+          <w:tcPr>
+            <w:tcW w:type="dxa" w:w="3630"/>
+            <w:tcMar>
+              <w:top w:type="dxa" w:w="100"/>
+              <w:left w:type="dxa" w:w="140"/>
+              <w:bottom w:type="dxa" w:w="100"/>
+              <w:right w:type="dxa" w:w="140"/>
+            </w:tcMar>
+            <w:vAlign w:val="top"/>
+          </w:tcPr>
+          <w:p>
+            <w:pPr>
+              <w:spacing w:after="40" w:line="264"/>
+            </w:pPr>
+            <w:r>
+              <w:rPr>
+                <w:rFonts w:ascii="Calibri" w:cs="Calibri" w:eastAsia="Calibri" w:hAnsi="Calibri"/>
+              </w:rPr>
+              <w:t xml:space="preserve">Accompagne le sous-groupe en atelier : modélise le rôle de leader, aide à régler les blocages, soutient l'autorégulation, encadre les transitions. Co-anime le retour réflexif.</w:t>
+            </w:r>
+          </w:p>
+        </w:tc>
+        <w:tc>
+          <w:tcPr>
+            <w:tcW w:type="dxa" w:w="3630"/>
+            <w:tcMar>
+              <w:top w:type="dxa" w:w="100"/>
+              <w:left w:type="dxa" w:w="140"/>
+              <w:bottom w:type="dxa" w:w="100"/>
+              <w:right w:type="dxa" w:w="140"/>
+            </w:tcMar>
+            <w:vAlign w:val="top"/>
+          </w:tcPr>
+          <w:p>
+            <w:pPr>
+              <w:spacing w:after="40" w:line="264"/>
+            </w:pPr>
+            <w:r>
+              <w:rPr>
+                <w:rFonts w:ascii="Calibri" w:cs="Calibri" w:eastAsia="Calibri" w:hAnsi="Calibri"/>
+                <w:b/>
+                <w:bCs/>
+              </w:rPr>
+              <w:t xml:space="preserve">Anime des ateliers ciblés en petits groupes</w:t>
+            </w:r>
+            <w:r>
+              <w:rPr>
+                <w:rFonts w:ascii="Calibri" w:cs="Calibri" w:eastAsia="Calibri" w:hAnsi="Calibri"/>
+              </w:rPr>
+              <w:t xml:space="preserve"> : habiletés de vie, gestion des émotions, préparation à l'emploi. Elle a déjà donné son accord.</w:t>
+            </w:r>
+          </w:p>
+        </w:tc>
+      </w:tr>
+      <w:tr>
+        <w:trPr>
+          <w:cantSplit/>
+        </w:trPr>
+        <w:tc>
+          <w:tcPr>
+            <w:tcW w:type="dxa" w:w="2100"/>
+            <w:shd w:fill="EAF4E4" w:color="auto" w:val="clear"/>
+            <w:tcMar>
+              <w:top w:type="dxa" w:w="100"/>
+              <w:left w:type="dxa" w:w="140"/>
+              <w:bottom w:type="dxa" w:w="100"/>
+              <w:right w:type="dxa" w:w="140"/>
+            </w:tcMar>
+            <w:vAlign w:val="top"/>
+          </w:tcPr>
+          <w:p>
+            <w:pPr>
+              <w:spacing w:after="40" w:line="264"/>
+            </w:pPr>
+            <w:r>
+              <w:rPr>
+                <w:rFonts w:ascii="Calibri" w:cs="Calibri" w:eastAsia="Calibri" w:hAnsi="Calibri"/>
+                <w:b/>
+                <w:bCs/>
+              </w:rPr>
+              <w:t xml:space="preserve">Orthopédagogue</w:t>
+            </w:r>
+          </w:p>
+        </w:tc>
+        <w:tc>
+          <w:tcPr>
+            <w:tcW w:type="dxa" w:w="3630"/>
+            <w:tcMar>
+              <w:top w:type="dxa" w:w="100"/>
+              <w:left w:type="dxa" w:w="140"/>
+              <w:bottom w:type="dxa" w:w="100"/>
+              <w:right w:type="dxa" w:w="140"/>
+            </w:tcMar>
+            <w:vAlign w:val="top"/>
+          </w:tcPr>
+          <w:p>
+            <w:pPr>
+              <w:spacing w:after="40" w:line="264"/>
+            </w:pPr>
+            <w:r>
+              <w:rPr>
+                <w:rFonts w:ascii="Calibri" w:cs="Calibri" w:eastAsia="Calibri" w:hAnsi="Calibri"/>
+              </w:rPr>
+              <w:t xml:space="preserve">Conçoit les boîtes TEACCH. Adapte les fiches et le matériel aux besoins des élèves.</w:t>
+            </w:r>
+          </w:p>
+        </w:tc>
+        <w:tc>
+          <w:tcPr>
+            <w:tcW w:type="dxa" w:w="3630"/>
+            <w:tcMar>
+              <w:top w:type="dxa" w:w="100"/>
+              <w:left w:type="dxa" w:w="140"/>
+              <w:bottom w:type="dxa" w:w="100"/>
+              <w:right w:type="dxa" w:w="140"/>
+            </w:tcMar>
+            <w:vAlign w:val="top"/>
+          </w:tcPr>
+          <w:p>
+            <w:pPr>
+              <w:spacing w:after="40" w:line="264"/>
+            </w:pPr>
+            <w:r>
+              <w:rPr>
+                <w:rFonts w:ascii="Calibri" w:cs="Calibri" w:eastAsia="Calibri" w:hAnsi="Calibri"/>
+              </w:rPr>
+              <w:t xml:space="preserve">Ajuste le matériel selon les besoins observés.</w:t>
+            </w:r>
+          </w:p>
+        </w:tc>
+      </w:tr>
+      <w:tr>
+        <w:trPr>
+          <w:cantSplit/>
+        </w:trPr>
+        <w:tc>
+          <w:tcPr>
+            <w:tcW w:type="dxa" w:w="2100"/>
+            <w:shd w:fill="EAF4E4" w:color="auto" w:val="clear"/>
+            <w:tcMar>
+              <w:top w:type="dxa" w:w="100"/>
+              <w:left w:type="dxa" w:w="140"/>
+              <w:bottom w:type="dxa" w:w="100"/>
+              <w:right w:type="dxa" w:w="140"/>
+            </w:tcMar>
+            <w:vAlign w:val="top"/>
+          </w:tcPr>
+          <w:p>
+            <w:pPr>
+              <w:spacing w:after="40" w:line="264"/>
+            </w:pPr>
+            <w:r>
+              <w:rPr>
+                <w:rFonts w:ascii="Calibri" w:cs="Calibri" w:eastAsia="Calibri" w:hAnsi="Calibri"/>
+                <w:b/>
+                <w:bCs/>
+              </w:rPr>
+              <w:t xml:space="preserve">Conseillère pédagogique</w:t>
+            </w:r>
+          </w:p>
+        </w:tc>
+        <w:tc>
+          <w:tcPr>
+            <w:tcW w:type="dxa" w:w="3630"/>
+            <w:tcMar>
+              <w:top w:type="dxa" w:w="100"/>
+              <w:left w:type="dxa" w:w="140"/>
+              <w:bottom w:type="dxa" w:w="100"/>
+              <w:right w:type="dxa" w:w="140"/>
+            </w:tcMar>
+            <w:vAlign w:val="top"/>
+          </w:tcPr>
+          <w:p>
+            <w:pPr>
+              <w:spacing w:after="40" w:line="264"/>
+            </w:pPr>
+            <w:r>
+              <w:rPr>
+                <w:rFonts w:ascii="Calibri" w:cs="Calibri" w:eastAsia="Calibri" w:hAnsi="Calibri"/>
+              </w:rPr>
+              <w:t xml:space="preserve">Accompagne l'équipe dans l'implantation. Assure la conformité au programme. Prépare les outils de suivi.</w:t>
+            </w:r>
+          </w:p>
+        </w:tc>
+        <w:tc>
+          <w:tcPr>
+            <w:tcW w:type="dxa" w:w="3630"/>
+            <w:tcMar>
+              <w:top w:type="dxa" w:w="100"/>
+              <w:left w:type="dxa" w:w="140"/>
+              <w:bottom w:type="dxa" w:w="100"/>
+              <w:right w:type="dxa" w:w="140"/>
+            </w:tcMar>
+            <w:vAlign w:val="top"/>
+          </w:tcPr>
+          <w:p>
+            <w:pPr>
+              <w:spacing w:after="40" w:line="264"/>
+            </w:pPr>
+            <w:r>
+              <w:rPr>
+                <w:rFonts w:ascii="Calibri" w:cs="Calibri" w:eastAsia="Calibri" w:hAnsi="Calibri"/>
+              </w:rPr>
+              <w:t xml:space="preserve">Analyse les indicateurs, rédige le bilan et la recommandation.</w:t>
+            </w:r>
+          </w:p>
+        </w:tc>
+      </w:tr>
+      <w:tr>
+        <w:trPr>
+          <w:cantSplit/>
+        </w:trPr>
+        <w:tc>
+          <w:tcPr>
+            <w:tcW w:type="dxa" w:w="2100"/>
+            <w:shd w:fill="EAF4E4" w:color="auto" w:val="clear"/>
+            <w:tcMar>
+              <w:top w:type="dxa" w:w="100"/>
+              <w:left w:type="dxa" w:w="140"/>
+              <w:bottom w:type="dxa" w:w="100"/>
+              <w:right w:type="dxa" w:w="140"/>
+            </w:tcMar>
+            <w:vAlign w:val="top"/>
+          </w:tcPr>
+          <w:p>
+            <w:pPr>
+              <w:spacing w:after="40" w:line="264"/>
+            </w:pPr>
+            <w:r>
+              <w:rPr>
+                <w:rFonts w:ascii="Calibri" w:cs="Calibri" w:eastAsia="Calibri" w:hAnsi="Calibri"/>
+                <w:b/>
+                <w:bCs/>
+              </w:rPr>
+              <w:t xml:space="preserve">Élèves leaders</w:t>
+            </w:r>
+          </w:p>
+        </w:tc>
+        <w:tc>
+          <w:tcPr>
+            <w:tcW w:type="dxa" w:w="3630"/>
+            <w:tcMar>
+              <w:top w:type="dxa" w:w="100"/>
+              <w:left w:type="dxa" w:w="140"/>
+              <w:bottom w:type="dxa" w:w="100"/>
+              <w:right w:type="dxa" w:w="140"/>
+            </w:tcMar>
+            <w:vAlign w:val="top"/>
+          </w:tcPr>
+          <w:p>
+            <w:pPr>
+              <w:spacing w:after="40" w:line="264"/>
+            </w:pPr>
+            <w:r>
+              <w:rPr>
+                <w:rFonts w:ascii="Calibri" w:cs="Calibri" w:eastAsia="Calibri" w:hAnsi="Calibri"/>
+              </w:rPr>
+              <w:t xml:space="preserve">Lisent la fiche, distribuent les rôles, gèrent le temps, font ranger.</w:t>
+            </w:r>
+          </w:p>
+        </w:tc>
+        <w:tc>
+          <w:tcPr>
+            <w:tcW w:type="dxa" w:w="3630"/>
+            <w:tcMar>
+              <w:top w:type="dxa" w:w="100"/>
+              <w:left w:type="dxa" w:w="140"/>
+              <w:bottom w:type="dxa" w:w="100"/>
+              <w:right w:type="dxa" w:w="140"/>
+            </w:tcMar>
+            <w:vAlign w:val="top"/>
+          </w:tcPr>
+          <w:p>
+            <w:pPr>
+              <w:spacing w:after="40" w:line="264"/>
+            </w:pPr>
+            <w:r>
+              <w:rPr>
+                <w:rFonts w:ascii="Calibri" w:cs="Calibri" w:eastAsia="Calibri" w:hAnsi="Calibri"/>
+              </w:rPr>
+              <w:t xml:space="preserve">Animent aussi une partie de l'accueil et du retour.</w:t>
+            </w:r>
+          </w:p>
+        </w:tc>
+      </w:tr>
+      <w:tr>
+        <w:trPr>
+          <w:cantSplit/>
+        </w:trPr>
+        <w:tc>
+          <w:tcPr>
+            <w:tcW w:type="dxa" w:w="2100"/>
+            <w:shd w:fill="EAF4E4" w:color="auto" w:val="clear"/>
+            <w:tcMar>
+              <w:top w:type="dxa" w:w="100"/>
+              <w:left w:type="dxa" w:w="140"/>
+              <w:bottom w:type="dxa" w:w="100"/>
+              <w:right w:type="dxa" w:w="140"/>
+            </w:tcMar>
+            <w:vAlign w:val="top"/>
+          </w:tcPr>
+          <w:p>
+            <w:pPr>
+              <w:spacing w:after="40" w:line="264"/>
+            </w:pPr>
+            <w:r>
+              <w:rPr>
+                <w:rFonts w:ascii="Calibri" w:cs="Calibri" w:eastAsia="Calibri" w:hAnsi="Calibri"/>
+                <w:b/>
+                <w:bCs/>
+              </w:rPr>
+              <w:t xml:space="preserve">Direction</w:t>
+            </w:r>
+          </w:p>
+        </w:tc>
+        <w:tc>
+          <w:tcPr>
+            <w:tcW w:type="dxa" w:w="3630"/>
+            <w:tcMar>
+              <w:top w:type="dxa" w:w="100"/>
+              <w:left w:type="dxa" w:w="140"/>
+              <w:bottom w:type="dxa" w:w="100"/>
+              <w:right w:type="dxa" w:w="140"/>
+            </w:tcMar>
+            <w:vAlign w:val="top"/>
+          </w:tcPr>
+          <w:p>
+            <w:pPr>
+              <w:spacing w:after="40" w:line="264"/>
+            </w:pPr>
+            <w:r>
+              <w:rPr>
+                <w:rFonts w:ascii="Calibri" w:cs="Calibri" w:eastAsia="Calibri" w:hAnsi="Calibri"/>
+              </w:rPr>
+              <w:t xml:space="preserve">Autorise le projet, confirme les locaux et l'horaire de la TES.</w:t>
+            </w:r>
+          </w:p>
+        </w:tc>
+        <w:tc>
+          <w:tcPr>
+            <w:tcW w:type="dxa" w:w="3630"/>
+            <w:tcMar>
+              <w:top w:type="dxa" w:w="100"/>
+              <w:left w:type="dxa" w:w="140"/>
+              <w:bottom w:type="dxa" w:w="100"/>
+              <w:right w:type="dxa" w:w="140"/>
+            </w:tcMar>
+            <w:vAlign w:val="top"/>
+          </w:tcPr>
+          <w:p>
+            <w:pPr>
+              <w:spacing w:after="40" w:line="264"/>
+            </w:pPr>
+            <w:r>
+              <w:rPr>
+                <w:rFonts w:ascii="Calibri" w:cs="Calibri" w:eastAsia="Calibri" w:hAnsi="Calibri"/>
+              </w:rPr>
+              <w:t xml:space="preserve">Reçoit le bilan et décide de la suite.</w:t>
+            </w:r>
+          </w:p>
+        </w:tc>
+      </w:tr>
+    </w:tbl>
+    <w:p>
+      <w:pPr>
+        <w:spacing w:after="160"/>
       </w:pPr>
     </w:p>
-    <w:p>
-      <w:pPr>
-        <w:pStyle w:val="Heading2"/>
-        <w:keepNext/>
-        <w:spacing w:after="80" w:before="200"/>
-      </w:pPr>
-      <w:r>
-        <w:rPr>
-          <w:rFonts w:ascii="Calibri" w:cs="Calibri" w:eastAsia="Calibri" w:hAnsi="Calibri"/>
-        </w:rPr>
-        <w:t xml:space="preserve">Les outils qui rendent les élèves autonomes</w:t>
-      </w:r>
-    </w:p>
-    <w:p>
-      <w:pPr>
-        <w:pStyle w:val="ListParagraph"/>
-        <w:numPr>
-          <w:ilvl w:val="0"/>
-          <w:numId w:val="2"/>
-        </w:numPr>
-        <w:spacing w:after="80" w:line="276"/>
-      </w:pPr>
-      <w:r>
-        <w:rPr>
-          <w:rFonts w:ascii="Calibri" w:cs="Calibri" w:eastAsia="Calibri" w:hAnsi="Calibri"/>
-          <w:b/>
-          <w:bCs/>
-        </w:rPr>
-        <w:t xml:space="preserve">Fiches de tâches autonomes :</w:t>
-      </w:r>
-      <w:r>
-        <w:rPr>
-          <w:rFonts w:ascii="Calibri" w:cs="Calibri" w:eastAsia="Calibri" w:hAnsi="Calibri"/>
-        </w:rPr>
-        <w:t xml:space="preserve"> une tâche par fiche, de 1 à 5 étapes illustrées et des critères de réussite pour s'auto-évaluer.</w:t>
-      </w:r>
-    </w:p>
-    <w:p>
-      <w:pPr>
-        <w:pStyle w:val="ListParagraph"/>
-        <w:numPr>
-          <w:ilvl w:val="0"/>
-          <w:numId w:val="2"/>
-        </w:numPr>
-        <w:spacing w:after="80" w:line="276"/>
-      </w:pPr>
-      <w:r>
-        <w:rPr>
-          <w:rFonts w:ascii="Calibri" w:cs="Calibri" w:eastAsia="Calibri" w:hAnsi="Calibri"/>
-          <w:b/>
-          <w:bCs/>
-        </w:rPr>
-        <w:t xml:space="preserve">Leader tournant :</w:t>
-      </w:r>
-      <w:r>
-        <w:rPr>
-          <w:rFonts w:ascii="Calibri" w:cs="Calibri" w:eastAsia="Calibri" w:hAnsi="Calibri"/>
-        </w:rPr>
-        <w:t xml:space="preserve"> à chaque atelier, un élève lit la fiche, distribue les rôles et gère le temps. Le rôle tourne pour que chacun l'exerce.</w:t>
-      </w:r>
-    </w:p>
-    <w:p>
-      <w:pPr>
-        <w:pStyle w:val="ListParagraph"/>
-        <w:numPr>
-          <w:ilvl w:val="0"/>
-          <w:numId w:val="2"/>
-        </w:numPr>
-        <w:spacing w:after="80" w:line="276"/>
-      </w:pPr>
-      <w:r>
-        <w:rPr>
-          <w:rFonts w:ascii="Calibri" w:cs="Calibri" w:eastAsia="Calibri" w:hAnsi="Calibri"/>
-          <w:b/>
-          <w:bCs/>
-        </w:rPr>
-        <w:t xml:space="preserve">Registre d'autonomie :</w:t>
-      </w:r>
-      <w:r>
-        <w:rPr>
-          <w:rFonts w:ascii="Calibri" w:cs="Calibri" w:eastAsia="Calibri" w:hAnsi="Calibri"/>
-        </w:rPr>
-        <w:t xml:space="preserve"> chaque élève y inscrit sa tâche en début de matinée, et le leader valide les étapes.</w:t>
-      </w:r>
-    </w:p>
-    <w:p>
-      <w:pPr>
-        <w:pStyle w:val="ListParagraph"/>
-        <w:numPr>
-          <w:ilvl w:val="0"/>
-          <w:numId w:val="2"/>
-        </w:numPr>
-        <w:spacing w:after="80" w:line="276"/>
-      </w:pPr>
-      <w:r>
-        <w:rPr>
-          <w:rFonts w:ascii="Calibri" w:cs="Calibri" w:eastAsia="Calibri" w:hAnsi="Calibri"/>
-          <w:b/>
-          <w:bCs/>
-        </w:rPr>
-        <w:t xml:space="preserve">Règle « 3 avant l'enseignante » :</w:t>
-      </w:r>
-      <w:r>
-        <w:rPr>
-          <w:rFonts w:ascii="Calibri" w:cs="Calibri" w:eastAsia="Calibri" w:hAnsi="Calibri"/>
-        </w:rPr>
-        <w:t xml:space="preserve"> relire la fiche, demander à un coéquipier, essayer une autre solution.</w:t>
-      </w:r>
-    </w:p>
-    <w:p>
-      <w:pPr>
-        <w:pStyle w:val="ListParagraph"/>
-        <w:numPr>
-          <w:ilvl w:val="0"/>
-          <w:numId w:val="2"/>
-        </w:numPr>
-        <w:spacing w:after="80" w:line="276"/>
-      </w:pPr>
-      <w:r>
-        <w:rPr>
-          <w:rFonts w:ascii="Calibri" w:cs="Calibri" w:eastAsia="Calibri" w:hAnsi="Calibri"/>
-          <w:b/>
-          <w:bCs/>
-        </w:rPr>
-        <w:t xml:space="preserve">Chariots TEACCH :</w:t>
-      </w:r>
-      <w:r>
-        <w:rPr>
-          <w:rFonts w:ascii="Calibri" w:cs="Calibri" w:eastAsia="Calibri" w:hAnsi="Calibri"/>
-        </w:rPr>
-        <w:t xml:space="preserve"> des postes de travail visuels et structurés, partagés avec l'alpha-pré et la DAP.</w:t>
-      </w:r>
-    </w:p>
+    <w:tbl>
+      <w:tblPr>
+        <w:tblW w:type="dxa" w:w="9360"/>
+        <w:tblBorders>
+          <w:top w:val="single" w:color="auto" w:sz="4"/>
+          <w:left w:val="single" w:color="auto" w:sz="4"/>
+          <w:bottom w:val="single" w:color="auto" w:sz="4"/>
+          <w:right w:val="single" w:color="auto" w:sz="4"/>
+          <w:insideH w:val="single" w:color="auto" w:sz="4"/>
+          <w:insideV w:val="single" w:color="auto" w:sz="4"/>
+        </w:tblBorders>
+        <w:tblLayout w:type="fixed"/>
+      </w:tblPr>
+      <w:tblGrid>
+        <w:gridCol w:w="9360"/>
+      </w:tblGrid>
+      <w:tr>
+        <w:trPr>
+          <w:cantSplit/>
+        </w:trPr>
+        <w:tc>
+          <w:tcPr>
+            <w:tcW w:type="dxa" w:w="9360"/>
+            <w:tcBorders>
+              <w:top w:val="none" w:color="FFFFFF" w:sz="0"/>
+              <w:left w:val="single" w:color="2F7A2A" w:sz="36"/>
+              <w:bottom w:val="none" w:color="FFFFFF" w:sz="0"/>
+              <w:right w:val="none" w:color="FFFFFF" w:sz="0"/>
+            </w:tcBorders>
+            <w:shd w:fill="EAF4E4" w:color="auto" w:val="clear"/>
+            <w:tcMar>
+              <w:top w:type="dxa" w:w="160"/>
+              <w:left w:type="dxa" w:w="260"/>
+              <w:bottom w:type="dxa" w:w="120"/>
+              <w:right w:type="dxa" w:w="260"/>
+            </w:tcMar>
+          </w:tcPr>
+          <w:p>
+            <w:pPr>
+              <w:spacing w:after="80"/>
+            </w:pPr>
+            <w:r>
+              <w:rPr>
+                <w:rFonts w:ascii="Calibri" w:cs="Calibri" w:eastAsia="Calibri" w:hAnsi="Calibri"/>
+                <w:b/>
+                <w:bCs/>
+                <w:color w:val="2F7A2A"/>
+                <w:sz w:val="24"/>
+                <w:szCs w:val="24"/>
+              </w:rPr>
+              <w:t xml:space="preserve">La TES n'est pas une surveillante</w:t>
+            </w:r>
+          </w:p>
+          <w:p>
+            <w:pPr>
+              <w:spacing w:after="60"/>
+            </w:pPr>
+            <w:r>
+              <w:rPr>
+                <w:rFonts w:ascii="Calibri" w:cs="Calibri" w:eastAsia="Calibri" w:hAnsi="Calibri"/>
+              </w:rPr>
+              <w:t xml:space="preserve">Son rôle évolue avec les élèves. Elle </w:t>
+            </w:r>
+            <w:r>
+              <w:rPr>
+                <w:rFonts w:ascii="Calibri" w:cs="Calibri" w:eastAsia="Calibri" w:hAnsi="Calibri"/>
+                <w:b/>
+                <w:bCs/>
+              </w:rPr>
+              <w:t xml:space="preserve">installe</w:t>
+            </w:r>
+            <w:r>
+              <w:rPr>
+                <w:rFonts w:ascii="Calibri" w:cs="Calibri" w:eastAsia="Calibri" w:hAnsi="Calibri"/>
+              </w:rPr>
+              <w:t xml:space="preserve"> les routines, puis elle </w:t>
+            </w:r>
+            <w:r>
+              <w:rPr>
+                <w:rFonts w:ascii="Calibri" w:cs="Calibri" w:eastAsia="Calibri" w:hAnsi="Calibri"/>
+                <w:b/>
+                <w:bCs/>
+              </w:rPr>
+              <w:t xml:space="preserve">coache</w:t>
+            </w:r>
+            <w:r>
+              <w:rPr>
+                <w:rFonts w:ascii="Calibri" w:cs="Calibri" w:eastAsia="Calibri" w:hAnsi="Calibri"/>
+              </w:rPr>
+              <w:t xml:space="preserve"> en retrait. Quand l'autonomie le permet, elle </w:t>
+            </w:r>
+            <w:r>
+              <w:rPr>
+                <w:rFonts w:ascii="Calibri" w:cs="Calibri" w:eastAsia="Calibri" w:hAnsi="Calibri"/>
+                <w:b/>
+                <w:bCs/>
+              </w:rPr>
+              <w:t xml:space="preserve">anime ses propres ateliers ciblés</w:t>
+            </w:r>
+            <w:r>
+              <w:rPr>
+                <w:rFonts w:ascii="Calibri" w:cs="Calibri" w:eastAsia="Calibri" w:hAnsi="Calibri"/>
+              </w:rPr>
+              <w:t xml:space="preserve"> en petits groupes. Le fait qu'elle intervienne de moins en moins pendant les ateliers montre que l'autonomie progresse.</w:t>
+            </w:r>
+          </w:p>
+        </w:tc>
+      </w:tr>
+    </w:tbl>
     <w:p>
       <w:pPr>
         <w:pStyle w:val="Heading1"/>
@@ -2441,7 +3631,20 @@
         <w:rPr>
           <w:rFonts w:ascii="Calibri" w:cs="Calibri" w:eastAsia="Calibri" w:hAnsi="Calibri"/>
         </w:rPr>
-        <w:t xml:space="preserve">3. Trois périodes pour construire l'autonomie</w:t>
+        <w:t xml:space="preserve">6. Échéancier</w:t>
+      </w:r>
+    </w:p>
+    <w:p>
+      <w:pPr>
+        <w:pStyle w:val="Heading2"/>
+        <w:keepNext/>
+        <w:spacing w:after="80" w:before="200"/>
+      </w:pPr>
+      <w:r>
+        <w:rPr>
+          <w:rFonts w:ascii="Calibri" w:cs="Calibri" w:eastAsia="Calibri" w:hAnsi="Calibri"/>
+        </w:rPr>
+        <w:t xml:space="preserve">Les trois périodes</w:t>
       </w:r>
     </w:p>
     <w:p>
@@ -2452,7 +3655,7 @@
         <w:rPr>
           <w:rFonts w:ascii="Calibri" w:cs="Calibri" w:eastAsia="Calibri" w:hAnsi="Calibri"/>
         </w:rPr>
-        <w:t xml:space="preserve">L'autonomie se construit graduellement. Le rôle de chaque adulte change d'une période à l'autre. On passe à la période suivante quand on observe les signes de réussite, pas à une date fixe.</w:t>
+        <w:t xml:space="preserve">On passe d'une période à l'autre quand on observe les signes de réussite, et non à une date fixe.</w:t>
       </w:r>
     </w:p>
     <w:tbl>
@@ -3156,124 +4359,579 @@
     </w:tbl>
     <w:p>
       <w:pPr>
-        <w:spacing w:after="200"/>
+        <w:pStyle w:val="Heading2"/>
+        <w:keepNext/>
+        <w:spacing w:after="80" w:before="200"/>
       </w:pPr>
+      <w:r>
+        <w:rPr>
+          <w:rFonts w:ascii="Calibri" w:cs="Calibri" w:eastAsia="Calibri" w:hAnsi="Calibri"/>
+        </w:rPr>
+        <w:t xml:space="preserve">Démarrage du projet</w:t>
+      </w:r>
     </w:p>
     <w:tbl>
       <w:tblPr>
         <w:tblW w:type="dxa" w:w="9360"/>
         <w:tblBorders>
-          <w:top w:val="single" w:color="auto" w:sz="4"/>
-          <w:left w:val="single" w:color="auto" w:sz="4"/>
-          <w:bottom w:val="single" w:color="auto" w:sz="4"/>
-          <w:right w:val="single" w:color="auto" w:sz="4"/>
-          <w:insideH w:val="single" w:color="auto" w:sz="4"/>
-          <w:insideV w:val="single" w:color="auto" w:sz="4"/>
+          <w:top w:val="single" w:color="CFD4DC" w:sz="4"/>
+          <w:left w:val="single" w:color="CFD4DC" w:sz="4"/>
+          <w:bottom w:val="single" w:color="CFD4DC" w:sz="4"/>
+          <w:right w:val="single" w:color="CFD4DC" w:sz="4"/>
+          <w:insideH w:val="single" w:color="CFD4DC" w:sz="4"/>
+          <w:insideV w:val="single" w:color="CFD4DC" w:sz="4"/>
         </w:tblBorders>
         <w:tblLayout w:type="fixed"/>
       </w:tblPr>
       <w:tblGrid>
-        <w:gridCol w:w="9360"/>
+        <w:gridCol w:w="2000"/>
+        <w:gridCol w:w="4960"/>
+        <w:gridCol w:w="2400"/>
       </w:tblGrid>
+      <w:tr>
+        <w:trPr>
+          <w:tblHeader/>
+        </w:trPr>
+        <w:tc>
+          <w:tcPr>
+            <w:tcW w:type="dxa" w:w="2000"/>
+            <w:shd w:fill="1D3557" w:color="auto" w:val="clear"/>
+            <w:tcMar>
+              <w:top w:type="dxa" w:w="100"/>
+              <w:left w:type="dxa" w:w="140"/>
+              <w:bottom w:type="dxa" w:w="100"/>
+              <w:right w:type="dxa" w:w="140"/>
+            </w:tcMar>
+            <w:vAlign w:val="top"/>
+          </w:tcPr>
+          <w:p>
+            <w:pPr>
+              <w:spacing w:after="0"/>
+            </w:pPr>
+            <w:r>
+              <w:rPr>
+                <w:rFonts w:ascii="Calibri" w:cs="Calibri" w:eastAsia="Calibri" w:hAnsi="Calibri"/>
+                <w:b/>
+                <w:bCs/>
+                <w:color w:val="FFFFFF"/>
+                <w:sz w:val="20"/>
+                <w:szCs w:val="20"/>
+              </w:rPr>
+              <w:t xml:space="preserve">Quand</w:t>
+            </w:r>
+          </w:p>
+        </w:tc>
+        <w:tc>
+          <w:tcPr>
+            <w:tcW w:type="dxa" w:w="4960"/>
+            <w:shd w:fill="1D3557" w:color="auto" w:val="clear"/>
+            <w:tcMar>
+              <w:top w:type="dxa" w:w="100"/>
+              <w:left w:type="dxa" w:w="140"/>
+              <w:bottom w:type="dxa" w:w="100"/>
+              <w:right w:type="dxa" w:w="140"/>
+            </w:tcMar>
+            <w:vAlign w:val="top"/>
+          </w:tcPr>
+          <w:p>
+            <w:pPr>
+              <w:spacing w:after="0"/>
+            </w:pPr>
+            <w:r>
+              <w:rPr>
+                <w:rFonts w:ascii="Calibri" w:cs="Calibri" w:eastAsia="Calibri" w:hAnsi="Calibri"/>
+                <w:b/>
+                <w:bCs/>
+                <w:color w:val="FFFFFF"/>
+                <w:sz w:val="20"/>
+                <w:szCs w:val="20"/>
+              </w:rPr>
+              <w:t xml:space="preserve">Étape</w:t>
+            </w:r>
+          </w:p>
+        </w:tc>
+        <w:tc>
+          <w:tcPr>
+            <w:tcW w:type="dxa" w:w="2400"/>
+            <w:shd w:fill="1D3557" w:color="auto" w:val="clear"/>
+            <w:tcMar>
+              <w:top w:type="dxa" w:w="100"/>
+              <w:left w:type="dxa" w:w="140"/>
+              <w:bottom w:type="dxa" w:w="100"/>
+              <w:right w:type="dxa" w:w="140"/>
+            </w:tcMar>
+            <w:vAlign w:val="top"/>
+          </w:tcPr>
+          <w:p>
+            <w:pPr>
+              <w:spacing w:after="0"/>
+            </w:pPr>
+            <w:r>
+              <w:rPr>
+                <w:rFonts w:ascii="Calibri" w:cs="Calibri" w:eastAsia="Calibri" w:hAnsi="Calibri"/>
+                <w:b/>
+                <w:bCs/>
+                <w:color w:val="FFFFFF"/>
+                <w:sz w:val="20"/>
+                <w:szCs w:val="20"/>
+              </w:rPr>
+              <w:t xml:space="preserve">Responsable</w:t>
+            </w:r>
+          </w:p>
+        </w:tc>
+      </w:tr>
       <w:tr>
         <w:trPr>
           <w:cantSplit/>
         </w:trPr>
         <w:tc>
           <w:tcPr>
-            <w:tcW w:type="dxa" w:w="9360"/>
-            <w:tcBorders>
-              <w:top w:val="none" w:color="FFFFFF" w:sz="0"/>
-              <w:left w:val="single" w:color="2F7A2A" w:sz="36"/>
-              <w:bottom w:val="none" w:color="FFFFFF" w:sz="0"/>
-              <w:right w:val="none" w:color="FFFFFF" w:sz="0"/>
-            </w:tcBorders>
-            <w:shd w:fill="EAF4E4" w:color="auto" w:val="clear"/>
-            <w:tcMar>
-              <w:top w:type="dxa" w:w="160"/>
-              <w:left w:type="dxa" w:w="260"/>
-              <w:bottom w:type="dxa" w:w="120"/>
-              <w:right w:type="dxa" w:w="260"/>
-            </w:tcMar>
-          </w:tcPr>
-          <w:p>
-            <w:pPr>
-              <w:spacing w:after="80"/>
-            </w:pPr>
-            <w:r>
-              <w:rPr>
-                <w:rFonts w:ascii="Calibri" w:cs="Calibri" w:eastAsia="Calibri" w:hAnsi="Calibri"/>
-                <w:b/>
-                <w:bCs/>
-                <w:color w:val="2F7A2A"/>
-                <w:sz w:val="24"/>
-                <w:szCs w:val="24"/>
-              </w:rPr>
-              <w:t xml:space="preserve">La TES n'est pas une surveillante</w:t>
-            </w:r>
-          </w:p>
-          <w:p>
-            <w:pPr>
-              <w:spacing w:after="120" w:line="288"/>
-            </w:pPr>
-            <w:r>
-              <w:rPr>
-                <w:rFonts w:ascii="Calibri" w:cs="Calibri" w:eastAsia="Calibri" w:hAnsi="Calibri"/>
-              </w:rPr>
-              <w:t xml:space="preserve">Son rôle évolue avec les élèves. Elle </w:t>
-            </w:r>
-            <w:r>
-              <w:rPr>
-                <w:rFonts w:ascii="Calibri" w:cs="Calibri" w:eastAsia="Calibri" w:hAnsi="Calibri"/>
-                <w:b/>
-                <w:bCs/>
-              </w:rPr>
-              <w:t xml:space="preserve">installe</w:t>
-            </w:r>
-            <w:r>
-              <w:rPr>
-                <w:rFonts w:ascii="Calibri" w:cs="Calibri" w:eastAsia="Calibri" w:hAnsi="Calibri"/>
-              </w:rPr>
-              <w:t xml:space="preserve"> les routines, puis elle </w:t>
-            </w:r>
-            <w:r>
-              <w:rPr>
-                <w:rFonts w:ascii="Calibri" w:cs="Calibri" w:eastAsia="Calibri" w:hAnsi="Calibri"/>
-                <w:b/>
-                <w:bCs/>
-              </w:rPr>
-              <w:t xml:space="preserve">coache</w:t>
-            </w:r>
-            <w:r>
-              <w:rPr>
-                <w:rFonts w:ascii="Calibri" w:cs="Calibri" w:eastAsia="Calibri" w:hAnsi="Calibri"/>
-              </w:rPr>
-              <w:t xml:space="preserve"> en retrait. Quand l'autonomie et la gestion de classe le permettent, elle </w:t>
-            </w:r>
-            <w:r>
-              <w:rPr>
-                <w:rFonts w:ascii="Calibri" w:cs="Calibri" w:eastAsia="Calibri" w:hAnsi="Calibri"/>
-                <w:b/>
-                <w:bCs/>
-              </w:rPr>
-              <w:t xml:space="preserve">anime des ateliers ciblés auprès de petits groupes d'élèves</w:t>
-            </w:r>
-            <w:r>
-              <w:rPr>
-                <w:rFonts w:ascii="Calibri" w:cs="Calibri" w:eastAsia="Calibri" w:hAnsi="Calibri"/>
-              </w:rPr>
-              <w:t xml:space="preserve">. Ce dernier rôle a été discuté avec elle et elle est d'accord.</w:t>
-            </w:r>
-          </w:p>
-          <w:p>
-            <w:pPr>
-              <w:spacing w:after="60"/>
-            </w:pPr>
-            <w:r>
-              <w:rPr>
-                <w:rFonts w:ascii="Calibri" w:cs="Calibri" w:eastAsia="Calibri" w:hAnsi="Calibri"/>
-              </w:rPr>
-              <w:t xml:space="preserve">Le fait qu'elle intervienne de moins en moins pendant les ateliers montre que l'autonomie progresse.</w:t>
+            <w:tcW w:type="dxa" w:w="2000"/>
+            <w:tcMar>
+              <w:top w:type="dxa" w:w="100"/>
+              <w:left w:type="dxa" w:w="140"/>
+              <w:bottom w:type="dxa" w:w="100"/>
+              <w:right w:type="dxa" w:w="140"/>
+            </w:tcMar>
+            <w:vAlign w:val="top"/>
+          </w:tcPr>
+          <w:p>
+            <w:pPr>
+              <w:spacing w:after="40" w:line="264"/>
+            </w:pPr>
+            <w:r>
+              <w:rPr>
+                <w:rFonts w:ascii="Calibri" w:cs="Calibri" w:eastAsia="Calibri" w:hAnsi="Calibri"/>
+                <w:b/>
+                <w:bCs/>
+              </w:rPr>
+              <w:t xml:space="preserve">Semaine 0</w:t>
+            </w:r>
+          </w:p>
+        </w:tc>
+        <w:tc>
+          <w:tcPr>
+            <w:tcW w:type="dxa" w:w="4960"/>
+            <w:tcMar>
+              <w:top w:type="dxa" w:w="100"/>
+              <w:left w:type="dxa" w:w="140"/>
+              <w:bottom w:type="dxa" w:w="100"/>
+              <w:right w:type="dxa" w:w="140"/>
+            </w:tcMar>
+            <w:vAlign w:val="top"/>
+          </w:tcPr>
+          <w:p>
+            <w:pPr>
+              <w:spacing w:after="40" w:line="264"/>
+            </w:pPr>
+            <w:r>
+              <w:rPr>
+                <w:rFonts w:ascii="Calibri" w:cs="Calibri" w:eastAsia="Calibri" w:hAnsi="Calibri"/>
+              </w:rPr>
+              <w:t xml:space="preserve">Décision de la table des directions. Confirmation des locaux et de l'horaire de la TES.</w:t>
+            </w:r>
+          </w:p>
+        </w:tc>
+        <w:tc>
+          <w:tcPr>
+            <w:tcW w:type="dxa" w:w="2400"/>
+            <w:tcMar>
+              <w:top w:type="dxa" w:w="100"/>
+              <w:left w:type="dxa" w:w="140"/>
+              <w:bottom w:type="dxa" w:w="100"/>
+              <w:right w:type="dxa" w:w="140"/>
+            </w:tcMar>
+            <w:vAlign w:val="top"/>
+          </w:tcPr>
+          <w:p>
+            <w:pPr>
+              <w:spacing w:after="40" w:line="264"/>
+            </w:pPr>
+            <w:r>
+              <w:rPr>
+                <w:rFonts w:ascii="Calibri" w:cs="Calibri" w:eastAsia="Calibri" w:hAnsi="Calibri"/>
+              </w:rPr>
+              <w:t xml:space="preserve">Direction</w:t>
+            </w:r>
+          </w:p>
+        </w:tc>
+      </w:tr>
+      <w:tr>
+        <w:trPr>
+          <w:cantSplit/>
+        </w:trPr>
+        <w:tc>
+          <w:tcPr>
+            <w:tcW w:type="dxa" w:w="2000"/>
+            <w:tcMar>
+              <w:top w:type="dxa" w:w="100"/>
+              <w:left w:type="dxa" w:w="140"/>
+              <w:bottom w:type="dxa" w:w="100"/>
+              <w:right w:type="dxa" w:w="140"/>
+            </w:tcMar>
+            <w:vAlign w:val="top"/>
+          </w:tcPr>
+          <w:p>
+            <w:pPr>
+              <w:spacing w:after="40" w:line="264"/>
+            </w:pPr>
+            <w:r>
+              <w:rPr>
+                <w:rFonts w:ascii="Calibri" w:cs="Calibri" w:eastAsia="Calibri" w:hAnsi="Calibri"/>
+                <w:b/>
+                <w:bCs/>
+              </w:rPr>
+              <w:t xml:space="preserve">Semaine 0</w:t>
+            </w:r>
+          </w:p>
+        </w:tc>
+        <w:tc>
+          <w:tcPr>
+            <w:tcW w:type="dxa" w:w="4960"/>
+            <w:tcMar>
+              <w:top w:type="dxa" w:w="100"/>
+              <w:left w:type="dxa" w:w="140"/>
+              <w:bottom w:type="dxa" w:w="100"/>
+              <w:right w:type="dxa" w:w="140"/>
+            </w:tcMar>
+            <w:vAlign w:val="top"/>
+          </w:tcPr>
+          <w:p>
+            <w:pPr>
+              <w:spacing w:after="40" w:line="264"/>
+            </w:pPr>
+            <w:r>
+              <w:rPr>
+                <w:rFonts w:ascii="Calibri" w:cs="Calibri" w:eastAsia="Calibri" w:hAnsi="Calibri"/>
+              </w:rPr>
+              <w:t xml:space="preserve">Appel aux 9 élèves en attente et inscription dans le groupe Z101.</w:t>
+            </w:r>
+          </w:p>
+        </w:tc>
+        <w:tc>
+          <w:tcPr>
+            <w:tcW w:type="dxa" w:w="2400"/>
+            <w:tcMar>
+              <w:top w:type="dxa" w:w="100"/>
+              <w:left w:type="dxa" w:w="140"/>
+              <w:bottom w:type="dxa" w:w="100"/>
+              <w:right w:type="dxa" w:w="140"/>
+            </w:tcMar>
+            <w:vAlign w:val="top"/>
+          </w:tcPr>
+          <w:p>
+            <w:pPr>
+              <w:spacing w:after="40" w:line="264"/>
+            </w:pPr>
+            <w:r>
+              <w:rPr>
+                <w:rFonts w:ascii="Calibri" w:cs="Calibri" w:eastAsia="Calibri" w:hAnsi="Calibri"/>
+              </w:rPr>
+              <w:t xml:space="preserve">Secrétariat, CP</w:t>
+            </w:r>
+          </w:p>
+        </w:tc>
+      </w:tr>
+      <w:tr>
+        <w:trPr>
+          <w:cantSplit/>
+        </w:trPr>
+        <w:tc>
+          <w:tcPr>
+            <w:tcW w:type="dxa" w:w="2000"/>
+            <w:tcMar>
+              <w:top w:type="dxa" w:w="100"/>
+              <w:left w:type="dxa" w:w="140"/>
+              <w:bottom w:type="dxa" w:w="100"/>
+              <w:right w:type="dxa" w:w="140"/>
+            </w:tcMar>
+            <w:vAlign w:val="top"/>
+          </w:tcPr>
+          <w:p>
+            <w:pPr>
+              <w:spacing w:after="40" w:line="264"/>
+            </w:pPr>
+            <w:r>
+              <w:rPr>
+                <w:rFonts w:ascii="Calibri" w:cs="Calibri" w:eastAsia="Calibri" w:hAnsi="Calibri"/>
+                <w:b/>
+                <w:bCs/>
+              </w:rPr>
+              <w:t xml:space="preserve">Semaine 0</w:t>
+            </w:r>
+          </w:p>
+        </w:tc>
+        <w:tc>
+          <w:tcPr>
+            <w:tcW w:type="dxa" w:w="4960"/>
+            <w:tcMar>
+              <w:top w:type="dxa" w:w="100"/>
+              <w:left w:type="dxa" w:w="140"/>
+              <w:bottom w:type="dxa" w:w="100"/>
+              <w:right w:type="dxa" w:w="140"/>
+            </w:tcMar>
+            <w:vAlign w:val="top"/>
+          </w:tcPr>
+          <w:p>
+            <w:pPr>
+              <w:spacing w:after="40" w:line="264"/>
+            </w:pPr>
+            <w:r>
+              <w:rPr>
+                <w:rFonts w:ascii="Calibri" w:cs="Calibri" w:eastAsia="Calibri" w:hAnsi="Calibri"/>
+              </w:rPr>
+              <w:t xml:space="preserve">Formation des sous-groupes A et B (mixtes). Préparation des premières fiches de tâches et du registre.</w:t>
+            </w:r>
+          </w:p>
+        </w:tc>
+        <w:tc>
+          <w:tcPr>
+            <w:tcW w:type="dxa" w:w="2400"/>
+            <w:tcMar>
+              <w:top w:type="dxa" w:w="100"/>
+              <w:left w:type="dxa" w:w="140"/>
+              <w:bottom w:type="dxa" w:w="100"/>
+              <w:right w:type="dxa" w:w="140"/>
+            </w:tcMar>
+            <w:vAlign w:val="top"/>
+          </w:tcPr>
+          <w:p>
+            <w:pPr>
+              <w:spacing w:after="40" w:line="264"/>
+            </w:pPr>
+            <w:r>
+              <w:rPr>
+                <w:rFonts w:ascii="Calibri" w:cs="Calibri" w:eastAsia="Calibri" w:hAnsi="Calibri"/>
+              </w:rPr>
+              <w:t xml:space="preserve">Enseignante, orthopédagogue, CP</w:t>
+            </w:r>
+          </w:p>
+        </w:tc>
+      </w:tr>
+      <w:tr>
+        <w:trPr>
+          <w:cantSplit/>
+        </w:trPr>
+        <w:tc>
+          <w:tcPr>
+            <w:tcW w:type="dxa" w:w="2000"/>
+            <w:tcMar>
+              <w:top w:type="dxa" w:w="100"/>
+              <w:left w:type="dxa" w:w="140"/>
+              <w:bottom w:type="dxa" w:w="100"/>
+              <w:right w:type="dxa" w:w="140"/>
+            </w:tcMar>
+            <w:vAlign w:val="top"/>
+          </w:tcPr>
+          <w:p>
+            <w:pPr>
+              <w:spacing w:after="40" w:line="264"/>
+            </w:pPr>
+            <w:r>
+              <w:rPr>
+                <w:rFonts w:ascii="Calibri" w:cs="Calibri" w:eastAsia="Calibri" w:hAnsi="Calibri"/>
+                <w:b/>
+                <w:bCs/>
+              </w:rPr>
+              <w:t xml:space="preserve">Semaine 1</w:t>
+            </w:r>
+          </w:p>
+        </w:tc>
+        <w:tc>
+          <w:tcPr>
+            <w:tcW w:type="dxa" w:w="4960"/>
+            <w:tcMar>
+              <w:top w:type="dxa" w:w="100"/>
+              <w:left w:type="dxa" w:w="140"/>
+              <w:bottom w:type="dxa" w:w="100"/>
+              <w:right w:type="dxa" w:w="140"/>
+            </w:tcMar>
+            <w:vAlign w:val="top"/>
+          </w:tcPr>
+          <w:p>
+            <w:pPr>
+              <w:spacing w:after="40" w:line="264"/>
+            </w:pPr>
+            <w:r>
+              <w:rPr>
+                <w:rFonts w:ascii="Calibri" w:cs="Calibri" w:eastAsia="Calibri" w:hAnsi="Calibri"/>
+              </w:rPr>
+              <w:t xml:space="preserve">Début de la période d'ancrage avec les 24 élèves.</w:t>
+            </w:r>
+          </w:p>
+        </w:tc>
+        <w:tc>
+          <w:tcPr>
+            <w:tcW w:type="dxa" w:w="2400"/>
+            <w:tcMar>
+              <w:top w:type="dxa" w:w="100"/>
+              <w:left w:type="dxa" w:w="140"/>
+              <w:bottom w:type="dxa" w:w="100"/>
+              <w:right w:type="dxa" w:w="140"/>
+            </w:tcMar>
+            <w:vAlign w:val="top"/>
+          </w:tcPr>
+          <w:p>
+            <w:pPr>
+              <w:spacing w:after="40" w:line="264"/>
+            </w:pPr>
+            <w:r>
+              <w:rPr>
+                <w:rFonts w:ascii="Calibri" w:cs="Calibri" w:eastAsia="Calibri" w:hAnsi="Calibri"/>
+              </w:rPr>
+              <w:t xml:space="preserve">Enseignante, TES</w:t>
+            </w:r>
+          </w:p>
+        </w:tc>
+      </w:tr>
+      <w:tr>
+        <w:trPr>
+          <w:cantSplit/>
+        </w:trPr>
+        <w:tc>
+          <w:tcPr>
+            <w:tcW w:type="dxa" w:w="2000"/>
+            <w:tcMar>
+              <w:top w:type="dxa" w:w="100"/>
+              <w:left w:type="dxa" w:w="140"/>
+              <w:bottom w:type="dxa" w:w="100"/>
+              <w:right w:type="dxa" w:w="140"/>
+            </w:tcMar>
+            <w:vAlign w:val="top"/>
+          </w:tcPr>
+          <w:p>
+            <w:pPr>
+              <w:spacing w:after="40" w:line="264"/>
+            </w:pPr>
+            <w:r>
+              <w:rPr>
+                <w:rFonts w:ascii="Calibri" w:cs="Calibri" w:eastAsia="Calibri" w:hAnsi="Calibri"/>
+                <w:b/>
+                <w:bCs/>
+              </w:rPr>
+              <w:t xml:space="preserve">Fin de l'ancrage</w:t>
+            </w:r>
+          </w:p>
+        </w:tc>
+        <w:tc>
+          <w:tcPr>
+            <w:tcW w:type="dxa" w:w="4960"/>
+            <w:tcMar>
+              <w:top w:type="dxa" w:w="100"/>
+              <w:left w:type="dxa" w:w="140"/>
+              <w:bottom w:type="dxa" w:w="100"/>
+              <w:right w:type="dxa" w:w="140"/>
+            </w:tcMar>
+            <w:vAlign w:val="top"/>
+          </w:tcPr>
+          <w:p>
+            <w:pPr>
+              <w:spacing w:after="40" w:line="264"/>
+            </w:pPr>
+            <w:r>
+              <w:rPr>
+                <w:rFonts w:ascii="Calibri" w:cs="Calibri" w:eastAsia="Calibri" w:hAnsi="Calibri"/>
+              </w:rPr>
+              <w:t xml:space="preserve">Premier bilan à partir des indicateurs (section 9). Décision : poursuivre, ajuster ou revenir au groupe unique.</w:t>
+            </w:r>
+          </w:p>
+        </w:tc>
+        <w:tc>
+          <w:tcPr>
+            <w:tcW w:type="dxa" w:w="2400"/>
+            <w:tcMar>
+              <w:top w:type="dxa" w:w="100"/>
+              <w:left w:type="dxa" w:w="140"/>
+              <w:bottom w:type="dxa" w:w="100"/>
+              <w:right w:type="dxa" w:w="140"/>
+            </w:tcMar>
+            <w:vAlign w:val="top"/>
+          </w:tcPr>
+          <w:p>
+            <w:pPr>
+              <w:spacing w:after="40" w:line="264"/>
+            </w:pPr>
+            <w:r>
+              <w:rPr>
+                <w:rFonts w:ascii="Calibri" w:cs="Calibri" w:eastAsia="Calibri" w:hAnsi="Calibri"/>
+              </w:rPr>
+              <w:t xml:space="preserve">CP, direction</w:t>
+            </w:r>
+          </w:p>
+        </w:tc>
+      </w:tr>
+      <w:tr>
+        <w:trPr>
+          <w:cantSplit/>
+        </w:trPr>
+        <w:tc>
+          <w:tcPr>
+            <w:tcW w:type="dxa" w:w="2000"/>
+            <w:tcMar>
+              <w:top w:type="dxa" w:w="100"/>
+              <w:left w:type="dxa" w:w="140"/>
+              <w:bottom w:type="dxa" w:w="100"/>
+              <w:right w:type="dxa" w:w="140"/>
+            </w:tcMar>
+            <w:vAlign w:val="top"/>
+          </w:tcPr>
+          <w:p>
+            <w:pPr>
+              <w:spacing w:after="40" w:line="264"/>
+            </w:pPr>
+            <w:r>
+              <w:rPr>
+                <w:rFonts w:ascii="Calibri" w:cs="Calibri" w:eastAsia="Calibri" w:hAnsi="Calibri"/>
+                <w:b/>
+                <w:bCs/>
+              </w:rPr>
+              <w:t xml:space="preserve">Fin de l'année</w:t>
+            </w:r>
+          </w:p>
+        </w:tc>
+        <w:tc>
+          <w:tcPr>
+            <w:tcW w:type="dxa" w:w="4960"/>
+            <w:tcMar>
+              <w:top w:type="dxa" w:w="100"/>
+              <w:left w:type="dxa" w:w="140"/>
+              <w:bottom w:type="dxa" w:w="100"/>
+              <w:right w:type="dxa" w:w="140"/>
+            </w:tcMar>
+            <w:vAlign w:val="top"/>
+          </w:tcPr>
+          <w:p>
+            <w:pPr>
+              <w:spacing w:after="40" w:line="264"/>
+            </w:pPr>
+            <w:r>
+              <w:rPr>
+                <w:rFonts w:ascii="Calibri" w:cs="Calibri" w:eastAsia="Calibri" w:hAnsi="Calibri"/>
+              </w:rPr>
+              <w:t xml:space="preserve">Bilan final et recommandation sur la transférabilité à d'autres services.</w:t>
+            </w:r>
+          </w:p>
+        </w:tc>
+        <w:tc>
+          <w:tcPr>
+            <w:tcW w:type="dxa" w:w="2400"/>
+            <w:tcMar>
+              <w:top w:type="dxa" w:w="100"/>
+              <w:left w:type="dxa" w:w="140"/>
+              <w:bottom w:type="dxa" w:w="100"/>
+              <w:right w:type="dxa" w:w="140"/>
+            </w:tcMar>
+            <w:vAlign w:val="top"/>
+          </w:tcPr>
+          <w:p>
+            <w:pPr>
+              <w:spacing w:after="40" w:line="264"/>
+            </w:pPr>
+            <w:r>
+              <w:rPr>
+                <w:rFonts w:ascii="Calibri" w:cs="Calibri" w:eastAsia="Calibri" w:hAnsi="Calibri"/>
+              </w:rPr>
+              <w:t xml:space="preserve">CP, équipe, direction</w:t>
             </w:r>
           </w:p>
         </w:tc>
@@ -3292,7 +4950,382 @@
         <w:rPr>
           <w:rFonts w:ascii="Calibri" w:cs="Calibri" w:eastAsia="Calibri" w:hAnsi="Calibri"/>
         </w:rPr>
-        <w:t xml:space="preserve">4. Pourquoi la formule soutient l'engagement</w:t>
+        <w:t xml:space="preserve">7. Ressources et coûts</w:t>
+      </w:r>
+    </w:p>
+    <w:tbl>
+      <w:tblPr>
+        <w:tblW w:type="dxa" w:w="9360"/>
+        <w:tblBorders>
+          <w:top w:val="single" w:color="CFD4DC" w:sz="4"/>
+          <w:left w:val="single" w:color="CFD4DC" w:sz="4"/>
+          <w:bottom w:val="single" w:color="CFD4DC" w:sz="4"/>
+          <w:right w:val="single" w:color="CFD4DC" w:sz="4"/>
+          <w:insideH w:val="single" w:color="CFD4DC" w:sz="4"/>
+          <w:insideV w:val="single" w:color="CFD4DC" w:sz="4"/>
+        </w:tblBorders>
+        <w:tblLayout w:type="fixed"/>
+      </w:tblPr>
+      <w:tblGrid>
+        <w:gridCol w:w="2300"/>
+        <w:gridCol w:w="7060"/>
+      </w:tblGrid>
+      <w:tr>
+        <w:trPr>
+          <w:tblHeader/>
+        </w:trPr>
+        <w:tc>
+          <w:tcPr>
+            <w:tcW w:type="dxa" w:w="2300"/>
+            <w:shd w:fill="1D3557" w:color="auto" w:val="clear"/>
+            <w:tcMar>
+              <w:top w:type="dxa" w:w="100"/>
+              <w:left w:type="dxa" w:w="140"/>
+              <w:bottom w:type="dxa" w:w="100"/>
+              <w:right w:type="dxa" w:w="140"/>
+            </w:tcMar>
+            <w:vAlign w:val="top"/>
+          </w:tcPr>
+          <w:p>
+            <w:pPr>
+              <w:spacing w:after="0"/>
+            </w:pPr>
+            <w:r>
+              <w:rPr>
+                <w:rFonts w:ascii="Calibri" w:cs="Calibri" w:eastAsia="Calibri" w:hAnsi="Calibri"/>
+                <w:b/>
+                <w:bCs/>
+                <w:color w:val="FFFFFF"/>
+                <w:sz w:val="20"/>
+                <w:szCs w:val="20"/>
+              </w:rPr>
+              <w:t xml:space="preserve">Ressource</w:t>
+            </w:r>
+          </w:p>
+        </w:tc>
+        <w:tc>
+          <w:tcPr>
+            <w:tcW w:type="dxa" w:w="7060"/>
+            <w:shd w:fill="1D3557" w:color="auto" w:val="clear"/>
+            <w:tcMar>
+              <w:top w:type="dxa" w:w="100"/>
+              <w:left w:type="dxa" w:w="140"/>
+              <w:bottom w:type="dxa" w:w="100"/>
+              <w:right w:type="dxa" w:w="140"/>
+            </w:tcMar>
+            <w:vAlign w:val="top"/>
+          </w:tcPr>
+          <w:p>
+            <w:pPr>
+              <w:spacing w:after="0"/>
+            </w:pPr>
+            <w:r>
+              <w:rPr>
+                <w:rFonts w:ascii="Calibri" w:cs="Calibri" w:eastAsia="Calibri" w:hAnsi="Calibri"/>
+                <w:b/>
+                <w:bCs/>
+                <w:color w:val="FFFFFF"/>
+                <w:sz w:val="20"/>
+                <w:szCs w:val="20"/>
+              </w:rPr>
+              <w:t xml:space="preserve">Détail</w:t>
+            </w:r>
+          </w:p>
+        </w:tc>
+      </w:tr>
+      <w:tr>
+        <w:trPr>
+          <w:cantSplit/>
+        </w:trPr>
+        <w:tc>
+          <w:tcPr>
+            <w:tcW w:type="dxa" w:w="2300"/>
+            <w:shd w:fill="EAF4E4" w:color="auto" w:val="clear"/>
+            <w:tcMar>
+              <w:top w:type="dxa" w:w="100"/>
+              <w:left w:type="dxa" w:w="140"/>
+              <w:bottom w:type="dxa" w:w="100"/>
+              <w:right w:type="dxa" w:w="140"/>
+            </w:tcMar>
+            <w:vAlign w:val="top"/>
+          </w:tcPr>
+          <w:p>
+            <w:pPr>
+              <w:spacing w:after="40" w:line="264"/>
+            </w:pPr>
+            <w:r>
+              <w:rPr>
+                <w:rFonts w:ascii="Calibri" w:cs="Calibri" w:eastAsia="Calibri" w:hAnsi="Calibri"/>
+                <w:b/>
+                <w:bCs/>
+              </w:rPr>
+              <w:t xml:space="preserve">Ressources humaines</w:t>
+            </w:r>
+          </w:p>
+        </w:tc>
+        <w:tc>
+          <w:tcPr>
+            <w:tcW w:type="dxa" w:w="7060"/>
+            <w:tcMar>
+              <w:top w:type="dxa" w:w="100"/>
+              <w:left w:type="dxa" w:w="140"/>
+              <w:bottom w:type="dxa" w:w="100"/>
+              <w:right w:type="dxa" w:w="140"/>
+            </w:tcMar>
+            <w:vAlign w:val="top"/>
+          </w:tcPr>
+          <w:p>
+            <w:pPr>
+              <w:spacing w:after="40" w:line="264"/>
+            </w:pPr>
+            <w:r>
+              <w:rPr>
+                <w:rFonts w:ascii="Calibri" w:cs="Calibri" w:eastAsia="Calibri" w:hAnsi="Calibri"/>
+              </w:rPr>
+              <w:t xml:space="preserve">Enseignante du Z101, TES préventive, orthopédagogue, conseillère pédagogique. </w:t>
+            </w:r>
+            <w:r>
+              <w:rPr>
+                <w:rFonts w:ascii="Calibri" w:cs="Calibri" w:eastAsia="Calibri" w:hAnsi="Calibri"/>
+                <w:b/>
+                <w:bCs/>
+              </w:rPr>
+              <w:t xml:space="preserve">Aucune embauche.</w:t>
+            </w:r>
+          </w:p>
+        </w:tc>
+      </w:tr>
+      <w:tr>
+        <w:trPr>
+          <w:cantSplit/>
+        </w:trPr>
+        <w:tc>
+          <w:tcPr>
+            <w:tcW w:type="dxa" w:w="2300"/>
+            <w:shd w:fill="EAF4E4" w:color="auto" w:val="clear"/>
+            <w:tcMar>
+              <w:top w:type="dxa" w:w="100"/>
+              <w:left w:type="dxa" w:w="140"/>
+              <w:bottom w:type="dxa" w:w="100"/>
+              <w:right w:type="dxa" w:w="140"/>
+            </w:tcMar>
+            <w:vAlign w:val="top"/>
+          </w:tcPr>
+          <w:p>
+            <w:pPr>
+              <w:spacing w:after="40" w:line="264"/>
+            </w:pPr>
+            <w:r>
+              <w:rPr>
+                <w:rFonts w:ascii="Calibri" w:cs="Calibri" w:eastAsia="Calibri" w:hAnsi="Calibri"/>
+                <w:b/>
+                <w:bCs/>
+              </w:rPr>
+              <w:t xml:space="preserve">Horaire de la TES</w:t>
+            </w:r>
+          </w:p>
+        </w:tc>
+        <w:tc>
+          <w:tcPr>
+            <w:tcW w:type="dxa" w:w="7060"/>
+            <w:tcMar>
+              <w:top w:type="dxa" w:w="100"/>
+              <w:left w:type="dxa" w:w="140"/>
+              <w:bottom w:type="dxa" w:w="100"/>
+              <w:right w:type="dxa" w:w="140"/>
+            </w:tcMar>
+            <w:vAlign w:val="top"/>
+          </w:tcPr>
+          <w:p>
+            <w:pPr>
+              <w:spacing w:after="40" w:line="264"/>
+            </w:pPr>
+            <w:r>
+              <w:rPr>
+                <w:rFonts w:ascii="Calibri" w:cs="Calibri" w:eastAsia="Calibri" w:hAnsi="Calibri"/>
+              </w:rPr>
+              <w:t xml:space="preserve">Présente pendant les matinées d'ateliers (8 h 30 à 11 h 45), selon l'horaire d'intervention déjà prévu au guide d'organisation.</w:t>
+            </w:r>
+          </w:p>
+        </w:tc>
+      </w:tr>
+      <w:tr>
+        <w:trPr>
+          <w:cantSplit/>
+        </w:trPr>
+        <w:tc>
+          <w:tcPr>
+            <w:tcW w:type="dxa" w:w="2300"/>
+            <w:shd w:fill="EAF4E4" w:color="auto" w:val="clear"/>
+            <w:tcMar>
+              <w:top w:type="dxa" w:w="100"/>
+              <w:left w:type="dxa" w:w="140"/>
+              <w:bottom w:type="dxa" w:w="100"/>
+              <w:right w:type="dxa" w:w="140"/>
+            </w:tcMar>
+            <w:vAlign w:val="top"/>
+          </w:tcPr>
+          <w:p>
+            <w:pPr>
+              <w:spacing w:after="40" w:line="264"/>
+            </w:pPr>
+            <w:r>
+              <w:rPr>
+                <w:rFonts w:ascii="Calibri" w:cs="Calibri" w:eastAsia="Calibri" w:hAnsi="Calibri"/>
+                <w:b/>
+                <w:bCs/>
+              </w:rPr>
+              <w:t xml:space="preserve">Locaux</w:t>
+            </w:r>
+          </w:p>
+        </w:tc>
+        <w:tc>
+          <w:tcPr>
+            <w:tcW w:type="dxa" w:w="7060"/>
+            <w:tcMar>
+              <w:top w:type="dxa" w:w="100"/>
+              <w:left w:type="dxa" w:w="140"/>
+              <w:bottom w:type="dxa" w:w="100"/>
+              <w:right w:type="dxa" w:w="140"/>
+            </w:tcMar>
+            <w:vAlign w:val="top"/>
+          </w:tcPr>
+          <w:p>
+            <w:pPr>
+              <w:spacing w:after="40" w:line="264"/>
+            </w:pPr>
+            <w:r>
+              <w:rPr>
+                <w:rFonts w:ascii="Calibri" w:cs="Calibri" w:eastAsia="Calibri" w:hAnsi="Calibri"/>
+              </w:rPr>
+              <w:t xml:space="preserve">Classe du Z101 pour l'enseignement direct. Plateaux cuisine et grenier pour les ateliers.</w:t>
+            </w:r>
+          </w:p>
+        </w:tc>
+      </w:tr>
+      <w:tr>
+        <w:trPr>
+          <w:cantSplit/>
+        </w:trPr>
+        <w:tc>
+          <w:tcPr>
+            <w:tcW w:type="dxa" w:w="2300"/>
+            <w:shd w:fill="EAF4E4" w:color="auto" w:val="clear"/>
+            <w:tcMar>
+              <w:top w:type="dxa" w:w="100"/>
+              <w:left w:type="dxa" w:w="140"/>
+              <w:bottom w:type="dxa" w:w="100"/>
+              <w:right w:type="dxa" w:w="140"/>
+            </w:tcMar>
+            <w:vAlign w:val="top"/>
+          </w:tcPr>
+          <w:p>
+            <w:pPr>
+              <w:spacing w:after="40" w:line="264"/>
+            </w:pPr>
+            <w:r>
+              <w:rPr>
+                <w:rFonts w:ascii="Calibri" w:cs="Calibri" w:eastAsia="Calibri" w:hAnsi="Calibri"/>
+                <w:b/>
+                <w:bCs/>
+              </w:rPr>
+              <w:t xml:space="preserve">Matériel</w:t>
+            </w:r>
+          </w:p>
+        </w:tc>
+        <w:tc>
+          <w:tcPr>
+            <w:tcW w:type="dxa" w:w="7060"/>
+            <w:tcMar>
+              <w:top w:type="dxa" w:w="100"/>
+              <w:left w:type="dxa" w:w="140"/>
+              <w:bottom w:type="dxa" w:w="100"/>
+              <w:right w:type="dxa" w:w="140"/>
+            </w:tcMar>
+            <w:vAlign w:val="top"/>
+          </w:tcPr>
+          <w:p>
+            <w:pPr>
+              <w:spacing w:after="40" w:line="264"/>
+            </w:pPr>
+            <w:r>
+              <w:rPr>
+                <w:rFonts w:ascii="Calibri" w:cs="Calibri" w:eastAsia="Calibri" w:hAnsi="Calibri"/>
+              </w:rPr>
+              <w:t xml:space="preserve">Fiches de tâches plastifiées, registre d'autonomie, chariots TEACCH partagés avec l'alpha-pré et la DAP.</w:t>
+            </w:r>
+          </w:p>
+        </w:tc>
+      </w:tr>
+      <w:tr>
+        <w:trPr>
+          <w:cantSplit/>
+        </w:trPr>
+        <w:tc>
+          <w:tcPr>
+            <w:tcW w:type="dxa" w:w="2300"/>
+            <w:shd w:fill="EAF4E4" w:color="auto" w:val="clear"/>
+            <w:tcMar>
+              <w:top w:type="dxa" w:w="100"/>
+              <w:left w:type="dxa" w:w="140"/>
+              <w:bottom w:type="dxa" w:w="100"/>
+              <w:right w:type="dxa" w:w="140"/>
+            </w:tcMar>
+            <w:vAlign w:val="top"/>
+          </w:tcPr>
+          <w:p>
+            <w:pPr>
+              <w:spacing w:after="40" w:line="264"/>
+            </w:pPr>
+            <w:r>
+              <w:rPr>
+                <w:rFonts w:ascii="Calibri" w:cs="Calibri" w:eastAsia="Calibri" w:hAnsi="Calibri"/>
+                <w:b/>
+                <w:bCs/>
+              </w:rPr>
+              <w:t xml:space="preserve">Coût supplémentaire</w:t>
+            </w:r>
+          </w:p>
+        </w:tc>
+        <w:tc>
+          <w:tcPr>
+            <w:tcW w:type="dxa" w:w="7060"/>
+            <w:tcMar>
+              <w:top w:type="dxa" w:w="100"/>
+              <w:left w:type="dxa" w:w="140"/>
+              <w:bottom w:type="dxa" w:w="100"/>
+              <w:right w:type="dxa" w:w="140"/>
+            </w:tcMar>
+            <w:vAlign w:val="top"/>
+          </w:tcPr>
+          <w:p>
+            <w:pPr>
+              <w:spacing w:after="40" w:line="264"/>
+            </w:pPr>
+            <w:r>
+              <w:rPr>
+                <w:rFonts w:ascii="Calibri" w:cs="Calibri" w:eastAsia="Calibri" w:hAnsi="Calibri"/>
+              </w:rPr>
+              <w:t xml:space="preserve">Aucun salaire supplémentaire. Matériel : impression et plastification des fiches.</w:t>
+            </w:r>
+          </w:p>
+        </w:tc>
+      </w:tr>
+    </w:tbl>
+    <w:p>
+      <w:pPr>
+        <w:pStyle w:val="Heading1"/>
+        <w:keepNext/>
+        <w:pBdr>
+          <w:bottom w:val="single" w:color="2F7A2A" w:sz="6" w:space="4"/>
+        </w:pBdr>
+        <w:spacing w:after="140" w:before="360"/>
+      </w:pPr>
+      <w:r>
+        <w:rPr>
+          <w:rFonts w:ascii="Calibri" w:cs="Calibri" w:eastAsia="Calibri" w:hAnsi="Calibri"/>
+        </w:rPr>
+        <w:t xml:space="preserve">8. Fondements : les quatre besoins de l'engagement</w:t>
       </w:r>
     </w:p>
     <w:p>
@@ -3331,7 +5364,7 @@
         <w:rPr>
           <w:rFonts w:ascii="Calibri" w:cs="Calibri" w:eastAsia="Calibri" w:hAnsi="Calibri"/>
         </w:rPr>
-        <w:t xml:space="preserve">. La formule a été pensée pour nourrir chacun d'eux.</w:t>
+        <w:t xml:space="preserve">, et la formule a été pensée pour nourrir chacun d'eux.</w:t>
       </w:r>
     </w:p>
     <w:tbl>
@@ -3479,7 +5512,7 @@
               <w:rPr>
                 <w:rFonts w:ascii="Calibri" w:cs="Calibri" w:eastAsia="Calibri" w:hAnsi="Calibri"/>
               </w:rPr>
-              <w:t xml:space="preserve">Des fiches courtes (1 à 5 étapes) adaptées au niveau de l'élève. Des critères de réussite connus d'avance pour s'auto-évaluer. Des étapes validées au registre : l'élève voit ses progrès.</w:t>
+              <w:t xml:space="preserve">Des fiches courtes adaptées au niveau de l'élève. Des critères de réussite connus d'avance. Des étapes validées au registre : l'élève voit ses progrès.</w:t>
             </w:r>
           </w:p>
         </w:tc>
@@ -3549,7 +5582,7 @@
               <w:rPr>
                 <w:rFonts w:ascii="Calibri" w:cs="Calibri" w:eastAsia="Calibri" w:hAnsi="Calibri"/>
               </w:rPr>
-              <w:t xml:space="preserve">L'élève choisit sa tâche et s'inscrit lui-même au registre. Il prend la parole comme leader. Il règle ses blocages avec la règle « 3 avant l'enseignante ».</w:t>
+              <w:t xml:space="preserve">L'élève choisit sa tâche et s'inscrit au registre. Il prend la parole comme leader. Il règle ses blocages avec la règle « 3 avant l'enseignante ».</w:t>
             </w:r>
           </w:p>
         </w:tc>
@@ -3619,7 +5652,7 @@
               <w:rPr>
                 <w:rFonts w:ascii="Calibri" w:cs="Calibri" w:eastAsia="Calibri" w:hAnsi="Calibri"/>
               </w:rPr>
-              <w:t xml:space="preserve">Des tâches de la vraie vie : cuisiner, gérer un inventaire, faire un budget, choisir un logement. Ce qui est appris sert dès maintenant, puis en années 2 et 3.</w:t>
+              <w:t xml:space="preserve">Des tâches de la vraie vie : cuisiner, gérer un inventaire, faire un budget, choisir un logement. Ce qui est appris sert dès maintenant.</w:t>
             </w:r>
           </w:p>
         </w:tc>
@@ -3689,7 +5722,7 @@
               <w:rPr>
                 <w:rFonts w:ascii="Calibri" w:cs="Calibri" w:eastAsia="Calibri" w:hAnsi="Calibri"/>
               </w:rPr>
-              <w:t xml:space="preserve">Équipes mixtes, entraide et leader tournant : chaque élève compte pour son équipe. La TES veille au climat. Les ateliers en petits groupes offrent du temps de qualité avec un adulte.</w:t>
+              <w:t xml:space="preserve">Équipes mixtes, entraide et leader tournant : chaque élève compte pour son équipe. Les ateliers en petits groupes offrent du temps de qualité avec un adulte.</w:t>
             </w:r>
           </w:p>
         </w:tc>
@@ -3724,7 +5757,7 @@
         <w:rPr>
           <w:rFonts w:ascii="Calibri" w:cs="Calibri" w:eastAsia="Calibri" w:hAnsi="Calibri"/>
         </w:rPr>
-        <w:t xml:space="preserve">5. Réponses aux préoccupations</w:t>
+        <w:t xml:space="preserve">9. Risques et mesures prévues</w:t>
       </w:r>
     </w:p>
     <w:tbl>
@@ -3773,7 +5806,7 @@
                 <w:sz w:val="20"/>
                 <w:szCs w:val="20"/>
               </w:rPr>
-              <w:t xml:space="preserve">Préoccupation</w:t>
+              <w:t xml:space="preserve">Risque ou préoccupation</w:t>
             </w:r>
           </w:p>
         </w:tc>
@@ -3802,7 +5835,7 @@
                 <w:sz w:val="20"/>
                 <w:szCs w:val="20"/>
               </w:rPr>
-              <w:t xml:space="preserve">Notre réponse</w:t>
+              <w:t xml:space="preserve">Mesure prévue</w:t>
             </w:r>
           </w:p>
         </w:tc>
@@ -3833,7 +5866,7 @@
                 <w:b/>
                 <w:bCs/>
               </w:rPr>
-              <w:t xml:space="preserve">« Il y aura des trous à l'horaire. »</w:t>
+              <w:t xml:space="preserve">Des périodes vides à l'horaire</w:t>
             </w:r>
           </w:p>
         </w:tc>
@@ -3856,7 +5889,7 @@
               <w:rPr>
                 <w:rFonts w:ascii="Calibri" w:cs="Calibri" w:eastAsia="Calibri" w:hAnsi="Calibri"/>
               </w:rPr>
-              <w:t xml:space="preserve">Aucune période vide. Chaque bloc est planifié au tableau de programmation : l'élève est soit avec l'enseignante, soit en atelier guidé par une fiche.</w:t>
+              <w:t xml:space="preserve">Chaque bloc est planifié au tableau de programmation : l'élève est soit avec l'enseignante, soit en atelier guidé par une fiche.</w:t>
             </w:r>
           </w:p>
         </w:tc>
@@ -3887,7 +5920,7 @@
                 <w:b/>
                 <w:bCs/>
               </w:rPr>
-              <w:t xml:space="preserve">« Il faudra embaucher une ressource. »</w:t>
+              <w:t xml:space="preserve">Le besoin d'embaucher une ressource</w:t>
             </w:r>
           </w:p>
         </w:tc>
@@ -3910,7 +5943,7 @@
               <w:rPr>
                 <w:rFonts w:ascii="Calibri" w:cs="Calibri" w:eastAsia="Calibri" w:hAnsi="Calibri"/>
               </w:rPr>
-              <w:t xml:space="preserve">Aucune embauche. L'enseignante, la TES préventive, l'orthopédagogue et la CP sont déjà en place. Les chariots TEACCH sont partagés avec l'alpha-pré et la DAP.</w:t>
+              <w:t xml:space="preserve">L'équipe est déjà en place. La TES, l'orthopédagogue et la CP ont des rôles définis dans le projet.</w:t>
             </w:r>
           </w:p>
         </w:tc>
@@ -3941,7 +5974,7 @@
                 <w:b/>
                 <w:bCs/>
               </w:rPr>
-              <w:t xml:space="preserve">« On l'a essayé l'an dernier et des élèves se sont désengagés. »</w:t>
+              <w:t xml:space="preserve">Le désengagement observé l'an dernier</w:t>
             </w:r>
           </w:p>
         </w:tc>
@@ -3964,7 +5997,7 @@
               <w:rPr>
                 <w:rFonts w:ascii="Calibri" w:cs="Calibri" w:eastAsia="Calibri" w:hAnsi="Calibri"/>
               </w:rPr>
-              <w:t xml:space="preserve">Après vérification, ce désengagement s'explique par des cas très particuliers propres à la cohorte de l'an dernier. Cette année, les élèves sont très participatifs. La formule est aussi différente : fiches de tâches, leader tournant, registre et transition planifiée vers l'autonomie.</w:t>
+              <w:t xml:space="preserve">Après vérification, il s'explique par des cas très particuliers propres à la cohorte de l'an dernier. Cette année, les élèves sont très participatifs. La formule est aussi plus structurée : fiches, leader, registre et transition planifiée vers l'autonomie.</w:t>
             </w:r>
           </w:p>
         </w:tc>
@@ -3995,7 +6028,7 @@
                 <w:b/>
                 <w:bCs/>
               </w:rPr>
-              <w:t xml:space="preserve">« La TES va devenir une surveillante. »</w:t>
+              <w:t xml:space="preserve">La TES utilisée comme surveillante</w:t>
             </w:r>
           </w:p>
         </w:tc>
@@ -4018,7 +6051,7 @@
               <w:rPr>
                 <w:rFonts w:ascii="Calibri" w:cs="Calibri" w:eastAsia="Calibri" w:hAnsi="Calibri"/>
               </w:rPr>
-              <w:t xml:space="preserve">Non. Elle accompagne la transition vers l'autonomie, puis anime ses propres ateliers ciblés en petits groupes (section 3).</w:t>
+              <w:t xml:space="preserve">Son rôle évolue de l'accompagnement vers l'animation d'ateliers ciblés (section 5). Ses interventions en atelier sont suivies et doivent diminuer.</w:t>
             </w:r>
           </w:p>
         </w:tc>
@@ -4049,7 +6082,7 @@
                 <w:b/>
                 <w:bCs/>
               </w:rPr>
-              <w:t xml:space="preserve">« Et si ça ne fonctionne pas ? »</w:t>
+              <w:t xml:space="preserve">Un leader qui fait tout le travail</w:t>
             </w:r>
           </w:p>
         </w:tc>
@@ -4072,7 +6105,7 @@
               <w:rPr>
                 <w:rFonts w:ascii="Calibri" w:cs="Calibri" w:eastAsia="Calibri" w:hAnsi="Calibri"/>
               </w:rPr>
-              <w:t xml:space="preserve">Le projet est un pilote avec un bilan à la fin de la période d'ancrage. Si les indicateurs ne sont pas au rendez-vous, on ajuste ou on revient à la formule actuelle.</w:t>
+              <w:t xml:space="preserve">Le rôle tourne à chaque atelier. La fiche précise les tâches de chacun et tous les membres signent l'auto-évaluation.</w:t>
             </w:r>
           </w:p>
         </w:tc>
@@ -4103,7 +6136,7 @@
                 <w:b/>
                 <w:bCs/>
               </w:rPr>
-              <w:t xml:space="preserve">« Et si on ne fait rien ? »</w:t>
+              <w:t xml:space="preserve">Des élèves qui s'essoufflent</w:t>
             </w:r>
           </w:p>
         </w:tc>
@@ -4126,7 +6159,61 @@
               <w:rPr>
                 <w:rFonts w:ascii="Calibri" w:cs="Calibri" w:eastAsia="Calibri" w:hAnsi="Calibri"/>
               </w:rPr>
-              <w:t xml:space="preserve">9 élèves restent à la porte au moment où ils sont prêts à s'engager. Certains ne reviendront pas.</w:t>
+              <w:t xml:space="preserve">Fiches courtes et visuelles, ajustées par l'orthopédagogue. La TES repère les signes d'anxiété dès l'accueil.</w:t>
+            </w:r>
+          </w:p>
+        </w:tc>
+      </w:tr>
+      <w:tr>
+        <w:trPr>
+          <w:cantSplit/>
+        </w:trPr>
+        <w:tc>
+          <w:tcPr>
+            <w:tcW w:type="dxa" w:w="3000"/>
+            <w:shd w:fill="F4F5F7" w:color="auto" w:val="clear"/>
+            <w:tcMar>
+              <w:top w:type="dxa" w:w="100"/>
+              <w:left w:type="dxa" w:w="140"/>
+              <w:bottom w:type="dxa" w:w="100"/>
+              <w:right w:type="dxa" w:w="140"/>
+            </w:tcMar>
+            <w:vAlign w:val="top"/>
+          </w:tcPr>
+          <w:p>
+            <w:pPr>
+              <w:spacing w:after="40" w:line="264"/>
+            </w:pPr>
+            <w:r>
+              <w:rPr>
+                <w:rFonts w:ascii="Calibri" w:cs="Calibri" w:eastAsia="Calibri" w:hAnsi="Calibri"/>
+                <w:b/>
+                <w:bCs/>
+              </w:rPr>
+              <w:t xml:space="preserve">La formule ne fonctionne pas</w:t>
+            </w:r>
+          </w:p>
+        </w:tc>
+        <w:tc>
+          <w:tcPr>
+            <w:tcW w:type="dxa" w:w="6360"/>
+            <w:tcMar>
+              <w:top w:type="dxa" w:w="100"/>
+              <w:left w:type="dxa" w:w="140"/>
+              <w:bottom w:type="dxa" w:w="100"/>
+              <w:right w:type="dxa" w:w="140"/>
+            </w:tcMar>
+            <w:vAlign w:val="top"/>
+          </w:tcPr>
+          <w:p>
+            <w:pPr>
+              <w:spacing w:after="40" w:line="264"/>
+            </w:pPr>
+            <w:r>
+              <w:rPr>
+                <w:rFonts w:ascii="Calibri" w:cs="Calibri" w:eastAsia="Calibri" w:hAnsi="Calibri"/>
+              </w:rPr>
+              <w:t xml:space="preserve">Bilan à la fin de la période d'ancrage. Si les indicateurs ne sont pas au rendez-vous, on ajuste ou on revient à la formule actuelle.</w:t>
             </w:r>
           </w:p>
         </w:tc>
@@ -4145,20 +6232,7 @@
         <w:rPr>
           <w:rFonts w:ascii="Calibri" w:cs="Calibri" w:eastAsia="Calibri" w:hAnsi="Calibri"/>
         </w:rPr>
-        <w:t xml:space="preserve">6. Les ressources et le suivi</w:t>
-      </w:r>
-    </w:p>
-    <w:p>
-      <w:pPr>
-        <w:pStyle w:val="Heading2"/>
-        <w:keepNext/>
-        <w:spacing w:after="80" w:before="200"/>
-      </w:pPr>
-      <w:r>
-        <w:rPr>
-          <w:rFonts w:ascii="Calibri" w:cs="Calibri" w:eastAsia="Calibri" w:hAnsi="Calibri"/>
-        </w:rPr>
-        <w:t xml:space="preserve">Qui fait quoi</w:t>
+        <w:t xml:space="preserve">10. Évaluation et suivi</w:t>
       </w:r>
     </w:p>
     <w:tbl>
@@ -4175,8 +6249,10 @@
         <w:tblLayout w:type="fixed"/>
       </w:tblPr>
       <w:tblGrid>
-        <w:gridCol w:w="2300"/>
-        <w:gridCol w:w="7060"/>
+        <w:gridCol w:w="2700"/>
+        <w:gridCol w:w="2860"/>
+        <w:gridCol w:w="1900"/>
+        <w:gridCol w:w="1900"/>
       </w:tblGrid>
       <w:tr>
         <w:trPr>
@@ -4184,7 +6260,7 @@
         </w:trPr>
         <w:tc>
           <w:tcPr>
-            <w:tcW w:type="dxa" w:w="2300"/>
+            <w:tcW w:type="dxa" w:w="2700"/>
             <w:shd w:fill="1D3557" w:color="auto" w:val="clear"/>
             <w:tcMar>
               <w:top w:type="dxa" w:w="100"/>
@@ -4207,13 +6283,13 @@
                 <w:sz w:val="20"/>
                 <w:szCs w:val="20"/>
               </w:rPr>
-              <w:t xml:space="preserve">Personne</w:t>
-            </w:r>
-          </w:p>
-        </w:tc>
-        <w:tc>
-          <w:tcPr>
-            <w:tcW w:type="dxa" w:w="7060"/>
+              <w:t xml:space="preserve">Indicateur</w:t>
+            </w:r>
+          </w:p>
+        </w:tc>
+        <w:tc>
+          <w:tcPr>
+            <w:tcW w:type="dxa" w:w="2860"/>
             <w:shd w:fill="1D3557" w:color="auto" w:val="clear"/>
             <w:tcMar>
               <w:top w:type="dxa" w:w="100"/>
@@ -4236,7 +6312,65 @@
                 <w:sz w:val="20"/>
                 <w:szCs w:val="20"/>
               </w:rPr>
-              <w:t xml:space="preserve">Rôle dans le projet</w:t>
+              <w:t xml:space="preserve">Cible</w:t>
+            </w:r>
+          </w:p>
+        </w:tc>
+        <w:tc>
+          <w:tcPr>
+            <w:tcW w:type="dxa" w:w="1900"/>
+            <w:shd w:fill="1D3557" w:color="auto" w:val="clear"/>
+            <w:tcMar>
+              <w:top w:type="dxa" w:w="100"/>
+              <w:left w:type="dxa" w:w="140"/>
+              <w:bottom w:type="dxa" w:w="100"/>
+              <w:right w:type="dxa" w:w="140"/>
+            </w:tcMar>
+            <w:vAlign w:val="top"/>
+          </w:tcPr>
+          <w:p>
+            <w:pPr>
+              <w:spacing w:after="0"/>
+            </w:pPr>
+            <w:r>
+              <w:rPr>
+                <w:rFonts w:ascii="Calibri" w:cs="Calibri" w:eastAsia="Calibri" w:hAnsi="Calibri"/>
+                <w:b/>
+                <w:bCs/>
+                <w:color w:val="FFFFFF"/>
+                <w:sz w:val="20"/>
+                <w:szCs w:val="20"/>
+              </w:rPr>
+              <w:t xml:space="preserve">Outil</w:t>
+            </w:r>
+          </w:p>
+        </w:tc>
+        <w:tc>
+          <w:tcPr>
+            <w:tcW w:type="dxa" w:w="1900"/>
+            <w:shd w:fill="1D3557" w:color="auto" w:val="clear"/>
+            <w:tcMar>
+              <w:top w:type="dxa" w:w="100"/>
+              <w:left w:type="dxa" w:w="140"/>
+              <w:bottom w:type="dxa" w:w="100"/>
+              <w:right w:type="dxa" w:w="140"/>
+            </w:tcMar>
+            <w:vAlign w:val="top"/>
+          </w:tcPr>
+          <w:p>
+            <w:pPr>
+              <w:spacing w:after="0"/>
+            </w:pPr>
+            <w:r>
+              <w:rPr>
+                <w:rFonts w:ascii="Calibri" w:cs="Calibri" w:eastAsia="Calibri" w:hAnsi="Calibri"/>
+                <w:b/>
+                <w:bCs/>
+                <w:color w:val="FFFFFF"/>
+                <w:sz w:val="20"/>
+                <w:szCs w:val="20"/>
+              </w:rPr>
+              <w:t xml:space="preserve">Moment</w:t>
             </w:r>
           </w:p>
         </w:tc>
@@ -4247,7 +6381,7 @@
         </w:trPr>
         <w:tc>
           <w:tcPr>
-            <w:tcW w:type="dxa" w:w="2300"/>
+            <w:tcW w:type="dxa" w:w="2700"/>
             <w:shd w:fill="EAF4E4" w:color="auto" w:val="clear"/>
             <w:tcMar>
               <w:top w:type="dxa" w:w="100"/>
@@ -4267,30 +6401,76 @@
                 <w:b/>
                 <w:bCs/>
               </w:rPr>
-              <w:t xml:space="preserve">Enseignante</w:t>
-            </w:r>
-          </w:p>
-        </w:tc>
-        <w:tc>
-          <w:tcPr>
-            <w:tcW w:type="dxa" w:w="7060"/>
-            <w:tcMar>
-              <w:top w:type="dxa" w:w="100"/>
-              <w:left w:type="dxa" w:w="140"/>
-              <w:bottom w:type="dxa" w:w="100"/>
-              <w:right w:type="dxa" w:w="140"/>
-            </w:tcMar>
-            <w:vAlign w:val="top"/>
-          </w:tcPr>
-          <w:p>
-            <w:pPr>
-              <w:spacing w:after="40" w:line="264"/>
-            </w:pPr>
-            <w:r>
-              <w:rPr>
-                <w:rFonts w:ascii="Calibri" w:cs="Calibri" w:eastAsia="Calibri" w:hAnsi="Calibri"/>
-              </w:rPr>
-              <w:t xml:space="preserve">Pilote pédagogique : enseignement du Z101, planification, évaluation. En période 3, ateliers en sous-groupes de besoins.</w:t>
+              <w:t xml:space="preserve">Rétention des élèves</w:t>
+            </w:r>
+          </w:p>
+        </w:tc>
+        <w:tc>
+          <w:tcPr>
+            <w:tcW w:type="dxa" w:w="2860"/>
+            <w:tcMar>
+              <w:top w:type="dxa" w:w="100"/>
+              <w:left w:type="dxa" w:w="140"/>
+              <w:bottom w:type="dxa" w:w="100"/>
+              <w:right w:type="dxa" w:w="140"/>
+            </w:tcMar>
+            <w:vAlign w:val="top"/>
+          </w:tcPr>
+          <w:p>
+            <w:pPr>
+              <w:spacing w:after="40" w:line="264"/>
+            </w:pPr>
+            <w:r>
+              <w:rPr>
+                <w:rFonts w:ascii="Calibri" w:cs="Calibri" w:eastAsia="Calibri" w:hAnsi="Calibri"/>
+              </w:rPr>
+              <w:t xml:space="preserve">100 % des 24 élèves toujours inscrits</w:t>
+            </w:r>
+          </w:p>
+        </w:tc>
+        <w:tc>
+          <w:tcPr>
+            <w:tcW w:type="dxa" w:w="1900"/>
+            <w:tcMar>
+              <w:top w:type="dxa" w:w="100"/>
+              <w:left w:type="dxa" w:w="140"/>
+              <w:bottom w:type="dxa" w:w="100"/>
+              <w:right w:type="dxa" w:w="140"/>
+            </w:tcMar>
+            <w:vAlign w:val="top"/>
+          </w:tcPr>
+          <w:p>
+            <w:pPr>
+              <w:spacing w:after="40" w:line="264"/>
+            </w:pPr>
+            <w:r>
+              <w:rPr>
+                <w:rFonts w:ascii="Calibri" w:cs="Calibri" w:eastAsia="Calibri" w:hAnsi="Calibri"/>
+              </w:rPr>
+              <w:t xml:space="preserve">Liste de présence</w:t>
+            </w:r>
+          </w:p>
+        </w:tc>
+        <w:tc>
+          <w:tcPr>
+            <w:tcW w:type="dxa" w:w="1900"/>
+            <w:tcMar>
+              <w:top w:type="dxa" w:w="100"/>
+              <w:left w:type="dxa" w:w="140"/>
+              <w:bottom w:type="dxa" w:w="100"/>
+              <w:right w:type="dxa" w:w="140"/>
+            </w:tcMar>
+            <w:vAlign w:val="top"/>
+          </w:tcPr>
+          <w:p>
+            <w:pPr>
+              <w:spacing w:after="40" w:line="264"/>
+            </w:pPr>
+            <w:r>
+              <w:rPr>
+                <w:rFonts w:ascii="Calibri" w:cs="Calibri" w:eastAsia="Calibri" w:hAnsi="Calibri"/>
+              </w:rPr>
+              <w:t xml:space="preserve">Chaque bilan</w:t>
             </w:r>
           </w:p>
         </w:tc>
@@ -4301,7 +6481,7 @@
         </w:trPr>
         <w:tc>
           <w:tcPr>
-            <w:tcW w:type="dxa" w:w="2300"/>
+            <w:tcW w:type="dxa" w:w="2700"/>
             <w:shd w:fill="EAF4E4" w:color="auto" w:val="clear"/>
             <w:tcMar>
               <w:top w:type="dxa" w:w="100"/>
@@ -4321,30 +6501,76 @@
                 <w:b/>
                 <w:bCs/>
               </w:rPr>
-              <w:t xml:space="preserve">TES préventive</w:t>
-            </w:r>
-          </w:p>
-        </w:tc>
-        <w:tc>
-          <w:tcPr>
-            <w:tcW w:type="dxa" w:w="7060"/>
-            <w:tcMar>
-              <w:top w:type="dxa" w:w="100"/>
-              <w:left w:type="dxa" w:w="140"/>
-              <w:bottom w:type="dxa" w:w="100"/>
-              <w:right w:type="dxa" w:w="140"/>
-            </w:tcMar>
-            <w:vAlign w:val="top"/>
-          </w:tcPr>
-          <w:p>
-            <w:pPr>
-              <w:spacing w:after="40" w:line="264"/>
-            </w:pPr>
-            <w:r>
-              <w:rPr>
-                <w:rFonts w:ascii="Calibri" w:cs="Calibri" w:eastAsia="Calibri" w:hAnsi="Calibri"/>
-              </w:rPr>
-              <w:t xml:space="preserve">Transition vers l'autonomie, régulation et transitions. En période 3, ateliers ciblés en petits groupes.</w:t>
+              <w:t xml:space="preserve">Présence</w:t>
+            </w:r>
+          </w:p>
+        </w:tc>
+        <w:tc>
+          <w:tcPr>
+            <w:tcW w:type="dxa" w:w="2860"/>
+            <w:tcMar>
+              <w:top w:type="dxa" w:w="100"/>
+              <w:left w:type="dxa" w:w="140"/>
+              <w:bottom w:type="dxa" w:w="100"/>
+              <w:right w:type="dxa" w:w="140"/>
+            </w:tcMar>
+            <w:vAlign w:val="top"/>
+          </w:tcPr>
+          <w:p>
+            <w:pPr>
+              <w:spacing w:after="40" w:line="264"/>
+            </w:pPr>
+            <w:r>
+              <w:rPr>
+                <w:rFonts w:ascii="Calibri" w:cs="Calibri" w:eastAsia="Calibri" w:hAnsi="Calibri"/>
+              </w:rPr>
+              <w:t xml:space="preserve">Stable ou en hausse</w:t>
+            </w:r>
+          </w:p>
+        </w:tc>
+        <w:tc>
+          <w:tcPr>
+            <w:tcW w:type="dxa" w:w="1900"/>
+            <w:tcMar>
+              <w:top w:type="dxa" w:w="100"/>
+              <w:left w:type="dxa" w:w="140"/>
+              <w:bottom w:type="dxa" w:w="100"/>
+              <w:right w:type="dxa" w:w="140"/>
+            </w:tcMar>
+            <w:vAlign w:val="top"/>
+          </w:tcPr>
+          <w:p>
+            <w:pPr>
+              <w:spacing w:after="40" w:line="264"/>
+            </w:pPr>
+            <w:r>
+              <w:rPr>
+                <w:rFonts w:ascii="Calibri" w:cs="Calibri" w:eastAsia="Calibri" w:hAnsi="Calibri"/>
+              </w:rPr>
+              <w:t xml:space="preserve">Liste de présence</w:t>
+            </w:r>
+          </w:p>
+        </w:tc>
+        <w:tc>
+          <w:tcPr>
+            <w:tcW w:type="dxa" w:w="1900"/>
+            <w:tcMar>
+              <w:top w:type="dxa" w:w="100"/>
+              <w:left w:type="dxa" w:w="140"/>
+              <w:bottom w:type="dxa" w:w="100"/>
+              <w:right w:type="dxa" w:w="140"/>
+            </w:tcMar>
+            <w:vAlign w:val="top"/>
+          </w:tcPr>
+          <w:p>
+            <w:pPr>
+              <w:spacing w:after="40" w:line="264"/>
+            </w:pPr>
+            <w:r>
+              <w:rPr>
+                <w:rFonts w:ascii="Calibri" w:cs="Calibri" w:eastAsia="Calibri" w:hAnsi="Calibri"/>
+              </w:rPr>
+              <w:t xml:space="preserve">Chaque semaine</w:t>
             </w:r>
           </w:p>
         </w:tc>
@@ -4355,7 +6581,7 @@
         </w:trPr>
         <w:tc>
           <w:tcPr>
-            <w:tcW w:type="dxa" w:w="2300"/>
+            <w:tcW w:type="dxa" w:w="2700"/>
             <w:shd w:fill="EAF4E4" w:color="auto" w:val="clear"/>
             <w:tcMar>
               <w:top w:type="dxa" w:w="100"/>
@@ -4375,30 +6601,76 @@
                 <w:b/>
                 <w:bCs/>
               </w:rPr>
-              <w:t xml:space="preserve">Orthopédagogue</w:t>
-            </w:r>
-          </w:p>
-        </w:tc>
-        <w:tc>
-          <w:tcPr>
-            <w:tcW w:type="dxa" w:w="7060"/>
-            <w:tcMar>
-              <w:top w:type="dxa" w:w="100"/>
-              <w:left w:type="dxa" w:w="140"/>
-              <w:bottom w:type="dxa" w:w="100"/>
-              <w:right w:type="dxa" w:w="140"/>
-            </w:tcMar>
-            <w:vAlign w:val="top"/>
-          </w:tcPr>
-          <w:p>
-            <w:pPr>
-              <w:spacing w:after="40" w:line="264"/>
-            </w:pPr>
-            <w:r>
-              <w:rPr>
-                <w:rFonts w:ascii="Calibri" w:cs="Calibri" w:eastAsia="Calibri" w:hAnsi="Calibri"/>
-              </w:rPr>
-              <w:t xml:space="preserve">Conception des boîtes TEACCH, adaptation des fiches et du matériel.</w:t>
+              <w:t xml:space="preserve">Tâches réalisées en autonomie</w:t>
+            </w:r>
+          </w:p>
+        </w:tc>
+        <w:tc>
+          <w:tcPr>
+            <w:tcW w:type="dxa" w:w="2860"/>
+            <w:tcMar>
+              <w:top w:type="dxa" w:w="100"/>
+              <w:left w:type="dxa" w:w="140"/>
+              <w:bottom w:type="dxa" w:w="100"/>
+              <w:right w:type="dxa" w:w="140"/>
+            </w:tcMar>
+            <w:vAlign w:val="top"/>
+          </w:tcPr>
+          <w:p>
+            <w:pPr>
+              <w:spacing w:after="40" w:line="264"/>
+            </w:pPr>
+            <w:r>
+              <w:rPr>
+                <w:rFonts w:ascii="Calibri" w:cs="Calibri" w:eastAsia="Calibri" w:hAnsi="Calibri"/>
+              </w:rPr>
+              <w:t xml:space="preserve">En hausse d'une période à l'autre</w:t>
+            </w:r>
+          </w:p>
+        </w:tc>
+        <w:tc>
+          <w:tcPr>
+            <w:tcW w:type="dxa" w:w="1900"/>
+            <w:tcMar>
+              <w:top w:type="dxa" w:w="100"/>
+              <w:left w:type="dxa" w:w="140"/>
+              <w:bottom w:type="dxa" w:w="100"/>
+              <w:right w:type="dxa" w:w="140"/>
+            </w:tcMar>
+            <w:vAlign w:val="top"/>
+          </w:tcPr>
+          <w:p>
+            <w:pPr>
+              <w:spacing w:after="40" w:line="264"/>
+            </w:pPr>
+            <w:r>
+              <w:rPr>
+                <w:rFonts w:ascii="Calibri" w:cs="Calibri" w:eastAsia="Calibri" w:hAnsi="Calibri"/>
+              </w:rPr>
+              <w:t xml:space="preserve">Registre d'autonomie</w:t>
+            </w:r>
+          </w:p>
+        </w:tc>
+        <w:tc>
+          <w:tcPr>
+            <w:tcW w:type="dxa" w:w="1900"/>
+            <w:tcMar>
+              <w:top w:type="dxa" w:w="100"/>
+              <w:left w:type="dxa" w:w="140"/>
+              <w:bottom w:type="dxa" w:w="100"/>
+              <w:right w:type="dxa" w:w="140"/>
+            </w:tcMar>
+            <w:vAlign w:val="top"/>
+          </w:tcPr>
+          <w:p>
+            <w:pPr>
+              <w:spacing w:after="40" w:line="264"/>
+            </w:pPr>
+            <w:r>
+              <w:rPr>
+                <w:rFonts w:ascii="Calibri" w:cs="Calibri" w:eastAsia="Calibri" w:hAnsi="Calibri"/>
+              </w:rPr>
+              <w:t xml:space="preserve">Chaque semaine</w:t>
             </w:r>
           </w:p>
         </w:tc>
@@ -4409,7 +6681,7 @@
         </w:trPr>
         <w:tc>
           <w:tcPr>
-            <w:tcW w:type="dxa" w:w="2300"/>
+            <w:tcW w:type="dxa" w:w="2700"/>
             <w:shd w:fill="EAF4E4" w:color="auto" w:val="clear"/>
             <w:tcMar>
               <w:top w:type="dxa" w:w="100"/>
@@ -4429,30 +6701,76 @@
                 <w:b/>
                 <w:bCs/>
               </w:rPr>
-              <w:t xml:space="preserve">Conseillère pédagogique</w:t>
-            </w:r>
-          </w:p>
-        </w:tc>
-        <w:tc>
-          <w:tcPr>
-            <w:tcW w:type="dxa" w:w="7060"/>
-            <w:tcMar>
-              <w:top w:type="dxa" w:w="100"/>
-              <w:left w:type="dxa" w:w="140"/>
-              <w:bottom w:type="dxa" w:w="100"/>
-              <w:right w:type="dxa" w:w="140"/>
-            </w:tcMar>
-            <w:vAlign w:val="top"/>
-          </w:tcPr>
-          <w:p>
-            <w:pPr>
-              <w:spacing w:after="40" w:line="264"/>
-            </w:pPr>
-            <w:r>
-              <w:rPr>
-                <w:rFonts w:ascii="Calibri" w:cs="Calibri" w:eastAsia="Calibri" w:hAnsi="Calibri"/>
-              </w:rPr>
-              <w:t xml:space="preserve">Accompagnement de l'équipe, conformité au programme, suivi des indicateurs et bilan.</w:t>
+              <w:t xml:space="preserve">Interventions de la TES en atelier</w:t>
+            </w:r>
+          </w:p>
+        </w:tc>
+        <w:tc>
+          <w:tcPr>
+            <w:tcW w:type="dxa" w:w="2860"/>
+            <w:tcMar>
+              <w:top w:type="dxa" w:w="100"/>
+              <w:left w:type="dxa" w:w="140"/>
+              <w:bottom w:type="dxa" w:w="100"/>
+              <w:right w:type="dxa" w:w="140"/>
+            </w:tcMar>
+            <w:vAlign w:val="top"/>
+          </w:tcPr>
+          <w:p>
+            <w:pPr>
+              <w:spacing w:after="40" w:line="264"/>
+            </w:pPr>
+            <w:r>
+              <w:rPr>
+                <w:rFonts w:ascii="Calibri" w:cs="Calibri" w:eastAsia="Calibri" w:hAnsi="Calibri"/>
+              </w:rPr>
+              <w:t xml:space="preserve">En baisse d'une période à l'autre</w:t>
+            </w:r>
+          </w:p>
+        </w:tc>
+        <w:tc>
+          <w:tcPr>
+            <w:tcW w:type="dxa" w:w="1900"/>
+            <w:tcMar>
+              <w:top w:type="dxa" w:w="100"/>
+              <w:left w:type="dxa" w:w="140"/>
+              <w:bottom w:type="dxa" w:w="100"/>
+              <w:right w:type="dxa" w:w="140"/>
+            </w:tcMar>
+            <w:vAlign w:val="top"/>
+          </w:tcPr>
+          <w:p>
+            <w:pPr>
+              <w:spacing w:after="40" w:line="264"/>
+            </w:pPr>
+            <w:r>
+              <w:rPr>
+                <w:rFonts w:ascii="Calibri" w:cs="Calibri" w:eastAsia="Calibri" w:hAnsi="Calibri"/>
+              </w:rPr>
+              <w:t xml:space="preserve">Grille d'observation de la TES</w:t>
+            </w:r>
+          </w:p>
+        </w:tc>
+        <w:tc>
+          <w:tcPr>
+            <w:tcW w:type="dxa" w:w="1900"/>
+            <w:tcMar>
+              <w:top w:type="dxa" w:w="100"/>
+              <w:left w:type="dxa" w:w="140"/>
+              <w:bottom w:type="dxa" w:w="100"/>
+              <w:right w:type="dxa" w:w="140"/>
+            </w:tcMar>
+            <w:vAlign w:val="top"/>
+          </w:tcPr>
+          <w:p>
+            <w:pPr>
+              <w:spacing w:after="40" w:line="264"/>
+            </w:pPr>
+            <w:r>
+              <w:rPr>
+                <w:rFonts w:ascii="Calibri" w:cs="Calibri" w:eastAsia="Calibri" w:hAnsi="Calibri"/>
+              </w:rPr>
+              <w:t xml:space="preserve">Chaque semaine</w:t>
             </w:r>
           </w:p>
         </w:tc>
@@ -4463,7 +6781,7 @@
         </w:trPr>
         <w:tc>
           <w:tcPr>
-            <w:tcW w:type="dxa" w:w="2300"/>
+            <w:tcW w:type="dxa" w:w="2700"/>
             <w:shd w:fill="EAF4E4" w:color="auto" w:val="clear"/>
             <w:tcMar>
               <w:top w:type="dxa" w:w="100"/>
@@ -4483,30 +6801,176 @@
                 <w:b/>
                 <w:bCs/>
               </w:rPr>
-              <w:t xml:space="preserve">Élèves leaders</w:t>
-            </w:r>
-          </w:p>
-        </w:tc>
-        <w:tc>
-          <w:tcPr>
-            <w:tcW w:type="dxa" w:w="7060"/>
-            <w:tcMar>
-              <w:top w:type="dxa" w:w="100"/>
-              <w:left w:type="dxa" w:w="140"/>
-              <w:bottom w:type="dxa" w:w="100"/>
-              <w:right w:type="dxa" w:w="140"/>
-            </w:tcMar>
-            <w:vAlign w:val="top"/>
-          </w:tcPr>
-          <w:p>
-            <w:pPr>
-              <w:spacing w:after="40" w:line="264"/>
-            </w:pPr>
-            <w:r>
-              <w:rPr>
-                <w:rFonts w:ascii="Calibri" w:cs="Calibri" w:eastAsia="Calibri" w:hAnsi="Calibri"/>
-              </w:rPr>
-              <w:t xml:space="preserve">Animation des ateliers selon le rôle tournant.</w:t>
+              <w:t xml:space="preserve">Rôle de leader</w:t>
+            </w:r>
+          </w:p>
+        </w:tc>
+        <w:tc>
+          <w:tcPr>
+            <w:tcW w:type="dxa" w:w="2860"/>
+            <w:tcMar>
+              <w:top w:type="dxa" w:w="100"/>
+              <w:left w:type="dxa" w:w="140"/>
+              <w:bottom w:type="dxa" w:w="100"/>
+              <w:right w:type="dxa" w:w="140"/>
+            </w:tcMar>
+            <w:vAlign w:val="top"/>
+          </w:tcPr>
+          <w:p>
+            <w:pPr>
+              <w:spacing w:after="40" w:line="264"/>
+            </w:pPr>
+            <w:r>
+              <w:rPr>
+                <w:rFonts w:ascii="Calibri" w:cs="Calibri" w:eastAsia="Calibri" w:hAnsi="Calibri"/>
+              </w:rPr>
+              <w:t xml:space="preserve">Chaque élève l'a exercé au moins une fois par période</w:t>
+            </w:r>
+          </w:p>
+        </w:tc>
+        <w:tc>
+          <w:tcPr>
+            <w:tcW w:type="dxa" w:w="1900"/>
+            <w:tcMar>
+              <w:top w:type="dxa" w:w="100"/>
+              <w:left w:type="dxa" w:w="140"/>
+              <w:bottom w:type="dxa" w:w="100"/>
+              <w:right w:type="dxa" w:w="140"/>
+            </w:tcMar>
+            <w:vAlign w:val="top"/>
+          </w:tcPr>
+          <w:p>
+            <w:pPr>
+              <w:spacing w:after="40" w:line="264"/>
+            </w:pPr>
+            <w:r>
+              <w:rPr>
+                <w:rFonts w:ascii="Calibri" w:cs="Calibri" w:eastAsia="Calibri" w:hAnsi="Calibri"/>
+              </w:rPr>
+              <w:t xml:space="preserve">Registre d'autonomie</w:t>
+            </w:r>
+          </w:p>
+        </w:tc>
+        <w:tc>
+          <w:tcPr>
+            <w:tcW w:type="dxa" w:w="1900"/>
+            <w:tcMar>
+              <w:top w:type="dxa" w:w="100"/>
+              <w:left w:type="dxa" w:w="140"/>
+              <w:bottom w:type="dxa" w:w="100"/>
+              <w:right w:type="dxa" w:w="140"/>
+            </w:tcMar>
+            <w:vAlign w:val="top"/>
+          </w:tcPr>
+          <w:p>
+            <w:pPr>
+              <w:spacing w:after="40" w:line="264"/>
+            </w:pPr>
+            <w:r>
+              <w:rPr>
+                <w:rFonts w:ascii="Calibri" w:cs="Calibri" w:eastAsia="Calibri" w:hAnsi="Calibri"/>
+              </w:rPr>
+              <w:t xml:space="preserve">Fin de période</w:t>
+            </w:r>
+          </w:p>
+        </w:tc>
+      </w:tr>
+      <w:tr>
+        <w:trPr>
+          <w:cantSplit/>
+        </w:trPr>
+        <w:tc>
+          <w:tcPr>
+            <w:tcW w:type="dxa" w:w="2700"/>
+            <w:shd w:fill="EAF4E4" w:color="auto" w:val="clear"/>
+            <w:tcMar>
+              <w:top w:type="dxa" w:w="100"/>
+              <w:left w:type="dxa" w:w="140"/>
+              <w:bottom w:type="dxa" w:w="100"/>
+              <w:right w:type="dxa" w:w="140"/>
+            </w:tcMar>
+            <w:vAlign w:val="top"/>
+          </w:tcPr>
+          <w:p>
+            <w:pPr>
+              <w:spacing w:after="40" w:line="264"/>
+            </w:pPr>
+            <w:r>
+              <w:rPr>
+                <w:rFonts w:ascii="Calibri" w:cs="Calibri" w:eastAsia="Calibri" w:hAnsi="Calibri"/>
+                <w:b/>
+                <w:bCs/>
+              </w:rPr>
+              <w:t xml:space="preserve">Poursuite en PPS</w:t>
+            </w:r>
+          </w:p>
+        </w:tc>
+        <w:tc>
+          <w:tcPr>
+            <w:tcW w:type="dxa" w:w="2860"/>
+            <w:tcMar>
+              <w:top w:type="dxa" w:w="100"/>
+              <w:left w:type="dxa" w:w="140"/>
+              <w:bottom w:type="dxa" w:w="100"/>
+              <w:right w:type="dxa" w:w="140"/>
+            </w:tcMar>
+            <w:vAlign w:val="top"/>
+          </w:tcPr>
+          <w:p>
+            <w:pPr>
+              <w:spacing w:after="40" w:line="264"/>
+            </w:pPr>
+            <w:r>
+              <w:rPr>
+                <w:rFonts w:ascii="Calibri" w:cs="Calibri" w:eastAsia="Calibri" w:hAnsi="Calibri"/>
+              </w:rPr>
+              <w:t xml:space="preserve">Inscription en année 2</w:t>
+            </w:r>
+          </w:p>
+        </w:tc>
+        <w:tc>
+          <w:tcPr>
+            <w:tcW w:type="dxa" w:w="1900"/>
+            <w:tcMar>
+              <w:top w:type="dxa" w:w="100"/>
+              <w:left w:type="dxa" w:w="140"/>
+              <w:bottom w:type="dxa" w:w="100"/>
+              <w:right w:type="dxa" w:w="140"/>
+            </w:tcMar>
+            <w:vAlign w:val="top"/>
+          </w:tcPr>
+          <w:p>
+            <w:pPr>
+              <w:spacing w:after="40" w:line="264"/>
+            </w:pPr>
+            <w:r>
+              <w:rPr>
+                <w:rFonts w:ascii="Calibri" w:cs="Calibri" w:eastAsia="Calibri" w:hAnsi="Calibri"/>
+              </w:rPr>
+              <w:t xml:space="preserve">Inscriptions</w:t>
+            </w:r>
+          </w:p>
+        </w:tc>
+        <w:tc>
+          <w:tcPr>
+            <w:tcW w:type="dxa" w:w="1900"/>
+            <w:tcMar>
+              <w:top w:type="dxa" w:w="100"/>
+              <w:left w:type="dxa" w:w="140"/>
+              <w:bottom w:type="dxa" w:w="100"/>
+              <w:right w:type="dxa" w:w="140"/>
+            </w:tcMar>
+            <w:vAlign w:val="top"/>
+          </w:tcPr>
+          <w:p>
+            <w:pPr>
+              <w:spacing w:after="40" w:line="264"/>
+            </w:pPr>
+            <w:r>
+              <w:rPr>
+                <w:rFonts w:ascii="Calibri" w:cs="Calibri" w:eastAsia="Calibri" w:hAnsi="Calibri"/>
+              </w:rPr>
+              <w:t xml:space="preserve">Fin de l'année</w:t>
             </w:r>
           </w:p>
         </w:tc>
@@ -4514,15 +6978,18 @@
     </w:tbl>
     <w:p>
       <w:pPr>
-        <w:pStyle w:val="Heading2"/>
+        <w:pStyle w:val="Heading1"/>
         <w:keepNext/>
-        <w:spacing w:after="80" w:before="200"/>
+        <w:pBdr>
+          <w:bottom w:val="single" w:color="2F7A2A" w:sz="6" w:space="4"/>
+        </w:pBdr>
+        <w:spacing w:after="140" w:before="360"/>
       </w:pPr>
       <w:r>
         <w:rPr>
           <w:rFonts w:ascii="Calibri" w:cs="Calibri" w:eastAsia="Calibri" w:hAnsi="Calibri"/>
         </w:rPr>
-        <w:t xml:space="preserve">Comment on saura que ça fonctionne</w:t>
+        <w:t xml:space="preserve">11. Retombées et transférabilité</w:t>
       </w:r>
     </w:p>
     <w:p>
@@ -4540,13 +7007,13 @@
           <w:b/>
           <w:bCs/>
         </w:rPr>
-        <w:t xml:space="preserve">Présence et assiduité</w:t>
-      </w:r>
-      <w:r>
-        <w:rPr>
-          <w:rFonts w:ascii="Calibri" w:cs="Calibri" w:eastAsia="Calibri" w:hAnsi="Calibri"/>
-        </w:rPr>
-        <w:t xml:space="preserve"> des 24 élèves.</w:t>
+        <w:t xml:space="preserve">Pour les élèves :</w:t>
+      </w:r>
+      <w:r>
+        <w:rPr>
+          <w:rFonts w:ascii="Calibri" w:cs="Calibri" w:eastAsia="Calibri" w:hAnsi="Calibri"/>
+        </w:rPr>
+        <w:t xml:space="preserve"> une place au moment où ils sont prêts, plus d'autonomie, de leadership et d'estime de soi.</w:t>
       </w:r>
     </w:p>
     <w:p>
@@ -4564,13 +7031,13 @@
           <w:b/>
           <w:bCs/>
         </w:rPr>
-        <w:t xml:space="preserve">Tâches complétées et validées</w:t>
-      </w:r>
-      <w:r>
-        <w:rPr>
-          <w:rFonts w:ascii="Calibri" w:cs="Calibri" w:eastAsia="Calibri" w:hAnsi="Calibri"/>
-        </w:rPr>
-        <w:t xml:space="preserve"> au registre d'autonomie.</w:t>
+        <w:t xml:space="preserve">Pour le centre :</w:t>
+      </w:r>
+      <w:r>
+        <w:rPr>
+          <w:rFonts w:ascii="Calibri" w:cs="Calibri" w:eastAsia="Calibri" w:hAnsi="Calibri"/>
+        </w:rPr>
+        <w:t xml:space="preserve"> des élèves qui poursuivent en PPS, une meilleure réponse aux références de la FBC, et une utilisation optimale des ressources existantes.</w:t>
       </w:r>
     </w:p>
     <w:p>
@@ -4588,37 +7055,55 @@
           <w:b/>
           <w:bCs/>
         </w:rPr>
-        <w:t xml:space="preserve">Interventions de la TES pendant les ateliers</w:t>
-      </w:r>
-      <w:r>
-        <w:rPr>
-          <w:rFonts w:ascii="Calibri" w:cs="Calibri" w:eastAsia="Calibri" w:hAnsi="Calibri"/>
-        </w:rPr>
-        <w:t xml:space="preserve">, qui devraient diminuer d'une période à l'autre.</w:t>
-      </w:r>
-    </w:p>
-    <w:p>
-      <w:pPr>
-        <w:pStyle w:val="ListParagraph"/>
-        <w:numPr>
-          <w:ilvl w:val="0"/>
-          <w:numId w:val="2"/>
-        </w:numPr>
-        <w:spacing w:after="80" w:line="276"/>
-      </w:pPr>
+        <w:t xml:space="preserve">Pour d'autres services :</w:t>
+      </w:r>
+      <w:r>
+        <w:rPr>
+          <w:rFonts w:ascii="Calibri" w:cs="Calibri" w:eastAsia="Calibri" w:hAnsi="Calibri"/>
+        </w:rPr>
+        <w:t xml:space="preserve"> une formule où la collaboration est au cœur de l'apprentissage, qui pourrait s'appliquer en </w:t>
+      </w:r>
       <w:r>
         <w:rPr>
           <w:rFonts w:ascii="Calibri" w:cs="Calibri" w:eastAsia="Calibri" w:hAnsi="Calibri"/>
           <w:b/>
           <w:bCs/>
         </w:rPr>
-        <w:t xml:space="preserve">Poursuite en année 2</w:t>
-      </w:r>
-      <w:r>
-        <w:rPr>
-          <w:rFonts w:ascii="Calibri" w:cs="Calibri" w:eastAsia="Calibri" w:hAnsi="Calibri"/>
-        </w:rPr>
-        <w:t xml:space="preserve"> de PPS à la fin du parcours.</w:t>
+        <w:t xml:space="preserve">alpha-pré</w:t>
+      </w:r>
+      <w:r>
+        <w:rPr>
+          <w:rFonts w:ascii="Calibri" w:cs="Calibri" w:eastAsia="Calibri" w:hAnsi="Calibri"/>
+        </w:rPr>
+        <w:t xml:space="preserve">, en </w:t>
+      </w:r>
+      <w:r>
+        <w:rPr>
+          <w:rFonts w:ascii="Calibri" w:cs="Calibri" w:eastAsia="Calibri" w:hAnsi="Calibri"/>
+          <w:b/>
+          <w:bCs/>
+        </w:rPr>
+        <w:t xml:space="preserve">francisation</w:t>
+      </w:r>
+      <w:r>
+        <w:rPr>
+          <w:rFonts w:ascii="Calibri" w:cs="Calibri" w:eastAsia="Calibri" w:hAnsi="Calibri"/>
+        </w:rPr>
+        <w:t xml:space="preserve">, à la </w:t>
+      </w:r>
+      <w:r>
+        <w:rPr>
+          <w:rFonts w:ascii="Calibri" w:cs="Calibri" w:eastAsia="Calibri" w:hAnsi="Calibri"/>
+          <w:b/>
+          <w:bCs/>
+        </w:rPr>
+        <w:t xml:space="preserve">FBC</w:t>
+      </w:r>
+      <w:r>
+        <w:rPr>
+          <w:rFonts w:ascii="Calibri" w:cs="Calibri" w:eastAsia="Calibri" w:hAnsi="Calibri"/>
+        </w:rPr>
+        <w:t xml:space="preserve"> et ailleurs au centre.</w:t>
       </w:r>
     </w:p>
     <w:p>
@@ -4634,7 +7119,7 @@
         <w:rPr>
           <w:rFonts w:ascii="Calibri" w:cs="Calibri" w:eastAsia="Calibri" w:hAnsi="Calibri"/>
         </w:rPr>
-        <w:t xml:space="preserve">7. Au-delà du Z101</w:t>
+        <w:t xml:space="preserve">12. Décision demandée et prochaines étapes</w:t>
       </w:r>
     </w:p>
     <w:p>
@@ -4645,65 +7130,7 @@
         <w:rPr>
           <w:rFonts w:ascii="Calibri" w:cs="Calibri" w:eastAsia="Calibri" w:hAnsi="Calibri"/>
         </w:rPr>
-        <w:t xml:space="preserve">Cette formule met la collaboration au cœur de l'apprentissage. Si elle fonctionne en Z101, elle pourrait s'appliquer en </w:t>
-      </w:r>
-      <w:r>
-        <w:rPr>
-          <w:rFonts w:ascii="Calibri" w:cs="Calibri" w:eastAsia="Calibri" w:hAnsi="Calibri"/>
-          <w:b/>
-          <w:bCs/>
-        </w:rPr>
-        <w:t xml:space="preserve">alpha-pré</w:t>
-      </w:r>
-      <w:r>
-        <w:rPr>
-          <w:rFonts w:ascii="Calibri" w:cs="Calibri" w:eastAsia="Calibri" w:hAnsi="Calibri"/>
-        </w:rPr>
-        <w:t xml:space="preserve">, en </w:t>
-      </w:r>
-      <w:r>
-        <w:rPr>
-          <w:rFonts w:ascii="Calibri" w:cs="Calibri" w:eastAsia="Calibri" w:hAnsi="Calibri"/>
-          <w:b/>
-          <w:bCs/>
-        </w:rPr>
-        <w:t xml:space="preserve">francisation</w:t>
-      </w:r>
-      <w:r>
-        <w:rPr>
-          <w:rFonts w:ascii="Calibri" w:cs="Calibri" w:eastAsia="Calibri" w:hAnsi="Calibri"/>
-        </w:rPr>
-        <w:t xml:space="preserve">, à la </w:t>
-      </w:r>
-      <w:r>
-        <w:rPr>
-          <w:rFonts w:ascii="Calibri" w:cs="Calibri" w:eastAsia="Calibri" w:hAnsi="Calibri"/>
-          <w:b/>
-          <w:bCs/>
-        </w:rPr>
-        <w:t xml:space="preserve">FBC</w:t>
-      </w:r>
-      <w:r>
-        <w:rPr>
-          <w:rFonts w:ascii="Calibri" w:cs="Calibri" w:eastAsia="Calibri" w:hAnsi="Calibri"/>
-        </w:rPr>
-        <w:t xml:space="preserve"> et ailleurs au centre : partout où l'on veut accueillir plus d'élèves et développer leur autonomie avec les ressources existantes.</w:t>
-      </w:r>
-    </w:p>
-    <w:p>
-      <w:pPr>
-        <w:pStyle w:val="Heading1"/>
-        <w:keepNext/>
-        <w:pBdr>
-          <w:bottom w:val="single" w:color="2F7A2A" w:sz="6" w:space="4"/>
-        </w:pBdr>
-        <w:spacing w:after="140" w:before="360"/>
-      </w:pPr>
-      <w:r>
-        <w:rPr>
-          <w:rFonts w:ascii="Calibri" w:cs="Calibri" w:eastAsia="Calibri" w:hAnsi="Calibri"/>
-        </w:rPr>
-        <w:t xml:space="preserve">8. Ce que nous demandons</w:t>
+        <w:t xml:space="preserve">Nous demandons à la table des directions :</w:t>
       </w:r>
     </w:p>
     <w:p>
@@ -4721,7 +7148,7 @@
           <w:b/>
           <w:bCs/>
         </w:rPr>
-        <w:t xml:space="preserve">Rouvrir les inscriptions au Z101</w:t>
+        <w:t xml:space="preserve">De rouvrir les inscriptions au Z101</w:t>
       </w:r>
       <w:r>
         <w:rPr>
@@ -4745,7 +7172,7 @@
           <w:b/>
           <w:bCs/>
         </w:rPr>
-        <w:t xml:space="preserve">Autoriser la formule en deux sous-groupes</w:t>
+        <w:t xml:space="preserve">D'autoriser la formule en deux sous-groupes</w:t>
       </w:r>
       <w:r>
         <w:rPr>
@@ -4769,18 +7196,53 @@
           <w:b/>
           <w:bCs/>
         </w:rPr>
-        <w:t xml:space="preserve">Prévoir un bilan</w:t>
-      </w:r>
-      <w:r>
-        <w:rPr>
-          <w:rFonts w:ascii="Calibri" w:cs="Calibri" w:eastAsia="Calibri" w:hAnsi="Calibri"/>
-        </w:rPr>
-        <w:t xml:space="preserve"> à la fin de la période d'ancrage, à partir des indicateurs de la section 6.</w:t>
+        <w:t xml:space="preserve">De confirmer les locaux et l'horaire de la TES</w:t>
+      </w:r>
+      <w:r>
+        <w:rPr>
+          <w:rFonts w:ascii="Calibri" w:cs="Calibri" w:eastAsia="Calibri" w:hAnsi="Calibri"/>
+        </w:rPr>
+        <w:t xml:space="preserve"> pour les matinées d'ateliers.</w:t>
       </w:r>
     </w:p>
     <w:p>
       <w:pPr>
-        <w:spacing w:after="200"/>
+        <w:pStyle w:val="ListParagraph"/>
+        <w:numPr>
+          <w:ilvl w:val="0"/>
+          <w:numId w:val="3"/>
+        </w:numPr>
+        <w:spacing w:after="80" w:line="276"/>
+      </w:pPr>
+      <w:r>
+        <w:rPr>
+          <w:rFonts w:ascii="Calibri" w:cs="Calibri" w:eastAsia="Calibri" w:hAnsi="Calibri"/>
+          <w:b/>
+          <w:bCs/>
+        </w:rPr>
+        <w:t xml:space="preserve">De recevoir un bilan</w:t>
+      </w:r>
+      <w:r>
+        <w:rPr>
+          <w:rFonts w:ascii="Calibri" w:cs="Calibri" w:eastAsia="Calibri" w:hAnsi="Calibri"/>
+        </w:rPr>
+        <w:t xml:space="preserve"> à la fin de la période d'ancrage.</w:t>
+      </w:r>
+    </w:p>
+    <w:p>
+      <w:pPr>
+        <w:spacing w:after="120" w:line="288"/>
+      </w:pPr>
+      <w:r>
+        <w:rPr>
+          <w:rFonts w:ascii="Calibri" w:cs="Calibri" w:eastAsia="Calibri" w:hAnsi="Calibri"/>
+        </w:rPr>
+        <w:t xml:space="preserve">Dès l'acceptation, l'équipe peut contacter les élèves et démarrer selon l'échéancier de la section 6.</w:t>
+      </w:r>
+    </w:p>
+    <w:p>
+      <w:pPr>
+        <w:spacing w:after="160"/>
       </w:pPr>
     </w:p>
     <w:tbl>
@@ -4918,7 +7380,7 @@
         <w:sz w:val="16"/>
         <w:szCs w:val="16"/>
       </w:rPr>
-      <w:t xml:space="preserve">Projet PPS Z101 · Proposition à la table des directions · page </w:t>
+      <w:t xml:space="preserve">Présentation de projet · PPS Z101 · page </w:t>
     </w:r>
     <w:r>
       <w:rPr>

</xml_diff>

<commit_message>
Corrige l'horaire réel et ajoute le rôle des leaders au projet Z101
Menu du matin en trois périodes d'une heure, sous-groupe PPS pur avec
1 h 25 de Z101, phases renommées en étapes, locaux des ateliers
exploratoires et circulation de l'enseignante.

Co-Authored-By: Claude Opus 5.5 <noreply@anthropic.com>
Claude-Session: https://claude.ai/code/session_01GMdriyBYj6aFRdtmm4tFaT
</commit_message>
<xml_diff>
--- a/documents/z101/Projet-Z101.docx
+++ b/documents/z101/Projet-Z101.docx
@@ -437,13 +437,13 @@
                 <w:b/>
                 <w:bCs/>
               </w:rPr>
-              <w:t xml:space="preserve">deux sous-groupes de 12</w:t>
-            </w:r>
-            <w:r>
-              <w:rPr>
-                <w:rFonts w:ascii="Calibri" w:cs="Calibri" w:eastAsia="Calibri" w:hAnsi="Calibri"/>
-              </w:rPr>
-              <w:t xml:space="preserve"> qui alternent entre l'enseignement direct et des ateliers autonomes structurés.</w:t>
+              <w:t xml:space="preserve">deux sous-groupes</w:t>
+            </w:r>
+            <w:r>
+              <w:rPr>
+                <w:rFonts w:ascii="Calibri" w:cs="Calibri" w:eastAsia="Calibri" w:hAnsi="Calibri"/>
+              </w:rPr>
+              <w:t xml:space="preserve"> qui alternent entre le Z101 avec l'enseignante et des ateliers exploratoires structurés. Les élèves en PPS pur, qui ont besoin de plus de soutien, ont plus de temps en Z101.</w:t>
             </w:r>
           </w:p>
         </w:tc>
@@ -667,7 +667,7 @@
               <w:rPr>
                 <w:rFonts w:ascii="Calibri" w:cs="Calibri" w:eastAsia="Calibri" w:hAnsi="Calibri"/>
               </w:rPr>
-              <w:t xml:space="preserve">Projet pilote à partir de l'acceptation, en trois périodes, avec un premier bilan à la fin de la période d'ancrage.</w:t>
+              <w:t xml:space="preserve">Projet pilote à partir de l'acceptation, en trois étapes, avec un premier bilan à la fin de la étape d'ancrage.</w:t>
             </w:r>
           </w:p>
         </w:tc>
@@ -1153,7 +1153,7 @@
               <w:rPr>
                 <w:rFonts w:ascii="Calibri" w:cs="Calibri" w:eastAsia="Calibri" w:hAnsi="Calibri"/>
               </w:rPr>
-              <w:t xml:space="preserve">La formule peut devenir un modèle pour d'autres services du centre (section 10).</w:t>
+              <w:t xml:space="preserve">La formule peut devenir un modèle pour d'autres services du centre (section 12).</w:t>
             </w:r>
           </w:p>
         </w:tc>
@@ -1252,7 +1252,7 @@
         <w:rPr>
           <w:rFonts w:ascii="Calibri" w:cs="Calibri" w:eastAsia="Calibri" w:hAnsi="Calibri"/>
         </w:rPr>
-        <w:t xml:space="preserve"> des élèves en atelier, au point où les adultes peuvent enseigner de façon ciblée (période 3).</w:t>
+        <w:t xml:space="preserve"> des élèves en atelier, au point où les adultes peuvent enseigner de façon ciblée (étape 3).</w:t>
       </w:r>
     </w:p>
     <w:p>
@@ -1335,13 +1335,13 @@
           <w:b/>
           <w:bCs/>
         </w:rPr>
-        <w:t xml:space="preserve">deux sous-groupes de 12 (A et B)</w:t>
-      </w:r>
-      <w:r>
-        <w:rPr>
-          <w:rFonts w:ascii="Calibri" w:cs="Calibri" w:eastAsia="Calibri" w:hAnsi="Calibri"/>
-        </w:rPr>
-        <w:t xml:space="preserve">, composés d'élèves de profils variés. Pendant que l'un reçoit l'enseignement direct du Z101 avec l'enseignante, l'autre travaille en </w:t>
+        <w:t xml:space="preserve">deux sous-groupes</w:t>
+      </w:r>
+      <w:r>
+        <w:rPr>
+          <w:rFonts w:ascii="Calibri" w:cs="Calibri" w:eastAsia="Calibri" w:hAnsi="Calibri"/>
+        </w:rPr>
+        <w:t xml:space="preserve">. Le </w:t>
       </w:r>
       <w:r>
         <w:rPr>
@@ -1349,13 +1349,80 @@
           <w:b/>
           <w:bCs/>
         </w:rPr>
-        <w:t xml:space="preserve">ateliers autonomes</w:t>
-      </w:r>
-      <w:r>
-        <w:rPr>
-          <w:rFonts w:ascii="Calibri" w:cs="Calibri" w:eastAsia="Calibri" w:hAnsi="Calibri"/>
-        </w:rPr>
-        <w:t xml:space="preserve">. Les sous-groupes changent de place à mi-matinée. Chaque élève est donc toujours en apprentissage encadré.</w:t>
+        <w:t xml:space="preserve">sous-groupe 1</w:t>
+      </w:r>
+      <w:r>
+        <w:rPr>
+          <w:rFonts w:ascii="Calibri" w:cs="Calibri" w:eastAsia="Calibri" w:hAnsi="Calibri"/>
+        </w:rPr>
+        <w:t xml:space="preserve"> réunit les élèves en </w:t>
+      </w:r>
+      <w:r>
+        <w:rPr>
+          <w:rFonts w:ascii="Calibri" w:cs="Calibri" w:eastAsia="Calibri" w:hAnsi="Calibri"/>
+          <w:b/>
+          <w:bCs/>
+        </w:rPr>
+        <w:t xml:space="preserve">PPS pur</w:t>
+      </w:r>
+      <w:r>
+        <w:rPr>
+          <w:rFonts w:ascii="Calibri" w:cs="Calibri" w:eastAsia="Calibri" w:hAnsi="Calibri"/>
+        </w:rPr>
+        <w:t xml:space="preserve">, qui ont généralement besoin de plus de soutien : ils reçoivent donc plus de temps en Z101. Le </w:t>
+      </w:r>
+      <w:r>
+        <w:rPr>
+          <w:rFonts w:ascii="Calibri" w:cs="Calibri" w:eastAsia="Calibri" w:hAnsi="Calibri"/>
+          <w:b/>
+          <w:bCs/>
+        </w:rPr>
+        <w:t xml:space="preserve">sous-groupe 2</w:t>
+      </w:r>
+      <w:r>
+        <w:rPr>
+          <w:rFonts w:ascii="Calibri" w:cs="Calibri" w:eastAsia="Calibri" w:hAnsi="Calibri"/>
+        </w:rPr>
+        <w:t xml:space="preserve"> réunit les autres élèves.</w:t>
+      </w:r>
+    </w:p>
+    <w:p>
+      <w:pPr>
+        <w:spacing w:after="120" w:line="288"/>
+      </w:pPr>
+      <w:r>
+        <w:rPr>
+          <w:rFonts w:ascii="Calibri" w:cs="Calibri" w:eastAsia="Calibri" w:hAnsi="Calibri"/>
+        </w:rPr>
+        <w:t xml:space="preserve">Pendant que l'un des sous-groupes est en </w:t>
+      </w:r>
+      <w:r>
+        <w:rPr>
+          <w:rFonts w:ascii="Calibri" w:cs="Calibri" w:eastAsia="Calibri" w:hAnsi="Calibri"/>
+          <w:b/>
+          <w:bCs/>
+        </w:rPr>
+        <w:t xml:space="preserve">Z101 avec l'enseignante</w:t>
+      </w:r>
+      <w:r>
+        <w:rPr>
+          <w:rFonts w:ascii="Calibri" w:cs="Calibri" w:eastAsia="Calibri" w:hAnsi="Calibri"/>
+        </w:rPr>
+        <w:t xml:space="preserve">, l'autre est en </w:t>
+      </w:r>
+      <w:r>
+        <w:rPr>
+          <w:rFonts w:ascii="Calibri" w:cs="Calibri" w:eastAsia="Calibri" w:hAnsi="Calibri"/>
+          <w:b/>
+          <w:bCs/>
+        </w:rPr>
+        <w:t xml:space="preserve">atelier exploratoire</w:t>
+      </w:r>
+      <w:r>
+        <w:rPr>
+          <w:rFonts w:ascii="Calibri" w:cs="Calibri" w:eastAsia="Calibri" w:hAnsi="Calibri"/>
+        </w:rPr>
+        <w:t xml:space="preserve">, guidé par une fiche de tâche et une équipe de leaders. Les sous-groupes changent de place à la troisième période. Chaque élève est donc toujours en apprentissage encadré.</w:t>
       </w:r>
     </w:p>
     <w:p>
@@ -1482,13 +1549,13 @@
           <w:b/>
           <w:bCs/>
         </w:rPr>
-        <w:t xml:space="preserve">Plateaux et chariots TEACCH :</w:t>
-      </w:r>
-      <w:r>
-        <w:rPr>
-          <w:rFonts w:ascii="Calibri" w:cs="Calibri" w:eastAsia="Calibri" w:hAnsi="Calibri"/>
-        </w:rPr>
-        <w:t xml:space="preserve"> ateliers en cuisine et au grenier, postes de travail visuels et structurés.</w:t>
+        <w:t xml:space="preserve">Deux lieux d'ateliers exploratoires :</w:t>
+      </w:r>
+      <w:r>
+        <w:rPr>
+          <w:rFonts w:ascii="Calibri" w:cs="Calibri" w:eastAsia="Calibri" w:hAnsi="Calibri"/>
+        </w:rPr>
+        <w:t xml:space="preserve"> le grenier de Maria, juste à côté de la classe de Mme Lisa, et le local d'arts plastiques, un grand local actuellement libre.</w:t>
       </w:r>
     </w:p>
     <w:p>
@@ -1506,13 +1573,37 @@
           <w:b/>
           <w:bCs/>
         </w:rPr>
+        <w:t xml:space="preserve">Chariots TEACCH :</w:t>
+      </w:r>
+      <w:r>
+        <w:rPr>
+          <w:rFonts w:ascii="Calibri" w:cs="Calibri" w:eastAsia="Calibri" w:hAnsi="Calibri"/>
+        </w:rPr>
+        <w:t xml:space="preserve"> postes de travail visuels et structurés, partagés avec l'alpha-pré et la DAP.</w:t>
+      </w:r>
+    </w:p>
+    <w:p>
+      <w:pPr>
+        <w:pStyle w:val="ListParagraph"/>
+        <w:numPr>
+          <w:ilvl w:val="0"/>
+          <w:numId w:val="2"/>
+        </w:numPr>
+        <w:spacing w:after="80" w:line="276"/>
+      </w:pPr>
+      <w:r>
+        <w:rPr>
+          <w:rFonts w:ascii="Calibri" w:cs="Calibri" w:eastAsia="Calibri" w:hAnsi="Calibri"/>
+          <w:b/>
+          <w:bCs/>
+        </w:rPr>
         <w:t xml:space="preserve">Tableau de programmation :</w:t>
       </w:r>
       <w:r>
         <w:rPr>
           <w:rFonts w:ascii="Calibri" w:cs="Calibri" w:eastAsia="Calibri" w:hAnsi="Calibri"/>
         </w:rPr>
-        <w:t xml:space="preserve"> chaque bloc de la matinée est planifié et affiché. Aucune période n'est laissée vide.</w:t>
+        <w:t xml:space="preserve"> chaque bloc de la matinée est planifié et affiché. Aucun moment n'est laissé vide.</w:t>
       </w:r>
     </w:p>
     <w:p>
@@ -1533,6 +1624,1071 @@
     </w:p>
     <w:p>
       <w:pPr>
+        <w:spacing w:after="120" w:line="288"/>
+      </w:pPr>
+      <w:r>
+        <w:rPr>
+          <w:rFonts w:ascii="Calibri" w:cs="Calibri" w:eastAsia="Calibri" w:hAnsi="Calibri"/>
+        </w:rPr>
+        <w:t xml:space="preserve">La matinée compte </w:t>
+      </w:r>
+      <w:r>
+        <w:rPr>
+          <w:rFonts w:ascii="Calibri" w:cs="Calibri" w:eastAsia="Calibri" w:hAnsi="Calibri"/>
+          <w:b/>
+          <w:bCs/>
+        </w:rPr>
+        <w:t xml:space="preserve">trois périodes d'une heure</w:t>
+      </w:r>
+      <w:r>
+        <w:rPr>
+          <w:rFonts w:ascii="Calibri" w:cs="Calibri" w:eastAsia="Calibri" w:hAnsi="Calibri"/>
+        </w:rPr>
+        <w:t xml:space="preserve">, séparées par deux pauses de 10 minutes.</w:t>
+      </w:r>
+    </w:p>
+    <w:tbl>
+      <w:tblPr>
+        <w:tblW w:type="dxa" w:w="9360"/>
+        <w:tblBorders>
+          <w:top w:val="single" w:color="CFD4DC" w:sz="4"/>
+          <w:left w:val="single" w:color="CFD4DC" w:sz="4"/>
+          <w:bottom w:val="single" w:color="CFD4DC" w:sz="4"/>
+          <w:right w:val="single" w:color="CFD4DC" w:sz="4"/>
+          <w:insideH w:val="single" w:color="CFD4DC" w:sz="4"/>
+          <w:insideV w:val="single" w:color="CFD4DC" w:sz="4"/>
+        </w:tblBorders>
+        <w:tblLayout w:type="fixed"/>
+      </w:tblPr>
+      <w:tblGrid>
+        <w:gridCol w:w="1500"/>
+        <w:gridCol w:w="1300"/>
+        <w:gridCol w:w="3280"/>
+        <w:gridCol w:w="3280"/>
+      </w:tblGrid>
+      <w:tr>
+        <w:trPr>
+          <w:tblHeader/>
+        </w:trPr>
+        <w:tc>
+          <w:tcPr>
+            <w:tcW w:type="dxa" w:w="1500"/>
+            <w:shd w:fill="1D3557" w:color="auto" w:val="clear"/>
+            <w:tcMar>
+              <w:top w:type="dxa" w:w="100"/>
+              <w:left w:type="dxa" w:w="140"/>
+              <w:bottom w:type="dxa" w:w="100"/>
+              <w:right w:type="dxa" w:w="140"/>
+            </w:tcMar>
+            <w:vAlign w:val="top"/>
+          </w:tcPr>
+          <w:p>
+            <w:pPr>
+              <w:spacing w:after="0"/>
+            </w:pPr>
+            <w:r>
+              <w:rPr>
+                <w:rFonts w:ascii="Calibri" w:cs="Calibri" w:eastAsia="Calibri" w:hAnsi="Calibri"/>
+                <w:b/>
+                <w:bCs/>
+                <w:color w:val="FFFFFF"/>
+                <w:sz w:val="20"/>
+                <w:szCs w:val="20"/>
+              </w:rPr>
+              <w:t xml:space="preserve">Heure</w:t>
+            </w:r>
+          </w:p>
+        </w:tc>
+        <w:tc>
+          <w:tcPr>
+            <w:tcW w:type="dxa" w:w="1300"/>
+            <w:shd w:fill="1D3557" w:color="auto" w:val="clear"/>
+            <w:tcMar>
+              <w:top w:type="dxa" w:w="100"/>
+              <w:left w:type="dxa" w:w="140"/>
+              <w:bottom w:type="dxa" w:w="100"/>
+              <w:right w:type="dxa" w:w="140"/>
+            </w:tcMar>
+            <w:vAlign w:val="top"/>
+          </w:tcPr>
+          <w:p>
+            <w:pPr>
+              <w:spacing w:after="0"/>
+            </w:pPr>
+            <w:r>
+              <w:rPr>
+                <w:rFonts w:ascii="Calibri" w:cs="Calibri" w:eastAsia="Calibri" w:hAnsi="Calibri"/>
+                <w:b/>
+                <w:bCs/>
+                <w:color w:val="FFFFFF"/>
+                <w:sz w:val="20"/>
+                <w:szCs w:val="20"/>
+              </w:rPr>
+              <w:t xml:space="preserve">Période</w:t>
+            </w:r>
+          </w:p>
+        </w:tc>
+        <w:tc>
+          <w:tcPr>
+            <w:tcW w:type="dxa" w:w="3280"/>
+            <w:shd w:fill="1D3557" w:color="auto" w:val="clear"/>
+            <w:tcMar>
+              <w:top w:type="dxa" w:w="100"/>
+              <w:left w:type="dxa" w:w="140"/>
+              <w:bottom w:type="dxa" w:w="100"/>
+              <w:right w:type="dxa" w:w="140"/>
+            </w:tcMar>
+            <w:vAlign w:val="top"/>
+          </w:tcPr>
+          <w:p>
+            <w:pPr>
+              <w:spacing w:after="0"/>
+            </w:pPr>
+            <w:r>
+              <w:rPr>
+                <w:rFonts w:ascii="Calibri" w:cs="Calibri" w:eastAsia="Calibri" w:hAnsi="Calibri"/>
+                <w:b/>
+                <w:bCs/>
+                <w:color w:val="FFFFFF"/>
+                <w:sz w:val="20"/>
+                <w:szCs w:val="20"/>
+              </w:rPr>
+              <w:t xml:space="preserve">Sous-groupe 1 : PPS pur</w:t>
+            </w:r>
+          </w:p>
+        </w:tc>
+        <w:tc>
+          <w:tcPr>
+            <w:tcW w:type="dxa" w:w="3280"/>
+            <w:shd w:fill="1D3557" w:color="auto" w:val="clear"/>
+            <w:tcMar>
+              <w:top w:type="dxa" w:w="100"/>
+              <w:left w:type="dxa" w:w="140"/>
+              <w:bottom w:type="dxa" w:w="100"/>
+              <w:right w:type="dxa" w:w="140"/>
+            </w:tcMar>
+            <w:vAlign w:val="top"/>
+          </w:tcPr>
+          <w:p>
+            <w:pPr>
+              <w:spacing w:after="0"/>
+            </w:pPr>
+            <w:r>
+              <w:rPr>
+                <w:rFonts w:ascii="Calibri" w:cs="Calibri" w:eastAsia="Calibri" w:hAnsi="Calibri"/>
+                <w:b/>
+                <w:bCs/>
+                <w:color w:val="FFFFFF"/>
+                <w:sz w:val="20"/>
+                <w:szCs w:val="20"/>
+              </w:rPr>
+              <w:t xml:space="preserve">Sous-groupe 2</w:t>
+            </w:r>
+          </w:p>
+        </w:tc>
+      </w:tr>
+      <w:tr>
+        <w:trPr>
+          <w:cantSplit/>
+        </w:trPr>
+        <w:tc>
+          <w:tcPr>
+            <w:tcW w:type="dxa" w:w="1500"/>
+            <w:shd w:fill="F4F5F7" w:color="auto" w:val="clear"/>
+            <w:tcMar>
+              <w:top w:type="dxa" w:w="100"/>
+              <w:left w:type="dxa" w:w="140"/>
+              <w:bottom w:type="dxa" w:w="100"/>
+              <w:right w:type="dxa" w:w="140"/>
+            </w:tcMar>
+            <w:vAlign w:val="top"/>
+          </w:tcPr>
+          <w:p>
+            <w:pPr>
+              <w:spacing w:after="40" w:line="264"/>
+            </w:pPr>
+            <w:r>
+              <w:rPr>
+                <w:rFonts w:ascii="Calibri" w:cs="Calibri" w:eastAsia="Calibri" w:hAnsi="Calibri"/>
+                <w:b/>
+                <w:bCs/>
+              </w:rPr>
+              <w:t xml:space="preserve">8 h 25 à 9 h 00</w:t>
+            </w:r>
+          </w:p>
+        </w:tc>
+        <w:tc>
+          <w:tcPr>
+            <w:tcW w:type="dxa" w:w="1300"/>
+            <w:shd w:fill="F4F5F7" w:color="auto" w:val="clear"/>
+            <w:tcMar>
+              <w:top w:type="dxa" w:w="100"/>
+              <w:left w:type="dxa" w:w="140"/>
+              <w:bottom w:type="dxa" w:w="100"/>
+              <w:right w:type="dxa" w:w="140"/>
+            </w:tcMar>
+            <w:vAlign w:val="top"/>
+          </w:tcPr>
+          <w:p>
+            <w:pPr>
+              <w:spacing w:after="40" w:line="264"/>
+            </w:pPr>
+            <w:r>
+              <w:rPr>
+                <w:rFonts w:ascii="Calibri" w:cs="Calibri" w:eastAsia="Calibri" w:hAnsi="Calibri"/>
+                <w:b/>
+                <w:bCs/>
+              </w:rPr>
+              <w:t xml:space="preserve">Période 1</w:t>
+            </w:r>
+          </w:p>
+        </w:tc>
+        <w:tc>
+          <w:tcPr>
+            <w:tcW w:type="dxa" w:w="6560"/>
+            <w:gridSpan w:val="2"/>
+            <w:shd w:fill="FDF6DD" w:color="auto" w:val="clear"/>
+            <w:tcMar>
+              <w:top w:type="dxa" w:w="100"/>
+              <w:left w:type="dxa" w:w="140"/>
+              <w:bottom w:type="dxa" w:w="100"/>
+              <w:right w:type="dxa" w:w="140"/>
+            </w:tcMar>
+            <w:vAlign w:val="top"/>
+          </w:tcPr>
+          <w:p>
+            <w:pPr>
+              <w:spacing w:after="40" w:line="264"/>
+            </w:pPr>
+            <w:r>
+              <w:rPr>
+                <w:rFonts w:ascii="Calibri" w:cs="Calibri" w:eastAsia="Calibri" w:hAnsi="Calibri"/>
+                <w:b/>
+                <w:bCs/>
+              </w:rPr>
+              <w:t xml:space="preserve">Tout le groupe :</w:t>
+            </w:r>
+            <w:r>
+              <w:rPr>
+                <w:rFonts w:ascii="Calibri" w:cs="Calibri" w:eastAsia="Calibri" w:hAnsi="Calibri"/>
+              </w:rPr>
+              <w:t xml:space="preserve"> accueil et rassemblement, présentation du menu du matin, formation des équipes de leaders.</w:t>
+            </w:r>
+          </w:p>
+        </w:tc>
+      </w:tr>
+      <w:tr>
+        <w:trPr>
+          <w:cantSplit/>
+        </w:trPr>
+        <w:tc>
+          <w:tcPr>
+            <w:tcW w:type="dxa" w:w="1500"/>
+            <w:shd w:fill="F4F5F7" w:color="auto" w:val="clear"/>
+            <w:tcMar>
+              <w:top w:type="dxa" w:w="100"/>
+              <w:left w:type="dxa" w:w="140"/>
+              <w:bottom w:type="dxa" w:w="100"/>
+              <w:right w:type="dxa" w:w="140"/>
+            </w:tcMar>
+            <w:vAlign w:val="top"/>
+          </w:tcPr>
+          <w:p>
+            <w:pPr>
+              <w:spacing w:after="40" w:line="264"/>
+            </w:pPr>
+            <w:r>
+              <w:rPr>
+                <w:rFonts w:ascii="Calibri" w:cs="Calibri" w:eastAsia="Calibri" w:hAnsi="Calibri"/>
+                <w:b/>
+                <w:bCs/>
+              </w:rPr>
+              <w:t xml:space="preserve">9 h 00 à 9 h 25</w:t>
+            </w:r>
+          </w:p>
+        </w:tc>
+        <w:tc>
+          <w:tcPr>
+            <w:tcW w:type="dxa" w:w="1300"/>
+            <w:shd w:fill="F4F5F7" w:color="auto" w:val="clear"/>
+            <w:tcMar>
+              <w:top w:type="dxa" w:w="100"/>
+              <w:left w:type="dxa" w:w="140"/>
+              <w:bottom w:type="dxa" w:w="100"/>
+              <w:right w:type="dxa" w:w="140"/>
+            </w:tcMar>
+            <w:vAlign w:val="top"/>
+          </w:tcPr>
+          <w:p>
+            <w:pPr>
+              <w:spacing w:after="40" w:line="264"/>
+            </w:pPr>
+            <w:r>
+              <w:rPr>
+                <w:rFonts w:ascii="Calibri" w:cs="Calibri" w:eastAsia="Calibri" w:hAnsi="Calibri"/>
+                <w:b/>
+                <w:bCs/>
+              </w:rPr>
+              <w:t xml:space="preserve">Période 1</w:t>
+            </w:r>
+          </w:p>
+        </w:tc>
+        <w:tc>
+          <w:tcPr>
+            <w:tcW w:type="dxa" w:w="3280"/>
+            <w:shd w:fill="E8F0FB" w:color="auto" w:val="clear"/>
+            <w:tcMar>
+              <w:top w:type="dxa" w:w="100"/>
+              <w:left w:type="dxa" w:w="140"/>
+              <w:bottom w:type="dxa" w:w="100"/>
+              <w:right w:type="dxa" w:w="140"/>
+            </w:tcMar>
+            <w:vAlign w:val="top"/>
+          </w:tcPr>
+          <w:p>
+            <w:pPr>
+              <w:spacing w:after="40" w:line="264"/>
+            </w:pPr>
+            <w:r>
+              <w:rPr>
+                <w:rFonts w:ascii="Calibri" w:cs="Calibri" w:eastAsia="Calibri" w:hAnsi="Calibri"/>
+                <w:b/>
+                <w:bCs/>
+              </w:rPr>
+              <w:t xml:space="preserve">Z101</w:t>
+            </w:r>
+            <w:r>
+              <w:rPr>
+                <w:rFonts w:ascii="Calibri" w:cs="Calibri" w:eastAsia="Calibri" w:hAnsi="Calibri"/>
+              </w:rPr>
+              <w:t xml:space="preserve"> avec Mme Lisa</w:t>
+            </w:r>
+          </w:p>
+        </w:tc>
+        <w:tc>
+          <w:tcPr>
+            <w:tcW w:type="dxa" w:w="3280"/>
+            <w:shd w:fill="EAF4E4" w:color="auto" w:val="clear"/>
+            <w:tcMar>
+              <w:top w:type="dxa" w:w="100"/>
+              <w:left w:type="dxa" w:w="140"/>
+              <w:bottom w:type="dxa" w:w="100"/>
+              <w:right w:type="dxa" w:w="140"/>
+            </w:tcMar>
+            <w:vAlign w:val="top"/>
+          </w:tcPr>
+          <w:p>
+            <w:pPr>
+              <w:spacing w:after="40" w:line="264"/>
+            </w:pPr>
+            <w:r>
+              <w:rPr>
+                <w:rFonts w:ascii="Calibri" w:cs="Calibri" w:eastAsia="Calibri" w:hAnsi="Calibri"/>
+                <w:b/>
+                <w:bCs/>
+              </w:rPr>
+              <w:t xml:space="preserve">Atelier exploratoire :</w:t>
+            </w:r>
+            <w:r>
+              <w:rPr>
+                <w:rFonts w:ascii="Calibri" w:cs="Calibri" w:eastAsia="Calibri" w:hAnsi="Calibri"/>
+              </w:rPr>
+              <w:t xml:space="preserve"> démarrage rapide. Le leader lit la fiche et distribue les rôles.</w:t>
+            </w:r>
+          </w:p>
+        </w:tc>
+      </w:tr>
+      <w:tr>
+        <w:trPr>
+          <w:cantSplit/>
+        </w:trPr>
+        <w:tc>
+          <w:tcPr>
+            <w:tcW w:type="dxa" w:w="1500"/>
+            <w:shd w:fill="F4F5F7" w:color="auto" w:val="clear"/>
+            <w:tcMar>
+              <w:top w:type="dxa" w:w="100"/>
+              <w:left w:type="dxa" w:w="140"/>
+              <w:bottom w:type="dxa" w:w="100"/>
+              <w:right w:type="dxa" w:w="140"/>
+            </w:tcMar>
+            <w:vAlign w:val="top"/>
+          </w:tcPr>
+          <w:p>
+            <w:pPr>
+              <w:spacing w:after="40" w:line="264"/>
+            </w:pPr>
+            <w:r>
+              <w:rPr>
+                <w:rFonts w:ascii="Calibri" w:cs="Calibri" w:eastAsia="Calibri" w:hAnsi="Calibri"/>
+                <w:b/>
+                <w:bCs/>
+              </w:rPr>
+              <w:t xml:space="preserve">9 h 25 à 9 h 35</w:t>
+            </w:r>
+          </w:p>
+        </w:tc>
+        <w:tc>
+          <w:tcPr>
+            <w:tcW w:type="dxa" w:w="1300"/>
+            <w:shd w:fill="F4F5F7" w:color="auto" w:val="clear"/>
+            <w:tcMar>
+              <w:top w:type="dxa" w:w="100"/>
+              <w:left w:type="dxa" w:w="140"/>
+              <w:bottom w:type="dxa" w:w="100"/>
+              <w:right w:type="dxa" w:w="140"/>
+            </w:tcMar>
+            <w:vAlign w:val="top"/>
+          </w:tcPr>
+          <w:p>
+            <w:pPr>
+              <w:spacing w:after="40" w:line="264"/>
+            </w:pPr>
+            <w:r>
+              <w:rPr>
+                <w:rFonts w:ascii="Calibri" w:cs="Calibri" w:eastAsia="Calibri" w:hAnsi="Calibri"/>
+              </w:rPr>
+              <w:t xml:space="preserve">Pause</w:t>
+            </w:r>
+          </w:p>
+        </w:tc>
+        <w:tc>
+          <w:tcPr>
+            <w:tcW w:type="dxa" w:w="6560"/>
+            <w:gridSpan w:val="2"/>
+            <w:shd w:fill="FFFFFF" w:color="auto" w:val="clear"/>
+            <w:tcMar>
+              <w:top w:type="dxa" w:w="100"/>
+              <w:left w:type="dxa" w:w="140"/>
+              <w:bottom w:type="dxa" w:w="100"/>
+              <w:right w:type="dxa" w:w="140"/>
+            </w:tcMar>
+            <w:vAlign w:val="top"/>
+          </w:tcPr>
+          <w:p>
+            <w:pPr>
+              <w:spacing w:after="40" w:line="264"/>
+            </w:pPr>
+            <w:r>
+              <w:rPr>
+                <w:rFonts w:ascii="Calibri" w:cs="Calibri" w:eastAsia="Calibri" w:hAnsi="Calibri"/>
+              </w:rPr>
+              <w:t xml:space="preserve">Pause de 10 minutes</w:t>
+            </w:r>
+          </w:p>
+        </w:tc>
+      </w:tr>
+      <w:tr>
+        <w:trPr>
+          <w:cantSplit/>
+        </w:trPr>
+        <w:tc>
+          <w:tcPr>
+            <w:tcW w:type="dxa" w:w="1500"/>
+            <w:shd w:fill="F4F5F7" w:color="auto" w:val="clear"/>
+            <w:tcMar>
+              <w:top w:type="dxa" w:w="100"/>
+              <w:left w:type="dxa" w:w="140"/>
+              <w:bottom w:type="dxa" w:w="100"/>
+              <w:right w:type="dxa" w:w="140"/>
+            </w:tcMar>
+            <w:vAlign w:val="top"/>
+          </w:tcPr>
+          <w:p>
+            <w:pPr>
+              <w:spacing w:after="40" w:line="264"/>
+            </w:pPr>
+            <w:r>
+              <w:rPr>
+                <w:rFonts w:ascii="Calibri" w:cs="Calibri" w:eastAsia="Calibri" w:hAnsi="Calibri"/>
+                <w:b/>
+                <w:bCs/>
+              </w:rPr>
+              <w:t xml:space="preserve">9 h 35 à 10 h 35</w:t>
+            </w:r>
+          </w:p>
+        </w:tc>
+        <w:tc>
+          <w:tcPr>
+            <w:tcW w:type="dxa" w:w="1300"/>
+            <w:shd w:fill="F4F5F7" w:color="auto" w:val="clear"/>
+            <w:tcMar>
+              <w:top w:type="dxa" w:w="100"/>
+              <w:left w:type="dxa" w:w="140"/>
+              <w:bottom w:type="dxa" w:w="100"/>
+              <w:right w:type="dxa" w:w="140"/>
+            </w:tcMar>
+            <w:vAlign w:val="top"/>
+          </w:tcPr>
+          <w:p>
+            <w:pPr>
+              <w:spacing w:after="40" w:line="264"/>
+            </w:pPr>
+            <w:r>
+              <w:rPr>
+                <w:rFonts w:ascii="Calibri" w:cs="Calibri" w:eastAsia="Calibri" w:hAnsi="Calibri"/>
+                <w:b/>
+                <w:bCs/>
+              </w:rPr>
+              <w:t xml:space="preserve">Période 2</w:t>
+            </w:r>
+          </w:p>
+        </w:tc>
+        <w:tc>
+          <w:tcPr>
+            <w:tcW w:type="dxa" w:w="3280"/>
+            <w:shd w:fill="E8F0FB" w:color="auto" w:val="clear"/>
+            <w:tcMar>
+              <w:top w:type="dxa" w:w="100"/>
+              <w:left w:type="dxa" w:w="140"/>
+              <w:bottom w:type="dxa" w:w="100"/>
+              <w:right w:type="dxa" w:w="140"/>
+            </w:tcMar>
+            <w:vAlign w:val="top"/>
+          </w:tcPr>
+          <w:p>
+            <w:pPr>
+              <w:spacing w:after="40" w:line="264"/>
+            </w:pPr>
+            <w:r>
+              <w:rPr>
+                <w:rFonts w:ascii="Calibri" w:cs="Calibri" w:eastAsia="Calibri" w:hAnsi="Calibri"/>
+                <w:b/>
+                <w:bCs/>
+              </w:rPr>
+              <w:t xml:space="preserve">Z101</w:t>
+            </w:r>
+            <w:r>
+              <w:rPr>
+                <w:rFonts w:ascii="Calibri" w:cs="Calibri" w:eastAsia="Calibri" w:hAnsi="Calibri"/>
+              </w:rPr>
+              <w:t xml:space="preserve"> avec Mme Lisa</w:t>
+            </w:r>
+          </w:p>
+        </w:tc>
+        <w:tc>
+          <w:tcPr>
+            <w:tcW w:type="dxa" w:w="3280"/>
+            <w:shd w:fill="EAF4E4" w:color="auto" w:val="clear"/>
+            <w:tcMar>
+              <w:top w:type="dxa" w:w="100"/>
+              <w:left w:type="dxa" w:w="140"/>
+              <w:bottom w:type="dxa" w:w="100"/>
+              <w:right w:type="dxa" w:w="140"/>
+            </w:tcMar>
+            <w:vAlign w:val="top"/>
+          </w:tcPr>
+          <w:p>
+            <w:pPr>
+              <w:spacing w:after="40" w:line="264"/>
+            </w:pPr>
+            <w:r>
+              <w:rPr>
+                <w:rFonts w:ascii="Calibri" w:cs="Calibri" w:eastAsia="Calibri" w:hAnsi="Calibri"/>
+                <w:b/>
+                <w:bCs/>
+              </w:rPr>
+              <w:t xml:space="preserve">Atelier exploratoire</w:t>
+            </w:r>
+            <w:r>
+              <w:rPr>
+                <w:rFonts w:ascii="Calibri" w:cs="Calibri" w:eastAsia="Calibri" w:hAnsi="Calibri"/>
+              </w:rPr>
+              <w:t xml:space="preserve"> avec fiche de tâche et équipe de leaders</w:t>
+            </w:r>
+          </w:p>
+        </w:tc>
+      </w:tr>
+      <w:tr>
+        <w:trPr>
+          <w:cantSplit/>
+        </w:trPr>
+        <w:tc>
+          <w:tcPr>
+            <w:tcW w:type="dxa" w:w="1500"/>
+            <w:shd w:fill="F4F5F7" w:color="auto" w:val="clear"/>
+            <w:tcMar>
+              <w:top w:type="dxa" w:w="100"/>
+              <w:left w:type="dxa" w:w="140"/>
+              <w:bottom w:type="dxa" w:w="100"/>
+              <w:right w:type="dxa" w:w="140"/>
+            </w:tcMar>
+            <w:vAlign w:val="top"/>
+          </w:tcPr>
+          <w:p>
+            <w:pPr>
+              <w:spacing w:after="40" w:line="264"/>
+            </w:pPr>
+            <w:r>
+              <w:rPr>
+                <w:rFonts w:ascii="Calibri" w:cs="Calibri" w:eastAsia="Calibri" w:hAnsi="Calibri"/>
+                <w:b/>
+                <w:bCs/>
+              </w:rPr>
+              <w:t xml:space="preserve">10 h 35 à 10 h 45</w:t>
+            </w:r>
+          </w:p>
+        </w:tc>
+        <w:tc>
+          <w:tcPr>
+            <w:tcW w:type="dxa" w:w="1300"/>
+            <w:shd w:fill="F4F5F7" w:color="auto" w:val="clear"/>
+            <w:tcMar>
+              <w:top w:type="dxa" w:w="100"/>
+              <w:left w:type="dxa" w:w="140"/>
+              <w:bottom w:type="dxa" w:w="100"/>
+              <w:right w:type="dxa" w:w="140"/>
+            </w:tcMar>
+            <w:vAlign w:val="top"/>
+          </w:tcPr>
+          <w:p>
+            <w:pPr>
+              <w:spacing w:after="40" w:line="264"/>
+            </w:pPr>
+            <w:r>
+              <w:rPr>
+                <w:rFonts w:ascii="Calibri" w:cs="Calibri" w:eastAsia="Calibri" w:hAnsi="Calibri"/>
+              </w:rPr>
+              <w:t xml:space="preserve">Pause</w:t>
+            </w:r>
+          </w:p>
+        </w:tc>
+        <w:tc>
+          <w:tcPr>
+            <w:tcW w:type="dxa" w:w="6560"/>
+            <w:gridSpan w:val="2"/>
+            <w:shd w:fill="FFFFFF" w:color="auto" w:val="clear"/>
+            <w:tcMar>
+              <w:top w:type="dxa" w:w="100"/>
+              <w:left w:type="dxa" w:w="140"/>
+              <w:bottom w:type="dxa" w:w="100"/>
+              <w:right w:type="dxa" w:w="140"/>
+            </w:tcMar>
+            <w:vAlign w:val="top"/>
+          </w:tcPr>
+          <w:p>
+            <w:pPr>
+              <w:spacing w:after="40" w:line="264"/>
+            </w:pPr>
+            <w:r>
+              <w:rPr>
+                <w:rFonts w:ascii="Calibri" w:cs="Calibri" w:eastAsia="Calibri" w:hAnsi="Calibri"/>
+              </w:rPr>
+              <w:t xml:space="preserve">Pause de 10 minutes. Les sous-groupes changent de place.</w:t>
+            </w:r>
+          </w:p>
+        </w:tc>
+      </w:tr>
+      <w:tr>
+        <w:trPr>
+          <w:cantSplit/>
+        </w:trPr>
+        <w:tc>
+          <w:tcPr>
+            <w:tcW w:type="dxa" w:w="1500"/>
+            <w:shd w:fill="F4F5F7" w:color="auto" w:val="clear"/>
+            <w:tcMar>
+              <w:top w:type="dxa" w:w="100"/>
+              <w:left w:type="dxa" w:w="140"/>
+              <w:bottom w:type="dxa" w:w="100"/>
+              <w:right w:type="dxa" w:w="140"/>
+            </w:tcMar>
+            <w:vAlign w:val="top"/>
+          </w:tcPr>
+          <w:p>
+            <w:pPr>
+              <w:spacing w:after="40" w:line="264"/>
+            </w:pPr>
+            <w:r>
+              <w:rPr>
+                <w:rFonts w:ascii="Calibri" w:cs="Calibri" w:eastAsia="Calibri" w:hAnsi="Calibri"/>
+                <w:b/>
+                <w:bCs/>
+              </w:rPr>
+              <w:t xml:space="preserve">10 h 45 à 11 h 45</w:t>
+            </w:r>
+          </w:p>
+        </w:tc>
+        <w:tc>
+          <w:tcPr>
+            <w:tcW w:type="dxa" w:w="1300"/>
+            <w:shd w:fill="F4F5F7" w:color="auto" w:val="clear"/>
+            <w:tcMar>
+              <w:top w:type="dxa" w:w="100"/>
+              <w:left w:type="dxa" w:w="140"/>
+              <w:bottom w:type="dxa" w:w="100"/>
+              <w:right w:type="dxa" w:w="140"/>
+            </w:tcMar>
+            <w:vAlign w:val="top"/>
+          </w:tcPr>
+          <w:p>
+            <w:pPr>
+              <w:spacing w:after="40" w:line="264"/>
+            </w:pPr>
+            <w:r>
+              <w:rPr>
+                <w:rFonts w:ascii="Calibri" w:cs="Calibri" w:eastAsia="Calibri" w:hAnsi="Calibri"/>
+                <w:b/>
+                <w:bCs/>
+              </w:rPr>
+              <w:t xml:space="preserve">Période 3</w:t>
+            </w:r>
+          </w:p>
+        </w:tc>
+        <w:tc>
+          <w:tcPr>
+            <w:tcW w:type="dxa" w:w="3280"/>
+            <w:shd w:fill="EAF4E4" w:color="auto" w:val="clear"/>
+            <w:tcMar>
+              <w:top w:type="dxa" w:w="100"/>
+              <w:left w:type="dxa" w:w="140"/>
+              <w:bottom w:type="dxa" w:w="100"/>
+              <w:right w:type="dxa" w:w="140"/>
+            </w:tcMar>
+            <w:vAlign w:val="top"/>
+          </w:tcPr>
+          <w:p>
+            <w:pPr>
+              <w:spacing w:after="40" w:line="264"/>
+            </w:pPr>
+            <w:r>
+              <w:rPr>
+                <w:rFonts w:ascii="Calibri" w:cs="Calibri" w:eastAsia="Calibri" w:hAnsi="Calibri"/>
+                <w:b/>
+                <w:bCs/>
+              </w:rPr>
+              <w:t xml:space="preserve">Atelier exploratoire</w:t>
+            </w:r>
+            <w:r>
+              <w:rPr>
+                <w:rFonts w:ascii="Calibri" w:cs="Calibri" w:eastAsia="Calibri" w:hAnsi="Calibri"/>
+              </w:rPr>
+              <w:t xml:space="preserve"> avec fiche de tâche et équipe de leaders</w:t>
+            </w:r>
+          </w:p>
+        </w:tc>
+        <w:tc>
+          <w:tcPr>
+            <w:tcW w:type="dxa" w:w="3280"/>
+            <w:shd w:fill="E8F0FB" w:color="auto" w:val="clear"/>
+            <w:tcMar>
+              <w:top w:type="dxa" w:w="100"/>
+              <w:left w:type="dxa" w:w="140"/>
+              <w:bottom w:type="dxa" w:w="100"/>
+              <w:right w:type="dxa" w:w="140"/>
+            </w:tcMar>
+            <w:vAlign w:val="top"/>
+          </w:tcPr>
+          <w:p>
+            <w:pPr>
+              <w:spacing w:after="40" w:line="264"/>
+            </w:pPr>
+            <w:r>
+              <w:rPr>
+                <w:rFonts w:ascii="Calibri" w:cs="Calibri" w:eastAsia="Calibri" w:hAnsi="Calibri"/>
+                <w:b/>
+                <w:bCs/>
+              </w:rPr>
+              <w:t xml:space="preserve">Z101</w:t>
+            </w:r>
+            <w:r>
+              <w:rPr>
+                <w:rFonts w:ascii="Calibri" w:cs="Calibri" w:eastAsia="Calibri" w:hAnsi="Calibri"/>
+              </w:rPr>
+              <w:t xml:space="preserve"> avec Mme Lisa</w:t>
+            </w:r>
+          </w:p>
+        </w:tc>
+      </w:tr>
+    </w:tbl>
+    <w:p>
+      <w:pPr>
+        <w:spacing w:after="140"/>
+      </w:pPr>
+    </w:p>
+    <w:tbl>
+      <w:tblPr>
+        <w:tblW w:type="dxa" w:w="9360"/>
+        <w:tblBorders>
+          <w:top w:val="single" w:color="CFD4DC" w:sz="4"/>
+          <w:left w:val="single" w:color="CFD4DC" w:sz="4"/>
+          <w:bottom w:val="single" w:color="CFD4DC" w:sz="4"/>
+          <w:right w:val="single" w:color="CFD4DC" w:sz="4"/>
+          <w:insideH w:val="single" w:color="CFD4DC" w:sz="4"/>
+          <w:insideV w:val="single" w:color="CFD4DC" w:sz="4"/>
+        </w:tblBorders>
+        <w:tblLayout w:type="fixed"/>
+      </w:tblPr>
+      <w:tblGrid>
+        <w:gridCol w:w="3120"/>
+        <w:gridCol w:w="3120"/>
+        <w:gridCol w:w="3120"/>
+      </w:tblGrid>
+      <w:tr>
+        <w:trPr>
+          <w:tblHeader/>
+        </w:trPr>
+        <w:tc>
+          <w:tcPr>
+            <w:tcW w:type="dxa" w:w="3120"/>
+            <w:shd w:fill="1D3557" w:color="auto" w:val="clear"/>
+            <w:tcMar>
+              <w:top w:type="dxa" w:w="100"/>
+              <w:left w:type="dxa" w:w="140"/>
+              <w:bottom w:type="dxa" w:w="100"/>
+              <w:right w:type="dxa" w:w="140"/>
+            </w:tcMar>
+            <w:vAlign w:val="top"/>
+          </w:tcPr>
+          <w:p>
+            <w:pPr>
+              <w:spacing w:after="0"/>
+            </w:pPr>
+            <w:r>
+              <w:rPr>
+                <w:rFonts w:ascii="Calibri" w:cs="Calibri" w:eastAsia="Calibri" w:hAnsi="Calibri"/>
+                <w:b/>
+                <w:bCs/>
+                <w:color w:val="FFFFFF"/>
+                <w:sz w:val="20"/>
+                <w:szCs w:val="20"/>
+              </w:rPr>
+              <w:t xml:space="preserve"/>
+            </w:r>
+          </w:p>
+        </w:tc>
+        <w:tc>
+          <w:tcPr>
+            <w:tcW w:type="dxa" w:w="3120"/>
+            <w:shd w:fill="1D3557" w:color="auto" w:val="clear"/>
+            <w:tcMar>
+              <w:top w:type="dxa" w:w="100"/>
+              <w:left w:type="dxa" w:w="140"/>
+              <w:bottom w:type="dxa" w:w="100"/>
+              <w:right w:type="dxa" w:w="140"/>
+            </w:tcMar>
+            <w:vAlign w:val="top"/>
+          </w:tcPr>
+          <w:p>
+            <w:pPr>
+              <w:spacing w:after="0"/>
+            </w:pPr>
+            <w:r>
+              <w:rPr>
+                <w:rFonts w:ascii="Calibri" w:cs="Calibri" w:eastAsia="Calibri" w:hAnsi="Calibri"/>
+                <w:b/>
+                <w:bCs/>
+                <w:color w:val="FFFFFF"/>
+                <w:sz w:val="20"/>
+                <w:szCs w:val="20"/>
+              </w:rPr>
+              <w:t xml:space="preserve">Temps en Z101</w:t>
+            </w:r>
+          </w:p>
+        </w:tc>
+        <w:tc>
+          <w:tcPr>
+            <w:tcW w:type="dxa" w:w="3120"/>
+            <w:shd w:fill="1D3557" w:color="auto" w:val="clear"/>
+            <w:tcMar>
+              <w:top w:type="dxa" w:w="100"/>
+              <w:left w:type="dxa" w:w="140"/>
+              <w:bottom w:type="dxa" w:w="100"/>
+              <w:right w:type="dxa" w:w="140"/>
+            </w:tcMar>
+            <w:vAlign w:val="top"/>
+          </w:tcPr>
+          <w:p>
+            <w:pPr>
+              <w:spacing w:after="0"/>
+            </w:pPr>
+            <w:r>
+              <w:rPr>
+                <w:rFonts w:ascii="Calibri" w:cs="Calibri" w:eastAsia="Calibri" w:hAnsi="Calibri"/>
+                <w:b/>
+                <w:bCs/>
+                <w:color w:val="FFFFFF"/>
+                <w:sz w:val="20"/>
+                <w:szCs w:val="20"/>
+              </w:rPr>
+              <w:t xml:space="preserve">Temps en atelier exploratoire</w:t>
+            </w:r>
+          </w:p>
+        </w:tc>
+      </w:tr>
+      <w:tr>
+        <w:trPr>
+          <w:cantSplit/>
+        </w:trPr>
+        <w:tc>
+          <w:tcPr>
+            <w:tcW w:type="dxa" w:w="3120"/>
+            <w:shd w:fill="F4F5F7" w:color="auto" w:val="clear"/>
+            <w:tcMar>
+              <w:top w:type="dxa" w:w="100"/>
+              <w:left w:type="dxa" w:w="140"/>
+              <w:bottom w:type="dxa" w:w="100"/>
+              <w:right w:type="dxa" w:w="140"/>
+            </w:tcMar>
+            <w:vAlign w:val="top"/>
+          </w:tcPr>
+          <w:p>
+            <w:pPr>
+              <w:spacing w:after="40" w:line="264"/>
+            </w:pPr>
+            <w:r>
+              <w:rPr>
+                <w:rFonts w:ascii="Calibri" w:cs="Calibri" w:eastAsia="Calibri" w:hAnsi="Calibri"/>
+                <w:b/>
+                <w:bCs/>
+              </w:rPr>
+              <w:t xml:space="preserve">Sous-groupe 1 : PPS pur</w:t>
+            </w:r>
+          </w:p>
+        </w:tc>
+        <w:tc>
+          <w:tcPr>
+            <w:tcW w:type="dxa" w:w="3120"/>
+            <w:tcMar>
+              <w:top w:type="dxa" w:w="100"/>
+              <w:left w:type="dxa" w:w="140"/>
+              <w:bottom w:type="dxa" w:w="100"/>
+              <w:right w:type="dxa" w:w="140"/>
+            </w:tcMar>
+            <w:vAlign w:val="top"/>
+          </w:tcPr>
+          <w:p>
+            <w:pPr>
+              <w:spacing w:after="40" w:line="264"/>
+            </w:pPr>
+            <w:r>
+              <w:rPr>
+                <w:rFonts w:ascii="Calibri" w:cs="Calibri" w:eastAsia="Calibri" w:hAnsi="Calibri"/>
+                <w:b/>
+                <w:bCs/>
+              </w:rPr>
+              <w:t xml:space="preserve">1 h 25</w:t>
+            </w:r>
+            <w:r>
+              <w:rPr>
+                <w:rFonts w:ascii="Calibri" w:cs="Calibri" w:eastAsia="Calibri" w:hAnsi="Calibri"/>
+              </w:rPr>
+              <w:t xml:space="preserve"> (9 h 00 à 10 h 35)</w:t>
+            </w:r>
+          </w:p>
+        </w:tc>
+        <w:tc>
+          <w:tcPr>
+            <w:tcW w:type="dxa" w:w="3120"/>
+            <w:tcMar>
+              <w:top w:type="dxa" w:w="100"/>
+              <w:left w:type="dxa" w:w="140"/>
+              <w:bottom w:type="dxa" w:w="100"/>
+              <w:right w:type="dxa" w:w="140"/>
+            </w:tcMar>
+            <w:vAlign w:val="top"/>
+          </w:tcPr>
+          <w:p>
+            <w:pPr>
+              <w:spacing w:after="40" w:line="264"/>
+            </w:pPr>
+            <w:r>
+              <w:rPr>
+                <w:rFonts w:ascii="Calibri" w:cs="Calibri" w:eastAsia="Calibri" w:hAnsi="Calibri"/>
+              </w:rPr>
+              <w:t xml:space="preserve">1 h (10 h 45 à 11 h 45)</w:t>
+            </w:r>
+          </w:p>
+        </w:tc>
+      </w:tr>
+      <w:tr>
+        <w:trPr>
+          <w:cantSplit/>
+        </w:trPr>
+        <w:tc>
+          <w:tcPr>
+            <w:tcW w:type="dxa" w:w="3120"/>
+            <w:shd w:fill="F4F5F7" w:color="auto" w:val="clear"/>
+            <w:tcMar>
+              <w:top w:type="dxa" w:w="100"/>
+              <w:left w:type="dxa" w:w="140"/>
+              <w:bottom w:type="dxa" w:w="100"/>
+              <w:right w:type="dxa" w:w="140"/>
+            </w:tcMar>
+            <w:vAlign w:val="top"/>
+          </w:tcPr>
+          <w:p>
+            <w:pPr>
+              <w:spacing w:after="40" w:line="264"/>
+            </w:pPr>
+            <w:r>
+              <w:rPr>
+                <w:rFonts w:ascii="Calibri" w:cs="Calibri" w:eastAsia="Calibri" w:hAnsi="Calibri"/>
+                <w:b/>
+                <w:bCs/>
+              </w:rPr>
+              <w:t xml:space="preserve">Sous-groupe 2</w:t>
+            </w:r>
+          </w:p>
+        </w:tc>
+        <w:tc>
+          <w:tcPr>
+            <w:tcW w:type="dxa" w:w="3120"/>
+            <w:tcMar>
+              <w:top w:type="dxa" w:w="100"/>
+              <w:left w:type="dxa" w:w="140"/>
+              <w:bottom w:type="dxa" w:w="100"/>
+              <w:right w:type="dxa" w:w="140"/>
+            </w:tcMar>
+            <w:vAlign w:val="top"/>
+          </w:tcPr>
+          <w:p>
+            <w:pPr>
+              <w:spacing w:after="40" w:line="264"/>
+            </w:pPr>
+            <w:r>
+              <w:rPr>
+                <w:rFonts w:ascii="Calibri" w:cs="Calibri" w:eastAsia="Calibri" w:hAnsi="Calibri"/>
+              </w:rPr>
+              <w:t xml:space="preserve">1 h (10 h 45 à 11 h 45)</w:t>
+            </w:r>
+          </w:p>
+        </w:tc>
+        <w:tc>
+          <w:tcPr>
+            <w:tcW w:type="dxa" w:w="3120"/>
+            <w:tcMar>
+              <w:top w:type="dxa" w:w="100"/>
+              <w:left w:type="dxa" w:w="140"/>
+              <w:bottom w:type="dxa" w:w="100"/>
+              <w:right w:type="dxa" w:w="140"/>
+            </w:tcMar>
+            <w:vAlign w:val="top"/>
+          </w:tcPr>
+          <w:p>
+            <w:pPr>
+              <w:spacing w:after="40" w:line="264"/>
+            </w:pPr>
+            <w:r>
+              <w:rPr>
+                <w:rFonts w:ascii="Calibri" w:cs="Calibri" w:eastAsia="Calibri" w:hAnsi="Calibri"/>
+                <w:b/>
+                <w:bCs/>
+              </w:rPr>
+              <w:t xml:space="preserve">1 h 25</w:t>
+            </w:r>
+            <w:r>
+              <w:rPr>
+                <w:rFonts w:ascii="Calibri" w:cs="Calibri" w:eastAsia="Calibri" w:hAnsi="Calibri"/>
+              </w:rPr>
+              <w:t xml:space="preserve"> (9 h 00 à 10 h 35)</w:t>
+            </w:r>
+          </w:p>
+        </w:tc>
+      </w:tr>
+    </w:tbl>
+    <w:p>
+      <w:pPr>
         <w:pStyle w:val="Heading2"/>
         <w:keepNext/>
         <w:spacing w:after="80" w:before="200"/>
@@ -1541,7 +2697,7 @@
         <w:rPr>
           <w:rFonts w:ascii="Calibri" w:cs="Calibri" w:eastAsia="Calibri" w:hAnsi="Calibri"/>
         </w:rPr>
-        <w:t xml:space="preserve">Périodes 1 et 2 : installer et consolider l'autonomie</w:t>
+        <w:t xml:space="preserve">Qui fait quoi pendant la matinée (étapes 1 et 2)</w:t>
       </w:r>
     </w:p>
     <w:tbl>
@@ -1621,7 +2777,7 @@
                 <w:sz w:val="20"/>
                 <w:szCs w:val="20"/>
               </w:rPr>
-              <w:t xml:space="preserve">Les élèves</w:t>
+              <w:t xml:space="preserve">L'enseignante (Mme Lisa)</w:t>
             </w:r>
           </w:p>
         </w:tc>
@@ -1650,7 +2806,7 @@
                 <w:sz w:val="20"/>
                 <w:szCs w:val="20"/>
               </w:rPr>
-              <w:t xml:space="preserve">L'enseignante</w:t>
+              <w:t xml:space="preserve">La TES</w:t>
             </w:r>
           </w:p>
         </w:tc>
@@ -1679,7 +2835,7 @@
                 <w:sz w:val="20"/>
                 <w:szCs w:val="20"/>
               </w:rPr>
-              <w:t xml:space="preserve">La TES</w:t>
+              <w:t xml:space="preserve">Les leaders</w:t>
             </w:r>
           </w:p>
         </w:tc>
@@ -1711,7 +2867,7 @@
                 <w:bCs/>
                 <w:color w:val="1D3557"/>
               </w:rPr>
-              <w:t xml:space="preserve">8 h 30</w:t>
+              <w:t xml:space="preserve">8 h 25</w:t>
             </w:r>
           </w:p>
           <w:p>
@@ -1725,7 +2881,7 @@
                 <w:sz w:val="19"/>
                 <w:szCs w:val="19"/>
               </w:rPr>
-              <w:t xml:space="preserve">Accueil et briefing</w:t>
+              <w:t xml:space="preserve">Accueil</w:t>
             </w:r>
           </w:p>
         </w:tc>
@@ -1749,7 +2905,7 @@
               <w:rPr>
                 <w:rFonts w:ascii="Calibri" w:cs="Calibri" w:eastAsia="Calibri" w:hAnsi="Calibri"/>
               </w:rPr>
-              <w:t xml:space="preserve">Météo d'équipe. Chacun inscrit sa tâche au registre d'autonomie. Le leader du jour reçoit son rôle.</w:t>
+              <w:t xml:space="preserve">Présente le menu du matin et les objectifs du jour.</w:t>
             </w:r>
           </w:p>
         </w:tc>
@@ -1773,7 +2929,7 @@
               <w:rPr>
                 <w:rFonts w:ascii="Calibri" w:cs="Calibri" w:eastAsia="Calibri" w:hAnsi="Calibri"/>
               </w:rPr>
-              <w:t xml:space="preserve">Présente les objectifs du jour et les ateliers. Forme les sous-groupes A et B.</w:t>
+              <w:t xml:space="preserve">Accueille les élèves un à un. Repère les signes d'anxiété et prévient les difficultés.</w:t>
             </w:r>
           </w:p>
         </w:tc>
@@ -1797,7 +2953,7 @@
               <w:rPr>
                 <w:rFonts w:ascii="Calibri" w:cs="Calibri" w:eastAsia="Calibri" w:hAnsi="Calibri"/>
               </w:rPr>
-              <w:t xml:space="preserve">Accueille les élèves un à un. Repère les signes d'anxiété et prévient les difficultés.</w:t>
+              <w:t xml:space="preserve">Reçoivent leur rôle et leur atelier. Chaque élève inscrit sa tâche au registre d'autonomie.</w:t>
             </w:r>
           </w:p>
         </w:tc>
@@ -1829,7 +2985,7 @@
                 <w:bCs/>
                 <w:color w:val="1D3557"/>
               </w:rPr>
-              <w:t xml:space="preserve">9 h 00</w:t>
+              <w:t xml:space="preserve">9 h 00 à 10 h 35</w:t>
             </w:r>
           </w:p>
           <w:p>
@@ -1843,7 +2999,7 @@
                 <w:sz w:val="19"/>
                 <w:szCs w:val="19"/>
               </w:rPr>
-              <w:t xml:space="preserve">Bloc 1</w:t>
+              <w:t xml:space="preserve">Périodes 1 et 2</w:t>
             </w:r>
           </w:p>
         </w:tc>
@@ -1865,35 +3021,22 @@
             <w:r>
               <w:rPr>
                 <w:rFonts w:ascii="Calibri" w:cs="Calibri" w:eastAsia="Calibri" w:hAnsi="Calibri"/>
-                <w:b/>
-                <w:bCs/>
-              </w:rPr>
-              <w:t xml:space="preserve">A :</w:t>
-            </w:r>
-            <w:r>
-              <w:rPr>
-                <w:rFonts w:ascii="Calibri" w:cs="Calibri" w:eastAsia="Calibri" w:hAnsi="Calibri"/>
-              </w:rPr>
-              <w:t xml:space="preserve"> enseignement direct.</w:t>
-            </w:r>
-          </w:p>
-          <w:p>
-            <w:pPr>
-              <w:spacing w:after="40" w:line="264"/>
-            </w:pPr>
-            <w:r>
-              <w:rPr>
-                <w:rFonts w:ascii="Calibri" w:cs="Calibri" w:eastAsia="Calibri" w:hAnsi="Calibri"/>
-                <w:b/>
-                <w:bCs/>
-              </w:rPr>
-              <w:t xml:space="preserve">B :</w:t>
-            </w:r>
-            <w:r>
-              <w:rPr>
-                <w:rFonts w:ascii="Calibri" w:cs="Calibri" w:eastAsia="Calibri" w:hAnsi="Calibri"/>
-              </w:rPr>
-              <w:t xml:space="preserve"> ateliers autonomes (cuisine, grenier, chariots TEACCH) avec fiche de tâche et leader.</w:t>
+              </w:rPr>
+              <w:t xml:space="preserve">Enseigne le Z101 au sous-groupe PPS pur. </w:t>
+            </w:r>
+            <w:r>
+              <w:rPr>
+                <w:rFonts w:ascii="Calibri" w:cs="Calibri" w:eastAsia="Calibri" w:hAnsi="Calibri"/>
+                <w:b/>
+                <w:bCs/>
+              </w:rPr>
+              <w:t xml:space="preserve">Circule</w:t>
+            </w:r>
+            <w:r>
+              <w:rPr>
+                <w:rFonts w:ascii="Calibri" w:cs="Calibri" w:eastAsia="Calibri" w:hAnsi="Calibri"/>
+              </w:rPr>
+              <w:t xml:space="preserve"> aussi vers les ateliers pour s'assurer de leur bon fonctionnement. En atelier, on applique « 3 avant l'enseignante ».</w:t>
             </w:r>
           </w:p>
         </w:tc>
@@ -1916,7 +3059,7 @@
               <w:rPr>
                 <w:rFonts w:ascii="Calibri" w:cs="Calibri" w:eastAsia="Calibri" w:hAnsi="Calibri"/>
               </w:rPr>
-              <w:t xml:space="preserve">Enseigne le Z101 au sous-groupe A. N'est pas interrompue : le sous-groupe B applique « 3 avant l'enseignante ».</w:t>
+              <w:t xml:space="preserve">Accompagne le sous-groupe 2 en atelier exploratoire : soutient discrètement les leaders, aide à régler les blocages, offre des pauses de régulation.</w:t>
             </w:r>
           </w:p>
         </w:tc>
@@ -1939,7 +3082,7 @@
               <w:rPr>
                 <w:rFonts w:ascii="Calibri" w:cs="Calibri" w:eastAsia="Calibri" w:hAnsi="Calibri"/>
               </w:rPr>
-              <w:t xml:space="preserve">Accompagne le sous-groupe B en atelier : soutient le leader, aide à régler les blocages, offre des pauses de régulation.</w:t>
+              <w:t xml:space="preserve">Lisent la fiche à voix haute, distribuent les rôles, gèrent le temps, donnent la parole à chacun.</w:t>
             </w:r>
           </w:p>
         </w:tc>
@@ -1971,7 +3114,7 @@
                 <w:bCs/>
                 <w:color w:val="1D3557"/>
               </w:rPr>
-              <w:t xml:space="preserve">10 h 05</w:t>
+              <w:t xml:space="preserve">10 h 35</w:t>
             </w:r>
           </w:p>
           <w:p>
@@ -1985,7 +3128,7 @@
                 <w:sz w:val="19"/>
                 <w:szCs w:val="19"/>
               </w:rPr>
-              <w:t xml:space="preserve">Transition</w:t>
+              <w:t xml:space="preserve">Pause et changement</w:t>
             </w:r>
           </w:p>
         </w:tc>
@@ -2009,7 +3152,7 @@
               <w:rPr>
                 <w:rFonts w:ascii="Calibri" w:cs="Calibri" w:eastAsia="Calibri" w:hAnsi="Calibri"/>
               </w:rPr>
-              <w:t xml:space="preserve">Le leader fait valider la fiche et ranger le poste. Les sous-groupes changent de place.</w:t>
+              <w:t xml:space="preserve">Accueille le sous-groupe 2.</w:t>
             </w:r>
           </w:p>
         </w:tc>
@@ -2033,7 +3176,7 @@
               <w:rPr>
                 <w:rFonts w:ascii="Calibri" w:cs="Calibri" w:eastAsia="Calibri" w:hAnsi="Calibri"/>
               </w:rPr>
-              <w:t xml:space="preserve">Termine le bloc et accueille le sous-groupe B.</w:t>
+              <w:t xml:space="preserve">Encadre le changement de place pour qu'il se fasse calmement.</w:t>
             </w:r>
           </w:p>
         </w:tc>
@@ -2057,7 +3200,7 @@
               <w:rPr>
                 <w:rFonts w:ascii="Calibri" w:cs="Calibri" w:eastAsia="Calibri" w:hAnsi="Calibri"/>
               </w:rPr>
-              <w:t xml:space="preserve">Encadre le changement de place pour qu'il se fasse calmement et rapidement.</w:t>
+              <w:t xml:space="preserve">Passent en revue les critères de réussite et font ranger le poste.</w:t>
             </w:r>
           </w:p>
         </w:tc>
@@ -2089,7 +3232,7 @@
                 <w:bCs/>
                 <w:color w:val="1D3557"/>
               </w:rPr>
-              <w:t xml:space="preserve">10 h 10</w:t>
+              <w:t xml:space="preserve">10 h 45 à 11 h 45</w:t>
             </w:r>
           </w:p>
           <w:p>
@@ -2103,7 +3246,7 @@
                 <w:sz w:val="19"/>
                 <w:szCs w:val="19"/>
               </w:rPr>
-              <w:t xml:space="preserve">Bloc 2</w:t>
+              <w:t xml:space="preserve">Période 3</w:t>
             </w:r>
           </w:p>
         </w:tc>
@@ -2125,35 +3268,22 @@
             <w:r>
               <w:rPr>
                 <w:rFonts w:ascii="Calibri" w:cs="Calibri" w:eastAsia="Calibri" w:hAnsi="Calibri"/>
-                <w:b/>
-                <w:bCs/>
-              </w:rPr>
-              <w:t xml:space="preserve">B :</w:t>
-            </w:r>
-            <w:r>
-              <w:rPr>
-                <w:rFonts w:ascii="Calibri" w:cs="Calibri" w:eastAsia="Calibri" w:hAnsi="Calibri"/>
-              </w:rPr>
-              <w:t xml:space="preserve"> enseignement direct.</w:t>
-            </w:r>
-          </w:p>
-          <w:p>
-            <w:pPr>
-              <w:spacing w:after="40" w:line="264"/>
-            </w:pPr>
-            <w:r>
-              <w:rPr>
-                <w:rFonts w:ascii="Calibri" w:cs="Calibri" w:eastAsia="Calibri" w:hAnsi="Calibri"/>
-                <w:b/>
-                <w:bCs/>
-              </w:rPr>
-              <w:t xml:space="preserve">A :</w:t>
-            </w:r>
-            <w:r>
-              <w:rPr>
-                <w:rFonts w:ascii="Calibri" w:cs="Calibri" w:eastAsia="Calibri" w:hAnsi="Calibri"/>
-              </w:rPr>
-              <w:t xml:space="preserve"> ateliers autonomes avec un nouveau leader.</w:t>
+              </w:rPr>
+              <w:t xml:space="preserve">Enseigne le Z101 au sous-groupe 2. </w:t>
+            </w:r>
+            <w:r>
+              <w:rPr>
+                <w:rFonts w:ascii="Calibri" w:cs="Calibri" w:eastAsia="Calibri" w:hAnsi="Calibri"/>
+                <w:b/>
+                <w:bCs/>
+              </w:rPr>
+              <w:t xml:space="preserve">Circule</w:t>
+            </w:r>
+            <w:r>
+              <w:rPr>
+                <w:rFonts w:ascii="Calibri" w:cs="Calibri" w:eastAsia="Calibri" w:hAnsi="Calibri"/>
+              </w:rPr>
+              <w:t xml:space="preserve"> vers les ateliers. Valide le registre d'autonomie.</w:t>
             </w:r>
           </w:p>
         </w:tc>
@@ -2176,7 +3306,7 @@
               <w:rPr>
                 <w:rFonts w:ascii="Calibri" w:cs="Calibri" w:eastAsia="Calibri" w:hAnsi="Calibri"/>
               </w:rPr>
-              <w:t xml:space="preserve">Enseigne le Z101 au sous-groupe B.</w:t>
+              <w:t xml:space="preserve">Accompagne le sous-groupe PPS pur en atelier exploratoire, comme aux périodes 1 et 2.</w:t>
             </w:r>
           </w:p>
         </w:tc>
@@ -2199,146 +3329,12 @@
               <w:rPr>
                 <w:rFonts w:ascii="Calibri" w:cs="Calibri" w:eastAsia="Calibri" w:hAnsi="Calibri"/>
               </w:rPr>
-              <w:t xml:space="preserve">Accompagne le sous-groupe A en atelier, comme au bloc 1.</w:t>
-            </w:r>
-          </w:p>
-        </w:tc>
-      </w:tr>
-      <w:tr>
-        <w:trPr>
-          <w:cantSplit/>
-        </w:trPr>
-        <w:tc>
-          <w:tcPr>
-            <w:tcW w:type="dxa" w:w="1560"/>
-            <w:shd w:fill="F4F5F7" w:color="auto" w:val="clear"/>
-            <w:tcMar>
-              <w:top w:type="dxa" w:w="100"/>
-              <w:left w:type="dxa" w:w="140"/>
-              <w:bottom w:type="dxa" w:w="100"/>
-              <w:right w:type="dxa" w:w="140"/>
-            </w:tcMar>
-            <w:vAlign w:val="top"/>
-          </w:tcPr>
-          <w:p>
-            <w:pPr>
-              <w:spacing w:after="0"/>
-            </w:pPr>
-            <w:r>
-              <w:rPr>
-                <w:rFonts w:ascii="Calibri" w:cs="Calibri" w:eastAsia="Calibri" w:hAnsi="Calibri"/>
-                <w:b/>
-                <w:bCs/>
-                <w:color w:val="1D3557"/>
-              </w:rPr>
-              <w:t xml:space="preserve">11 h 15</w:t>
-            </w:r>
-          </w:p>
-          <w:p>
-            <w:pPr>
-              <w:spacing w:after="0"/>
-            </w:pPr>
-            <w:r>
-              <w:rPr>
-                <w:rFonts w:ascii="Calibri" w:cs="Calibri" w:eastAsia="Calibri" w:hAnsi="Calibri"/>
-                <w:color w:val="5A6070"/>
-                <w:sz w:val="19"/>
-                <w:szCs w:val="19"/>
-              </w:rPr>
-              <w:t xml:space="preserve">Retour et rangement</w:t>
-            </w:r>
-          </w:p>
-        </w:tc>
-        <w:tc>
-          <w:tcPr>
-            <w:tcW w:type="dxa" w:w="2600"/>
-            <w:shd w:fill="FDF6DD" w:color="auto" w:val="clear"/>
-            <w:tcMar>
-              <w:top w:type="dxa" w:w="100"/>
-              <w:left w:type="dxa" w:w="140"/>
-              <w:bottom w:type="dxa" w:w="100"/>
-              <w:right w:type="dxa" w:w="140"/>
-            </w:tcMar>
-            <w:vAlign w:val="top"/>
-          </w:tcPr>
-          <w:p>
-            <w:pPr>
-              <w:spacing w:after="40" w:line="264"/>
-            </w:pPr>
-            <w:r>
-              <w:rPr>
-                <w:rFonts w:ascii="Calibri" w:cs="Calibri" w:eastAsia="Calibri" w:hAnsi="Calibri"/>
-              </w:rPr>
-              <w:t xml:space="preserve">Retour sur ce qui a été appris et sur le travail d'équipe. Rangement collaboratif.</w:t>
-            </w:r>
-          </w:p>
-        </w:tc>
-        <w:tc>
-          <w:tcPr>
-            <w:tcW w:type="dxa" w:w="2600"/>
-            <w:shd w:fill="FDF6DD" w:color="auto" w:val="clear"/>
-            <w:tcMar>
-              <w:top w:type="dxa" w:w="100"/>
-              <w:left w:type="dxa" w:w="140"/>
-              <w:bottom w:type="dxa" w:w="100"/>
-              <w:right w:type="dxa" w:w="140"/>
-            </w:tcMar>
-            <w:vAlign w:val="top"/>
-          </w:tcPr>
-          <w:p>
-            <w:pPr>
-              <w:spacing w:after="40" w:line="264"/>
-            </w:pPr>
-            <w:r>
-              <w:rPr>
-                <w:rFonts w:ascii="Calibri" w:cs="Calibri" w:eastAsia="Calibri" w:hAnsi="Calibri"/>
-              </w:rPr>
-              <w:t xml:space="preserve">Valide le registre d'autonomie et note les progrès.</w:t>
-            </w:r>
-          </w:p>
-        </w:tc>
-        <w:tc>
-          <w:tcPr>
-            <w:tcW w:type="dxa" w:w="2600"/>
-            <w:shd w:fill="FDF6DD" w:color="auto" w:val="clear"/>
-            <w:tcMar>
-              <w:top w:type="dxa" w:w="100"/>
-              <w:left w:type="dxa" w:w="140"/>
-              <w:bottom w:type="dxa" w:w="100"/>
-              <w:right w:type="dxa" w:w="140"/>
-            </w:tcMar>
-            <w:vAlign w:val="top"/>
-          </w:tcPr>
-          <w:p>
-            <w:pPr>
-              <w:spacing w:after="40" w:line="264"/>
-            </w:pPr>
-            <w:r>
-              <w:rPr>
-                <w:rFonts w:ascii="Calibri" w:cs="Calibri" w:eastAsia="Calibri" w:hAnsi="Calibri"/>
-              </w:rPr>
-              <w:t xml:space="preserve">Co-anime le retour réflexif : ce qui a aidé, ce qui a bloqué, comment on s'est réglé.</w:t>
+              <w:t xml:space="preserve">Un nouveau leader prend le relais pour le sous-groupe PPS pur.</w:t>
             </w:r>
           </w:p>
         </w:tc>
       </w:tr>
     </w:tbl>
-    <w:p>
-      <w:pPr>
-        <w:spacing w:after="120" w:before="60"/>
-      </w:pPr>
-      <w:r>
-        <w:rPr>
-          <w:rFonts w:ascii="Calibri" w:cs="Calibri" w:eastAsia="Calibri" w:hAnsi="Calibri"/>
-          <w:i/>
-          <w:iCs/>
-          <w:color w:val="5A6070"/>
-          <w:sz w:val="18"/>
-          <w:szCs w:val="18"/>
-        </w:rPr>
-        <w:t xml:space="preserve">Heures indicatives, à ajuster à l'horaire réel du groupe.</w:t>
-      </w:r>
-    </w:p>
     <w:p>
       <w:pPr>
         <w:pStyle w:val="Heading2"/>
@@ -2349,7 +3345,7 @@
         <w:rPr>
           <w:rFonts w:ascii="Calibri" w:cs="Calibri" w:eastAsia="Calibri" w:hAnsi="Calibri"/>
         </w:rPr>
-        <w:t xml:space="preserve">Période 3 : quand l'autonomie est acquise</w:t>
+        <w:t xml:space="preserve">Étape 3 : quand l'autonomie est acquise</w:t>
       </w:r>
     </w:p>
     <w:p>
@@ -2360,7 +3356,7 @@
         <w:rPr>
           <w:rFonts w:ascii="Calibri" w:cs="Calibri" w:eastAsia="Calibri" w:hAnsi="Calibri"/>
         </w:rPr>
-        <w:t xml:space="preserve">Quand les élèves fonctionnent seuls en atelier et que la gestion de classe le permet, les adultes n'ont plus besoin d'accompagner les ateliers. Ils enseignent alors de façon ciblée.</w:t>
+        <w:t xml:space="preserve">L'horaire reste le même. Quand les élèves fonctionnent seuls en atelier et que la gestion de classe le permet, les adultes n'ont plus besoin d'accompagner les ateliers. Ils enseignent alors de façon ciblée.</w:t>
       </w:r>
     </w:p>
     <w:tbl>
@@ -2440,7 +3436,7 @@
                 <w:sz w:val="20"/>
                 <w:szCs w:val="20"/>
               </w:rPr>
-              <w:t xml:space="preserve">Les élèves</w:t>
+              <w:t xml:space="preserve">L'enseignante (Mme Lisa)</w:t>
             </w:r>
           </w:p>
         </w:tc>
@@ -2469,7 +3465,7 @@
                 <w:sz w:val="20"/>
                 <w:szCs w:val="20"/>
               </w:rPr>
-              <w:t xml:space="preserve">L'enseignante</w:t>
+              <w:t xml:space="preserve">La TES</w:t>
             </w:r>
           </w:p>
         </w:tc>
@@ -2498,7 +3494,7 @@
                 <w:sz w:val="20"/>
                 <w:szCs w:val="20"/>
               </w:rPr>
-              <w:t xml:space="preserve">La TES</w:t>
+              <w:t xml:space="preserve">Les leaders</w:t>
             </w:r>
           </w:p>
         </w:tc>
@@ -2530,7 +3526,7 @@
                 <w:bCs/>
                 <w:color w:val="1D3557"/>
               </w:rPr>
-              <w:t xml:space="preserve">8 h 30</w:t>
+              <w:t xml:space="preserve">8 h 25</w:t>
             </w:r>
           </w:p>
           <w:p>
@@ -2544,7 +3540,7 @@
                 <w:sz w:val="19"/>
                 <w:szCs w:val="19"/>
               </w:rPr>
-              <w:t xml:space="preserve">Accueil et briefing</w:t>
+              <w:t xml:space="preserve">Accueil</w:t>
             </w:r>
           </w:p>
         </w:tc>
@@ -2568,7 +3564,7 @@
               <w:rPr>
                 <w:rFonts w:ascii="Calibri" w:cs="Calibri" w:eastAsia="Calibri" w:hAnsi="Calibri"/>
               </w:rPr>
-              <w:t xml:space="preserve">Même routine, animée de plus en plus par les élèves leaders.</w:t>
+              <w:t xml:space="preserve">Annonce qui participe aux sous-groupes de besoins du jour.</w:t>
             </w:r>
           </w:p>
         </w:tc>
@@ -2592,7 +3588,7 @@
               <w:rPr>
                 <w:rFonts w:ascii="Calibri" w:cs="Calibri" w:eastAsia="Calibri" w:hAnsi="Calibri"/>
               </w:rPr>
-              <w:t xml:space="preserve">Annonce qui participe aux sous-groupes de besoins du jour.</w:t>
+              <w:t xml:space="preserve">Annonce qui participe à ses ateliers ciblés du jour.</w:t>
             </w:r>
           </w:p>
         </w:tc>
@@ -2616,7 +3612,7 @@
               <w:rPr>
                 <w:rFonts w:ascii="Calibri" w:cs="Calibri" w:eastAsia="Calibri" w:hAnsi="Calibri"/>
               </w:rPr>
-              <w:t xml:space="preserve">Annonce qui participe à ses ateliers ciblés du jour.</w:t>
+              <w:t xml:space="preserve">Animent une partie de l'accueil, par exemple la météo d'équipe.</w:t>
             </w:r>
           </w:p>
         </w:tc>
@@ -2648,7 +3644,7 @@
                 <w:bCs/>
                 <w:color w:val="1D3557"/>
               </w:rPr>
-              <w:t xml:space="preserve">9 h 00 à 11 h 15</w:t>
+              <w:t xml:space="preserve">9 h 00 à 11 h 45</w:t>
             </w:r>
           </w:p>
           <w:p>
@@ -2662,7 +3658,7 @@
                 <w:sz w:val="19"/>
                 <w:szCs w:val="19"/>
               </w:rPr>
-              <w:t xml:space="preserve">Blocs de travail</w:t>
+              <w:t xml:space="preserve">Périodes 1, 2 et 3</w:t>
             </w:r>
           </w:p>
         </w:tc>
@@ -2685,7 +3681,21 @@
               <w:rPr>
                 <w:rFonts w:ascii="Calibri" w:cs="Calibri" w:eastAsia="Calibri" w:hAnsi="Calibri"/>
               </w:rPr>
-              <w:t xml:space="preserve">La majorité travaille en ateliers autonomes. Quelques élèves rejoignent l'enseignante ou la TES selon leurs besoins.</w:t>
+              <w:t xml:space="preserve">Garde le même horaire de Z101 et </w:t>
+            </w:r>
+            <w:r>
+              <w:rPr>
+                <w:rFonts w:ascii="Calibri" w:cs="Calibri" w:eastAsia="Calibri" w:hAnsi="Calibri"/>
+                <w:b/>
+                <w:bCs/>
+              </w:rPr>
+              <w:t xml:space="preserve">anime des ateliers en sous-groupes de besoins</w:t>
+            </w:r>
+            <w:r>
+              <w:rPr>
+                <w:rFonts w:ascii="Calibri" w:cs="Calibri" w:eastAsia="Calibri" w:hAnsi="Calibri"/>
+              </w:rPr>
+              <w:t xml:space="preserve"> : de petits groupes formés selon les difficultés observées.</w:t>
             </w:r>
           </w:p>
         </w:tc>
@@ -2710,13 +3720,13 @@
                 <w:b/>
                 <w:bCs/>
               </w:rPr>
-              <w:t xml:space="preserve">Anime des ateliers en sous-groupes de besoins</w:t>
-            </w:r>
-            <w:r>
-              <w:rPr>
-                <w:rFonts w:ascii="Calibri" w:cs="Calibri" w:eastAsia="Calibri" w:hAnsi="Calibri"/>
-              </w:rPr>
-              <w:t xml:space="preserve"> (petits groupes formés selon les difficultés observées) en plus de l'enseignement direct.</w:t>
+              <w:t xml:space="preserve">Anime des ateliers ciblés en petits groupes</w:t>
+            </w:r>
+            <w:r>
+              <w:rPr>
+                <w:rFonts w:ascii="Calibri" w:cs="Calibri" w:eastAsia="Calibri" w:hAnsi="Calibri"/>
+              </w:rPr>
+              <w:t xml:space="preserve"> : habiletés de vie, gestion des émotions, préparation à l'emploi. Les ateliers exploratoires fonctionnent sans elle.</w:t>
             </w:r>
           </w:p>
         </w:tc>
@@ -2738,134 +3748,8 @@
             <w:r>
               <w:rPr>
                 <w:rFonts w:ascii="Calibri" w:cs="Calibri" w:eastAsia="Calibri" w:hAnsi="Calibri"/>
-                <w:b/>
-                <w:bCs/>
-              </w:rPr>
-              <w:t xml:space="preserve">Anime des ateliers ciblés en petits groupes</w:t>
-            </w:r>
-            <w:r>
-              <w:rPr>
-                <w:rFonts w:ascii="Calibri" w:cs="Calibri" w:eastAsia="Calibri" w:hAnsi="Calibri"/>
-              </w:rPr>
-              <w:t xml:space="preserve"> : habiletés de vie, gestion des émotions, préparation à l'emploi.</w:t>
-            </w:r>
-          </w:p>
-        </w:tc>
-      </w:tr>
-      <w:tr>
-        <w:trPr>
-          <w:cantSplit/>
-        </w:trPr>
-        <w:tc>
-          <w:tcPr>
-            <w:tcW w:type="dxa" w:w="1560"/>
-            <w:shd w:fill="F4F5F7" w:color="auto" w:val="clear"/>
-            <w:tcMar>
-              <w:top w:type="dxa" w:w="100"/>
-              <w:left w:type="dxa" w:w="140"/>
-              <w:bottom w:type="dxa" w:w="100"/>
-              <w:right w:type="dxa" w:w="140"/>
-            </w:tcMar>
-            <w:vAlign w:val="top"/>
-          </w:tcPr>
-          <w:p>
-            <w:pPr>
-              <w:spacing w:after="0"/>
-            </w:pPr>
-            <w:r>
-              <w:rPr>
-                <w:rFonts w:ascii="Calibri" w:cs="Calibri" w:eastAsia="Calibri" w:hAnsi="Calibri"/>
-                <w:b/>
-                <w:bCs/>
-                <w:color w:val="1D3557"/>
-              </w:rPr>
-              <w:t xml:space="preserve">11 h 15</w:t>
-            </w:r>
-          </w:p>
-          <w:p>
-            <w:pPr>
-              <w:spacing w:after="0"/>
-            </w:pPr>
-            <w:r>
-              <w:rPr>
-                <w:rFonts w:ascii="Calibri" w:cs="Calibri" w:eastAsia="Calibri" w:hAnsi="Calibri"/>
-                <w:color w:val="5A6070"/>
-                <w:sz w:val="19"/>
-                <w:szCs w:val="19"/>
-              </w:rPr>
-              <w:t xml:space="preserve">Retour et rangement</w:t>
-            </w:r>
-          </w:p>
-        </w:tc>
-        <w:tc>
-          <w:tcPr>
-            <w:tcW w:type="dxa" w:w="2600"/>
-            <w:shd w:fill="FDF6DD" w:color="auto" w:val="clear"/>
-            <w:tcMar>
-              <w:top w:type="dxa" w:w="100"/>
-              <w:left w:type="dxa" w:w="140"/>
-              <w:bottom w:type="dxa" w:w="100"/>
-              <w:right w:type="dxa" w:w="140"/>
-            </w:tcMar>
-            <w:vAlign w:val="top"/>
-          </w:tcPr>
-          <w:p>
-            <w:pPr>
-              <w:spacing w:after="40" w:line="264"/>
-            </w:pPr>
-            <w:r>
-              <w:rPr>
-                <w:rFonts w:ascii="Calibri" w:cs="Calibri" w:eastAsia="Calibri" w:hAnsi="Calibri"/>
-              </w:rPr>
-              <w:t xml:space="preserve">Les élèves animent eux-mêmes une partie du retour.</w:t>
-            </w:r>
-          </w:p>
-        </w:tc>
-        <w:tc>
-          <w:tcPr>
-            <w:tcW w:type="dxa" w:w="2600"/>
-            <w:shd w:fill="FDF6DD" w:color="auto" w:val="clear"/>
-            <w:tcMar>
-              <w:top w:type="dxa" w:w="100"/>
-              <w:left w:type="dxa" w:w="140"/>
-              <w:bottom w:type="dxa" w:w="100"/>
-              <w:right w:type="dxa" w:w="140"/>
-            </w:tcMar>
-            <w:vAlign w:val="top"/>
-          </w:tcPr>
-          <w:p>
-            <w:pPr>
-              <w:spacing w:after="40" w:line="264"/>
-            </w:pPr>
-            <w:r>
-              <w:rPr>
-                <w:rFonts w:ascii="Calibri" w:cs="Calibri" w:eastAsia="Calibri" w:hAnsi="Calibri"/>
-              </w:rPr>
-              <w:t xml:space="preserve">Valide le registre.</w:t>
-            </w:r>
-          </w:p>
-        </w:tc>
-        <w:tc>
-          <w:tcPr>
-            <w:tcW w:type="dxa" w:w="2600"/>
-            <w:shd w:fill="FDF6DD" w:color="auto" w:val="clear"/>
-            <w:tcMar>
-              <w:top w:type="dxa" w:w="100"/>
-              <w:left w:type="dxa" w:w="140"/>
-              <w:bottom w:type="dxa" w:w="100"/>
-              <w:right w:type="dxa" w:w="140"/>
-            </w:tcMar>
-            <w:vAlign w:val="top"/>
-          </w:tcPr>
-          <w:p>
-            <w:pPr>
-              <w:spacing w:after="40" w:line="264"/>
-            </w:pPr>
-            <w:r>
-              <w:rPr>
-                <w:rFonts w:ascii="Calibri" w:cs="Calibri" w:eastAsia="Calibri" w:hAnsi="Calibri"/>
-              </w:rPr>
-              <w:t xml:space="preserve">Co-anime le retour réflexif.</w:t>
+              </w:rPr>
+              <w:t xml:space="preserve">Font fonctionner les ateliers exploratoires de façon autonome, avec la fiche et le registre.</w:t>
             </w:r>
           </w:p>
         </w:tc>
@@ -2884,7 +3768,602 @@
         <w:rPr>
           <w:rFonts w:ascii="Calibri" w:cs="Calibri" w:eastAsia="Calibri" w:hAnsi="Calibri"/>
         </w:rPr>
-        <w:t xml:space="preserve">5. Rôles et responsabilités</w:t>
+        <w:t xml:space="preserve">5. Le rôle des leaders</w:t>
+      </w:r>
+    </w:p>
+    <w:p>
+      <w:pPr>
+        <w:spacing w:after="120" w:line="288"/>
+      </w:pPr>
+      <w:r>
+        <w:rPr>
+          <w:rFonts w:ascii="Calibri" w:cs="Calibri" w:eastAsia="Calibri" w:hAnsi="Calibri"/>
+        </w:rPr>
+        <w:t xml:space="preserve">Le leader n'est pas un chef qui fait tout. C'est un </w:t>
+      </w:r>
+      <w:r>
+        <w:rPr>
+          <w:rFonts w:ascii="Calibri" w:cs="Calibri" w:eastAsia="Calibri" w:hAnsi="Calibri"/>
+          <w:b/>
+          <w:bCs/>
+        </w:rPr>
+        <w:t xml:space="preserve">facilitateur</w:t>
+      </w:r>
+      <w:r>
+        <w:rPr>
+          <w:rFonts w:ascii="Calibri" w:cs="Calibri" w:eastAsia="Calibri" w:hAnsi="Calibri"/>
+        </w:rPr>
+        <w:t xml:space="preserve"> qui assure la cohésion de son équipe, pour que l'enseignante puisse enseigner sans être interrompue.</w:t>
+      </w:r>
+    </w:p>
+    <w:tbl>
+      <w:tblPr>
+        <w:tblW w:type="dxa" w:w="9360"/>
+        <w:tblBorders>
+          <w:top w:val="single" w:color="CFD4DC" w:sz="4"/>
+          <w:left w:val="single" w:color="CFD4DC" w:sz="4"/>
+          <w:bottom w:val="single" w:color="CFD4DC" w:sz="4"/>
+          <w:right w:val="single" w:color="CFD4DC" w:sz="4"/>
+          <w:insideH w:val="single" w:color="CFD4DC" w:sz="4"/>
+          <w:insideV w:val="single" w:color="CFD4DC" w:sz="4"/>
+        </w:tblBorders>
+        <w:tblLayout w:type="fixed"/>
+      </w:tblPr>
+      <w:tblGrid>
+        <w:gridCol w:w="2100"/>
+        <w:gridCol w:w="7260"/>
+      </w:tblGrid>
+      <w:tr>
+        <w:trPr>
+          <w:tblHeader/>
+        </w:trPr>
+        <w:tc>
+          <w:tcPr>
+            <w:tcW w:type="dxa" w:w="2100"/>
+            <w:shd w:fill="1D3557" w:color="auto" w:val="clear"/>
+            <w:tcMar>
+              <w:top w:type="dxa" w:w="100"/>
+              <w:left w:type="dxa" w:w="140"/>
+              <w:bottom w:type="dxa" w:w="100"/>
+              <w:right w:type="dxa" w:w="140"/>
+            </w:tcMar>
+            <w:vAlign w:val="top"/>
+          </w:tcPr>
+          <w:p>
+            <w:pPr>
+              <w:spacing w:after="0"/>
+            </w:pPr>
+            <w:r>
+              <w:rPr>
+                <w:rFonts w:ascii="Calibri" w:cs="Calibri" w:eastAsia="Calibri" w:hAnsi="Calibri"/>
+                <w:b/>
+                <w:bCs/>
+                <w:color w:val="FFFFFF"/>
+                <w:sz w:val="20"/>
+                <w:szCs w:val="20"/>
+              </w:rPr>
+              <w:t xml:space="preserve">Moment</w:t>
+            </w:r>
+          </w:p>
+        </w:tc>
+        <w:tc>
+          <w:tcPr>
+            <w:tcW w:type="dxa" w:w="7260"/>
+            <w:shd w:fill="1D3557" w:color="auto" w:val="clear"/>
+            <w:tcMar>
+              <w:top w:type="dxa" w:w="100"/>
+              <w:left w:type="dxa" w:w="140"/>
+              <w:bottom w:type="dxa" w:w="100"/>
+              <w:right w:type="dxa" w:w="140"/>
+            </w:tcMar>
+            <w:vAlign w:val="top"/>
+          </w:tcPr>
+          <w:p>
+            <w:pPr>
+              <w:spacing w:after="0"/>
+            </w:pPr>
+            <w:r>
+              <w:rPr>
+                <w:rFonts w:ascii="Calibri" w:cs="Calibri" w:eastAsia="Calibri" w:hAnsi="Calibri"/>
+                <w:b/>
+                <w:bCs/>
+                <w:color w:val="FFFFFF"/>
+                <w:sz w:val="20"/>
+                <w:szCs w:val="20"/>
+              </w:rPr>
+              <w:t xml:space="preserve">Ce que fait le leader</w:t>
+            </w:r>
+          </w:p>
+        </w:tc>
+      </w:tr>
+      <w:tr>
+        <w:trPr>
+          <w:cantSplit/>
+        </w:trPr>
+        <w:tc>
+          <w:tcPr>
+            <w:tcW w:type="dxa" w:w="2100"/>
+            <w:shd w:fill="EAF4E4" w:color="auto" w:val="clear"/>
+            <w:tcMar>
+              <w:top w:type="dxa" w:w="100"/>
+              <w:left w:type="dxa" w:w="140"/>
+              <w:bottom w:type="dxa" w:w="100"/>
+              <w:right w:type="dxa" w:w="140"/>
+            </w:tcMar>
+            <w:vAlign w:val="top"/>
+          </w:tcPr>
+          <w:p>
+            <w:pPr>
+              <w:spacing w:after="40" w:line="264"/>
+            </w:pPr>
+            <w:r>
+              <w:rPr>
+                <w:rFonts w:ascii="Calibri" w:cs="Calibri" w:eastAsia="Calibri" w:hAnsi="Calibri"/>
+                <w:b/>
+                <w:bCs/>
+              </w:rPr>
+              <w:t xml:space="preserve">Au début</w:t>
+            </w:r>
+          </w:p>
+        </w:tc>
+        <w:tc>
+          <w:tcPr>
+            <w:tcW w:type="dxa" w:w="7260"/>
+            <w:tcMar>
+              <w:top w:type="dxa" w:w="100"/>
+              <w:left w:type="dxa" w:w="140"/>
+              <w:bottom w:type="dxa" w:w="100"/>
+              <w:right w:type="dxa" w:w="140"/>
+            </w:tcMar>
+            <w:vAlign w:val="top"/>
+          </w:tcPr>
+          <w:p>
+            <w:pPr>
+              <w:spacing w:after="40" w:line="264"/>
+            </w:pPr>
+            <w:r>
+              <w:rPr>
+                <w:rFonts w:ascii="Calibri" w:cs="Calibri" w:eastAsia="Calibri" w:hAnsi="Calibri"/>
+              </w:rPr>
+              <w:t xml:space="preserve">Rassemble l'équipe autour de la table. Lit la fiche de tâche lentement, à voix haute. Vérifie que chacun a son matériel.</w:t>
+            </w:r>
+          </w:p>
+        </w:tc>
+      </w:tr>
+      <w:tr>
+        <w:trPr>
+          <w:cantSplit/>
+        </w:trPr>
+        <w:tc>
+          <w:tcPr>
+            <w:tcW w:type="dxa" w:w="2100"/>
+            <w:shd w:fill="EAF4E4" w:color="auto" w:val="clear"/>
+            <w:tcMar>
+              <w:top w:type="dxa" w:w="100"/>
+              <w:left w:type="dxa" w:w="140"/>
+              <w:bottom w:type="dxa" w:w="100"/>
+              <w:right w:type="dxa" w:w="140"/>
+            </w:tcMar>
+            <w:vAlign w:val="top"/>
+          </w:tcPr>
+          <w:p>
+            <w:pPr>
+              <w:spacing w:after="40" w:line="264"/>
+            </w:pPr>
+            <w:r>
+              <w:rPr>
+                <w:rFonts w:ascii="Calibri" w:cs="Calibri" w:eastAsia="Calibri" w:hAnsi="Calibri"/>
+                <w:b/>
+                <w:bCs/>
+              </w:rPr>
+              <w:t xml:space="preserve">Pendant</w:t>
+            </w:r>
+          </w:p>
+        </w:tc>
+        <w:tc>
+          <w:tcPr>
+            <w:tcW w:type="dxa" w:w="7260"/>
+            <w:tcMar>
+              <w:top w:type="dxa" w:w="100"/>
+              <w:left w:type="dxa" w:w="140"/>
+              <w:bottom w:type="dxa" w:w="100"/>
+              <w:right w:type="dxa" w:w="140"/>
+            </w:tcMar>
+            <w:vAlign w:val="top"/>
+          </w:tcPr>
+          <w:p>
+            <w:pPr>
+              <w:spacing w:after="40" w:line="264"/>
+            </w:pPr>
+            <w:r>
+              <w:rPr>
+                <w:rFonts w:ascii="Calibri" w:cs="Calibri" w:eastAsia="Calibri" w:hAnsi="Calibri"/>
+              </w:rPr>
+              <w:t xml:space="preserve">Distribue la parole pour que les plus timides s'expriment. Gère le temps (« Il nous reste 10 minutes »). Règle les blocages avec la règle « 3 avant l'enseignante ».</w:t>
+            </w:r>
+          </w:p>
+        </w:tc>
+      </w:tr>
+      <w:tr>
+        <w:trPr>
+          <w:cantSplit/>
+        </w:trPr>
+        <w:tc>
+          <w:tcPr>
+            <w:tcW w:type="dxa" w:w="2100"/>
+            <w:shd w:fill="EAF4E4" w:color="auto" w:val="clear"/>
+            <w:tcMar>
+              <w:top w:type="dxa" w:w="100"/>
+              <w:left w:type="dxa" w:w="140"/>
+              <w:bottom w:type="dxa" w:w="100"/>
+              <w:right w:type="dxa" w:w="140"/>
+            </w:tcMar>
+            <w:vAlign w:val="top"/>
+          </w:tcPr>
+          <w:p>
+            <w:pPr>
+              <w:spacing w:after="40" w:line="264"/>
+            </w:pPr>
+            <w:r>
+              <w:rPr>
+                <w:rFonts w:ascii="Calibri" w:cs="Calibri" w:eastAsia="Calibri" w:hAnsi="Calibri"/>
+                <w:b/>
+                <w:bCs/>
+              </w:rPr>
+              <w:t xml:space="preserve">À la fin</w:t>
+            </w:r>
+          </w:p>
+        </w:tc>
+        <w:tc>
+          <w:tcPr>
+            <w:tcW w:type="dxa" w:w="7260"/>
+            <w:tcMar>
+              <w:top w:type="dxa" w:w="100"/>
+              <w:left w:type="dxa" w:w="140"/>
+              <w:bottom w:type="dxa" w:w="100"/>
+              <w:right w:type="dxa" w:w="140"/>
+            </w:tcMar>
+            <w:vAlign w:val="top"/>
+          </w:tcPr>
+          <w:p>
+            <w:pPr>
+              <w:spacing w:after="40" w:line="264"/>
+            </w:pPr>
+            <w:r>
+              <w:rPr>
+                <w:rFonts w:ascii="Calibri" w:cs="Calibri" w:eastAsia="Calibri" w:hAnsi="Calibri"/>
+              </w:rPr>
+              <w:t xml:space="preserve">Passe en revue les critères de réussite avec l'équipe. Fait ranger le matériel. Valide les étapes au registre par ses initiales, avant la validation finale de l'enseignante.</w:t>
+            </w:r>
+          </w:p>
+        </w:tc>
+      </w:tr>
+    </w:tbl>
+    <w:p>
+      <w:pPr>
+        <w:pStyle w:val="Heading2"/>
+        <w:keepNext/>
+        <w:spacing w:after="80" w:before="200"/>
+      </w:pPr>
+      <w:r>
+        <w:rPr>
+          <w:rFonts w:ascii="Calibri" w:cs="Calibri" w:eastAsia="Calibri" w:hAnsi="Calibri"/>
+        </w:rPr>
+        <w:t xml:space="preserve">Les tâches selon le lieu</w:t>
+      </w:r>
+    </w:p>
+    <w:tbl>
+      <w:tblPr>
+        <w:tblW w:type="dxa" w:w="9360"/>
+        <w:tblBorders>
+          <w:top w:val="single" w:color="CFD4DC" w:sz="4"/>
+          <w:left w:val="single" w:color="CFD4DC" w:sz="4"/>
+          <w:bottom w:val="single" w:color="CFD4DC" w:sz="4"/>
+          <w:right w:val="single" w:color="CFD4DC" w:sz="4"/>
+          <w:insideH w:val="single" w:color="CFD4DC" w:sz="4"/>
+          <w:insideV w:val="single" w:color="CFD4DC" w:sz="4"/>
+        </w:tblBorders>
+        <w:tblLayout w:type="fixed"/>
+      </w:tblPr>
+      <w:tblGrid>
+        <w:gridCol w:w="2100"/>
+        <w:gridCol w:w="7260"/>
+      </w:tblGrid>
+      <w:tr>
+        <w:trPr>
+          <w:tblHeader/>
+        </w:trPr>
+        <w:tc>
+          <w:tcPr>
+            <w:tcW w:type="dxa" w:w="2100"/>
+            <w:shd w:fill="1D3557" w:color="auto" w:val="clear"/>
+            <w:tcMar>
+              <w:top w:type="dxa" w:w="100"/>
+              <w:left w:type="dxa" w:w="140"/>
+              <w:bottom w:type="dxa" w:w="100"/>
+              <w:right w:type="dxa" w:w="140"/>
+            </w:tcMar>
+            <w:vAlign w:val="top"/>
+          </w:tcPr>
+          <w:p>
+            <w:pPr>
+              <w:spacing w:after="0"/>
+            </w:pPr>
+            <w:r>
+              <w:rPr>
+                <w:rFonts w:ascii="Calibri" w:cs="Calibri" w:eastAsia="Calibri" w:hAnsi="Calibri"/>
+                <w:b/>
+                <w:bCs/>
+                <w:color w:val="FFFFFF"/>
+                <w:sz w:val="20"/>
+                <w:szCs w:val="20"/>
+              </w:rPr>
+              <w:t xml:space="preserve">Lieu</w:t>
+            </w:r>
+          </w:p>
+        </w:tc>
+        <w:tc>
+          <w:tcPr>
+            <w:tcW w:type="dxa" w:w="7260"/>
+            <w:shd w:fill="1D3557" w:color="auto" w:val="clear"/>
+            <w:tcMar>
+              <w:top w:type="dxa" w:w="100"/>
+              <w:left w:type="dxa" w:w="140"/>
+              <w:bottom w:type="dxa" w:w="100"/>
+              <w:right w:type="dxa" w:w="140"/>
+            </w:tcMar>
+            <w:vAlign w:val="top"/>
+          </w:tcPr>
+          <w:p>
+            <w:pPr>
+              <w:spacing w:after="0"/>
+            </w:pPr>
+            <w:r>
+              <w:rPr>
+                <w:rFonts w:ascii="Calibri" w:cs="Calibri" w:eastAsia="Calibri" w:hAnsi="Calibri"/>
+                <w:b/>
+                <w:bCs/>
+                <w:color w:val="FFFFFF"/>
+                <w:sz w:val="20"/>
+                <w:szCs w:val="20"/>
+              </w:rPr>
+              <w:t xml:space="preserve">Responsabilités du leader</w:t>
+            </w:r>
+          </w:p>
+        </w:tc>
+      </w:tr>
+      <w:tr>
+        <w:trPr>
+          <w:cantSplit/>
+        </w:trPr>
+        <w:tc>
+          <w:tcPr>
+            <w:tcW w:type="dxa" w:w="2100"/>
+            <w:shd w:fill="EAF4E4" w:color="auto" w:val="clear"/>
+            <w:tcMar>
+              <w:top w:type="dxa" w:w="100"/>
+              <w:left w:type="dxa" w:w="140"/>
+              <w:bottom w:type="dxa" w:w="100"/>
+              <w:right w:type="dxa" w:w="140"/>
+            </w:tcMar>
+            <w:vAlign w:val="top"/>
+          </w:tcPr>
+          <w:p>
+            <w:pPr>
+              <w:spacing w:after="40" w:line="264"/>
+            </w:pPr>
+            <w:r>
+              <w:rPr>
+                <w:rFonts w:ascii="Calibri" w:cs="Calibri" w:eastAsia="Calibri" w:hAnsi="Calibri"/>
+                <w:b/>
+                <w:bCs/>
+              </w:rPr>
+              <w:t xml:space="preserve">Grenier de Maria</w:t>
+            </w:r>
+          </w:p>
+        </w:tc>
+        <w:tc>
+          <w:tcPr>
+            <w:tcW w:type="dxa" w:w="7260"/>
+            <w:tcMar>
+              <w:top w:type="dxa" w:w="100"/>
+              <w:left w:type="dxa" w:w="140"/>
+              <w:bottom w:type="dxa" w:w="100"/>
+              <w:right w:type="dxa" w:w="140"/>
+            </w:tcMar>
+            <w:vAlign w:val="top"/>
+          </w:tcPr>
+          <w:p>
+            <w:pPr>
+              <w:spacing w:after="40" w:line="264"/>
+            </w:pPr>
+            <w:r>
+              <w:rPr>
+                <w:rFonts w:ascii="Calibri" w:cs="Calibri" w:eastAsia="Calibri" w:hAnsi="Calibri"/>
+              </w:rPr>
+              <w:t xml:space="preserve">Organise le tri, l'inventaire et la manutention sécuritaire. Répartit les tâches de logistique. Assure le contrôle de la qualité.</w:t>
+            </w:r>
+          </w:p>
+        </w:tc>
+      </w:tr>
+      <w:tr>
+        <w:trPr>
+          <w:cantSplit/>
+        </w:trPr>
+        <w:tc>
+          <w:tcPr>
+            <w:tcW w:type="dxa" w:w="2100"/>
+            <w:shd w:fill="EAF4E4" w:color="auto" w:val="clear"/>
+            <w:tcMar>
+              <w:top w:type="dxa" w:w="100"/>
+              <w:left w:type="dxa" w:w="140"/>
+              <w:bottom w:type="dxa" w:w="100"/>
+              <w:right w:type="dxa" w:w="140"/>
+            </w:tcMar>
+            <w:vAlign w:val="top"/>
+          </w:tcPr>
+          <w:p>
+            <w:pPr>
+              <w:spacing w:after="40" w:line="264"/>
+            </w:pPr>
+            <w:r>
+              <w:rPr>
+                <w:rFonts w:ascii="Calibri" w:cs="Calibri" w:eastAsia="Calibri" w:hAnsi="Calibri"/>
+                <w:b/>
+                <w:bCs/>
+              </w:rPr>
+              <w:t xml:space="preserve">Local d'arts plastiques</w:t>
+            </w:r>
+          </w:p>
+        </w:tc>
+        <w:tc>
+          <w:tcPr>
+            <w:tcW w:type="dxa" w:w="7260"/>
+            <w:tcMar>
+              <w:top w:type="dxa" w:w="100"/>
+              <w:left w:type="dxa" w:w="140"/>
+              <w:bottom w:type="dxa" w:w="100"/>
+              <w:right w:type="dxa" w:w="140"/>
+            </w:tcMar>
+            <w:vAlign w:val="top"/>
+          </w:tcPr>
+          <w:p>
+            <w:pPr>
+              <w:spacing w:after="40" w:line="264"/>
+            </w:pPr>
+            <w:r>
+              <w:rPr>
+                <w:rFonts w:ascii="Calibri" w:cs="Calibri" w:eastAsia="Calibri" w:hAnsi="Calibri"/>
+              </w:rPr>
+              <w:t xml:space="preserve">Distribue le matériel, fait respecter les consignes de sécurité et veille au rangement du local à la fin de l'atelier.</w:t>
+            </w:r>
+          </w:p>
+        </w:tc>
+      </w:tr>
+    </w:tbl>
+    <w:p>
+      <w:pPr>
+        <w:pStyle w:val="Heading2"/>
+        <w:keepNext/>
+        <w:spacing w:after="80" w:before="200"/>
+      </w:pPr>
+      <w:r>
+        <w:rPr>
+          <w:rFonts w:ascii="Calibri" w:cs="Calibri" w:eastAsia="Calibri" w:hAnsi="Calibri"/>
+        </w:rPr>
+        <w:t xml:space="preserve">Comment on choisit les leaders</w:t>
+      </w:r>
+    </w:p>
+    <w:p>
+      <w:pPr>
+        <w:pStyle w:val="ListParagraph"/>
+        <w:numPr>
+          <w:ilvl w:val="0"/>
+          <w:numId w:val="2"/>
+        </w:numPr>
+        <w:spacing w:after="80" w:line="276"/>
+      </w:pPr>
+      <w:r>
+        <w:rPr>
+          <w:rFonts w:ascii="Calibri" w:cs="Calibri" w:eastAsia="Calibri" w:hAnsi="Calibri"/>
+          <w:b/>
+          <w:bCs/>
+        </w:rPr>
+        <w:t xml:space="preserve">Rotation :</w:t>
+      </w:r>
+      <w:r>
+        <w:rPr>
+          <w:rFonts w:ascii="Calibri" w:cs="Calibri" w:eastAsia="Calibri" w:hAnsi="Calibri"/>
+        </w:rPr>
+        <w:t xml:space="preserve"> chaque élève occupe le rôle au moins une fois par étape.</w:t>
+      </w:r>
+    </w:p>
+    <w:p>
+      <w:pPr>
+        <w:pStyle w:val="ListParagraph"/>
+        <w:numPr>
+          <w:ilvl w:val="0"/>
+          <w:numId w:val="2"/>
+        </w:numPr>
+        <w:spacing w:after="80" w:line="276"/>
+      </w:pPr>
+      <w:r>
+        <w:rPr>
+          <w:rFonts w:ascii="Calibri" w:cs="Calibri" w:eastAsia="Calibri" w:hAnsi="Calibri"/>
+          <w:b/>
+          <w:bCs/>
+        </w:rPr>
+        <w:t xml:space="preserve">Volontariat encouragé :</w:t>
+      </w:r>
+      <w:r>
+        <w:rPr>
+          <w:rFonts w:ascii="Calibri" w:cs="Calibri" w:eastAsia="Calibri" w:hAnsi="Calibri"/>
+        </w:rPr>
+        <w:t xml:space="preserve"> priorité aux élèves qui veulent développer leur leadership.</w:t>
+      </w:r>
+    </w:p>
+    <w:p>
+      <w:pPr>
+        <w:pStyle w:val="ListParagraph"/>
+        <w:numPr>
+          <w:ilvl w:val="0"/>
+          <w:numId w:val="2"/>
+        </w:numPr>
+        <w:spacing w:after="80" w:line="276"/>
+      </w:pPr>
+      <w:r>
+        <w:rPr>
+          <w:rFonts w:ascii="Calibri" w:cs="Calibri" w:eastAsia="Calibri" w:hAnsi="Calibri"/>
+          <w:b/>
+          <w:bCs/>
+        </w:rPr>
+        <w:t xml:space="preserve">Jumelage :</w:t>
+      </w:r>
+      <w:r>
+        <w:rPr>
+          <w:rFonts w:ascii="Calibri" w:cs="Calibri" w:eastAsia="Calibri" w:hAnsi="Calibri"/>
+        </w:rPr>
+        <w:t xml:space="preserve"> un leader plus réservé peut être jumelé à un co-leader de soutien.</w:t>
+      </w:r>
+    </w:p>
+    <w:p>
+      <w:pPr>
+        <w:pStyle w:val="ListParagraph"/>
+        <w:numPr>
+          <w:ilvl w:val="0"/>
+          <w:numId w:val="2"/>
+        </w:numPr>
+        <w:spacing w:after="80" w:line="276"/>
+      </w:pPr>
+      <w:r>
+        <w:rPr>
+          <w:rFonts w:ascii="Calibri" w:cs="Calibri" w:eastAsia="Calibri" w:hAnsi="Calibri"/>
+          <w:b/>
+          <w:bCs/>
+        </w:rPr>
+        <w:t xml:space="preserve">Soutien de la TES :</w:t>
+      </w:r>
+      <w:r>
+        <w:rPr>
+          <w:rFonts w:ascii="Calibri" w:cs="Calibri" w:eastAsia="Calibri" w:hAnsi="Calibri"/>
+        </w:rPr>
+        <w:t xml:space="preserve"> elle conseille discrètement le leader pour renforcer sa posture.</w:t>
+      </w:r>
+    </w:p>
+    <w:p>
+      <w:pPr>
+        <w:pStyle w:val="Heading1"/>
+        <w:keepNext/>
+        <w:pBdr>
+          <w:bottom w:val="single" w:color="2F7A2A" w:sz="6" w:space="4"/>
+        </w:pBdr>
+        <w:spacing w:after="140" w:before="360"/>
+      </w:pPr>
+      <w:r>
+        <w:rPr>
+          <w:rFonts w:ascii="Calibri" w:cs="Calibri" w:eastAsia="Calibri" w:hAnsi="Calibri"/>
+        </w:rPr>
+        <w:t xml:space="preserve">6. Rôles et responsabilités</w:t>
       </w:r>
     </w:p>
     <w:tbl>
@@ -2963,7 +4442,7 @@
                 <w:sz w:val="20"/>
                 <w:szCs w:val="20"/>
               </w:rPr>
-              <w:t xml:space="preserve">Périodes 1 et 2</w:t>
+              <w:t xml:space="preserve">Étapes 1 et 2</w:t>
             </w:r>
           </w:p>
         </w:tc>
@@ -2992,7 +4471,7 @@
                 <w:sz w:val="20"/>
                 <w:szCs w:val="20"/>
               </w:rPr>
-              <w:t xml:space="preserve">Période 3</w:t>
+              <w:t xml:space="preserve">Étape 3</w:t>
             </w:r>
           </w:p>
         </w:tc>
@@ -3057,7 +4536,21 @@
               <w:rPr>
                 <w:rFonts w:ascii="Calibri" w:cs="Calibri" w:eastAsia="Calibri" w:hAnsi="Calibri"/>
               </w:rPr>
-              <w:t xml:space="preserve">Enseigne le Z101 à chaque sous-groupe. Planifie, évalue et valide le registre. Présente les outils d'autonomie.</w:t>
+              <w:t xml:space="preserve">Enseigne le Z101 à chaque sous-groupe et </w:t>
+            </w:r>
+            <w:r>
+              <w:rPr>
+                <w:rFonts w:ascii="Calibri" w:cs="Calibri" w:eastAsia="Calibri" w:hAnsi="Calibri"/>
+                <w:b/>
+                <w:bCs/>
+              </w:rPr>
+              <w:t xml:space="preserve">circule</w:t>
+            </w:r>
+            <w:r>
+              <w:rPr>
+                <w:rFonts w:ascii="Calibri" w:cs="Calibri" w:eastAsia="Calibri" w:hAnsi="Calibri"/>
+              </w:rPr>
+              <w:t xml:space="preserve"> vers les ateliers pour s'assurer de leur bon fonctionnement. Planifie, évalue et valide le registre. Présente les outils d'autonomie.</w:t>
             </w:r>
           </w:p>
         </w:tc>
@@ -3159,7 +4652,7 @@
               <w:rPr>
                 <w:rFonts w:ascii="Calibri" w:cs="Calibri" w:eastAsia="Calibri" w:hAnsi="Calibri"/>
               </w:rPr>
-              <w:t xml:space="preserve">Accompagne le sous-groupe en atelier : modélise le rôle de leader, aide à régler les blocages, soutient l'autorégulation, encadre les transitions. Co-anime le retour réflexif.</w:t>
+              <w:t xml:space="preserve">Accompagne le sous-groupe en atelier : modélise le rôle de leader, aide à régler les blocages, soutient l'autorégulation, encadre les transitions.</w:t>
             </w:r>
           </w:p>
         </w:tc>
@@ -3421,7 +4914,7 @@
               <w:rPr>
                 <w:rFonts w:ascii="Calibri" w:cs="Calibri" w:eastAsia="Calibri" w:hAnsi="Calibri"/>
               </w:rPr>
-              <w:t xml:space="preserve">Animent aussi une partie de l'accueil et du retour.</w:t>
+              <w:t xml:space="preserve">Animent aussi une partie de l'accueil.</w:t>
             </w:r>
           </w:p>
         </w:tc>
@@ -3631,7 +5124,7 @@
         <w:rPr>
           <w:rFonts w:ascii="Calibri" w:cs="Calibri" w:eastAsia="Calibri" w:hAnsi="Calibri"/>
         </w:rPr>
-        <w:t xml:space="preserve">6. Échéancier</w:t>
+        <w:t xml:space="preserve">7. Échéancier</w:t>
       </w:r>
     </w:p>
     <w:p>
@@ -3644,7 +5137,7 @@
         <w:rPr>
           <w:rFonts w:ascii="Calibri" w:cs="Calibri" w:eastAsia="Calibri" w:hAnsi="Calibri"/>
         </w:rPr>
-        <w:t xml:space="preserve">Les trois périodes</w:t>
+        <w:t xml:space="preserve">Les trois étapes</w:t>
       </w:r>
     </w:p>
     <w:p>
@@ -3655,7 +5148,7 @@
         <w:rPr>
           <w:rFonts w:ascii="Calibri" w:cs="Calibri" w:eastAsia="Calibri" w:hAnsi="Calibri"/>
         </w:rPr>
-        <w:t xml:space="preserve">On passe d'une période à l'autre quand on observe les signes de réussite, et non à une date fixe.</w:t>
+        <w:t xml:space="preserve">Le projet se déroule en trois étapes. On passe d'une étape à l'autre quand on observe les signes de réussite.</w:t>
       </w:r>
     </w:p>
     <w:tbl>
@@ -3734,7 +5227,7 @@
                 <w:sz w:val="22"/>
                 <w:szCs w:val="22"/>
               </w:rPr>
-              <w:t xml:space="preserve">1. Ancrage</w:t>
+              <w:t xml:space="preserve">Étape 1 : ancrage</w:t>
             </w:r>
           </w:p>
           <w:p>
@@ -3776,7 +5269,7 @@
                 <w:sz w:val="22"/>
                 <w:szCs w:val="22"/>
               </w:rPr>
-              <w:t xml:space="preserve">2. Consolidation</w:t>
+              <w:t xml:space="preserve">Étape 2 : consolidation</w:t>
             </w:r>
           </w:p>
           <w:p>
@@ -3818,7 +5311,7 @@
                 <w:sz w:val="22"/>
                 <w:szCs w:val="22"/>
               </w:rPr>
-              <w:t xml:space="preserve">3. Autonomie</w:t>
+              <w:t xml:space="preserve">Étape 3 : autonomie</w:t>
             </w:r>
           </w:p>
           <w:p>
@@ -4094,7 +5587,7 @@
               <w:rPr>
                 <w:rFonts w:ascii="Calibri" w:cs="Calibri" w:eastAsia="Calibri" w:hAnsi="Calibri"/>
               </w:rPr>
-              <w:t xml:space="preserve">Présente sur les plateaux. Modélise le rôle de leader, sécurise les transitions, repère les signes d'anxiété.</w:t>
+              <w:t xml:space="preserve">Présente dans les ateliers. Modélise le rôle de leader, sécurise les transitions, repère les signes d'anxiété.</w:t>
             </w:r>
           </w:p>
         </w:tc>
@@ -4680,7 +6173,7 @@
               <w:rPr>
                 <w:rFonts w:ascii="Calibri" w:cs="Calibri" w:eastAsia="Calibri" w:hAnsi="Calibri"/>
               </w:rPr>
-              <w:t xml:space="preserve">Formation des sous-groupes A et B (mixtes). Préparation des premières fiches de tâches et du registre.</w:t>
+              <w:t xml:space="preserve">Formation des deux sous-groupes : PPS pur et sous-groupe 2. Préparation des premières fiches de tâches et du registre.</w:t>
             </w:r>
           </w:p>
         </w:tc>
@@ -4756,7 +6249,7 @@
               <w:rPr>
                 <w:rFonts w:ascii="Calibri" w:cs="Calibri" w:eastAsia="Calibri" w:hAnsi="Calibri"/>
               </w:rPr>
-              <w:t xml:space="preserve">Début de la période d'ancrage avec les 24 élèves.</w:t>
+              <w:t xml:space="preserve">Début de la étape d'ancrage avec les 24 élèves.</w:t>
             </w:r>
           </w:p>
         </w:tc>
@@ -4832,7 +6325,7 @@
               <w:rPr>
                 <w:rFonts w:ascii="Calibri" w:cs="Calibri" w:eastAsia="Calibri" w:hAnsi="Calibri"/>
               </w:rPr>
-              <w:t xml:space="preserve">Premier bilan à partir des indicateurs (section 9). Décision : poursuivre, ajuster ou revenir au groupe unique.</w:t>
+              <w:t xml:space="preserve">Premier bilan à partir des indicateurs (section 11). Décision : poursuivre, ajuster ou revenir au groupe unique.</w:t>
             </w:r>
           </w:p>
         </w:tc>
@@ -4950,7 +6443,7 @@
         <w:rPr>
           <w:rFonts w:ascii="Calibri" w:cs="Calibri" w:eastAsia="Calibri" w:hAnsi="Calibri"/>
         </w:rPr>
-        <w:t xml:space="preserve">7. Ressources et coûts</w:t>
+        <w:t xml:space="preserve">8. Ressources et coûts</w:t>
       </w:r>
     </w:p>
     <w:tbl>
@@ -5144,7 +6637,7 @@
               <w:rPr>
                 <w:rFonts w:ascii="Calibri" w:cs="Calibri" w:eastAsia="Calibri" w:hAnsi="Calibri"/>
               </w:rPr>
-              <w:t xml:space="preserve">Présente pendant les matinées d'ateliers (8 h 30 à 11 h 45), selon l'horaire d'intervention déjà prévu au guide d'organisation.</w:t>
+              <w:t xml:space="preserve">Présente pendant les matinées d'ateliers, de 8 h 25 à 11 h 45. Sa présence a déjà été validée.</w:t>
             </w:r>
           </w:p>
         </w:tc>
@@ -5198,7 +6691,7 @@
               <w:rPr>
                 <w:rFonts w:ascii="Calibri" w:cs="Calibri" w:eastAsia="Calibri" w:hAnsi="Calibri"/>
               </w:rPr>
-              <w:t xml:space="preserve">Classe du Z101 pour l'enseignement direct. Plateaux cuisine et grenier pour les ateliers.</w:t>
+              <w:t xml:space="preserve">Classe de Mme Lisa pour le Z101. Pour les ateliers exploratoires : le grenier de Maria, juste à côté de la classe, et le local d'arts plastiques, un grand local actuellement libre.</w:t>
             </w:r>
           </w:p>
         </w:tc>
@@ -5325,7 +6818,7 @@
         <w:rPr>
           <w:rFonts w:ascii="Calibri" w:cs="Calibri" w:eastAsia="Calibri" w:hAnsi="Calibri"/>
         </w:rPr>
-        <w:t xml:space="preserve">8. Fondements : les quatre besoins de l'engagement</w:t>
+        <w:t xml:space="preserve">9. Fondements : les quatre besoins de l'engagement</w:t>
       </w:r>
     </w:p>
     <w:p>
@@ -5652,7 +7145,7 @@
               <w:rPr>
                 <w:rFonts w:ascii="Calibri" w:cs="Calibri" w:eastAsia="Calibri" w:hAnsi="Calibri"/>
               </w:rPr>
-              <w:t xml:space="preserve">Des tâches de la vraie vie : cuisiner, gérer un inventaire, faire un budget, choisir un logement. Ce qui est appris sert dès maintenant.</w:t>
+              <w:t xml:space="preserve">Des tâches de la vraie vie : trier, gérer un inventaire, créer, faire un budget, choisir un logement. Ce qui est appris sert dès maintenant.</w:t>
             </w:r>
           </w:p>
         </w:tc>
@@ -5757,7 +7250,7 @@
         <w:rPr>
           <w:rFonts w:ascii="Calibri" w:cs="Calibri" w:eastAsia="Calibri" w:hAnsi="Calibri"/>
         </w:rPr>
-        <w:t xml:space="preserve">9. Risques et mesures prévues</w:t>
+        <w:t xml:space="preserve">10. Risques et mesures prévues</w:t>
       </w:r>
     </w:p>
     <w:tbl>
@@ -6051,7 +7544,7 @@
               <w:rPr>
                 <w:rFonts w:ascii="Calibri" w:cs="Calibri" w:eastAsia="Calibri" w:hAnsi="Calibri"/>
               </w:rPr>
-              <w:t xml:space="preserve">Son rôle évolue de l'accompagnement vers l'animation d'ateliers ciblés (section 5). Ses interventions en atelier sont suivies et doivent diminuer.</w:t>
+              <w:t xml:space="preserve">Son rôle évolue de l'accompagnement vers l'animation d'ateliers ciblés (section 6). Ses interventions en atelier sont suivies et doivent diminuer.</w:t>
             </w:r>
           </w:p>
         </w:tc>
@@ -6082,7 +7575,7 @@
                 <w:b/>
                 <w:bCs/>
               </w:rPr>
-              <w:t xml:space="preserve">Un leader qui fait tout le travail</w:t>
+              <w:t xml:space="preserve">Des ateliers dans deux locaux en même temps</w:t>
             </w:r>
           </w:p>
         </w:tc>
@@ -6105,7 +7598,7 @@
               <w:rPr>
                 <w:rFonts w:ascii="Calibri" w:cs="Calibri" w:eastAsia="Calibri" w:hAnsi="Calibri"/>
               </w:rPr>
-              <w:t xml:space="preserve">Le rôle tourne à chaque atelier. La fiche précise les tâches de chacun et tous les membres signent l'auto-évaluation.</w:t>
+              <w:t xml:space="preserve">Le grenier de Maria est juste à côté de la classe de Mme Lisa. L'enseignante circule pour s'assurer du bon fonctionnement des ateliers, et la TES les accompagne aux étapes 1 et 2.</w:t>
             </w:r>
           </w:p>
         </w:tc>
@@ -6136,7 +7629,7 @@
                 <w:b/>
                 <w:bCs/>
               </w:rPr>
-              <w:t xml:space="preserve">Des élèves qui s'essoufflent</w:t>
+              <w:t xml:space="preserve">Un leader qui fait tout le travail</w:t>
             </w:r>
           </w:p>
         </w:tc>
@@ -6159,7 +7652,7 @@
               <w:rPr>
                 <w:rFonts w:ascii="Calibri" w:cs="Calibri" w:eastAsia="Calibri" w:hAnsi="Calibri"/>
               </w:rPr>
-              <w:t xml:space="preserve">Fiches courtes et visuelles, ajustées par l'orthopédagogue. La TES repère les signes d'anxiété dès l'accueil.</w:t>
+              <w:t xml:space="preserve">Le rôle tourne à chaque atelier. La fiche précise les tâches de chacun et tous les membres signent l'auto-évaluation.</w:t>
             </w:r>
           </w:p>
         </w:tc>
@@ -6190,6 +7683,60 @@
                 <w:b/>
                 <w:bCs/>
               </w:rPr>
+              <w:t xml:space="preserve">Des élèves qui s'essoufflent</w:t>
+            </w:r>
+          </w:p>
+        </w:tc>
+        <w:tc>
+          <w:tcPr>
+            <w:tcW w:type="dxa" w:w="6360"/>
+            <w:tcMar>
+              <w:top w:type="dxa" w:w="100"/>
+              <w:left w:type="dxa" w:w="140"/>
+              <w:bottom w:type="dxa" w:w="100"/>
+              <w:right w:type="dxa" w:w="140"/>
+            </w:tcMar>
+            <w:vAlign w:val="top"/>
+          </w:tcPr>
+          <w:p>
+            <w:pPr>
+              <w:spacing w:after="40" w:line="264"/>
+            </w:pPr>
+            <w:r>
+              <w:rPr>
+                <w:rFonts w:ascii="Calibri" w:cs="Calibri" w:eastAsia="Calibri" w:hAnsi="Calibri"/>
+              </w:rPr>
+              <w:t xml:space="preserve">Fiches courtes et visuelles, ajustées par l'orthopédagogue. La TES repère les signes d'anxiété dès l'accueil.</w:t>
+            </w:r>
+          </w:p>
+        </w:tc>
+      </w:tr>
+      <w:tr>
+        <w:trPr>
+          <w:cantSplit/>
+        </w:trPr>
+        <w:tc>
+          <w:tcPr>
+            <w:tcW w:type="dxa" w:w="3000"/>
+            <w:shd w:fill="F4F5F7" w:color="auto" w:val="clear"/>
+            <w:tcMar>
+              <w:top w:type="dxa" w:w="100"/>
+              <w:left w:type="dxa" w:w="140"/>
+              <w:bottom w:type="dxa" w:w="100"/>
+              <w:right w:type="dxa" w:w="140"/>
+            </w:tcMar>
+            <w:vAlign w:val="top"/>
+          </w:tcPr>
+          <w:p>
+            <w:pPr>
+              <w:spacing w:after="40" w:line="264"/>
+            </w:pPr>
+            <w:r>
+              <w:rPr>
+                <w:rFonts w:ascii="Calibri" w:cs="Calibri" w:eastAsia="Calibri" w:hAnsi="Calibri"/>
+                <w:b/>
+                <w:bCs/>
+              </w:rPr>
               <w:t xml:space="preserve">La formule ne fonctionne pas</w:t>
             </w:r>
           </w:p>
@@ -6213,7 +7760,7 @@
               <w:rPr>
                 <w:rFonts w:ascii="Calibri" w:cs="Calibri" w:eastAsia="Calibri" w:hAnsi="Calibri"/>
               </w:rPr>
-              <w:t xml:space="preserve">Bilan à la fin de la période d'ancrage. Si les indicateurs ne sont pas au rendez-vous, on ajuste ou on revient à la formule actuelle.</w:t>
+              <w:t xml:space="preserve">Bilan à la fin de la étape d'ancrage. Si les indicateurs ne sont pas au rendez-vous, on ajuste ou on revient à la formule actuelle.</w:t>
             </w:r>
           </w:p>
         </w:tc>
@@ -6232,7 +7779,7 @@
         <w:rPr>
           <w:rFonts w:ascii="Calibri" w:cs="Calibri" w:eastAsia="Calibri" w:hAnsi="Calibri"/>
         </w:rPr>
-        <w:t xml:space="preserve">10. Évaluation et suivi</w:t>
+        <w:t xml:space="preserve">11. Évaluation et suivi</w:t>
       </w:r>
     </w:p>
     <w:tbl>
@@ -6624,7 +8171,7 @@
               <w:rPr>
                 <w:rFonts w:ascii="Calibri" w:cs="Calibri" w:eastAsia="Calibri" w:hAnsi="Calibri"/>
               </w:rPr>
-              <w:t xml:space="preserve">En hausse d'une période à l'autre</w:t>
+              <w:t xml:space="preserve">En hausse d'une étape à l'autre</w:t>
             </w:r>
           </w:p>
         </w:tc>
@@ -6724,7 +8271,7 @@
               <w:rPr>
                 <w:rFonts w:ascii="Calibri" w:cs="Calibri" w:eastAsia="Calibri" w:hAnsi="Calibri"/>
               </w:rPr>
-              <w:t xml:space="preserve">En baisse d'une période à l'autre</w:t>
+              <w:t xml:space="preserve">En baisse d'une étape à l'autre</w:t>
             </w:r>
           </w:p>
         </w:tc>
@@ -6824,7 +8371,7 @@
               <w:rPr>
                 <w:rFonts w:ascii="Calibri" w:cs="Calibri" w:eastAsia="Calibri" w:hAnsi="Calibri"/>
               </w:rPr>
-              <w:t xml:space="preserve">Chaque élève l'a exercé au moins une fois par période</w:t>
+              <w:t xml:space="preserve">Chaque élève l'a exercé au moins une fois par étape</w:t>
             </w:r>
           </w:p>
         </w:tc>
@@ -6870,7 +8417,7 @@
               <w:rPr>
                 <w:rFonts w:ascii="Calibri" w:cs="Calibri" w:eastAsia="Calibri" w:hAnsi="Calibri"/>
               </w:rPr>
-              <w:t xml:space="preserve">Fin de période</w:t>
+              <w:t xml:space="preserve">Fin d'étape</w:t>
             </w:r>
           </w:p>
         </w:tc>
@@ -6989,7 +8536,7 @@
         <w:rPr>
           <w:rFonts w:ascii="Calibri" w:cs="Calibri" w:eastAsia="Calibri" w:hAnsi="Calibri"/>
         </w:rPr>
-        <w:t xml:space="preserve">11. Retombées et transférabilité</w:t>
+        <w:t xml:space="preserve">12. Retombées et transférabilité</w:t>
       </w:r>
     </w:p>
     <w:p>
@@ -7119,7 +8666,7 @@
         <w:rPr>
           <w:rFonts w:ascii="Calibri" w:cs="Calibri" w:eastAsia="Calibri" w:hAnsi="Calibri"/>
         </w:rPr>
-        <w:t xml:space="preserve">12. Décision demandée et prochaines étapes</w:t>
+        <w:t xml:space="preserve">13. Décision demandée et prochaines étapes</w:t>
       </w:r>
     </w:p>
     <w:p>
@@ -7226,7 +8773,7 @@
         <w:rPr>
           <w:rFonts w:ascii="Calibri" w:cs="Calibri" w:eastAsia="Calibri" w:hAnsi="Calibri"/>
         </w:rPr>
-        <w:t xml:space="preserve"> à la fin de la période d'ancrage.</w:t>
+        <w:t xml:space="preserve"> à la fin de la étape d'ancrage.</w:t>
       </w:r>
     </w:p>
     <w:p>
@@ -7237,7 +8784,7 @@
         <w:rPr>
           <w:rFonts w:ascii="Calibri" w:cs="Calibri" w:eastAsia="Calibri" w:hAnsi="Calibri"/>
         </w:rPr>
-        <w:t xml:space="preserve">Dès l'acceptation, l'équipe peut contacter les élèves et démarrer selon l'échéancier de la section 6.</w:t>
+        <w:t xml:space="preserve">Dès l'acceptation, l'équipe peut contacter les élèves et démarrer selon l'échéancier de la section 7.</w:t>
       </w:r>
     </w:p>
     <w:p>

</xml_diff>

<commit_message>
Précise l'équipe, l'horaire de la TES et les ateliers exploratoires du Z101
Ajoute Mme Lisa et Janie-Lee, l'horaire de la TES du guide d'organisation,
le sous-groupe en concomitance, les mardis et jeudis matin et les ateliers
proposés par les élèves.

Co-Authored-By: Claude Opus 5.5 <noreply@anthropic.com>
Claude-Session: https://claude.ai/code/session_01GMdriyBYj6aFRdtmm4tFaT
</commit_message>
<xml_diff>
--- a/documents/z101/Projet-Z101.docx
+++ b/documents/z101/Projet-Z101.docx
@@ -551,7 +551,7 @@
               <w:rPr>
                 <w:rFonts w:ascii="Calibri" w:cs="Calibri" w:eastAsia="Calibri" w:hAnsi="Calibri"/>
               </w:rPr>
-              <w:t xml:space="preserve">Enseignante du Z101, TES préventive, orthopédagogue et conseillère pédagogique. Tous déjà en poste.</w:t>
+              <w:t xml:space="preserve">Mme Lisa (enseignante du Z101), Janie-Lee (TES préventive), l'orthopédagogue et la conseillère pédagogique. Tous déjà en poste. Le projet a été présenté à Mme Lisa et à Janie-Lee, qui a accepté son rôle.</w:t>
             </w:r>
           </w:p>
         </w:tc>
@@ -582,7 +582,7 @@
                 <w:b/>
                 <w:bCs/>
               </w:rPr>
-              <w:t xml:space="preserve">Coût</w:t>
+              <w:t xml:space="preserve">Quand</w:t>
             </w:r>
           </w:p>
         </w:tc>
@@ -604,16 +604,8 @@
             <w:r>
               <w:rPr>
                 <w:rFonts w:ascii="Calibri" w:cs="Calibri" w:eastAsia="Calibri" w:hAnsi="Calibri"/>
-                <w:b/>
-                <w:bCs/>
-              </w:rPr>
-              <w:t xml:space="preserve">Aucune embauche.</w:t>
-            </w:r>
-            <w:r>
-              <w:rPr>
-                <w:rFonts w:ascii="Calibri" w:cs="Calibri" w:eastAsia="Calibri" w:hAnsi="Calibri"/>
-              </w:rPr>
-              <w:t xml:space="preserve"> Matériel : fiches plastifiées et chariots TEACCH partagés avec l'alpha-pré et la DAP.</w:t>
+              </w:rPr>
+              <w:t xml:space="preserve">Le mardi et le jeudi matin, de 8 h 25 à 11 h 45.</w:t>
             </w:r>
           </w:p>
         </w:tc>
@@ -644,6 +636,68 @@
                 <w:b/>
                 <w:bCs/>
               </w:rPr>
+              <w:t xml:space="preserve">Coût</w:t>
+            </w:r>
+          </w:p>
+        </w:tc>
+        <w:tc>
+          <w:tcPr>
+            <w:tcW w:type="dxa" w:w="6960"/>
+            <w:tcMar>
+              <w:top w:type="dxa" w:w="100"/>
+              <w:left w:type="dxa" w:w="140"/>
+              <w:bottom w:type="dxa" w:w="100"/>
+              <w:right w:type="dxa" w:w="140"/>
+            </w:tcMar>
+            <w:vAlign w:val="top"/>
+          </w:tcPr>
+          <w:p>
+            <w:pPr>
+              <w:spacing w:after="40" w:line="264"/>
+            </w:pPr>
+            <w:r>
+              <w:rPr>
+                <w:rFonts w:ascii="Calibri" w:cs="Calibri" w:eastAsia="Calibri" w:hAnsi="Calibri"/>
+                <w:b/>
+                <w:bCs/>
+              </w:rPr>
+              <w:t xml:space="preserve">Aucune embauche.</w:t>
+            </w:r>
+            <w:r>
+              <w:rPr>
+                <w:rFonts w:ascii="Calibri" w:cs="Calibri" w:eastAsia="Calibri" w:hAnsi="Calibri"/>
+              </w:rPr>
+              <w:t xml:space="preserve"> Matériel : fiches plastifiées et chariots TEACCH partagés avec l'alpha-pré et la DAP.</w:t>
+            </w:r>
+          </w:p>
+        </w:tc>
+      </w:tr>
+      <w:tr>
+        <w:trPr>
+          <w:cantSplit/>
+        </w:trPr>
+        <w:tc>
+          <w:tcPr>
+            <w:tcW w:type="dxa" w:w="2400"/>
+            <w:shd w:fill="E8F0FB" w:color="auto" w:val="clear"/>
+            <w:tcMar>
+              <w:top w:type="dxa" w:w="100"/>
+              <w:left w:type="dxa" w:w="140"/>
+              <w:bottom w:type="dxa" w:w="100"/>
+              <w:right w:type="dxa" w:w="140"/>
+            </w:tcMar>
+            <w:vAlign w:val="top"/>
+          </w:tcPr>
+          <w:p>
+            <w:pPr>
+              <w:spacing w:after="40" w:line="264"/>
+            </w:pPr>
+            <w:r>
+              <w:rPr>
+                <w:rFonts w:ascii="Calibri" w:cs="Calibri" w:eastAsia="Calibri" w:hAnsi="Calibri"/>
+                <w:b/>
+                <w:bCs/>
+              </w:rPr>
               <w:t xml:space="preserve">Durée</w:t>
             </w:r>
           </w:p>
@@ -667,7 +721,7 @@
               <w:rPr>
                 <w:rFonts w:ascii="Calibri" w:cs="Calibri" w:eastAsia="Calibri" w:hAnsi="Calibri"/>
               </w:rPr>
-              <w:t xml:space="preserve">Projet pilote à partir de l'acceptation, en trois étapes, avec un premier bilan à la fin de la étape d'ancrage.</w:t>
+              <w:t xml:space="preserve">Projet pilote à partir de l'acceptation, en trois étapes, avec un premier bilan à la fin de l'étape d'ancrage.</w:t>
             </w:r>
           </w:p>
         </w:tc>
@@ -1383,7 +1437,21 @@
         <w:rPr>
           <w:rFonts w:ascii="Calibri" w:cs="Calibri" w:eastAsia="Calibri" w:hAnsi="Calibri"/>
         </w:rPr>
-        <w:t xml:space="preserve"> réunit les autres élèves.</w:t>
+        <w:t xml:space="preserve"> réunit les élèves </w:t>
+      </w:r>
+      <w:r>
+        <w:rPr>
+          <w:rFonts w:ascii="Calibri" w:cs="Calibri" w:eastAsia="Calibri" w:hAnsi="Calibri"/>
+          <w:b/>
+          <w:bCs/>
+        </w:rPr>
+        <w:t xml:space="preserve">en concomitance</w:t>
+      </w:r>
+      <w:r>
+        <w:rPr>
+          <w:rFonts w:ascii="Calibri" w:cs="Calibri" w:eastAsia="Calibri" w:hAnsi="Calibri"/>
+        </w:rPr>
+        <w:t xml:space="preserve">, qui suivent aussi d'autres matières.</w:t>
       </w:r>
     </w:p>
     <w:p>
@@ -1549,13 +1617,13 @@
           <w:b/>
           <w:bCs/>
         </w:rPr>
-        <w:t xml:space="preserve">Deux lieux d'ateliers exploratoires :</w:t>
-      </w:r>
-      <w:r>
-        <w:rPr>
-          <w:rFonts w:ascii="Calibri" w:cs="Calibri" w:eastAsia="Calibri" w:hAnsi="Calibri"/>
-        </w:rPr>
-        <w:t xml:space="preserve"> le grenier de Maria, juste à côté de la classe de Mme Lisa, et le local d'arts plastiques, un grand local actuellement libre.</w:t>
+        <w:t xml:space="preserve">Chariots TEACCH :</w:t>
+      </w:r>
+      <w:r>
+        <w:rPr>
+          <w:rFonts w:ascii="Calibri" w:cs="Calibri" w:eastAsia="Calibri" w:hAnsi="Calibri"/>
+        </w:rPr>
+        <w:t xml:space="preserve"> postes de travail visuels et structurés, partagés avec l'alpha-pré et la DAP.</w:t>
       </w:r>
     </w:p>
     <w:p>
@@ -1573,13 +1641,51 @@
           <w:b/>
           <w:bCs/>
         </w:rPr>
-        <w:t xml:space="preserve">Chariots TEACCH :</w:t>
-      </w:r>
-      <w:r>
-        <w:rPr>
-          <w:rFonts w:ascii="Calibri" w:cs="Calibri" w:eastAsia="Calibri" w:hAnsi="Calibri"/>
-        </w:rPr>
-        <w:t xml:space="preserve"> postes de travail visuels et structurés, partagés avec l'alpha-pré et la DAP.</w:t>
+        <w:t xml:space="preserve">Tableau de programmation :</w:t>
+      </w:r>
+      <w:r>
+        <w:rPr>
+          <w:rFonts w:ascii="Calibri" w:cs="Calibri" w:eastAsia="Calibri" w:hAnsi="Calibri"/>
+        </w:rPr>
+        <w:t xml:space="preserve"> chaque bloc de la matinée est planifié et affiché. Aucun moment n'est laissé vide.</w:t>
+      </w:r>
+    </w:p>
+    <w:p>
+      <w:pPr>
+        <w:pStyle w:val="Heading2"/>
+        <w:keepNext/>
+        <w:spacing w:after="80" w:before="200"/>
+      </w:pPr>
+      <w:r>
+        <w:rPr>
+          <w:rFonts w:ascii="Calibri" w:cs="Calibri" w:eastAsia="Calibri" w:hAnsi="Calibri"/>
+        </w:rPr>
+        <w:t xml:space="preserve">Les ateliers exploratoires</w:t>
+      </w:r>
+    </w:p>
+    <w:p>
+      <w:pPr>
+        <w:spacing w:after="120" w:line="288"/>
+      </w:pPr>
+      <w:r>
+        <w:rPr>
+          <w:rFonts w:ascii="Calibri" w:cs="Calibri" w:eastAsia="Calibri" w:hAnsi="Calibri"/>
+        </w:rPr>
+        <w:t xml:space="preserve">Les élèves ont été </w:t>
+      </w:r>
+      <w:r>
+        <w:rPr>
+          <w:rFonts w:ascii="Calibri" w:cs="Calibri" w:eastAsia="Calibri" w:hAnsi="Calibri"/>
+          <w:b/>
+          <w:bCs/>
+        </w:rPr>
+        <w:t xml:space="preserve">sondés</w:t>
+      </w:r>
+      <w:r>
+        <w:rPr>
+          <w:rFonts w:ascii="Calibri" w:cs="Calibri" w:eastAsia="Calibri" w:hAnsi="Calibri"/>
+        </w:rPr>
+        <w:t xml:space="preserve"> sur la formule et sur les compétences qu'ils souhaitent développer. Les ateliers s'appuient sur leurs suggestions. En voici des exemples :</w:t>
       </w:r>
     </w:p>
     <w:p>
@@ -1597,13 +1703,100 @@
           <w:b/>
           <w:bCs/>
         </w:rPr>
-        <w:t xml:space="preserve">Tableau de programmation :</w:t>
-      </w:r>
-      <w:r>
-        <w:rPr>
-          <w:rFonts w:ascii="Calibri" w:cs="Calibri" w:eastAsia="Calibri" w:hAnsi="Calibri"/>
-        </w:rPr>
-        <w:t xml:space="preserve"> chaque bloc de la matinée est planifié et affiché. Aucun moment n'est laissé vide.</w:t>
+        <w:t xml:space="preserve">Pré-employabilité</w:t>
+      </w:r>
+      <w:r>
+        <w:rPr>
+          <w:rFonts w:ascii="Calibri" w:cs="Calibri" w:eastAsia="Calibri" w:hAnsi="Calibri"/>
+        </w:rPr>
+        <w:t xml:space="preserve">, au grenier de Maria.</w:t>
+      </w:r>
+    </w:p>
+    <w:p>
+      <w:pPr>
+        <w:pStyle w:val="ListParagraph"/>
+        <w:numPr>
+          <w:ilvl w:val="0"/>
+          <w:numId w:val="2"/>
+        </w:numPr>
+        <w:spacing w:after="80" w:line="276"/>
+      </w:pPr>
+      <w:r>
+        <w:rPr>
+          <w:rFonts w:ascii="Calibri" w:cs="Calibri" w:eastAsia="Calibri" w:hAnsi="Calibri"/>
+          <w:b/>
+          <w:bCs/>
+        </w:rPr>
+        <w:t xml:space="preserve">Développement durable</w:t>
+      </w:r>
+      <w:r>
+        <w:rPr>
+          <w:rFonts w:ascii="Calibri" w:cs="Calibri" w:eastAsia="Calibri" w:hAnsi="Calibri"/>
+        </w:rPr>
+        <w:t xml:space="preserve">, une suggestion des élèves.</w:t>
+      </w:r>
+    </w:p>
+    <w:p>
+      <w:pPr>
+        <w:pStyle w:val="ListParagraph"/>
+        <w:numPr>
+          <w:ilvl w:val="0"/>
+          <w:numId w:val="2"/>
+        </w:numPr>
+        <w:spacing w:after="80" w:line="276"/>
+      </w:pPr>
+      <w:r>
+        <w:rPr>
+          <w:rFonts w:ascii="Calibri" w:cs="Calibri" w:eastAsia="Calibri" w:hAnsi="Calibri"/>
+          <w:b/>
+          <w:bCs/>
+        </w:rPr>
+        <w:t xml:space="preserve">Entrepreneuriat</w:t>
+      </w:r>
+      <w:r>
+        <w:rPr>
+          <w:rFonts w:ascii="Calibri" w:cs="Calibri" w:eastAsia="Calibri" w:hAnsi="Calibri"/>
+        </w:rPr>
+        <w:t xml:space="preserve"> : des projets débuteront bientôt en PPS. Les élèves pourront les poursuivre en atelier.</w:t>
+      </w:r>
+    </w:p>
+    <w:p>
+      <w:pPr>
+        <w:spacing w:after="120" w:line="288"/>
+      </w:pPr>
+      <w:r>
+        <w:rPr>
+          <w:rFonts w:ascii="Calibri" w:cs="Calibri" w:eastAsia="Calibri" w:hAnsi="Calibri"/>
+        </w:rPr>
+        <w:t xml:space="preserve">Les ateliers ont lieu dans </w:t>
+      </w:r>
+      <w:r>
+        <w:rPr>
+          <w:rFonts w:ascii="Calibri" w:cs="Calibri" w:eastAsia="Calibri" w:hAnsi="Calibri"/>
+          <w:b/>
+          <w:bCs/>
+        </w:rPr>
+        <w:t xml:space="preserve">deux locaux</w:t>
+      </w:r>
+      <w:r>
+        <w:rPr>
+          <w:rFonts w:ascii="Calibri" w:cs="Calibri" w:eastAsia="Calibri" w:hAnsi="Calibri"/>
+        </w:rPr>
+        <w:t xml:space="preserve"> : le grenier de Maria, juste à côté de la classe de Mme Lisa, et le </w:t>
+      </w:r>
+      <w:r>
+        <w:rPr>
+          <w:rFonts w:ascii="Calibri" w:cs="Calibri" w:eastAsia="Calibri" w:hAnsi="Calibri"/>
+          <w:b/>
+          <w:bCs/>
+        </w:rPr>
+        <w:t xml:space="preserve">local d'arts plastiques</w:t>
+      </w:r>
+      <w:r>
+        <w:rPr>
+          <w:rFonts w:ascii="Calibri" w:cs="Calibri" w:eastAsia="Calibri" w:hAnsi="Calibri"/>
+        </w:rPr>
+        <w:t xml:space="preserve">, un grand local actuellement libre. Le contenu détaillé des ateliers sera précisé avec l'équipe.</w:t>
       </w:r>
     </w:p>
     <w:p>
@@ -1630,7 +1823,21 @@
         <w:rPr>
           <w:rFonts w:ascii="Calibri" w:cs="Calibri" w:eastAsia="Calibri" w:hAnsi="Calibri"/>
         </w:rPr>
-        <w:t xml:space="preserve">La matinée compte </w:t>
+        <w:t xml:space="preserve">La formule s'applique </w:t>
+      </w:r>
+      <w:r>
+        <w:rPr>
+          <w:rFonts w:ascii="Calibri" w:cs="Calibri" w:eastAsia="Calibri" w:hAnsi="Calibri"/>
+          <w:b/>
+          <w:bCs/>
+        </w:rPr>
+        <w:t xml:space="preserve">le mardi et le jeudi matin</w:t>
+      </w:r>
+      <w:r>
+        <w:rPr>
+          <w:rFonts w:ascii="Calibri" w:cs="Calibri" w:eastAsia="Calibri" w:hAnsi="Calibri"/>
+        </w:rPr>
+        <w:t xml:space="preserve">. La matinée compte </w:t>
       </w:r>
       <w:r>
         <w:rPr>
@@ -1782,7 +1989,7 @@
                 <w:sz w:val="20"/>
                 <w:szCs w:val="20"/>
               </w:rPr>
-              <w:t xml:space="preserve">Sous-groupe 2</w:t>
+              <w:t xml:space="preserve">Sous-groupe 2 : concomitance</w:t>
             </w:r>
           </w:p>
         </w:tc>
@@ -2627,7 +2834,7 @@
                 <w:b/>
                 <w:bCs/>
               </w:rPr>
-              <w:t xml:space="preserve">Sous-groupe 2</w:t>
+              <w:t xml:space="preserve">Sous-groupe 2 : concomitance</w:t>
             </w:r>
           </w:p>
         </w:tc>
@@ -2806,7 +3013,7 @@
                 <w:sz w:val="20"/>
                 <w:szCs w:val="20"/>
               </w:rPr>
-              <w:t xml:space="preserve">La TES</w:t>
+              <w:t xml:space="preserve">La TES (Janie-Lee)</w:t>
             </w:r>
           </w:p>
         </w:tc>
@@ -2929,7 +3136,7 @@
               <w:rPr>
                 <w:rFonts w:ascii="Calibri" w:cs="Calibri" w:eastAsia="Calibri" w:hAnsi="Calibri"/>
               </w:rPr>
-              <w:t xml:space="preserve">Accueille les élèves un à un. Repère les signes d'anxiété et prévient les difficultés.</w:t>
+              <w:t xml:space="preserve">Arrive à 8 h 30. Accueille les élèves un à un, capte les signes d'anxiété et prévient les difficultés.</w:t>
             </w:r>
           </w:p>
         </w:tc>
@@ -3036,7 +3243,7 @@
               <w:rPr>
                 <w:rFonts w:ascii="Calibri" w:cs="Calibri" w:eastAsia="Calibri" w:hAnsi="Calibri"/>
               </w:rPr>
-              <w:t xml:space="preserve"> aussi vers les ateliers pour s'assurer de leur bon fonctionnement. En atelier, on applique « 3 avant l'enseignante ».</w:t>
+              <w:t xml:space="preserve"> aussi vers les ateliers exploratoires pour s'assurer du bon fonctionnement de la formule, offrir un soutien ponctuel et rediriger les élèves au besoin. En atelier, on applique « 3 avant l'enseignante ».</w:t>
             </w:r>
           </w:p>
         </w:tc>
@@ -3059,7 +3266,21 @@
               <w:rPr>
                 <w:rFonts w:ascii="Calibri" w:cs="Calibri" w:eastAsia="Calibri" w:hAnsi="Calibri"/>
               </w:rPr>
-              <w:t xml:space="preserve">Accompagne le sous-groupe 2 en atelier exploratoire : soutient discrètement les leaders, aide à régler les blocages, offre des pauses de régulation.</w:t>
+              <w:t xml:space="preserve">Jusqu'à 9 h 15 : accompagne le démarrage des ateliers. De 9 h 30 : </w:t>
+            </w:r>
+            <w:r>
+              <w:rPr>
+                <w:rFonts w:ascii="Calibri" w:cs="Calibri" w:eastAsia="Calibri" w:hAnsi="Calibri"/>
+                <w:b/>
+                <w:bCs/>
+              </w:rPr>
+              <w:t xml:space="preserve">coaching de terrain</w:t>
+            </w:r>
+            <w:r>
+              <w:rPr>
+                <w:rFonts w:ascii="Calibri" w:cs="Calibri" w:eastAsia="Calibri" w:hAnsi="Calibri"/>
+              </w:rPr>
+              <w:t xml:space="preserve"> auprès du sous-groupe 2 en atelier exploratoire. Elle soutient discrètement les leaders, aide à régler les blocages, offre des pauses de régulation.</w:t>
             </w:r>
           </w:p>
         </w:tc>
@@ -3283,7 +3504,7 @@
               <w:rPr>
                 <w:rFonts w:ascii="Calibri" w:cs="Calibri" w:eastAsia="Calibri" w:hAnsi="Calibri"/>
               </w:rPr>
-              <w:t xml:space="preserve"> vers les ateliers. Valide le registre d'autonomie.</w:t>
+              <w:t xml:space="preserve"> vers les ateliers pour offrir un soutien ponctuel. Valide le registre d'autonomie.</w:t>
             </w:r>
           </w:p>
         </w:tc>
@@ -3306,7 +3527,7 @@
               <w:rPr>
                 <w:rFonts w:ascii="Calibri" w:cs="Calibri" w:eastAsia="Calibri" w:hAnsi="Calibri"/>
               </w:rPr>
-              <w:t xml:space="preserve">Accompagne le sous-groupe PPS pur en atelier exploratoire, comme aux périodes 1 et 2.</w:t>
+              <w:t xml:space="preserve">Jusqu'à 11 h 00 : coaching de terrain auprès du sous-groupe PPS pur en atelier exploratoire.</w:t>
             </w:r>
           </w:p>
         </w:tc>
@@ -3465,7 +3686,7 @@
                 <w:sz w:val="20"/>
                 <w:szCs w:val="20"/>
               </w:rPr>
-              <w:t xml:space="preserve">La TES</w:t>
+              <w:t xml:space="preserve">La TES (Janie-Lee)</w:t>
             </w:r>
           </w:p>
         </w:tc>
@@ -4034,208 +4255,6 @@
                 <w:rFonts w:ascii="Calibri" w:cs="Calibri" w:eastAsia="Calibri" w:hAnsi="Calibri"/>
               </w:rPr>
               <w:t xml:space="preserve">Passe en revue les critères de réussite avec l'équipe. Fait ranger le matériel. Valide les étapes au registre par ses initiales, avant la validation finale de l'enseignante.</w:t>
-            </w:r>
-          </w:p>
-        </w:tc>
-      </w:tr>
-    </w:tbl>
-    <w:p>
-      <w:pPr>
-        <w:pStyle w:val="Heading2"/>
-        <w:keepNext/>
-        <w:spacing w:after="80" w:before="200"/>
-      </w:pPr>
-      <w:r>
-        <w:rPr>
-          <w:rFonts w:ascii="Calibri" w:cs="Calibri" w:eastAsia="Calibri" w:hAnsi="Calibri"/>
-        </w:rPr>
-        <w:t xml:space="preserve">Les tâches selon le lieu</w:t>
-      </w:r>
-    </w:p>
-    <w:tbl>
-      <w:tblPr>
-        <w:tblW w:type="dxa" w:w="9360"/>
-        <w:tblBorders>
-          <w:top w:val="single" w:color="CFD4DC" w:sz="4"/>
-          <w:left w:val="single" w:color="CFD4DC" w:sz="4"/>
-          <w:bottom w:val="single" w:color="CFD4DC" w:sz="4"/>
-          <w:right w:val="single" w:color="CFD4DC" w:sz="4"/>
-          <w:insideH w:val="single" w:color="CFD4DC" w:sz="4"/>
-          <w:insideV w:val="single" w:color="CFD4DC" w:sz="4"/>
-        </w:tblBorders>
-        <w:tblLayout w:type="fixed"/>
-      </w:tblPr>
-      <w:tblGrid>
-        <w:gridCol w:w="2100"/>
-        <w:gridCol w:w="7260"/>
-      </w:tblGrid>
-      <w:tr>
-        <w:trPr>
-          <w:tblHeader/>
-        </w:trPr>
-        <w:tc>
-          <w:tcPr>
-            <w:tcW w:type="dxa" w:w="2100"/>
-            <w:shd w:fill="1D3557" w:color="auto" w:val="clear"/>
-            <w:tcMar>
-              <w:top w:type="dxa" w:w="100"/>
-              <w:left w:type="dxa" w:w="140"/>
-              <w:bottom w:type="dxa" w:w="100"/>
-              <w:right w:type="dxa" w:w="140"/>
-            </w:tcMar>
-            <w:vAlign w:val="top"/>
-          </w:tcPr>
-          <w:p>
-            <w:pPr>
-              <w:spacing w:after="0"/>
-            </w:pPr>
-            <w:r>
-              <w:rPr>
-                <w:rFonts w:ascii="Calibri" w:cs="Calibri" w:eastAsia="Calibri" w:hAnsi="Calibri"/>
-                <w:b/>
-                <w:bCs/>
-                <w:color w:val="FFFFFF"/>
-                <w:sz w:val="20"/>
-                <w:szCs w:val="20"/>
-              </w:rPr>
-              <w:t xml:space="preserve">Lieu</w:t>
-            </w:r>
-          </w:p>
-        </w:tc>
-        <w:tc>
-          <w:tcPr>
-            <w:tcW w:type="dxa" w:w="7260"/>
-            <w:shd w:fill="1D3557" w:color="auto" w:val="clear"/>
-            <w:tcMar>
-              <w:top w:type="dxa" w:w="100"/>
-              <w:left w:type="dxa" w:w="140"/>
-              <w:bottom w:type="dxa" w:w="100"/>
-              <w:right w:type="dxa" w:w="140"/>
-            </w:tcMar>
-            <w:vAlign w:val="top"/>
-          </w:tcPr>
-          <w:p>
-            <w:pPr>
-              <w:spacing w:after="0"/>
-            </w:pPr>
-            <w:r>
-              <w:rPr>
-                <w:rFonts w:ascii="Calibri" w:cs="Calibri" w:eastAsia="Calibri" w:hAnsi="Calibri"/>
-                <w:b/>
-                <w:bCs/>
-                <w:color w:val="FFFFFF"/>
-                <w:sz w:val="20"/>
-                <w:szCs w:val="20"/>
-              </w:rPr>
-              <w:t xml:space="preserve">Responsabilités du leader</w:t>
-            </w:r>
-          </w:p>
-        </w:tc>
-      </w:tr>
-      <w:tr>
-        <w:trPr>
-          <w:cantSplit/>
-        </w:trPr>
-        <w:tc>
-          <w:tcPr>
-            <w:tcW w:type="dxa" w:w="2100"/>
-            <w:shd w:fill="EAF4E4" w:color="auto" w:val="clear"/>
-            <w:tcMar>
-              <w:top w:type="dxa" w:w="100"/>
-              <w:left w:type="dxa" w:w="140"/>
-              <w:bottom w:type="dxa" w:w="100"/>
-              <w:right w:type="dxa" w:w="140"/>
-            </w:tcMar>
-            <w:vAlign w:val="top"/>
-          </w:tcPr>
-          <w:p>
-            <w:pPr>
-              <w:spacing w:after="40" w:line="264"/>
-            </w:pPr>
-            <w:r>
-              <w:rPr>
-                <w:rFonts w:ascii="Calibri" w:cs="Calibri" w:eastAsia="Calibri" w:hAnsi="Calibri"/>
-                <w:b/>
-                <w:bCs/>
-              </w:rPr>
-              <w:t xml:space="preserve">Grenier de Maria</w:t>
-            </w:r>
-          </w:p>
-        </w:tc>
-        <w:tc>
-          <w:tcPr>
-            <w:tcW w:type="dxa" w:w="7260"/>
-            <w:tcMar>
-              <w:top w:type="dxa" w:w="100"/>
-              <w:left w:type="dxa" w:w="140"/>
-              <w:bottom w:type="dxa" w:w="100"/>
-              <w:right w:type="dxa" w:w="140"/>
-            </w:tcMar>
-            <w:vAlign w:val="top"/>
-          </w:tcPr>
-          <w:p>
-            <w:pPr>
-              <w:spacing w:after="40" w:line="264"/>
-            </w:pPr>
-            <w:r>
-              <w:rPr>
-                <w:rFonts w:ascii="Calibri" w:cs="Calibri" w:eastAsia="Calibri" w:hAnsi="Calibri"/>
-              </w:rPr>
-              <w:t xml:space="preserve">Organise le tri, l'inventaire et la manutention sécuritaire. Répartit les tâches de logistique. Assure le contrôle de la qualité.</w:t>
-            </w:r>
-          </w:p>
-        </w:tc>
-      </w:tr>
-      <w:tr>
-        <w:trPr>
-          <w:cantSplit/>
-        </w:trPr>
-        <w:tc>
-          <w:tcPr>
-            <w:tcW w:type="dxa" w:w="2100"/>
-            <w:shd w:fill="EAF4E4" w:color="auto" w:val="clear"/>
-            <w:tcMar>
-              <w:top w:type="dxa" w:w="100"/>
-              <w:left w:type="dxa" w:w="140"/>
-              <w:bottom w:type="dxa" w:w="100"/>
-              <w:right w:type="dxa" w:w="140"/>
-            </w:tcMar>
-            <w:vAlign w:val="top"/>
-          </w:tcPr>
-          <w:p>
-            <w:pPr>
-              <w:spacing w:after="40" w:line="264"/>
-            </w:pPr>
-            <w:r>
-              <w:rPr>
-                <w:rFonts w:ascii="Calibri" w:cs="Calibri" w:eastAsia="Calibri" w:hAnsi="Calibri"/>
-                <w:b/>
-                <w:bCs/>
-              </w:rPr>
-              <w:t xml:space="preserve">Local d'arts plastiques</w:t>
-            </w:r>
-          </w:p>
-        </w:tc>
-        <w:tc>
-          <w:tcPr>
-            <w:tcW w:type="dxa" w:w="7260"/>
-            <w:tcMar>
-              <w:top w:type="dxa" w:w="100"/>
-              <w:left w:type="dxa" w:w="140"/>
-              <w:bottom w:type="dxa" w:w="100"/>
-              <w:right w:type="dxa" w:w="140"/>
-            </w:tcMar>
-            <w:vAlign w:val="top"/>
-          </w:tcPr>
-          <w:p>
-            <w:pPr>
-              <w:spacing w:after="40" w:line="264"/>
-            </w:pPr>
-            <w:r>
-              <w:rPr>
-                <w:rFonts w:ascii="Calibri" w:cs="Calibri" w:eastAsia="Calibri" w:hAnsi="Calibri"/>
-              </w:rPr>
-              <w:t xml:space="preserve">Distribue le matériel, fait respecter les consignes de sécurité et veille au rangement du local à la fin de l'atelier.</w:t>
             </w:r>
           </w:p>
         </w:tc>
@@ -4550,7 +4569,7 @@
               <w:rPr>
                 <w:rFonts w:ascii="Calibri" w:cs="Calibri" w:eastAsia="Calibri" w:hAnsi="Calibri"/>
               </w:rPr>
-              <w:t xml:space="preserve"> vers les ateliers pour s'assurer de leur bon fonctionnement. Planifie, évalue et valide le registre. Présente les outils d'autonomie.</w:t>
+              <w:t xml:space="preserve"> vers les ateliers exploratoires pour s'assurer du bon fonctionnement de la formule, offrir un soutien ponctuel et rediriger les élèves au besoin. Planifie, évalue et valide le registre. Présente les outils d'autonomie.</w:t>
             </w:r>
           </w:p>
         </w:tc>
@@ -4968,7 +4987,7 @@
               <w:rPr>
                 <w:rFonts w:ascii="Calibri" w:cs="Calibri" w:eastAsia="Calibri" w:hAnsi="Calibri"/>
               </w:rPr>
-              <w:t xml:space="preserve">Autorise le projet, confirme les locaux et l'horaire de la TES.</w:t>
+              <w:t xml:space="preserve">Autorise le projet et confirme l'accès au local d'arts plastiques.</w:t>
             </w:r>
           </w:p>
         </w:tc>
@@ -6021,7 +6040,7 @@
               <w:rPr>
                 <w:rFonts w:ascii="Calibri" w:cs="Calibri" w:eastAsia="Calibri" w:hAnsi="Calibri"/>
               </w:rPr>
-              <w:t xml:space="preserve">Décision de la table des directions. Confirmation des locaux et de l'horaire de la TES.</w:t>
+              <w:t xml:space="preserve">Décision de la table des directions. Confirmation de l'accès au local d'arts plastiques.</w:t>
             </w:r>
           </w:p>
         </w:tc>
@@ -6173,7 +6192,7 @@
               <w:rPr>
                 <w:rFonts w:ascii="Calibri" w:cs="Calibri" w:eastAsia="Calibri" w:hAnsi="Calibri"/>
               </w:rPr>
-              <w:t xml:space="preserve">Formation des deux sous-groupes : PPS pur et sous-groupe 2. Préparation des premières fiches de tâches et du registre.</w:t>
+              <w:t xml:space="preserve">Formation des deux sous-groupes : PPS pur et concomitance. Préparation des premières fiches de tâches et du registre.</w:t>
             </w:r>
           </w:p>
         </w:tc>
@@ -6249,7 +6268,7 @@
               <w:rPr>
                 <w:rFonts w:ascii="Calibri" w:cs="Calibri" w:eastAsia="Calibri" w:hAnsi="Calibri"/>
               </w:rPr>
-              <w:t xml:space="preserve">Début de la étape d'ancrage avec les 24 élèves.</w:t>
+              <w:t xml:space="preserve">Début de l'étape d'ancrage avec les 24 élèves.</w:t>
             </w:r>
           </w:p>
         </w:tc>
@@ -6575,7 +6594,7 @@
               <w:rPr>
                 <w:rFonts w:ascii="Calibri" w:cs="Calibri" w:eastAsia="Calibri" w:hAnsi="Calibri"/>
               </w:rPr>
-              <w:t xml:space="preserve">Enseignante du Z101, TES préventive, orthopédagogue, conseillère pédagogique. </w:t>
+              <w:t xml:space="preserve">Mme Lisa (enseignante du Z101), Janie-Lee (TES préventive), l'orthopédagogue et la conseillère pédagogique. </w:t>
             </w:r>
             <w:r>
               <w:rPr>
@@ -6637,7 +6656,7 @@
               <w:rPr>
                 <w:rFonts w:ascii="Calibri" w:cs="Calibri" w:eastAsia="Calibri" w:hAnsi="Calibri"/>
               </w:rPr>
-              <w:t xml:space="preserve">Présente pendant les matinées d'ateliers, de 8 h 25 à 11 h 45. Sa présence a déjà été validée.</w:t>
+              <w:t xml:space="preserve">Le mardi et le jeudi matin : de 8 h 30 à 9 h 15 pour l'accueil et la prévention, puis de 9 h 30 à 11 h 00 pour le coaching de terrain dans les ateliers. Le projet lui a été présenté et elle a accepté ce rôle.</w:t>
             </w:r>
           </w:p>
         </w:tc>
@@ -7075,7 +7094,7 @@
               <w:rPr>
                 <w:rFonts w:ascii="Calibri" w:cs="Calibri" w:eastAsia="Calibri" w:hAnsi="Calibri"/>
               </w:rPr>
-              <w:t xml:space="preserve">L'élève choisit sa tâche et s'inscrit au registre. Il prend la parole comme leader. Il règle ses blocages avec la règle « 3 avant l'enseignante ».</w:t>
+              <w:t xml:space="preserve">Les élèves ont été consultés sur la formule et sur les ateliers qu'ils souhaitent. L'élève choisit sa tâche et s'inscrit au registre. Il prend la parole comme leader. Il règle ses blocages avec la règle « 3 avant l'enseignante ».</w:t>
             </w:r>
           </w:p>
         </w:tc>
@@ -7145,7 +7164,7 @@
               <w:rPr>
                 <w:rFonts w:ascii="Calibri" w:cs="Calibri" w:eastAsia="Calibri" w:hAnsi="Calibri"/>
               </w:rPr>
-              <w:t xml:space="preserve">Des tâches de la vraie vie : trier, gérer un inventaire, créer, faire un budget, choisir un logement. Ce qui est appris sert dès maintenant.</w:t>
+              <w:t xml:space="preserve">Des ateliers proposés par les élèves eux-mêmes et liés à leur projet de vie : pré-employabilité, développement durable, entrepreneuriat. Ce qui est appris sert dès maintenant.</w:t>
             </w:r>
           </w:p>
         </w:tc>
@@ -7598,7 +7617,7 @@
               <w:rPr>
                 <w:rFonts w:ascii="Calibri" w:cs="Calibri" w:eastAsia="Calibri" w:hAnsi="Calibri"/>
               </w:rPr>
-              <w:t xml:space="preserve">Le grenier de Maria est juste à côté de la classe de Mme Lisa. L'enseignante circule pour s'assurer du bon fonctionnement des ateliers, et la TES les accompagne aux étapes 1 et 2.</w:t>
+              <w:t xml:space="preserve">Le grenier de Maria est juste à côté de la classe de Mme Lisa. L'enseignante circule pour s'assurer du bon fonctionnement des ateliers, et la TES y fait du coaching de terrain de 9 h 30 à 11 h 00.</w:t>
             </w:r>
           </w:p>
         </w:tc>
@@ -7760,7 +7779,7 @@
               <w:rPr>
                 <w:rFonts w:ascii="Calibri" w:cs="Calibri" w:eastAsia="Calibri" w:hAnsi="Calibri"/>
               </w:rPr>
-              <w:t xml:space="preserve">Bilan à la fin de la étape d'ancrage. Si les indicateurs ne sont pas au rendez-vous, on ajuste ou on revient à la formule actuelle.</w:t>
+              <w:t xml:space="preserve">Bilan à la fin de l'étape d'ancrage. Si les indicateurs ne sont pas au rendez-vous, on ajuste ou on revient à la formule actuelle.</w:t>
             </w:r>
           </w:p>
         </w:tc>
@@ -8743,13 +8762,13 @@
           <w:b/>
           <w:bCs/>
         </w:rPr>
-        <w:t xml:space="preserve">De confirmer les locaux et l'horaire de la TES</w:t>
-      </w:r>
-      <w:r>
-        <w:rPr>
-          <w:rFonts w:ascii="Calibri" w:cs="Calibri" w:eastAsia="Calibri" w:hAnsi="Calibri"/>
-        </w:rPr>
-        <w:t xml:space="preserve"> pour les matinées d'ateliers.</w:t>
+        <w:t xml:space="preserve">De confirmer l'accès au local d'arts plastiques</w:t>
+      </w:r>
+      <w:r>
+        <w:rPr>
+          <w:rFonts w:ascii="Calibri" w:cs="Calibri" w:eastAsia="Calibri" w:hAnsi="Calibri"/>
+        </w:rPr>
+        <w:t xml:space="preserve"> les mardis et jeudis matin.</w:t>
       </w:r>
     </w:p>
     <w:p>
@@ -8773,7 +8792,7 @@
         <w:rPr>
           <w:rFonts w:ascii="Calibri" w:cs="Calibri" w:eastAsia="Calibri" w:hAnsi="Calibri"/>
         </w:rPr>
-        <w:t xml:space="preserve"> à la fin de la étape d'ancrage.</w:t>
+        <w:t xml:space="preserve"> à la fin de l'étape d'ancrage.</w:t>
       </w:r>
     </w:p>
     <w:p>

</xml_diff>

<commit_message>
Présente les boîtes TEACCH comme un projet souhaité
Co-Authored-By: Claude Opus 5.5 <noreply@anthropic.com>
Claude-Session: https://claude.ai/code/session_01GMdriyBYj6aFRdtmm4tFaT
</commit_message>
<xml_diff>
--- a/documents/z101/Projet-Z101.docx
+++ b/documents/z101/Projet-Z101.docx
@@ -1787,7 +1787,7 @@
         <w:rPr>
           <w:rFonts w:ascii="Calibri" w:cs="Calibri" w:eastAsia="Calibri" w:hAnsi="Calibri"/>
         </w:rPr>
-        <w:t xml:space="preserve"> des tâches visuelles et structurées pour travailler l'autonomie. L'orthopédagogue prévoit déjà d'en concevoir pour les élèves du centre, notamment en alpha-pré. Ces boîtes pourront aussi servir aux élèves du Z101.</w:t>
+        <w:t xml:space="preserve"> des tâches visuelles et structurées pour travailler l'autonomie. Un projet de boîtes de découverte avec l'orthopédagogue est souhaité pour les élèves du centre, notamment en alpha-pré. Si ce projet se réalise, ces boîtes pourraient aussi servir aux élèves du Z101.</w:t>
       </w:r>
     </w:p>
     <w:p>
@@ -7385,7 +7385,7 @@
               <w:rPr>
                 <w:rFonts w:ascii="Calibri" w:cs="Calibri" w:eastAsia="Calibri" w:hAnsi="Calibri"/>
               </w:rPr>
-              <w:t xml:space="preserve">Fiches de tâches plastifiées et registre d'autonomie. Les boîtes de découverte TEACCH que l'orthopédagogue prévoit déjà de concevoir pour les élèves du centre pourront aussi être utilisées.</w:t>
+              <w:t xml:space="preserve">Fiches de tâches plastifiées et registre d'autonomie. Si le projet de boîtes de découverte TEACCH souhaité avec l'orthopédagogue se réalise, ces boîtes pourraient aussi être utilisées.</w:t>
             </w:r>
           </w:p>
         </w:tc>

</xml_diff>

<commit_message>
Retire la mention de la table des directions
Co-Authored-By: Claude Opus 5.5 <noreply@anthropic.com>
Claude-Session: https://claude.ai/code/session_01GMdriyBYj6aFRdtmm4tFaT
</commit_message>
<xml_diff>
--- a/documents/z101/Projet-Z101.docx
+++ b/documents/z101/Projet-Z101.docx
@@ -148,7 +148,7 @@
                 <w:sz w:val="20"/>
                 <w:szCs w:val="20"/>
               </w:rPr>
-              <w:t xml:space="preserve">Table des directions · Octobre 2026</w:t>
+              <w:t xml:space="preserve">Octobre 2026</w:t>
             </w:r>
           </w:p>
           <w:p>
@@ -4918,7 +4918,7 @@
         <w:sz w:val="16"/>
         <w:szCs w:val="16"/>
       </w:rPr>
-      <w:t xml:space="preserve">Projet PPS Z101 · Table des directions · page </w:t>
+      <w:t xml:space="preserve">Projet PPS Z101 · page </w:t>
     </w:r>
     <w:r>
       <w:rPr>

</xml_diff>

<commit_message>
Présente les bilans aux directions
Co-Authored-By: Claude Opus 5.5 <noreply@anthropic.com>
Claude-Session: https://claude.ai/code/session_01GMdriyBYj6aFRdtmm4tFaT
</commit_message>
<xml_diff>
--- a/documents/z101/Projet-Z101.docx
+++ b/documents/z101/Projet-Z101.docx
@@ -787,7 +787,7 @@
               <w:rPr>
                 <w:rFonts w:ascii="Calibri" w:cs="Calibri" w:eastAsia="Calibri" w:hAnsi="Calibri"/>
               </w:rPr>
-              <w:t xml:space="preserve">Projet pilote en trois étapes, avec un bilan à la fin de chaque étape.</w:t>
+              <w:t xml:space="preserve">Projet pilote en trois étapes, avec un bilan aux directions à la fin de chaque étape.</w:t>
             </w:r>
           </w:p>
         </w:tc>
@@ -1007,7 +1007,7 @@
         <w:rPr>
           <w:rFonts w:ascii="Calibri" w:cs="Calibri" w:eastAsia="Calibri" w:hAnsi="Calibri"/>
         </w:rPr>
-        <w:t xml:space="preserve">La direction demande </w:t>
+        <w:t xml:space="preserve">Les directions demandent </w:t>
       </w:r>
       <w:r>
         <w:rPr>
@@ -2186,7 +2186,7 @@
                 <w:bCs/>
                 <w:color w:val="004983"/>
               </w:rPr>
-              <w:t xml:space="preserve">Direction</w:t>
+              <w:t xml:space="preserve">Directions</w:t>
             </w:r>
           </w:p>
         </w:tc>
@@ -2209,7 +2209,7 @@
               <w:rPr>
                 <w:rFonts w:ascii="Calibri" w:cs="Calibri" w:eastAsia="Calibri" w:hAnsi="Calibri"/>
               </w:rPr>
-              <w:t xml:space="preserve">Autorise le projet et confirme l'accès au local d'arts plastiques.</w:t>
+              <w:t xml:space="preserve">Autorisent le projet et confirment l'accès au local d'arts plastiques.</w:t>
             </w:r>
           </w:p>
         </w:tc>
@@ -3047,7 +3047,7 @@
           <w:b/>
           <w:bCs/>
         </w:rPr>
-        <w:t xml:space="preserve">Un bilan est présenté à la direction à la fin de chaque étape.</w:t>
+        <w:t xml:space="preserve">Un bilan est présenté aux directions à la fin de chaque étape.</w:t>
       </w:r>
     </w:p>
     <w:p>
@@ -4489,7 +4489,7 @@
               <w:rPr>
                 <w:rFonts w:ascii="Calibri" w:cs="Calibri" w:eastAsia="Calibri" w:hAnsi="Calibri"/>
               </w:rPr>
-              <w:t xml:space="preserve">Direction</w:t>
+              <w:t xml:space="preserve">Directions</w:t>
             </w:r>
           </w:p>
         </w:tc>
@@ -4703,7 +4703,7 @@
               <w:rPr>
                 <w:rFonts w:ascii="Calibri" w:cs="Calibri" w:eastAsia="Calibri" w:hAnsi="Calibri"/>
               </w:rPr>
-              <w:t xml:space="preserve">Bilan à la direction.</w:t>
+              <w:t xml:space="preserve">Bilan aux directions.</w:t>
             </w:r>
           </w:p>
         </w:tc>

</xml_diff>

<commit_message>
Enrichit les ateliers exploratoires du projet Z101
Visuel en deux familles : ateliers déjà offerts en PPS et idées des
élèves tirées du sondage. Équipes formées par l'enseignante, qui choisit
le leader au départ.

Co-Authored-By: Claude Opus 5.5 <noreply@anthropic.com>
Claude-Session: https://claude.ai/code/session_01GMdriyBYj6aFRdtmm4tFaT
</commit_message>
<xml_diff>
--- a/documents/z101/Projet-Z101.docx
+++ b/documents/z101/Projet-Z101.docx
@@ -2730,7 +2730,7 @@
           <w:sz w:val="18"/>
           <w:szCs w:val="18"/>
         </w:rPr>
-        <w:t xml:space="preserve">Chaque élève est leader au moins une fois par étape. Un leader plus réservé peut avoir un co-leader.</w:t>
+        <w:t xml:space="preserve">Au départ, l'enseignante forme des équipes hétérogènes et choisit le leader de chaque équipe. Ensuite, chaque élève est leader au moins une fois par étape. Un leader plus réservé peut avoir un co-leader.</w:t>
       </w:r>
     </w:p>
     <w:p>
@@ -2771,294 +2771,18 @@
         <w:rPr>
           <w:rFonts w:ascii="Calibri" w:cs="Calibri" w:eastAsia="Calibri" w:hAnsi="Calibri"/>
         </w:rPr>
-        <w:t xml:space="preserve"> sur la formule et sur ce qu'ils veulent apprendre. Quelques exemples, </w:t>
-      </w:r>
-      <w:r>
-        <w:rPr>
-          <w:rFonts w:ascii="Calibri" w:cs="Calibri" w:eastAsia="Calibri" w:hAnsi="Calibri"/>
-          <w:b/>
-          <w:bCs/>
-        </w:rPr>
-        <w:t xml:space="preserve">liste non exhaustive</w:t>
-      </w:r>
-      <w:r>
-        <w:rPr>
-          <w:rFonts w:ascii="Calibri" w:cs="Calibri" w:eastAsia="Calibri" w:hAnsi="Calibri"/>
-        </w:rPr>
-        <w:t xml:space="preserve"> :</w:t>
-      </w:r>
-    </w:p>
-    <w:tbl>
-      <w:tblPr>
-        <w:tblW w:type="dxa" w:w="9360"/>
-        <w:tblBorders>
-          <w:top w:val="single" w:color="C9CFD8" w:sz="4"/>
-          <w:left w:val="single" w:color="C9CFD8" w:sz="4"/>
-          <w:bottom w:val="single" w:color="C9CFD8" w:sz="4"/>
-          <w:right w:val="single" w:color="C9CFD8" w:sz="4"/>
-          <w:insideH w:val="single" w:color="C9CFD8" w:sz="4"/>
-          <w:insideV w:val="single" w:color="C9CFD8" w:sz="4"/>
-        </w:tblBorders>
-        <w:tblLayout w:type="fixed"/>
-      </w:tblPr>
-      <w:tblGrid>
-        <w:gridCol w:w="3120"/>
-        <w:gridCol w:w="3120"/>
-        <w:gridCol w:w="3120"/>
-      </w:tblGrid>
-      <w:tr>
-        <w:trPr>
-          <w:tblHeader/>
-        </w:trPr>
-        <w:tc>
-          <w:tcPr>
-            <w:tcW w:type="dxa" w:w="3120"/>
-            <w:shd w:fill="004983" w:color="auto" w:val="clear"/>
-            <w:tcMar>
-              <w:top w:type="dxa" w:w="100"/>
-              <w:left w:type="dxa" w:w="140"/>
-              <w:bottom w:type="dxa" w:w="100"/>
-              <w:right w:type="dxa" w:w="140"/>
-            </w:tcMar>
-            <w:vAlign w:val="top"/>
-          </w:tcPr>
-          <w:p>
-            <w:pPr>
-              <w:keepNext/>
-              <w:spacing w:after="0"/>
-            </w:pPr>
-            <w:r>
-              <w:rPr>
-                <w:rFonts w:ascii="Calibri" w:cs="Calibri" w:eastAsia="Calibri" w:hAnsi="Calibri"/>
-                <w:b/>
-                <w:bCs/>
-                <w:color w:val="FFFFFF"/>
-                <w:sz w:val="20"/>
-                <w:szCs w:val="20"/>
-              </w:rPr>
-              <w:t xml:space="preserve">Pré-employabilité</w:t>
-            </w:r>
-          </w:p>
-        </w:tc>
-        <w:tc>
-          <w:tcPr>
-            <w:tcW w:type="dxa" w:w="3120"/>
-            <w:shd w:fill="004983" w:color="auto" w:val="clear"/>
-            <w:tcMar>
-              <w:top w:type="dxa" w:w="100"/>
-              <w:left w:type="dxa" w:w="140"/>
-              <w:bottom w:type="dxa" w:w="100"/>
-              <w:right w:type="dxa" w:w="140"/>
-            </w:tcMar>
-            <w:vAlign w:val="top"/>
-          </w:tcPr>
-          <w:p>
-            <w:pPr>
-              <w:keepNext/>
-              <w:spacing w:after="0"/>
-            </w:pPr>
-            <w:r>
-              <w:rPr>
-                <w:rFonts w:ascii="Calibri" w:cs="Calibri" w:eastAsia="Calibri" w:hAnsi="Calibri"/>
-                <w:b/>
-                <w:bCs/>
-                <w:color w:val="FFFFFF"/>
-                <w:sz w:val="20"/>
-                <w:szCs w:val="20"/>
-              </w:rPr>
-              <w:t xml:space="preserve">Développement durable</w:t>
-            </w:r>
-          </w:p>
-        </w:tc>
-        <w:tc>
-          <w:tcPr>
-            <w:tcW w:type="dxa" w:w="3120"/>
-            <w:shd w:fill="004983" w:color="auto" w:val="clear"/>
-            <w:tcMar>
-              <w:top w:type="dxa" w:w="100"/>
-              <w:left w:type="dxa" w:w="140"/>
-              <w:bottom w:type="dxa" w:w="100"/>
-              <w:right w:type="dxa" w:w="140"/>
-            </w:tcMar>
-            <w:vAlign w:val="top"/>
-          </w:tcPr>
-          <w:p>
-            <w:pPr>
-              <w:keepNext/>
-              <w:spacing w:after="0"/>
-            </w:pPr>
-            <w:r>
-              <w:rPr>
-                <w:rFonts w:ascii="Calibri" w:cs="Calibri" w:eastAsia="Calibri" w:hAnsi="Calibri"/>
-                <w:b/>
-                <w:bCs/>
-                <w:color w:val="FFFFFF"/>
-                <w:sz w:val="20"/>
-                <w:szCs w:val="20"/>
-              </w:rPr>
-              <w:t xml:space="preserve">Entrepreneuriat</w:t>
-            </w:r>
-          </w:p>
-        </w:tc>
-      </w:tr>
-      <w:tr>
-        <w:trPr>
-          <w:cantSplit/>
-        </w:trPr>
-        <w:tc>
-          <w:tcPr>
-            <w:tcW w:type="dxa" w:w="3120"/>
-            <w:tcMar>
-              <w:top w:type="dxa" w:w="100"/>
-              <w:left w:type="dxa" w:w="140"/>
-              <w:bottom w:type="dxa" w:w="100"/>
-              <w:right w:type="dxa" w:w="140"/>
-            </w:tcMar>
-            <w:vAlign w:val="top"/>
-          </w:tcPr>
-          <w:p>
-            <w:pPr>
-              <w:spacing w:after="40" w:line="264"/>
-            </w:pPr>
-            <w:r>
-              <w:rPr>
-                <w:rFonts w:ascii="Calibri" w:cs="Calibri" w:eastAsia="Calibri" w:hAnsi="Calibri"/>
-                <w:color w:val="004983"/>
-              </w:rPr>
-              <w:t xml:space="preserve">Au grenier de Maria.</w:t>
-            </w:r>
-          </w:p>
-        </w:tc>
-        <w:tc>
-          <w:tcPr>
-            <w:tcW w:type="dxa" w:w="3120"/>
-            <w:tcMar>
-              <w:top w:type="dxa" w:w="100"/>
-              <w:left w:type="dxa" w:w="140"/>
-              <w:bottom w:type="dxa" w:w="100"/>
-              <w:right w:type="dxa" w:w="140"/>
-            </w:tcMar>
-            <w:vAlign w:val="top"/>
-          </w:tcPr>
-          <w:p>
-            <w:pPr>
-              <w:spacing w:after="40" w:line="264"/>
-            </w:pPr>
-            <w:r>
-              <w:rPr>
-                <w:rFonts w:ascii="Calibri" w:cs="Calibri" w:eastAsia="Calibri" w:hAnsi="Calibri"/>
-              </w:rPr>
-              <w:t xml:space="preserve">Une suggestion des élèves.</w:t>
-            </w:r>
-          </w:p>
-        </w:tc>
-        <w:tc>
-          <w:tcPr>
-            <w:tcW w:type="dxa" w:w="3120"/>
-            <w:tcMar>
-              <w:top w:type="dxa" w:w="100"/>
-              <w:left w:type="dxa" w:w="140"/>
-              <w:bottom w:type="dxa" w:w="100"/>
-              <w:right w:type="dxa" w:w="140"/>
-            </w:tcMar>
-            <w:vAlign w:val="top"/>
-          </w:tcPr>
-          <w:p>
-            <w:pPr>
-              <w:spacing w:after="40" w:line="264"/>
-            </w:pPr>
-            <w:r>
-              <w:rPr>
-                <w:rFonts w:ascii="Calibri" w:cs="Calibri" w:eastAsia="Calibri" w:hAnsi="Calibri"/>
-              </w:rPr>
-              <w:t xml:space="preserve">Des projets que les élèves veulent réaliser et qui débuteront bientôt en PPS.</w:t>
-            </w:r>
-          </w:p>
-        </w:tc>
-      </w:tr>
-    </w:tbl>
-    <w:p>
-      <w:pPr>
-        <w:spacing w:after="120" w:line="288"/>
-      </w:pPr>
-      <w:r>
-        <w:rPr>
-          <w:rFonts w:ascii="Calibri" w:cs="Calibri" w:eastAsia="Calibri" w:hAnsi="Calibri"/>
-          <w:b/>
-          <w:bCs/>
-        </w:rPr>
-        <w:t xml:space="preserve">Exemple de projet :</w:t>
-      </w:r>
-      <w:r>
-        <w:rPr>
-          <w:rFonts w:ascii="Calibri" w:cs="Calibri" w:eastAsia="Calibri" w:hAnsi="Calibri"/>
-        </w:rPr>
-        <w:t xml:space="preserve"> un projet d'entrepreneuriat en développement durable, qui se poursuit d'un atelier à l'autre.</w:t>
+        <w:t xml:space="preserve"> sur la formule et sur ce qu'ils veulent apprendre. Les ateliers combinent ce qui existe déjà en PPS et leurs propres idées.</w:t>
       </w:r>
     </w:p>
     <w:p>
       <w:pPr>
-        <w:spacing w:after="120" w:line="288"/>
-      </w:pPr>
-      <w:r>
-        <w:rPr>
-          <w:rFonts w:ascii="Calibri" w:cs="Calibri" w:eastAsia="Calibri" w:hAnsi="Calibri"/>
-          <w:b/>
-          <w:bCs/>
-        </w:rPr>
-        <w:t xml:space="preserve">Locaux :</w:t>
-      </w:r>
-      <w:r>
-        <w:rPr>
-          <w:rFonts w:ascii="Calibri" w:cs="Calibri" w:eastAsia="Calibri" w:hAnsi="Calibri"/>
-        </w:rPr>
-        <w:t xml:space="preserve"> le grenier de Maria, à côté de la classe de Mme Lisa, et le local d'arts plastiques, un grand local libre.</w:t>
-      </w:r>
-    </w:p>
-    <w:p>
-      <w:pPr>
-        <w:pStyle w:val="Heading1"/>
-        <w:keepNext/>
-        <w:pBdr>
-          <w:bottom w:val="single" w:color="7AA32B" w:sz="12" w:space="4"/>
-        </w:pBdr>
-        <w:spacing w:after="160" w:before="400"/>
-      </w:pPr>
-      <w:r>
-        <w:rPr>
-          <w:rFonts w:ascii="Calibri" w:cs="Calibri" w:eastAsia="Calibri" w:hAnsi="Calibri"/>
-        </w:rPr>
-        <w:t xml:space="preserve">7. Les trois étapes</w:t>
-      </w:r>
-    </w:p>
-    <w:p>
-      <w:pPr>
-        <w:spacing w:after="120" w:line="288"/>
-      </w:pPr>
-      <w:r>
-        <w:rPr>
-          <w:rFonts w:ascii="Calibri" w:cs="Calibri" w:eastAsia="Calibri" w:hAnsi="Calibri"/>
-        </w:rPr>
-        <w:t xml:space="preserve">On passe à l'étape suivante quand on observe les signes de réussite. </w:t>
-      </w:r>
-      <w:r>
-        <w:rPr>
-          <w:rFonts w:ascii="Calibri" w:cs="Calibri" w:eastAsia="Calibri" w:hAnsi="Calibri"/>
-          <w:b/>
-          <w:bCs/>
-        </w:rPr>
-        <w:t xml:space="preserve">Un bilan est présenté aux directions à la fin de chaque étape.</w:t>
-      </w:r>
-    </w:p>
-    <w:p>
-      <w:pPr>
         <w:spacing w:after="160" w:before="120"/>
         <w:jc w:val="center"/>
       </w:pPr>
       <w:r>
         <w:drawing>
           <wp:inline distT="0" distB="0" distL="0" distR="0">
-            <wp:extent cx="5943600" cy="2343150"/>
+            <wp:extent cx="5943600" cy="2981325"/>
             <wp:effectExtent t="0" r="0" b="0" l="0"/>
             <wp:docPr id="1" name="" descr="" title=""/>
             <wp:cNvGraphicFramePr>
@@ -3083,6 +2807,87 @@
                   <pic:spPr bwMode="auto">
                     <a:xfrm>
                       <a:off x="0" y="0"/>
+                      <a:ext cx="5943600" cy="2981325"/>
+                    </a:xfrm>
+                    <a:prstGeom prst="rect">
+                      <a:avLst/>
+                    </a:prstGeom>
+                  </pic:spPr>
+                </pic:pic>
+              </a:graphicData>
+            </a:graphic>
+          </wp:inline>
+        </w:drawing>
+      </w:r>
+    </w:p>
+    <w:p>
+      <w:pPr>
+        <w:pStyle w:val="Heading1"/>
+        <w:keepNext/>
+        <w:pBdr>
+          <w:bottom w:val="single" w:color="7AA32B" w:sz="12" w:space="4"/>
+        </w:pBdr>
+        <w:spacing w:after="160" w:before="400"/>
+      </w:pPr>
+      <w:r>
+        <w:rPr>
+          <w:rFonts w:ascii="Calibri" w:cs="Calibri" w:eastAsia="Calibri" w:hAnsi="Calibri"/>
+        </w:rPr>
+        <w:t xml:space="preserve">7. Les trois étapes</w:t>
+      </w:r>
+    </w:p>
+    <w:p>
+      <w:pPr>
+        <w:spacing w:after="120" w:line="288"/>
+      </w:pPr>
+      <w:r>
+        <w:rPr>
+          <w:rFonts w:ascii="Calibri" w:cs="Calibri" w:eastAsia="Calibri" w:hAnsi="Calibri"/>
+        </w:rPr>
+        <w:t xml:space="preserve">On passe à l'étape suivante quand on observe les signes de réussite. </w:t>
+      </w:r>
+      <w:r>
+        <w:rPr>
+          <w:rFonts w:ascii="Calibri" w:cs="Calibri" w:eastAsia="Calibri" w:hAnsi="Calibri"/>
+          <w:b/>
+          <w:bCs/>
+        </w:rPr>
+        <w:t xml:space="preserve">Un bilan est présenté aux directions à la fin de chaque étape.</w:t>
+      </w:r>
+    </w:p>
+    <w:p>
+      <w:pPr>
+        <w:spacing w:after="160" w:before="120"/>
+        <w:jc w:val="center"/>
+      </w:pPr>
+      <w:r>
+        <w:drawing>
+          <wp:inline distT="0" distB="0" distL="0" distR="0">
+            <wp:extent cx="5943600" cy="2343150"/>
+            <wp:effectExtent t="0" r="0" b="0" l="0"/>
+            <wp:docPr id="1" name="" descr="" title=""/>
+            <wp:cNvGraphicFramePr>
+              <a:graphicFrameLocks xmlns:a="http://schemas.openxmlformats.org/drawingml/2006/main" noChangeAspect="1"/>
+            </wp:cNvGraphicFramePr>
+            <a:graphic xmlns:a="http://schemas.openxmlformats.org/drawingml/2006/main">
+              <a:graphicData uri="http://schemas.openxmlformats.org/drawingml/2006/picture">
+                <pic:pic xmlns:pic="http://schemas.openxmlformats.org/drawingml/2006/picture">
+                  <pic:nvPicPr>
+                    <pic:cNvPr id="0" name="" descr=""/>
+                    <pic:cNvPicPr>
+                      <a:picLocks noChangeAspect="1" noChangeArrowheads="1"/>
+                    </pic:cNvPicPr>
+                  </pic:nvPicPr>
+                  <pic:blipFill>
+                    <a:blip r:embed="rId11" cstate="none"/>
+                    <a:srcRect/>
+                    <a:stretch>
+                      <a:fillRect/>
+                    </a:stretch>
+                  </pic:blipFill>
+                  <pic:spPr bwMode="auto">
+                    <a:xfrm>
+                      <a:off x="0" y="0"/>
                       <a:ext cx="5943600" cy="2343150"/>
                     </a:xfrm>
                     <a:prstGeom prst="rect">
@@ -3136,7 +2941,7 @@
                     </pic:cNvPicPr>
                   </pic:nvPicPr>
                   <pic:blipFill>
-                    <a:blip r:embed="rId11" cstate="none"/>
+                    <a:blip r:embed="rId12" cstate="none"/>
                     <a:srcRect/>
                     <a:stretch>
                       <a:fillRect/>

</xml_diff>

<commit_message>
Intègre les retouches au projet Z101 et précise les ateliers
Reprend les modifications faites dans Word, ajoute le démarrage graduel
des ateliers et des pistes pour aller plus loin, précise les arts
plastiques et les capsules d'histoire, et confie l'inscription à la CP.

Co-Authored-By: Claude Opus 5.5 <noreply@anthropic.com>
Claude-Session: https://claude.ai/code/session_01GMdriyBYj6aFRdtmm4tFaT
</commit_message>
<xml_diff>
--- a/documents/z101/Projet-Z101.docx
+++ b/documents/z101/Projet-Z101.docx
@@ -151,21 +151,6 @@
               <w:t xml:space="preserve">Octobre 2026</w:t>
             </w:r>
           </w:p>
-          <w:p>
-            <w:pPr>
-              <w:keepNext/>
-              <w:spacing w:after="0"/>
-            </w:pPr>
-            <w:r>
-              <w:rPr>
-                <w:rFonts w:ascii="Calibri" w:cs="Calibri" w:eastAsia="Calibri" w:hAnsi="Calibri"/>
-                <w:color w:val="D6E4F2"/>
-                <w:sz w:val="20"/>
-                <w:szCs w:val="20"/>
-              </w:rPr>
-              <w:t xml:space="preserve">Préparé par la conseillère pédagogique, secteur PPS, CFGA</w:t>
-            </w:r>
-          </w:p>
         </w:tc>
       </w:tr>
       <w:tr>
@@ -731,7 +716,7 @@
               <w:rPr>
                 <w:rFonts w:ascii="Calibri" w:cs="Calibri" w:eastAsia="Calibri" w:hAnsi="Calibri"/>
               </w:rPr>
-              <w:t xml:space="preserve">Mme Lisa, enseignante du Z101, et Janie-Lee, TES, qui a accepté son rôle.</w:t>
+              <w:t xml:space="preserve">Mme Lisa, enseignante du Z101, et Janie-Lee, TES, qui a accepté son rôle dans le projet.</w:t>
             </w:r>
           </w:p>
         </w:tc>
@@ -1184,7 +1169,7 @@
               <w:rPr>
                 <w:rFonts w:ascii="Calibri" w:cs="Calibri" w:eastAsia="Calibri" w:hAnsi="Calibri"/>
               </w:rPr>
-              <w:t xml:space="preserve">Ces élèves sont motivés maintenant. Attendre retarde leur parcours en PPS.</w:t>
+              <w:t xml:space="preserve">Ces élèves sont motivés maintenant. Attendre retarde leur parcours en PPS et peut avoir un impact sur leur engagement dans leur parcours scolaire.</w:t>
             </w:r>
           </w:p>
         </w:tc>
@@ -1240,7 +1225,7 @@
               <w:rPr>
                 <w:rFonts w:ascii="Calibri" w:cs="Calibri" w:eastAsia="Calibri" w:hAnsi="Calibri"/>
               </w:rPr>
-              <w:t xml:space="preserve">Chaque élève accueilli peut faire trois ans en PPS au centre.</w:t>
+              <w:t xml:space="preserve">Chaque élève accueilli pourra poursuivre en PPS dans les prochaines années.</w:t>
             </w:r>
           </w:p>
         </w:tc>
@@ -1294,7 +1279,7 @@
               <w:rPr>
                 <w:rFonts w:ascii="Calibri" w:cs="Calibri" w:eastAsia="Calibri" w:hAnsi="Calibri"/>
               </w:rPr>
-              <w:t xml:space="preserve">La formule pourrait servir ailleurs : alpha-pré, francisation, FBC.</w:t>
+              <w:t xml:space="preserve">La formule pourrait servir ailleurs : alpha-pré, francisation, FBC, etc.</w:t>
             </w:r>
           </w:p>
         </w:tc>
@@ -1611,7 +1596,7 @@
               <w:rPr>
                 <w:rFonts w:ascii="Calibri" w:cs="Calibri" w:eastAsia="Calibri" w:hAnsi="Calibri"/>
               </w:rPr>
-              <w:t xml:space="preserve">L'horaire du mardi et celui du jeudi sont inversés.</w:t>
+              <w:t xml:space="preserve">L'horaire du mardi et celui du jeudi sont inversés (voir visuel).</w:t>
             </w:r>
           </w:p>
         </w:tc>
@@ -1667,21 +1652,21 @@
               <w:rPr>
                 <w:rFonts w:ascii="Calibri" w:cs="Calibri" w:eastAsia="Calibri" w:hAnsi="Calibri"/>
               </w:rPr>
-              <w:t xml:space="preserve">Les élèves en PPS pur sont </w:t>
-            </w:r>
-            <w:r>
-              <w:rPr>
-                <w:rFonts w:ascii="Calibri" w:cs="Calibri" w:eastAsia="Calibri" w:hAnsi="Calibri"/>
-                <w:b/>
-                <w:bCs/>
-              </w:rPr>
-              <w:t xml:space="preserve">toujours avec Janie-Lee</w:t>
-            </w:r>
-            <w:r>
-              <w:rPr>
-                <w:rFonts w:ascii="Calibri" w:cs="Calibri" w:eastAsia="Calibri" w:hAnsi="Calibri"/>
-              </w:rPr>
-              <w:t xml:space="preserve"> quand ils sont en atelier.</w:t>
+              <w:t xml:space="preserve">Les élèves en PPS pur pourront bénéficier de la </w:t>
+            </w:r>
+            <w:r>
+              <w:rPr>
+                <w:rFonts w:ascii="Calibri" w:cs="Calibri" w:eastAsia="Calibri" w:hAnsi="Calibri"/>
+                <w:b/>
+                <w:bCs/>
+              </w:rPr>
+              <w:t xml:space="preserve">présence de Janie-Lee</w:t>
+            </w:r>
+            <w:r>
+              <w:rPr>
+                <w:rFonts w:ascii="Calibri" w:cs="Calibri" w:eastAsia="Calibri" w:hAnsi="Calibri"/>
+              </w:rPr>
+              <w:t xml:space="preserve"> quand ils sont en ateliers.</w:t>
             </w:r>
           </w:p>
         </w:tc>
@@ -1990,7 +1975,7 @@
               <w:rPr>
                 <w:rFonts w:ascii="Calibri" w:cs="Calibri" w:eastAsia="Calibri" w:hAnsi="Calibri"/>
               </w:rPr>
-              <w:t xml:space="preserve"> vers les ateliers pour offrir un soutien ponctuel et rediriger les élèves.</w:t>
+              <w:t xml:space="preserve"> vers les ateliers pour offrir un soutien ponctuel et rediriger les élèves au besoin.</w:t>
             </w:r>
           </w:p>
         </w:tc>
@@ -2059,7 +2044,7 @@
               <w:rPr>
                 <w:rFonts w:ascii="Calibri" w:cs="Calibri" w:eastAsia="Calibri" w:hAnsi="Calibri"/>
               </w:rPr>
-              <w:t xml:space="preserve">Accompagne les élèves en PPS pur en atelier et pendant les transitions.</w:t>
+              <w:t xml:space="preserve">Accompagne les élèves en PPS pur en ateliers et pendant les transitions.</w:t>
             </w:r>
           </w:p>
           <w:p>
@@ -2782,7 +2767,7 @@
       <w:r>
         <w:drawing>
           <wp:inline distT="0" distB="0" distL="0" distR="0">
-            <wp:extent cx="5943600" cy="2981325"/>
+            <wp:extent cx="5943600" cy="3048000"/>
             <wp:effectExtent t="0" r="0" b="0" l="0"/>
             <wp:docPr id="1" name="" descr="" title=""/>
             <wp:cNvGraphicFramePr>
@@ -2807,7 +2792,7 @@
                   <pic:spPr bwMode="auto">
                     <a:xfrm>
                       <a:off x="0" y="0"/>
-                      <a:ext cx="5943600" cy="2981325"/>
+                      <a:ext cx="5943600" cy="3048000"/>
                     </a:xfrm>
                     <a:prstGeom prst="rect">
                       <a:avLst/>
@@ -2818,6 +2803,196 @@
             </a:graphic>
           </wp:inline>
         </w:drawing>
+      </w:r>
+    </w:p>
+    <w:tbl>
+      <w:tblPr>
+        <w:tblW w:type="dxa" w:w="9360"/>
+        <w:tblBorders>
+          <w:top w:val="single" w:color="auto" w:sz="4"/>
+          <w:left w:val="single" w:color="auto" w:sz="4"/>
+          <w:bottom w:val="single" w:color="auto" w:sz="4"/>
+          <w:right w:val="single" w:color="auto" w:sz="4"/>
+          <w:insideH w:val="single" w:color="auto" w:sz="4"/>
+          <w:insideV w:val="single" w:color="auto" w:sz="4"/>
+        </w:tblBorders>
+        <w:tblLayout w:type="fixed"/>
+      </w:tblPr>
+      <w:tblGrid>
+        <w:gridCol w:w="9360"/>
+      </w:tblGrid>
+      <w:tr>
+        <w:trPr>
+          <w:cantSplit/>
+        </w:trPr>
+        <w:tc>
+          <w:tcPr>
+            <w:tcW w:type="dxa" w:w="9360"/>
+            <w:tcBorders>
+              <w:top w:val="none" w:color="FFFFFF" w:sz="0"/>
+              <w:left w:val="single" w:color="004983" w:sz="36"/>
+              <w:bottom w:val="none" w:color="FFFFFF" w:sz="0"/>
+              <w:right w:val="none" w:color="FFFFFF" w:sz="0"/>
+            </w:tcBorders>
+            <w:tcMar>
+              <w:top w:type="dxa" w:w="160"/>
+              <w:left w:type="dxa" w:w="280"/>
+              <w:bottom w:type="dxa" w:w="100"/>
+              <w:right w:type="dxa" w:w="240"/>
+            </w:tcMar>
+          </w:tcPr>
+          <w:p>
+            <w:pPr>
+              <w:spacing w:after="80"/>
+            </w:pPr>
+            <w:r>
+              <w:rPr>
+                <w:rFonts w:ascii="Calibri" w:cs="Calibri" w:eastAsia="Calibri" w:hAnsi="Calibri"/>
+                <w:b/>
+                <w:bCs/>
+                <w:color w:val="004983"/>
+                <w:sz w:val="24"/>
+                <w:szCs w:val="24"/>
+              </w:rPr>
+              <w:t xml:space="preserve">Un démarrage graduel</w:t>
+            </w:r>
+          </w:p>
+          <w:p>
+            <w:pPr>
+              <w:spacing w:after="80" w:line="276"/>
+            </w:pPr>
+            <w:r>
+              <w:rPr>
+                <w:rFonts w:ascii="Calibri" w:cs="Calibri" w:eastAsia="Calibri" w:hAnsi="Calibri"/>
+              </w:rPr>
+              <w:t xml:space="preserve">Les idées des élèves sont des </w:t>
+            </w:r>
+            <w:r>
+              <w:rPr>
+                <w:rFonts w:ascii="Calibri" w:cs="Calibri" w:eastAsia="Calibri" w:hAnsi="Calibri"/>
+                <w:b/>
+                <w:bCs/>
+              </w:rPr>
+              <w:t xml:space="preserve">propositions</w:t>
+            </w:r>
+            <w:r>
+              <w:rPr>
+                <w:rFonts w:ascii="Calibri" w:cs="Calibri" w:eastAsia="Calibri" w:hAnsi="Calibri"/>
+              </w:rPr>
+              <w:t xml:space="preserve"> : elles ne sont pas encore confirmées. Si le projet est accepté, nous débuterons avec </w:t>
+            </w:r>
+            <w:r>
+              <w:rPr>
+                <w:rFonts w:ascii="Calibri" w:cs="Calibri" w:eastAsia="Calibri" w:hAnsi="Calibri"/>
+                <w:b/>
+                <w:bCs/>
+              </w:rPr>
+              <w:t xml:space="preserve">un ou deux ateliers exploratoires à la fois</w:t>
+            </w:r>
+            <w:r>
+              <w:rPr>
+                <w:rFonts w:ascii="Calibri" w:cs="Calibri" w:eastAsia="Calibri" w:hAnsi="Calibri"/>
+              </w:rPr>
+              <w:t xml:space="preserve">, pour ne pas nous éparpiller.</w:t>
+            </w:r>
+          </w:p>
+        </w:tc>
+      </w:tr>
+    </w:tbl>
+    <w:p>
+      <w:pPr>
+        <w:pStyle w:val="Heading2"/>
+        <w:keepNext/>
+        <w:spacing w:after="100" w:before="240"/>
+      </w:pPr>
+      <w:r>
+        <w:rPr>
+          <w:rFonts w:ascii="Calibri" w:cs="Calibri" w:eastAsia="Calibri" w:hAnsi="Calibri"/>
+        </w:rPr>
+        <w:t xml:space="preserve">Pour aller plus loin</w:t>
+      </w:r>
+    </w:p>
+    <w:p>
+      <w:pPr>
+        <w:spacing w:after="120" w:line="288"/>
+      </w:pPr>
+      <w:r>
+        <w:rPr>
+          <w:rFonts w:ascii="Calibri" w:cs="Calibri" w:eastAsia="Calibri" w:hAnsi="Calibri"/>
+        </w:rPr>
+        <w:t xml:space="preserve">Ces pistes ne sont pas encore en place. Elles montrent ce que la formule pourrait permettre :</w:t>
+      </w:r>
+    </w:p>
+    <w:p>
+      <w:pPr>
+        <w:pStyle w:val="ListParagraph"/>
+        <w:numPr>
+          <w:ilvl w:val="0"/>
+          <w:numId w:val="2"/>
+        </w:numPr>
+        <w:spacing w:after="80" w:line="276"/>
+      </w:pPr>
+      <w:r>
+        <w:rPr>
+          <w:rFonts w:ascii="Calibri" w:cs="Calibri" w:eastAsia="Calibri" w:hAnsi="Calibri"/>
+          <w:b/>
+          <w:bCs/>
+        </w:rPr>
+        <w:t xml:space="preserve">Un rôle plus préventif pour la TES.</w:t>
+      </w:r>
+      <w:r>
+        <w:rPr>
+          <w:rFonts w:ascii="Calibri" w:cs="Calibri" w:eastAsia="Calibri" w:hAnsi="Calibri"/>
+        </w:rPr>
+        <w:t xml:space="preserve"> Quand l'autonomie et les routines seront bien acquises, les ateliers exploratoires, signifiants et concrets pour les élèves, seront une occasion en or pour faire de la prévention et offrir des ateliers ciblés.</w:t>
+      </w:r>
+    </w:p>
+    <w:p>
+      <w:pPr>
+        <w:pStyle w:val="ListParagraph"/>
+        <w:numPr>
+          <w:ilvl w:val="0"/>
+          <w:numId w:val="2"/>
+        </w:numPr>
+        <w:spacing w:after="80" w:line="276"/>
+      </w:pPr>
+      <w:r>
+        <w:rPr>
+          <w:rFonts w:ascii="Calibri" w:cs="Calibri" w:eastAsia="Calibri" w:hAnsi="Calibri"/>
+          <w:b/>
+          <w:bCs/>
+        </w:rPr>
+        <w:t xml:space="preserve">Des places pour d'autres élèves du centre.</w:t>
+      </w:r>
+      <w:r>
+        <w:rPr>
+          <w:rFonts w:ascii="Calibri" w:cs="Calibri" w:eastAsia="Calibri" w:hAnsi="Calibri"/>
+        </w:rPr>
+        <w:t xml:space="preserve"> Par exemple, ouvrir quelques places à des élèves d'alpha-pré dans un atelier d'écriture : lecture d'un album par la conseillère pédagogique, suivie d'une question de réaction.</w:t>
+      </w:r>
+    </w:p>
+    <w:p>
+      <w:pPr>
+        <w:pStyle w:val="ListParagraph"/>
+        <w:numPr>
+          <w:ilvl w:val="0"/>
+          <w:numId w:val="2"/>
+        </w:numPr>
+        <w:spacing w:after="80" w:line="276"/>
+      </w:pPr>
+      <w:r>
+        <w:rPr>
+          <w:rFonts w:ascii="Calibri" w:cs="Calibri" w:eastAsia="Calibri" w:hAnsi="Calibri"/>
+          <w:b/>
+          <w:bCs/>
+        </w:rPr>
+        <w:t xml:space="preserve">La vie étudiante.</w:t>
+      </w:r>
+      <w:r>
+        <w:rPr>
+          <w:rFonts w:ascii="Calibri" w:cs="Calibri" w:eastAsia="Calibri" w:hAnsi="Calibri"/>
+        </w:rPr>
+        <w:t xml:space="preserve"> Des ateliers en collaboration avec la technicienne en loisirs.</w:t>
       </w:r>
     </w:p>
     <w:p>
@@ -3352,7 +3527,7 @@
               <w:rPr>
                 <w:rFonts w:ascii="Calibri" w:cs="Calibri" w:eastAsia="Calibri" w:hAnsi="Calibri"/>
               </w:rPr>
-              <w:t xml:space="preserve">Le grenier est à côté de la classe. Mme Lisa circule. Les élèves en PPS pur sont avec la TES.</w:t>
+              <w:t xml:space="preserve">Le grenier est à côté de la classe. Mme Lisa circule. Les élèves en PPS pur bénéficient de la présence de la TES.</w:t>
             </w:r>
           </w:p>
         </w:tc>
@@ -4270,7 +4445,7 @@
               <w:rPr>
                 <w:rFonts w:ascii="Calibri" w:cs="Calibri" w:eastAsia="Calibri" w:hAnsi="Calibri"/>
               </w:rPr>
-              <w:t xml:space="preserve">Inscription des 9 élèves et accès au local.</w:t>
+              <w:t xml:space="preserve">Inscription des 9 élèves.</w:t>
             </w:r>
           </w:p>
         </w:tc>
@@ -4294,7 +4469,7 @@
               <w:rPr>
                 <w:rFonts w:ascii="Calibri" w:cs="Calibri" w:eastAsia="Calibri" w:hAnsi="Calibri"/>
               </w:rPr>
-              <w:t xml:space="preserve">Directions</w:t>
+              <w:t xml:space="preserve">Conseillère pédagogique</w:t>
             </w:r>
           </w:p>
         </w:tc>
@@ -4531,7 +4706,7 @@
               <w:rPr>
                 <w:rFonts w:ascii="Calibri" w:cs="Calibri" w:eastAsia="Calibri" w:hAnsi="Calibri"/>
               </w:rPr>
-              <w:t xml:space="preserve">Mme Lisa, Janie-Lee</w:t>
+              <w:t xml:space="preserve">Mme Lisa, Janie-Lee, conseillère pédagogique</w:t>
             </w:r>
           </w:p>
         </w:tc>

</xml_diff>